<commit_message>
bcode| fix loc object
</commit_message>
<xml_diff>
--- a/Cấu trúc Bcode  BcodeViewer (v3 - Tóm tắt).docx
+++ b/Cấu trúc Bcode  BcodeViewer (v3 - Tóm tắt).docx
@@ -1854,6 +1854,18 @@
           <w:rFonts w:ascii="Consolas" w:hAnsi="Consolas" w:eastAsia="Consolas"/>
           <w:sz w:val="13"/>
         </w:rPr>
+        <w:t>│   ├── rpt/</w:t>
+      </w:r>
+    </w:p>
+    <w:p>
+      <w:pPr>
+        <w:spacing w:after="0" w:before="0" w:line="240" w:lineRule="auto"/>
+      </w:pPr>
+      <w:r>
+        <w:rPr>
+          <w:rFonts w:ascii="Consolas" w:hAnsi="Consolas" w:eastAsia="Consolas"/>
+          <w:sz w:val="13"/>
+        </w:rPr>
         <w:t>│   └── README.md  14</w:t>
       </w:r>
     </w:p>
@@ -2082,7 +2094,7 @@
           <w:rFonts w:ascii="Consolas" w:hAnsi="Consolas" w:eastAsia="Consolas"/>
           <w:sz w:val="13"/>
         </w:rPr>
-        <w:t>│   ├── ISqlTab.cs  55</w:t>
+        <w:t>│   ├── ISqlTab.cs  57</w:t>
       </w:r>
     </w:p>
     <w:p>
@@ -2202,31 +2214,31 @@
           <w:rFonts w:ascii="Consolas" w:hAnsi="Consolas" w:eastAsia="Consolas"/>
           <w:sz w:val="13"/>
         </w:rPr>
-        <w:t>│   ├── NativeFindBar.cs  62</w:t>
-      </w:r>
-    </w:p>
-    <w:p>
-      <w:pPr>
-        <w:spacing w:after="0" w:before="0" w:line="240" w:lineRule="auto"/>
-      </w:pPr>
-      <w:r>
-        <w:rPr>
-          <w:rFonts w:ascii="Consolas" w:hAnsi="Consolas" w:eastAsia="Consolas"/>
-          <w:sz w:val="13"/>
-        </w:rPr>
-        <w:t>│   ├── NativeInputs.cs  247</w:t>
-      </w:r>
-    </w:p>
-    <w:p>
-      <w:pPr>
-        <w:spacing w:after="0" w:before="0" w:line="240" w:lineRule="auto"/>
-      </w:pPr>
-      <w:r>
-        <w:rPr>
-          <w:rFonts w:ascii="Consolas" w:hAnsi="Consolas" w:eastAsia="Consolas"/>
-          <w:sz w:val="13"/>
-        </w:rPr>
-        <w:t>│   ├── NativeKit.cs  491</w:t>
+        <w:t>│   ├── NativeFindBar.cs  65</w:t>
+      </w:r>
+    </w:p>
+    <w:p>
+      <w:pPr>
+        <w:spacing w:after="0" w:before="0" w:line="240" w:lineRule="auto"/>
+      </w:pPr>
+      <w:r>
+        <w:rPr>
+          <w:rFonts w:ascii="Consolas" w:hAnsi="Consolas" w:eastAsia="Consolas"/>
+          <w:sz w:val="13"/>
+        </w:rPr>
+        <w:t>│   ├── NativeInputs.cs  292</w:t>
+      </w:r>
+    </w:p>
+    <w:p>
+      <w:pPr>
+        <w:spacing w:after="0" w:before="0" w:line="240" w:lineRule="auto"/>
+      </w:pPr>
+      <w:r>
+        <w:rPr>
+          <w:rFonts w:ascii="Consolas" w:hAnsi="Consolas" w:eastAsia="Consolas"/>
+          <w:sz w:val="13"/>
+        </w:rPr>
+        <w:t>│   ├── NativeKit.cs  515</w:t>
       </w:r>
     </w:p>
     <w:p>
@@ -2334,7 +2346,7 @@
           <w:rFonts w:ascii="Consolas" w:hAnsi="Consolas" w:eastAsia="Consolas"/>
           <w:sz w:val="13"/>
         </w:rPr>
-        <w:t>│   ├── NativePages.Commands.cs  252</w:t>
+        <w:t>│   ├── NativePages.Commands.cs  320</w:t>
       </w:r>
     </w:p>
     <w:p>
@@ -2538,7 +2550,19 @@
           <w:rFonts w:ascii="Consolas" w:hAnsi="Consolas" w:eastAsia="Consolas"/>
           <w:sz w:val="13"/>
         </w:rPr>
-        <w:t>│   ├── NativePages.Register.cs  49</w:t>
+        <w:t>│   ├── NativePages.Register.cs  50</w:t>
+      </w:r>
+    </w:p>
+    <w:p>
+      <w:pPr>
+        <w:spacing w:after="0" w:before="0" w:line="240" w:lineRule="auto"/>
+      </w:pPr>
+      <w:r>
+        <w:rPr>
+          <w:rFonts w:ascii="Consolas" w:hAnsi="Consolas" w:eastAsia="Consolas"/>
+          <w:sz w:val="13"/>
+        </w:rPr>
+        <w:t>│   ├── NativePages.RptSchema.cs  106</w:t>
       </w:r>
     </w:p>
     <w:p>
@@ -2598,31 +2622,31 @@
           <w:rFonts w:ascii="Consolas" w:hAnsi="Consolas" w:eastAsia="Consolas"/>
           <w:sz w:val="13"/>
         </w:rPr>
-        <w:t>│   ├── NativeShellBars.cs  246</w:t>
-      </w:r>
-    </w:p>
-    <w:p>
-      <w:pPr>
-        <w:spacing w:after="0" w:before="0" w:line="240" w:lineRule="auto"/>
-      </w:pPr>
-      <w:r>
-        <w:rPr>
-          <w:rFonts w:ascii="Consolas" w:hAnsi="Consolas" w:eastAsia="Consolas"/>
-          <w:sz w:val="13"/>
-        </w:rPr>
-        <w:t>│   ├── NativeSqlControl.cs  750</w:t>
-      </w:r>
-    </w:p>
-    <w:p>
-      <w:pPr>
-        <w:spacing w:after="0" w:before="0" w:line="240" w:lineRule="auto"/>
-      </w:pPr>
-      <w:r>
-        <w:rPr>
-          <w:rFonts w:ascii="Consolas" w:hAnsi="Consolas" w:eastAsia="Consolas"/>
-          <w:sz w:val="13"/>
-        </w:rPr>
-        <w:t>│   ├── NativeSqlHints.cs  363</w:t>
+        <w:t>│   ├── NativeShellBars.cs  253</w:t>
+      </w:r>
+    </w:p>
+    <w:p>
+      <w:pPr>
+        <w:spacing w:after="0" w:before="0" w:line="240" w:lineRule="auto"/>
+      </w:pPr>
+      <w:r>
+        <w:rPr>
+          <w:rFonts w:ascii="Consolas" w:hAnsi="Consolas" w:eastAsia="Consolas"/>
+          <w:sz w:val="13"/>
+        </w:rPr>
+        <w:t>│   ├── NativeSqlControl.cs  849</w:t>
+      </w:r>
+    </w:p>
+    <w:p>
+      <w:pPr>
+        <w:spacing w:after="0" w:before="0" w:line="240" w:lineRule="auto"/>
+      </w:pPr>
+      <w:r>
+        <w:rPr>
+          <w:rFonts w:ascii="Consolas" w:hAnsi="Consolas" w:eastAsia="Consolas"/>
+          <w:sz w:val="13"/>
+        </w:rPr>
+        <w:t>│   ├── NativeSqlHints.cs  366</w:t>
       </w:r>
     </w:p>
     <w:p>
@@ -2730,7 +2754,7 @@
           <w:rFonts w:ascii="Consolas" w:hAnsi="Consolas" w:eastAsia="Consolas"/>
           <w:sz w:val="13"/>
         </w:rPr>
-        <w:t>│   ├── RawSqlControl.cs  2503</w:t>
+        <w:t>│   ├── RawSqlControl.cs  2504</w:t>
       </w:r>
     </w:p>
     <w:p>
@@ -2802,7 +2826,7 @@
           <w:rFonts w:ascii="Consolas" w:hAnsi="Consolas" w:eastAsia="Consolas"/>
           <w:sz w:val="13"/>
         </w:rPr>
-        <w:t>│   ├── SqlObjectTreeControl.cs  376</w:t>
+        <w:t>│   ├── SqlObjectTreeControl.cs  419</w:t>
       </w:r>
     </w:p>
     <w:p>
@@ -2850,7 +2874,7 @@
           <w:rFonts w:ascii="Consolas" w:hAnsi="Consolas" w:eastAsia="Consolas"/>
           <w:sz w:val="13"/>
         </w:rPr>
-        <w:t>│   ├── SqlScintilla.cs  127</w:t>
+        <w:t>│   ├── SqlScintilla.cs  137</w:t>
       </w:r>
     </w:p>
     <w:p>
@@ -2910,7 +2934,7 @@
           <w:rFonts w:ascii="Consolas" w:hAnsi="Consolas" w:eastAsia="Consolas"/>
           <w:sz w:val="13"/>
         </w:rPr>
-        <w:t>│   ├── TableEditControl.cs  1871</w:t>
+        <w:t>│   ├── TableEditControl.cs  1896</w:t>
       </w:r>
     </w:p>
     <w:p>
@@ -2946,7 +2970,7 @@
           <w:rFonts w:ascii="Consolas" w:hAnsi="Consolas" w:eastAsia="Consolas"/>
           <w:sz w:val="13"/>
         </w:rPr>
-        <w:t>│   ├── WCommandTreeControl.cs  696</w:t>
+        <w:t>│   ├── WCommandTreeControl.cs  814</w:t>
       </w:r>
     </w:p>
     <w:p>
@@ -2994,7 +3018,7 @@
           <w:rFonts w:ascii="Consolas" w:hAnsi="Consolas" w:eastAsia="Consolas"/>
           <w:sz w:val="13"/>
         </w:rPr>
-        <w:t>│   ├── WebMenu.cs  288</w:t>
+        <w:t>│   ├── WebMenu.cs  332</w:t>
       </w:r>
     </w:p>
     <w:p>
@@ -3090,7 +3114,7 @@
           <w:rFonts w:ascii="Consolas" w:hAnsi="Consolas" w:eastAsia="Consolas"/>
           <w:sz w:val="13"/>
         </w:rPr>
-        <w:t>│   ├── AppCommandEditForm.cs  216</w:t>
+        <w:t>│   ├── AppCommandEditForm.cs  255</w:t>
       </w:r>
     </w:p>
     <w:p>
@@ -3378,7 +3402,7 @@
           <w:rFonts w:ascii="Consolas" w:hAnsi="Consolas" w:eastAsia="Consolas"/>
           <w:sz w:val="13"/>
         </w:rPr>
-        <w:t>│   ├── MainForm.cs  3265</w:t>
+        <w:t>│   ├── MainForm.cs  3357</w:t>
       </w:r>
     </w:p>
     <w:p>
@@ -3522,6 +3546,18 @@
           <w:rFonts w:ascii="Consolas" w:hAnsi="Consolas" w:eastAsia="Consolas"/>
           <w:sz w:val="13"/>
         </w:rPr>
+        <w:t>│   ├── RptSchemaForm.cs  193</w:t>
+      </w:r>
+    </w:p>
+    <w:p>
+      <w:pPr>
+        <w:spacing w:after="0" w:before="0" w:line="240" w:lineRule="auto"/>
+      </w:pPr>
+      <w:r>
+        <w:rPr>
+          <w:rFonts w:ascii="Consolas" w:hAnsi="Consolas" w:eastAsia="Consolas"/>
+          <w:sz w:val="13"/>
+        </w:rPr>
         <w:t>│   ├── ScriptPopupForm.cs  155</w:t>
       </w:r>
     </w:p>
@@ -3642,7 +3678,7 @@
           <w:rFonts w:ascii="Consolas" w:hAnsi="Consolas" w:eastAsia="Consolas"/>
           <w:sz w:val="13"/>
         </w:rPr>
-        <w:t>│   ├── UiTemplateForm.cs  649</w:t>
+        <w:t>│   ├── UiTemplateForm.cs  651</w:t>
       </w:r>
     </w:p>
     <w:p>
@@ -3738,7 +3774,7 @@
           <w:rFonts w:ascii="Consolas" w:hAnsi="Consolas" w:eastAsia="Consolas"/>
           <w:sz w:val="13"/>
         </w:rPr>
-        <w:t>│   ├── AppSettings.cs  256</w:t>
+        <w:t>│   ├── AppSettings.cs  261</w:t>
       </w:r>
     </w:p>
     <w:p>
@@ -4038,7 +4074,31 @@
           <w:rFonts w:ascii="Consolas" w:hAnsi="Consolas" w:eastAsia="Consolas"/>
           <w:sz w:val="13"/>
         </w:rPr>
-        <w:t>│   │   └── RptXmlBuilder.cs  103</w:t>
+        <w:t>│   │   ├── RptSchemaService.cs  124</w:t>
+      </w:r>
+    </w:p>
+    <w:p>
+      <w:pPr>
+        <w:spacing w:after="0" w:before="0" w:line="240" w:lineRule="auto"/>
+      </w:pPr>
+      <w:r>
+        <w:rPr>
+          <w:rFonts w:ascii="Consolas" w:hAnsi="Consolas" w:eastAsia="Consolas"/>
+          <w:sz w:val="13"/>
+        </w:rPr>
+        <w:t>│   │   ├── RptXmlBuilder.cs  103</w:t>
+      </w:r>
+    </w:p>
+    <w:p>
+      <w:pPr>
+        <w:spacing w:after="0" w:before="0" w:line="240" w:lineRule="auto"/>
+      </w:pPr>
+      <w:r>
+        <w:rPr>
+          <w:rFonts w:ascii="Consolas" w:hAnsi="Consolas" w:eastAsia="Consolas"/>
+          <w:sz w:val="13"/>
+        </w:rPr>
+        <w:t>│   │   └── XsdSchemaWriter.cs  108</w:t>
       </w:r>
     </w:p>
     <w:p>
@@ -4086,7 +4146,7 @@
           <w:rFonts w:ascii="Consolas" w:hAnsi="Consolas" w:eastAsia="Consolas"/>
           <w:sz w:val="13"/>
         </w:rPr>
-        <w:t>│   ├── AppCommandService.cs  262</w:t>
+        <w:t>│   ├── AppCommandService.cs  382</w:t>
       </w:r>
     </w:p>
     <w:p>
@@ -4254,7 +4314,7 @@
           <w:rFonts w:ascii="Consolas" w:hAnsi="Consolas" w:eastAsia="Consolas"/>
           <w:sz w:val="13"/>
         </w:rPr>
-        <w:t>│   ├── CommandTableService.cs  69</w:t>
+        <w:t>│   ├── CommandTableService.cs  75</w:t>
       </w:r>
     </w:p>
     <w:p>
@@ -4410,7 +4470,7 @@
           <w:rFonts w:ascii="Consolas" w:hAnsi="Consolas" w:eastAsia="Consolas"/>
           <w:sz w:val="13"/>
         </w:rPr>
-        <w:t>│   ├── FileLookupService.cs  1143</w:t>
+        <w:t>│   ├── FileLookupService.cs  1165</w:t>
       </w:r>
     </w:p>
     <w:p>
@@ -4458,7 +4518,7 @@
           <w:rFonts w:ascii="Consolas" w:hAnsi="Consolas" w:eastAsia="Consolas"/>
           <w:sz w:val="13"/>
         </w:rPr>
-        <w:t>│   ├── GenAllService.cs  790</w:t>
+        <w:t>│   ├── GenAllService.cs  789</w:t>
       </w:r>
     </w:p>
     <w:p>
@@ -4602,6 +4662,18 @@
           <w:rFonts w:ascii="Consolas" w:hAnsi="Consolas" w:eastAsia="Consolas"/>
           <w:sz w:val="13"/>
         </w:rPr>
+        <w:t>│   ├── MobilePathService.cs  53</w:t>
+      </w:r>
+    </w:p>
+    <w:p>
+      <w:pPr>
+        <w:spacing w:after="0" w:before="0" w:line="240" w:lineRule="auto"/>
+      </w:pPr>
+      <w:r>
+        <w:rPr>
+          <w:rFonts w:ascii="Consolas" w:hAnsi="Consolas" w:eastAsia="Consolas"/>
+          <w:sz w:val="13"/>
+        </w:rPr>
         <w:t>│   ├── NoteService.cs  66</w:t>
       </w:r>
     </w:p>
@@ -4842,7 +4914,7 @@
           <w:rFonts w:ascii="Consolas" w:hAnsi="Consolas" w:eastAsia="Consolas"/>
           <w:sz w:val="13"/>
         </w:rPr>
-        <w:t>│   ├── SqlHintEngine.cs  199</w:t>
+        <w:t>│   ├── SqlHintEngine.cs  205</w:t>
       </w:r>
     </w:p>
     <w:p>
@@ -4866,7 +4938,7 @@
           <w:rFonts w:ascii="Consolas" w:hAnsi="Consolas" w:eastAsia="Consolas"/>
           <w:sz w:val="13"/>
         </w:rPr>
-        <w:t>│   ├── SqlHintService.cs  213</w:t>
+        <w:t>│   ├── SqlHintService.cs  222</w:t>
       </w:r>
     </w:p>
     <w:p>
@@ -4902,7 +4974,7 @@
           <w:rFonts w:ascii="Consolas" w:hAnsi="Consolas" w:eastAsia="Consolas"/>
           <w:sz w:val="13"/>
         </w:rPr>
-        <w:t>│   ├── SqlObjectBrowserService.cs  589</w:t>
+        <w:t>│   ├── SqlObjectBrowserService.cs  632</w:t>
       </w:r>
     </w:p>
     <w:p>
@@ -4974,7 +5046,7 @@
           <w:rFonts w:ascii="Consolas" w:hAnsi="Consolas" w:eastAsia="Consolas"/>
           <w:sz w:val="13"/>
         </w:rPr>
-        <w:t>│   ├── WCommandService.cs  778</w:t>
+        <w:t>│   ├── WCommandService.cs  811</w:t>
       </w:r>
     </w:p>
     <w:p>
@@ -5082,7 +5154,7 @@
           <w:rFonts w:ascii="Consolas" w:hAnsi="Consolas" w:eastAsia="Consolas"/>
           <w:sz w:val="13"/>
         </w:rPr>
-        <w:t>│   ├── FlatToolStripRenderer.cs  113</w:t>
+        <w:t>│   ├── FlatToolStripRenderer.cs  120</w:t>
       </w:r>
     </w:p>
     <w:p>
@@ -5118,7 +5190,7 @@
           <w:rFonts w:ascii="Consolas" w:hAnsi="Consolas" w:eastAsia="Consolas"/>
           <w:sz w:val="13"/>
         </w:rPr>
-        <w:t>│   ├── IconGlyphs.cs  168</w:t>
+        <w:t>│   ├── IconGlyphs.cs  191</w:t>
       </w:r>
     </w:p>
     <w:p>
@@ -5190,7 +5262,7 @@
           <w:rFonts w:ascii="Consolas" w:hAnsi="Consolas" w:eastAsia="Consolas"/>
           <w:sz w:val="13"/>
         </w:rPr>
-        <w:t>│   ├── ShortcutRegistry.cs  308</w:t>
+        <w:t>│   ├── ShortcutRegistry.cs  319</w:t>
       </w:r>
     </w:p>
     <w:p>
@@ -5214,7 +5286,7 @@
           <w:rFonts w:ascii="Consolas" w:hAnsi="Consolas" w:eastAsia="Consolas"/>
           <w:sz w:val="13"/>
         </w:rPr>
-        <w:t>│   ├── ThemeManager.cs  661</w:t>
+        <w:t>│   ├── ThemeManager.cs  715</w:t>
       </w:r>
     </w:p>
     <w:p>
@@ -5406,7 +5478,7 @@
           <w:rFonts w:ascii="Consolas" w:hAnsi="Consolas" w:eastAsia="Consolas"/>
           <w:sz w:val="13"/>
         </w:rPr>
-        <w:t>│       ├── appcommandedit.html  119</w:t>
+        <w:t>│       ├── appcommandedit.html  158</w:t>
       </w:r>
     </w:p>
     <w:p>
@@ -5970,6 +6042,18 @@
           <w:rFonts w:ascii="Consolas" w:hAnsi="Consolas" w:eastAsia="Consolas"/>
           <w:sz w:val="13"/>
         </w:rPr>
+        <w:t>│       ├── rptschema.html  68</w:t>
+      </w:r>
+    </w:p>
+    <w:p>
+      <w:pPr>
+        <w:spacing w:after="0" w:before="0" w:line="240" w:lineRule="auto"/>
+      </w:pPr>
+      <w:r>
+        <w:rPr>
+          <w:rFonts w:ascii="Consolas" w:hAnsi="Consolas" w:eastAsia="Consolas"/>
+          <w:sz w:val="13"/>
+        </w:rPr>
         <w:t>│       ├── scriptpopup.html  88</w:t>
       </w:r>
     </w:p>
@@ -6018,7 +6102,7 @@
           <w:rFonts w:ascii="Consolas" w:hAnsi="Consolas" w:eastAsia="Consolas"/>
           <w:sz w:val="13"/>
         </w:rPr>
-        <w:t>│       ├── shell.css  251</w:t>
+        <w:t>│       ├── shell.css  255</w:t>
       </w:r>
     </w:p>
     <w:p>
@@ -6210,7 +6294,7 @@
           <w:rFonts w:ascii="Consolas" w:hAnsi="Consolas" w:eastAsia="Consolas"/>
           <w:sz w:val="13"/>
         </w:rPr>
-        <w:t>│       ├── topbar.html  167</w:t>
+        <w:t>│       ├── topbar.html  169</w:t>
       </w:r>
     </w:p>
     <w:p>
@@ -6246,7 +6330,7 @@
           <w:rFonts w:ascii="Consolas" w:hAnsi="Consolas" w:eastAsia="Consolas"/>
           <w:sz w:val="13"/>
         </w:rPr>
-        <w:t>│       ├── uitemplate.html  1091</w:t>
+        <w:t>│       ├── uitemplate.html  1094</w:t>
       </w:r>
     </w:p>
     <w:p>
@@ -6270,7 +6354,7 @@
           <w:rFonts w:ascii="Consolas" w:hAnsi="Consolas" w:eastAsia="Consolas"/>
           <w:sz w:val="13"/>
         </w:rPr>
-        <w:t>│       ├── wcommandbar.html  40</w:t>
+        <w:t>│       ├── wcommandbar.html  43</w:t>
       </w:r>
     </w:p>
     <w:p>
@@ -6318,7 +6402,7 @@
           <w:rFonts w:ascii="Consolas" w:hAnsi="Consolas" w:eastAsia="Consolas"/>
           <w:sz w:val="13"/>
         </w:rPr>
-        <w:t>├── Bcode.App.csproj  130</w:t>
+        <w:t>├── Bcode.App.csproj  132</w:t>
       </w:r>
     </w:p>
     <w:p>
@@ -6342,7 +6426,7 @@
           <w:rFonts w:ascii="Consolas" w:hAnsi="Consolas" w:eastAsia="Consolas"/>
           <w:sz w:val="13"/>
         </w:rPr>
-        <w:t>└── Program.cs  23</w:t>
+        <w:t>└── Program.cs  37</w:t>
       </w:r>
     </w:p>
     <w:p>
@@ -6518,7 +6602,7 @@
           <w:rFonts w:ascii="Consolas" w:hAnsi="Consolas" w:eastAsia="Consolas"/>
           <w:sz w:val="13"/>
         </w:rPr>
-        <w:t>│   ├── EditorBridge.cs  1288</w:t>
+        <w:t>│   ├── EditorBridge.cs  1327</w:t>
       </w:r>
     </w:p>
     <w:p>
@@ -6578,7 +6662,7 @@
           <w:rFonts w:ascii="Consolas" w:hAnsi="Consolas" w:eastAsia="Consolas"/>
           <w:sz w:val="13"/>
         </w:rPr>
-        <w:t>│   ├── WorkspaceConnection.cs  315</w:t>
+        <w:t>│   ├── WorkspaceConnection.cs  318</w:t>
       </w:r>
     </w:p>
     <w:p>
@@ -6686,7 +6770,7 @@
           <w:rFonts w:ascii="Consolas" w:hAnsi="Consolas" w:eastAsia="Consolas"/>
           <w:sz w:val="13"/>
         </w:rPr>
-        <w:t>│   ├── RecentFilesStore.cs  125</w:t>
+        <w:t>│   ├── RecentFilesStore.cs  151</w:t>
       </w:r>
     </w:p>
     <w:p>
@@ -6902,7 +6986,7 @@
           <w:rFonts w:ascii="Consolas" w:hAnsi="Consolas" w:eastAsia="Consolas"/>
           <w:sz w:val="13"/>
         </w:rPr>
-        <w:t>│   ├── completion.js  2343</w:t>
+        <w:t>│   ├── completion.js  2367</w:t>
       </w:r>
     </w:p>
     <w:p>
@@ -6926,7 +7010,7 @@
           <w:rFonts w:ascii="Consolas" w:hAnsi="Consolas" w:eastAsia="Consolas"/>
           <w:sz w:val="13"/>
         </w:rPr>
-        <w:t>│   ├── dirpreview.js  1232</w:t>
+        <w:t>│   ├── dirpreview.js  1257</w:t>
       </w:r>
     </w:p>
     <w:p>
@@ -6962,19 +7046,19 @@
           <w:rFonts w:ascii="Consolas" w:hAnsi="Consolas" w:eastAsia="Consolas"/>
           <w:sz w:val="13"/>
         </w:rPr>
-        <w:t>│   ├── editor.js  1610</w:t>
-      </w:r>
-    </w:p>
-    <w:p>
-      <w:pPr>
-        <w:spacing w:after="0" w:before="0" w:line="240" w:lineRule="auto"/>
-      </w:pPr>
-      <w:r>
-        <w:rPr>
-          <w:rFonts w:ascii="Consolas" w:hAnsi="Consolas" w:eastAsia="Consolas"/>
-          <w:sz w:val="13"/>
-        </w:rPr>
-        <w:t>│   ├── entity.js  1280</w:t>
+        <w:t>│   ├── editor.js  1632</w:t>
+      </w:r>
+    </w:p>
+    <w:p>
+      <w:pPr>
+        <w:spacing w:after="0" w:before="0" w:line="240" w:lineRule="auto"/>
+      </w:pPr>
+      <w:r>
+        <w:rPr>
+          <w:rFonts w:ascii="Consolas" w:hAnsi="Consolas" w:eastAsia="Consolas"/>
+          <w:sz w:val="13"/>
+        </w:rPr>
+        <w:t>│   ├── entity.js  1323</w:t>
       </w:r>
     </w:p>
     <w:p>
@@ -7046,7 +7130,7 @@
           <w:rFonts w:ascii="Consolas" w:hAnsi="Consolas" w:eastAsia="Consolas"/>
           <w:sz w:val="13"/>
         </w:rPr>
-        <w:t>│   ├── index.html  230</w:t>
+        <w:t>│   ├── index.html  231</w:t>
       </w:r>
     </w:p>
     <w:p>
@@ -7094,6 +7178,18 @@
           <w:rFonts w:ascii="Consolas" w:hAnsi="Consolas" w:eastAsia="Consolas"/>
           <w:sz w:val="13"/>
         </w:rPr>
+        <w:t>│   ├── perfwatch.js  110</w:t>
+      </w:r>
+    </w:p>
+    <w:p>
+      <w:pPr>
+        <w:spacing w:after="0" w:before="0" w:line="240" w:lineRule="auto"/>
+      </w:pPr>
+      <w:r>
+        <w:rPr>
+          <w:rFonts w:ascii="Consolas" w:hAnsi="Consolas" w:eastAsia="Consolas"/>
+          <w:sz w:val="13"/>
+        </w:rPr>
         <w:t>│   ├── problems-worker.js  101</w:t>
       </w:r>
     </w:p>
@@ -7106,7 +7202,7 @@
           <w:rFonts w:ascii="Consolas" w:hAnsi="Consolas" w:eastAsia="Consolas"/>
           <w:sz w:val="13"/>
         </w:rPr>
-        <w:t>│   ├── problems.js  1007</w:t>
+        <w:t>│   ├── problems.js  1013</w:t>
       </w:r>
     </w:p>
     <w:p>
@@ -7142,19 +7238,19 @@
           <w:rFonts w:ascii="Consolas" w:hAnsi="Consolas" w:eastAsia="Consolas"/>
           <w:sz w:val="13"/>
         </w:rPr>
-        <w:t>│   ├── settings.js  578</w:t>
-      </w:r>
-    </w:p>
-    <w:p>
-      <w:pPr>
-        <w:spacing w:after="0" w:before="0" w:line="240" w:lineRule="auto"/>
-      </w:pPr>
-      <w:r>
-        <w:rPr>
-          <w:rFonts w:ascii="Consolas" w:hAnsi="Consolas" w:eastAsia="Consolas"/>
-          <w:sz w:val="13"/>
-        </w:rPr>
-        <w:t>│   ├── shell.js  602</w:t>
+        <w:t>│   ├── settings.js  589</w:t>
+      </w:r>
+    </w:p>
+    <w:p>
+      <w:pPr>
+        <w:spacing w:after="0" w:before="0" w:line="240" w:lineRule="auto"/>
+      </w:pPr>
+      <w:r>
+        <w:rPr>
+          <w:rFonts w:ascii="Consolas" w:hAnsi="Consolas" w:eastAsia="Consolas"/>
+          <w:sz w:val="13"/>
+        </w:rPr>
+        <w:t>│   ├── shell.js  625</w:t>
       </w:r>
     </w:p>
     <w:p>
@@ -7190,7 +7286,7 @@
           <w:rFonts w:ascii="Consolas" w:hAnsi="Consolas" w:eastAsia="Consolas"/>
           <w:sz w:val="13"/>
         </w:rPr>
-        <w:t>│   ├── tabs.js  223</w:t>
+        <w:t>│   ├── tabs.js  236</w:t>
       </w:r>
     </w:p>
     <w:p>
@@ -7286,7 +7382,7 @@
           <w:rFonts w:ascii="Consolas" w:hAnsi="Consolas" w:eastAsia="Consolas"/>
           <w:sz w:val="13"/>
         </w:rPr>
-        <w:t>├── MainForm.cs  2559</w:t>
+        <w:t>├── MainForm.cs  2630</w:t>
       </w:r>
     </w:p>
     <w:p>
@@ -8058,7 +8154,7 @@
                 <w:b w:val="0"/>
                 <w:sz w:val="16"/>
               </w:rPr>
-              <w:t>Ctrl+Shift+P / Ctrl+O. Danh sách Workspace nằm trong AppSettings (settings.json) — BcodeViewer đọc lại. Mỗi workspace có 2 DB: Sys Data / App Data.</w:t>
+              <w:t>Ctrl+Shift+P / Ctrl+O. Danh sách Workspace nằm trong AppSettings (settings.json) — BcodeViewer đọc lại. Mỗi workspace có 2 DB: Sys Data / App Data. Ctrl+O / Choose Server: cửa sổ đang có tab mà chọn dự án KHÁC → mở Bcode mới bằng --project &lt;tên&gt; (vào thẳng dự án, không hiện Projects), cửa sổ cũ giữ nguyên; không có tab thì đổi dự án tại chỗ như cũ (MainForm.ShowProjectPicker(newWindowIfTabs), StartNewBcodeWindow, Program.StartupArgs). Ctrl+Shift+P và màn Projects lúc mở Bcode giữ như cũ.</w:t>
             </w:r>
           </w:p>
         </w:tc>
@@ -8429,7 +8525,7 @@
                 <w:b w:val="0"/>
                 <w:sz w:val="16"/>
               </w:rPr>
-              <w:t>Topbar: Settings, Actions, Script (Add/View/Clear/Save/Copy), Triển khai, Tool mở rộng, Claude, Gemini, chọn WS + Sys/App, theme, Quick Access.</w:t>
+              <w:t>Topbar: Settings, Actions, Script (Add/View/Clear/Save/Copy), Triển khai, Tool mở rộng, Claude, Gemini, chọn WS + nút ⟳ Refresh database (MainForm.RefreshDatabaseAsync, phím db.refresh: bỏ cache SQL Object App+Sys, gợi ý bảng/cột/procedure, tên bảng tab Table rồi nạp lại cây) + Sys/App, theme, Quick Access.</w:t>
             </w:r>
           </w:p>
         </w:tc>
@@ -8856,7 +8952,7 @@
                 <w:b w:val="0"/>
                 <w:sz w:val="16"/>
               </w:rPr>
-              <w:t>Editor là Monaco trong sqleditor.html. Panel Message, nhiều result set, AI ghost + Ctrl+I, Lịch sử AI (Forms/AiHistoryForm, Services/AiHistoryStore), kéo thả file.</w:t>
+              <w:t>Editor là Monaco trong sqleditor.html. Panel Message, nhiều result set, AI ghost + Ctrl+I, Lịch sử AI (Forms/AiHistoryForm, Services/AiHistoryStore), kéo thả file. Write Schema (editor.writeSchema, có cả ở NativeSqlControl) = file .xsd cho Crystal Report từ bảng kết quả lần chạy gần nhất (d1..dN) qua Services/Rpt/XsdSchemaWriter, rồi hỏi cập nhật bảng trong file .rpt (Forms/RptSchemaForm + Web/Shell/rptschema.html, App: Controls/NativePages.RptSchema.cs; Services/Rpt/RptSchemaService.cs chạy Assets/rpt/rptschema.ps1 bằng Windows PowerShell 5.1 + Crystal runtime 13).</w:t>
             </w:r>
           </w:p>
         </w:tc>
@@ -9248,7 +9344,7 @@
                 <w:b w:val="0"/>
                 <w:sz w:val="16"/>
               </w:rPr>
-              <w:t>Ctrl+Alt+U (Ai đang dùng); Ctrl+Shift+J (So sánh object). Cây không tự tải khi ô lọc rỗng.</w:t>
+              <w:t>Ctrl+Alt+U (Ai đang dùng); Ctrl+Shift+J (So sánh object). Cây không tự tải khi ô lọc rỗng. Lọc theo tên chạy trên cache trong bộ nhớ (nhóm đã sắp xếp, lọc ở luồng nền, node con nạp từng đợt, gõ tiếp thì huỷ lần dựng cũ).</w:t>
             </w:r>
           </w:p>
         </w:tc>
@@ -9563,7 +9659,7 @@
                 <w:b w:val="0"/>
                 <w:sz w:val="16"/>
               </w:rPr>
-              <w:t>New (Insert/F4), Edit F3, Delete F8, Gen Script Menu F12, Check WCommand, Refresh F5; Design = mở ScreenDesigner; Ctrl+F5 chạy menu.</w:t>
+              <w:t>New (Insert/F4), Edit F3, Delete F8, Gen Script Menu F12, Check WCommand, Refresh F5; Design = mở ScreenDesigner; Ctrl+F5 chạy menu. Ô (C) trên thanh lọc (cả cây Mobile) = chỉ hiện menu customize (tên có (C) / (*)) kèm menu cha — WCommandService.FilterCustom, lọc trên bản sao. Chuột phải "Menu Name: Bar2 / Bar" (phím wcommand.menuName) = đổi tên hiển thị tiếng Việt ↔ tiếng Anh cho cả cây WCommand và Mobile, nhớ ở %AppData%\Bcode\menu_name_bar2.txt.</w:t>
             </w:r>
           </w:p>
         </w:tc>
@@ -9583,7 +9679,7 @@
                 <w:b/>
                 <w:sz w:val="16"/>
               </w:rPr>
-              <w:t>File Lookup (Ctrl+Shift+F)</w:t>
+              <w:t>Mobile (cây menu app mobile — bảng dvcommand)</w:t>
             </w:r>
           </w:p>
         </w:tc>
@@ -9601,7 +9697,7 @@
                 <w:b w:val="0"/>
                 <w:sz w:val="16"/>
               </w:rPr>
-              <w:t>Controls/FileLookupControl.cs (1500 dòng), MonacoPreviewControl.cs; Services/FileLookupService.cs, FileParseCache.cs, EntityCheckService.cs; Web/Shell/filelookupbar.html, filelookuppreview.html, filepreview.html, searchbox.html, entitypeek.html; Forms/EntityMultiPeekForm.cs</w:t>
+              <w:t>Controls/WCommandTreeControl.cs (tham số menuTable); Services/AppCommandService.cs (MenuTableSpec.DvCommand), MobilePathService.cs, CommandTableService.ResolveIn; Forms/AppCommandEditForm.cs; Web/Shell/appcommandedit.html; Controls/NativePages.Commands.cs (AppCommandEditPage); MainForm.OpenMobileItem</w:t>
             </w:r>
           </w:p>
         </w:tc>
@@ -9619,7 +9715,7 @@
                 <w:b w:val="0"/>
                 <w:sz w:val="16"/>
               </w:rPr>
-              <w:t>Cây file theo menu, cache theo dự án (%AppData%\Bcode\FileLookupCache), tô đỏ entity thiếu, tìm nội dung, Edit in BcodeViewer (Process.Start).</w:t>
+              <w:t>Mục "Mobile" ở cột icon trái (phím left.mobile). Cùng control cây WCommand ở chế độ bảng: dvcommand ở Sys Data, khoá wmenu_id, cha = wmenu_id0 (không suy cha). New/Edit/Delete/Gen Script chỉ sửa dvcommand (menu_id mượn của command — không đụng command). Form "DVCOMMAND - Edit" = form COMMAND - Edit theo MenuTableSpec (nút Dịch Bar2, ô Table Dir, gợi ý wmenu_id). Double-click menu = tab "File Lookup · Mobile" theo sysid trong Mobile Path (trống thì đoán &lt;cha Source Path&gt;\MobileService); file nằm ở App_Data\Controllers\Mobile\{Dir,Filter,Grid,Include}.</w:t>
             </w:r>
           </w:p>
         </w:tc>
@@ -9639,7 +9735,7 @@
                 <w:b/>
                 <w:sz w:val="16"/>
               </w:rPr>
-              <w:t>Cấp source / Copy to / Clone</w:t>
+              <w:t>File Lookup (Ctrl+Shift+F)</w:t>
             </w:r>
           </w:p>
         </w:tc>
@@ -9657,7 +9753,7 @@
                 <w:b w:val="0"/>
                 <w:sz w:val="16"/>
               </w:rPr>
-              <w:t>Forms/AddSourceForm.cs, GrantSourceForm.cs, CopyMultiFileForm.cs, CopySourceStandardForm.cs; Services/SourceGrantService.cs; Web/Shell/addsource.html, grantsource.html, copymulti.html, copysourcestandard.html</w:t>
+              <w:t>Controls/FileLookupControl.cs (1500 dòng), MonacoPreviewControl.cs; Services/FileLookupService.cs, FileParseCache.cs, EntityCheckService.cs; Web/Shell/filelookupbar.html, filelookuppreview.html, filepreview.html, searchbox.html, entitypeek.html; Forms/EntityMultiPeekForm.cs</w:t>
             </w:r>
           </w:p>
         </w:tc>
@@ -9675,7 +9771,7 @@
                 <w:b w:val="0"/>
                 <w:sz w:val="16"/>
               </w:rPr>
-              <w:t>Kho SourceCollection theo phiên bản; chỉ đọc kho, hỏi trước khi ghi đè.</w:t>
+              <w:t>Cây file theo menu, cache theo dự án (%AppData%\Bcode\FileLookupCache), tô đỏ entity thiếu, tìm nội dung, Edit in BcodeViewer (Process.Start).</w:t>
             </w:r>
           </w:p>
         </w:tc>
@@ -9695,7 +9791,7 @@
                 <w:b/>
                 <w:sz w:val="16"/>
               </w:rPr>
-              <w:t>File Reference / Check Include</w:t>
+              <w:t>Cấp source / Copy to / Clone</w:t>
             </w:r>
           </w:p>
         </w:tc>
@@ -9713,7 +9809,7 @@
                 <w:b w:val="0"/>
                 <w:sz w:val="16"/>
               </w:rPr>
-              <w:t>Controls/FileReferenceControl.cs, IncludeCheckControl.cs; Services/FileReferenceService.cs, IncludeCheckService.cs; Assets/includecheck/*.txt; Web/Shell/filereference.html, includecheck.html</w:t>
+              <w:t>Forms/AddSourceForm.cs, GrantSourceForm.cs, CopyMultiFileForm.cs, CopySourceStandardForm.cs; Services/SourceGrantService.cs; Web/Shell/addsource.html, grantsource.html, copymulti.html, copysourcestandard.html</w:t>
             </w:r>
           </w:p>
         </w:tc>
@@ -9731,7 +9827,7 @@
                 <w:b w:val="0"/>
                 <w:sz w:val="16"/>
               </w:rPr>
-              <w:t>Check Include so khai báo INCLUDE/IGNORE + options + wcommand9 với catalog từng phiên bản (nhúng làm resource).</w:t>
+              <w:t>Kho SourceCollection theo phiên bản; chỉ đọc kho, hỏi trước khi ghi đè.</w:t>
             </w:r>
           </w:p>
         </w:tc>
@@ -9751,7 +9847,7 @@
                 <w:b/>
                 <w:sz w:val="16"/>
               </w:rPr>
-              <w:t>Gen Update (gói file)</w:t>
+              <w:t>File Reference / Check Include</w:t>
             </w:r>
           </w:p>
         </w:tc>
@@ -9769,7 +9865,7 @@
                 <w:b w:val="0"/>
                 <w:sz w:val="16"/>
               </w:rPr>
-              <w:t>Controls/GenUpdatePackageControl.cs; Services/GenAllService.cs; Web/Shell/genupdate.html</w:t>
+              <w:t>Controls/FileReferenceControl.cs, IncludeCheckControl.cs; Services/FileReferenceService.cs, IncludeCheckService.cs; Assets/includecheck/*.txt; Web/Shell/filereference.html, includecheck.html</w:t>
             </w:r>
           </w:p>
         </w:tc>
@@ -9787,7 +9883,63 @@
                 <w:b w:val="0"/>
                 <w:sz w:val="16"/>
               </w:rPr>
-              <w:t>Ctrl+Shift+G. Cấu trúc gói Script\app|sys\*.sql + Web\... dùng chung với Advance Note.</w:t>
+              <w:t>Check Include so khai báo INCLUDE/IGNORE + options + wcommand9 với catalog từng phiên bản (nhúng làm resource).</w:t>
+            </w:r>
+          </w:p>
+        </w:tc>
+      </w:tr>
+      <w:tr>
+        <w:tc>
+          <w:tcPr>
+            <w:tcW w:type="dxa" w:w="2041"/>
+          </w:tcPr>
+          <w:p>
+            <w:pPr>
+              <w:spacing w:after="20"/>
+            </w:pPr>
+            <w:r/>
+            <w:r>
+              <w:rPr>
+                <w:b/>
+                <w:sz w:val="16"/>
+              </w:rPr>
+              <w:t>Gen Update (gói file)</w:t>
+            </w:r>
+          </w:p>
+        </w:tc>
+        <w:tc>
+          <w:tcPr>
+            <w:tcW w:type="dxa" w:w="3969"/>
+          </w:tcPr>
+          <w:p>
+            <w:pPr>
+              <w:spacing w:after="20"/>
+            </w:pPr>
+            <w:r/>
+            <w:r>
+              <w:rPr>
+                <w:b w:val="0"/>
+                <w:sz w:val="16"/>
+              </w:rPr>
+              <w:t>Controls/GenUpdatePackageControl.cs; Services/GenAllService.cs; Web/Shell/genupdate.html</w:t>
+            </w:r>
+          </w:p>
+        </w:tc>
+        <w:tc>
+          <w:tcPr>
+            <w:tcW w:type="dxa" w:w="3855"/>
+          </w:tcPr>
+          <w:p>
+            <w:pPr>
+              <w:spacing w:after="20"/>
+            </w:pPr>
+            <w:r/>
+            <w:r>
+              <w:rPr>
+                <w:b w:val="0"/>
+                <w:sz w:val="16"/>
+              </w:rPr>
+              <w:t>Ctrl+Shift+G. Cấu trúc gói Script\app|sys\*.sql + Web\... dùng chung với Advance Note. Script procedure/function/view/trigger trong gói (Gen nhanh Store, Note (New)/Gen All) = SqlObjectBrowserService.GetDeployScriptAsync: IF EXISTS (sysobjects, xType, IsEncrypted = 0) DROP ... GO + CREATE gốc; table không bao giờ DROP; object mã hoá chỉ ra dòng nhắc.</w:t>
             </w:r>
           </w:p>
         </w:tc>
@@ -10994,7 +11146,7 @@
                 <w:b w:val="0"/>
                 <w:sz w:val="16"/>
               </w:rPr>
-              <w:t>Services/Rpt/ExcelTemplateWriter.cs, GridControllerReader.cs, PivotDetector.cs, PivotXlsxWriter.cs, ReportDeployService.cs, ReportProfilerService.cs, RptXmlBuilder.cs, RptModels.cs</w:t>
+              <w:t>Services/Rpt/ExcelTemplateWriter.cs, GridControllerReader.cs, PivotDetector.cs, PivotXlsxWriter.cs, ReportDeployService.cs, ReportProfilerService.cs, RptXmlBuilder.cs, RptModels.cs, XsdSchemaWriter.cs, RptSchemaService.cs</w:t>
             </w:r>
           </w:p>
         </w:tc>
@@ -11012,7 +11164,7 @@
                 <w:b w:val="0"/>
                 <w:sz w:val="16"/>
               </w:rPr>
-              <w:t>Chuỗi: profiler → đọc Grid controller → chọn field → sinh Excel mẫu + Report xml.</w:t>
+              <w:t>Chuỗi: profiler → đọc Grid controller → chọn field → sinh Excel mẫu + Report xml. XsdSchemaWriter = Write Schema của SQL Query (DataSet NewDataSet, bảng d1..dN, khớp Templates\Rpt\*.xsd); RptSchemaService = đổi nguồn / thêm bảng trong .rpt theo xsd đó (cả subreport bảng cùng tên).</w:t>
             </w:r>
           </w:p>
         </w:tc>
@@ -11982,7 +12134,7 @@
                 <w:b w:val="0"/>
                 <w:sz w:val="16"/>
               </w:rPr>
-              <w:t>Giữ nguyên encoding gốc theo BOM (file .f UTF-16). Lưu kèm snapshot local history.</w:t>
+              <w:t>Giữ nguyên encoding gốc theo BOM (file .f UTF-16). Lưu kèm snapshot local history. Đổi tab (Ctrl+Tab) phải nhẹ: editor.activateDoc chỉ gọi tabs.setActive (đổi tô sáng, không vẽ lại thanh) và giữ cỡ chữ (_fitHoldUntil — không tự co chữ do đổi model); host MainForm.OnFileOpened đi đường nhanh CanSwitchTreeInPlace → PushShellActive/shell.setActive (không dựng lại + gửi lại cả cây); RecentFilesStore.Save ghi nền (Flush lúc đóng), WorkspaceConnection cache settings.json theo giờ sửa.</w:t>
             </w:r>
           </w:p>
         </w:tc>
@@ -12243,7 +12395,7 @@
                 <w:b w:val="0"/>
                 <w:sz w:val="16"/>
               </w:rPr>
-              <w:t>Web/quickopen.js, tabswitcher.js; EditorBridge.BeginListFiles</w:t>
+              <w:t>Web/quickopen.js, tabswitcher.js; editor.js (cycleTab); EditorBridge.BeginListFiles</w:t>
             </w:r>
           </w:p>
         </w:tc>
@@ -12261,7 +12413,7 @@
                 <w:b w:val="0"/>
                 <w:sz w:val="16"/>
               </w:rPr>
-              <w:t>Danh sách file do host quét (có cache), trang chỉ lọc.</w:t>
+              <w:t>Danh sách file do host quét (có cache), trang chỉ lọc. Ctrl+Tab bấm nhanh như Bcode: Settings → Bố cục → "Ctrl+Tab bấm nhanh" = Tab tới (A→B→C) hoặc Tab song song (A⇄B, theo MRU) — lưu ở layout.tabSwitchMode; giữ Ctrl rồi Tab = hộp chọn tab.</w:t>
             </w:r>
           </w:p>
         </w:tc>
@@ -12464,7 +12616,7 @@
                 <w:b w:val="0"/>
                 <w:sz w:val="16"/>
               </w:rPr>
-              <w:t>Đồng bộ, không gọi mạng. Thư mục dùng chung đặt ở Settings.</w:t>
+              <w:t>Đồng bộ, không gọi mạng. Thư mục dùng chung đặt ở Settings. Gợi ý gọi do gõ DẤU CÁCH (completion.js isSpaceTrigger): XML chỉ khi đang ở chỗ gõ thuộc tính của thẻ mở (OPEN_TAG_ATTR_POS), SQL chỉ sau từ khoá mở mệnh đề / dấu phẩy / toán tử (SQL_SPACE_TRIGGER) — thoát trước docFacts (~15 lượt quét cả file). Snippet tính $[#FIELD#] lười.</w:t>
             </w:r>
           </w:p>
         </w:tc>
@@ -12779,7 +12931,7 @@
                 <w:b w:val="0"/>
                 <w:sz w:val="16"/>
               </w:rPr>
-              <w:t>Độ sâu include tới 64; fallback tìm toàn project; cache theo tên.</w:t>
+              <w:t>Độ sâu include tới 64; fallback tìm toàn project; cache theo tên. Công tắc %Conditional...; khai ở file khác (lookupParamValue): nhớ theo từng ngữ cảnh file+DOCTYPE (12 gần nhất) + noGlobalDecls nhớ khai báo từng file include, nhường luồng mỗi 40 file — trước đây Ctrl+Tab khi đang mở xem trước Dir (Alt+P) đứng trang 2–10+ s.</w:t>
             </w:r>
           </w:p>
         </w:tc>
@@ -12835,7 +12987,7 @@
                 <w:b w:val="0"/>
                 <w:sz w:val="16"/>
               </w:rPr>
-              <w:t>XML sai, số biến [item], thiếu entity/include, trùng field.</w:t>
+              <w:t>XML sai, số biến [item], thiếu entity/include, trùng field. Kiểm tra chạy nền: tra entity theo CHÍNH file đang kiểm (bcodeEntity.resolveTop(name, path, text), file gốc truyền xuống tới lookupParamValue) — không theo "file đang mở" (Ctrl+Tab giữa chừng từng báo thiếu %X; giả); kết quả lượt đã bị thay không được nhớ.</w:t>
             </w:r>
           </w:p>
         </w:tc>
@@ -13037,7 +13189,7 @@
                 <w:b w:val="0"/>
                 <w:sz w:val="16"/>
               </w:rPr>
-              <w:t>Dựng form FormTable từ source; file dùng chung với Bcode.ScreenDesigner.</w:t>
+              <w:t>Dựng form FormTable từ source; file dùng chung với Bcode.ScreenDesigner. layoutSignature (DOCTYPE + &lt;fields&gt; bỏ CDATA + &lt;views&gt; + &lt;title&gt; + file): giống lần vẽ trước thì bỏ qua (sửa &lt;script&gt;/&lt;command&gt;... không dựng lại; ⟳ = ép vẽ). Lượt vẽ mang docPath/docText của chính file (tra entity, Grid kèm theo, khoá expMemo) — không theo file đang mở.</w:t>
             </w:r>
           </w:p>
         </w:tc>
@@ -13427,7 +13579,7 @@
                 <w:b/>
                 <w:sz w:val="16"/>
               </w:rPr>
-              <w:t>Hint Code, New from Template</w:t>
+              <w:t>Đo độ mượt (log long task)</w:t>
             </w:r>
           </w:p>
         </w:tc>
@@ -13445,7 +13597,7 @@
                 <w:b w:val="0"/>
                 <w:sz w:val="16"/>
               </w:rPr>
-              <w:t>Web/templates.js; Settings/HintSnippetStore.cs, FileTemplateStore.cs</w:t>
+              <w:t>Web/perfwatch.js; EditorBridge.NotifyPerfLog/OpenPerfLog; shell.js menu Help</w:t>
             </w:r>
           </w:p>
         </w:tc>
@@ -13463,6 +13615,7 @@
                 <w:b w:val="0"/>
                 <w:sz w:val="16"/>
               </w:rPr>
+              <w:t>Trang bị chặn &gt;= 100 ms → 1 dòng vào %AppData%\Bcode\viewer-perf.log (thời điểm, ms, file, việc vừa làm: đổi tab / gõ / việc nền / xem trước Dir / gợi ý..., trạng thái). Gắn nhãn bằng cách bọc hàm sau khi trang nạp (BcodePerf.wrap), không sửa logic file khác. File &gt; 2 MB đổi thành .old. Help → "Log độ mượt".</w:t>
             </w:r>
           </w:p>
         </w:tc>
@@ -13482,7 +13635,7 @@
                 <w:b/>
                 <w:sz w:val="16"/>
               </w:rPr>
-              <w:t>Theme (+ import VS Code .json/.vsix)</w:t>
+              <w:t>Hint Code, New from Template</w:t>
             </w:r>
           </w:p>
         </w:tc>
@@ -13500,7 +13653,7 @@
                 <w:b w:val="0"/>
                 <w:sz w:val="16"/>
               </w:rPr>
-              <w:t>UI/ThemeCatalog.cs, AppTheme.cs, VsCodeThemeImporter.cs; Web/theme.js</w:t>
+              <w:t>Web/templates.js; Settings/HintSnippetStore.cs, FileTemplateStore.cs</w:t>
             </w:r>
           </w:p>
         </w:tc>
@@ -13518,7 +13671,6 @@
                 <w:b w:val="0"/>
                 <w:sz w:val="16"/>
               </w:rPr>
-              <w:t>Một bảng màu dùng cho WinForms + Monaco + CSS.</w:t>
             </w:r>
           </w:p>
         </w:tc>
@@ -13538,7 +13690,7 @@
                 <w:b/>
                 <w:sz w:val="16"/>
               </w:rPr>
-              <w:t>Hộp thoại theo theme</w:t>
+              <w:t>Theme (+ import VS Code .json/.vsix)</w:t>
             </w:r>
           </w:p>
         </w:tc>
@@ -13556,7 +13708,7 @@
                 <w:b w:val="0"/>
                 <w:sz w:val="16"/>
               </w:rPr>
-              <w:t>Web/ui.js; EditorBridge.ResolveUiDialog</w:t>
+              <w:t>UI/ThemeCatalog.cs, AppTheme.cs, VsCodeThemeImporter.cs; Web/theme.js</w:t>
             </w:r>
           </w:p>
         </w:tc>
@@ -13574,7 +13726,7 @@
                 <w:b w:val="0"/>
                 <w:sz w:val="16"/>
               </w:rPr>
-              <w:t>Thay alert/confirm/MessageBox.</w:t>
+              <w:t>Một bảng màu dùng cho WinForms + Monaco + CSS.</w:t>
             </w:r>
           </w:p>
         </w:tc>
@@ -13594,7 +13746,7 @@
                 <w:b/>
                 <w:sz w:val="16"/>
               </w:rPr>
-              <w:t>Sidebar Claude/Gemini + đính kèm file</w:t>
+              <w:t>Hộp thoại theo theme</w:t>
             </w:r>
           </w:p>
         </w:tc>
@@ -13612,7 +13764,7 @@
                 <w:b w:val="0"/>
                 <w:sz w:val="16"/>
               </w:rPr>
-              <w:t>MainForm.cs; Shared/AiWebHelper.cs</w:t>
+              <w:t>Web/ui.js; EditorBridge.ResolveUiDialog</w:t>
             </w:r>
           </w:p>
         </w:tc>
@@ -13630,7 +13782,63 @@
                 <w:b w:val="0"/>
                 <w:sz w:val="16"/>
               </w:rPr>
-              <w:t>Trang web thật (profile riêng), không dùng API key.</w:t>
+              <w:t>Thay alert/confirm/MessageBox.</w:t>
+            </w:r>
+          </w:p>
+        </w:tc>
+      </w:tr>
+      <w:tr>
+        <w:tc>
+          <w:tcPr>
+            <w:tcW w:type="dxa" w:w="2041"/>
+          </w:tcPr>
+          <w:p>
+            <w:pPr>
+              <w:spacing w:after="20"/>
+            </w:pPr>
+            <w:r/>
+            <w:r>
+              <w:rPr>
+                <w:b/>
+                <w:sz w:val="16"/>
+              </w:rPr>
+              <w:t>Sidebar Claude/Gemini + đính kèm file</w:t>
+            </w:r>
+          </w:p>
+        </w:tc>
+        <w:tc>
+          <w:tcPr>
+            <w:tcW w:type="dxa" w:w="3969"/>
+          </w:tcPr>
+          <w:p>
+            <w:pPr>
+              <w:spacing w:after="20"/>
+            </w:pPr>
+            <w:r/>
+            <w:r>
+              <w:rPr>
+                <w:b w:val="0"/>
+                <w:sz w:val="16"/>
+              </w:rPr>
+              <w:t>MainForm.cs; Shared/AiWebHelper.cs</w:t>
+            </w:r>
+          </w:p>
+        </w:tc>
+        <w:tc>
+          <w:tcPr>
+            <w:tcW w:type="dxa" w:w="3855"/>
+          </w:tcPr>
+          <w:p>
+            <w:pPr>
+              <w:spacing w:after="20"/>
+            </w:pPr>
+            <w:r/>
+            <w:r>
+              <w:rPr>
+                <w:b w:val="0"/>
+                <w:sz w:val="16"/>
+              </w:rPr>
+              <w:t>Trang web thật (profile riêng), không dùng API key. Đóng khung = giải phóng (ReleaseAiViews); thu nhỏ Viewer khi khung đang mở = ẩn + TrySuspendAsync, mở lại tự thức (MainForm.OnResize/SleepAiViews).</w:t>
             </w:r>
           </w:p>
         </w:tc>
@@ -16064,7 +16272,7 @@
         <w:rPr>
           <w:sz w:val="19"/>
         </w:rPr>
-        <w:t>Menu bật từ trang WebView2 tự đóng do AppFocusChange — sửa ở WebMenu.Track (memory bcode-webmenu-focus-bug).</w:t>
+        <w:t>WebFrameHost (gộp nhiều trang vào 1 WebView2): khung được đánh dấu sẵn sàng (__frame-ready) lúc iframe load xong — với trang có Monaco (nạp bằng script động) việc này đến SAU tin "editor-ready" của chính trang; EdExec lúc đó rơi im lặng. RawSqlControl hoãn editor-ready tới _edPage.Ready (từng làm tab SQL mở object lần đầu trống nội dung khi bật MergeSqlBarEditor). Trang mới đặt trong WebFrameHost phải chờ khung sẵn sàng trước khi gửi lệnh.</w:t>
       </w:r>
     </w:p>
     <w:p>
@@ -16076,7 +16284,7 @@
         <w:rPr>
           <w:sz w:val="19"/>
         </w:rPr>
-        <w:t>Đừng đặt PacketSize &gt; 16383 (TLS) khi kết nối SQL (memory bcode-sql-connection-gotchas).</w:t>
+        <w:t>BcodeViewer KHÔNG nhận BCODE_DATA_DIR (BcodePaths.cs của Viewer chưa đồng bộ với Bcode) — chạy thử Viewer là ghi thẳng vào %AppData%\Bcode\viewer-*.json thật: sao lưu trước. Chạy 1 bản mỗi phiên Windows; đo / điều khiển trang bằng WEBVIEW2_ADDITIONAL_BROWSER_ARGUMENTS=--remote-debugging-port=9333 + CDP (Runtime.evaluate).</w:t>
       </w:r>
     </w:p>
     <w:p>
@@ -16088,7 +16296,7 @@
         <w:rPr>
           <w:sz w:val="19"/>
         </w:rPr>
-        <w:t>Mỗi tab SQL Query ≈ 4 WebView2 ~125 MB → đã gộp bằng WebFrameHost / ngủ đông (memory bcode-startup-ram-findings).</w:t>
+        <w:t>Menu bật từ trang WebView2 tự đóng do AppFocusChange — sửa ở WebMenu.Track (memory bcode-webmenu-focus-bug).</w:t>
       </w:r>
     </w:p>
     <w:p>
@@ -16100,7 +16308,7 @@
         <w:rPr>
           <w:sz w:val="19"/>
         </w:rPr>
-        <w:t>Bcode.ReportBuilder.dll: Release phải build bằng MSBuild.exe cổ điển (ConfuserEx), giữ renameArgs=false; sau đó build lại Bcode.App.</w:t>
+        <w:t>Đừng đặt PacketSize &gt; 16383 (TLS) khi kết nối SQL (memory bcode-sql-connection-gotchas).</w:t>
       </w:r>
     </w:p>
     <w:p>
@@ -16112,7 +16320,7 @@
         <w:rPr>
           <w:sz w:val="19"/>
         </w:rPr>
-        <w:t>File .f của FastBusiness là UTF-16 — ghi lại phải giữ encoding gốc.</w:t>
+        <w:t>Mỗi tab SQL Query ≈ 4 WebView2 ~125 MB → đã gộp bằng WebFrameHost / ngủ đông (memory bcode-startup-ram-findings).</w:t>
       </w:r>
     </w:p>
     <w:p>
@@ -16124,7 +16332,7 @@
         <w:rPr>
           <w:sz w:val="19"/>
         </w:rPr>
-        <w:t>Mọi nội dung trong Web/vs là bundle Monaco (vendor): không sửa, không đọc.</w:t>
+        <w:t>Bcode.ReportBuilder.dll: Release phải build bằng MSBuild.exe cổ điển (ConfuserEx), giữ renameArgs=false; sau đó build lại Bcode.App.</w:t>
       </w:r>
     </w:p>
     <w:p>
@@ -16136,7 +16344,7 @@
         <w:rPr>
           <w:sz w:val="19"/>
         </w:rPr>
-        <w:t>Code chưa gắn vào UI: Services/DecryptSqlObjectConfigService.cs; BcodeViewer UI/CodeHighlighter.cs; Controls/PillButton.cs (Bcode) và UI/PillButton.cs (Viewer) là helper nhỏ; Web/chat.js (chat panel) đã gỡ khỏi index.html.</w:t>
+        <w:t>File .f của FastBusiness là UTF-16 — ghi lại phải giữ encoding gốc.</w:t>
       </w:r>
     </w:p>
     <w:p>
@@ -16148,7 +16356,7 @@
         <w:rPr>
           <w:sz w:val="19"/>
         </w:rPr>
-        <w:t>Mobile (cột icon trái) mới là placeholder; Restore/Attach DB, Create Processing, View Rpt in FEC chưa làm.</w:t>
+        <w:t>Mọi nội dung trong Web/vs là bundle Monaco (vendor): không sửa, không đọc.</w:t>
       </w:r>
     </w:p>
     <w:p>
@@ -16160,7 +16368,7 @@
         <w:rPr>
           <w:sz w:val="19"/>
         </w:rPr>
-        <w:t>Chế độ App: KHÔNG dùng WS_EX_COMPOSITED cho ListBox tự vẽ (treo, "Error creating window handle"); KHÔNG vẽ chữ bằng TextRenderer lên BufferedGraphics.Allocate(g, bounds) (bỏ qua Transform → mất chữ) — dùng ảnh đệm ở gốc (0,0), Format24bppRgb, và TextRenderer.DrawText LUÔN truyền màu nền (không thì chữ tối trên nền sáng bị đặc/nhoè).</w:t>
+        <w:t>Code chưa gắn vào UI: Services/DecryptSqlObjectConfigService.cs; BcodeViewer UI/CodeHighlighter.cs; Controls/PillButton.cs (Bcode) và UI/PillButton.cs (Viewer) là helper nhỏ; Web/chat.js (chat panel) đã gỡ khỏi index.html.</w:t>
       </w:r>
     </w:p>
     <w:p>
@@ -16172,7 +16380,7 @@
         <w:rPr>
           <w:sz w:val="19"/>
         </w:rPr>
-        <w:t>Chế độ App: SplitContainer đặt Panel1MinSize/Panel2MinSize trong initializer ném lỗi (rộng mặc định 150) — đặt sau khi có kích thước. WrapLabel trong FlowLayoutPanel TopDown không có bề rộng → thành cột hẹp: xếp dọc bằng NK.Stack. Label mặc định ẩn dấu &amp; (UseMnemonic).</w:t>
+        <w:t>Restore/Attach DB, Create Processing, View Rpt in FEC chưa làm.</w:t>
       </w:r>
     </w:p>
     <w:p>
@@ -16184,7 +16392,7 @@
         <w:rPr>
           <w:sz w:val="19"/>
         </w:rPr>
-        <w:t>Bo góc: FlatToolStripRenderer.RoundedRect gặp 2×bán kính ≥ cạnh ngắn thì vẽ HÌNH CHỮ NHẬT → nút / ô thấp bị vuông góc ("viền vuông thừa"). Luôn chặn bán kính ≤ (cạnh ngắn − 1) / 2. Góc ngoài vùng bo phải lấy nền thật của cha (cha Transparent → góc giữ rác).</w:t>
+        <w:t>Chế độ App: KHÔNG dùng WS_EX_COMPOSITED cho ListBox tự vẽ (treo, "Error creating window handle"); KHÔNG vẽ chữ bằng TextRenderer lên BufferedGraphics.Allocate(g, bounds) (bỏ qua Transform → mất chữ) — dùng ảnh đệm ở gốc (0,0), Format24bppRgb, và TextRenderer.DrawText LUÔN truyền màu nền (không thì chữ tối trên nền sáng bị đặc/nhoè).</w:t>
       </w:r>
     </w:p>
     <w:p>
@@ -16196,7 +16404,43 @@
         <w:rPr>
           <w:sz w:val="19"/>
         </w:rPr>
+        <w:t>Chế độ App: SplitContainer đặt Panel1MinSize/Panel2MinSize trong initializer ném lỗi (rộng mặc định 150) — đặt sau khi có kích thước. WrapLabel trong FlowLayoutPanel TopDown không có bề rộng → thành cột hẹp: xếp dọc bằng NK.Stack. Label mặc định ẩn dấu &amp; (UseMnemonic).</w:t>
+      </w:r>
+    </w:p>
+    <w:p>
+      <w:pPr>
+        <w:pStyle w:val="ListBullet"/>
+        <w:spacing w:after="40"/>
+      </w:pPr>
+      <w:r>
+        <w:rPr>
+          <w:sz w:val="19"/>
+        </w:rPr>
+        <w:t>Bo góc: FlatToolStripRenderer.RoundedRect gặp 2×bán kính ≥ cạnh ngắn thì vẽ HÌNH CHỮ NHẬT → nút / ô thấp bị vuông góc ("viền vuông thừa"). Luôn chặn bán kính ≤ (cạnh ngắn − 1) / 2. Góc ngoài vùng bo phải lấy nền thật của cha (cha Transparent → góc giữ rác).</w:t>
+      </w:r>
+    </w:p>
+    <w:p>
+      <w:pPr>
+        <w:pStyle w:val="ListBullet"/>
+        <w:spacing w:after="40"/>
+      </w:pPr>
+      <w:r>
+        <w:rPr>
+          <w:sz w:val="19"/>
+        </w:rPr>
         <w:t>Scintilla.NET 5: không có Lexer.Container (ném lỗi) — tự tô bằng SCI_SETILEXER(null) + StyleNeeded; LexerName vẫn báo tên cũ sau khi gỡ.</w:t>
+      </w:r>
+    </w:p>
+    <w:p>
+      <w:pPr>
+        <w:pStyle w:val="ListBullet"/>
+        <w:spacing w:after="40"/>
+      </w:pPr>
+      <w:r>
+        <w:rPr>
+          <w:sz w:val="19"/>
+        </w:rPr>
+        <w:t>Write Schema → .rpt (RptSchemaService): SDK Crystal là .NET Framework nên chạy qua powershell.exe 5.1; script tạm phải ghi UTF-8 CÓ BOM (không BOM = đọc theo ANSI, hỏng tiếng Việt → lỗi cú pháp). Khoá kết nối ADO.NET (XML) là "File Path " (có dấu cách cuối). Đổi nguồn mà xsd mới thiếu cột report đang dùng thì Crystal âm thầm XOÁ ô / tham chiếu đó khỏi layout — form đã cảnh báo và sao lưu .rpt.bak.</w:t>
       </w:r>
     </w:p>
     <w:p>

</xml_diff>

<commit_message>
bcode| bo sung ai tao danh muc
</commit_message>
<xml_diff>
--- a/Cấu trúc Bcode  BcodeViewer (v3 - Tóm tắt).docx
+++ b/Cấu trúc Bcode  BcodeViewer (v3 - Tóm tắt).docx
@@ -2034,7 +2034,7 @@
           <w:rFonts w:ascii="Consolas" w:hAnsi="Consolas" w:eastAsia="Consolas"/>
           <w:sz w:val="13"/>
         </w:rPr>
-        <w:t>│   ├── FsgRequirementReportControl.cs  160</w:t>
+        <w:t>│   ├── FsgRequirementReportControl.cs  167</w:t>
       </w:r>
     </w:p>
     <w:p>
@@ -3414,7 +3414,7 @@
           <w:rFonts w:ascii="Consolas" w:hAnsi="Consolas" w:eastAsia="Consolas"/>
           <w:sz w:val="13"/>
         </w:rPr>
-        <w:t>│   ├── MainForm.cs  3484</w:t>
+        <w:t>│   ├── MainForm.cs  3492</w:t>
       </w:r>
     </w:p>
     <w:p>
@@ -3786,7 +3786,7 @@
           <w:rFonts w:ascii="Consolas" w:hAnsi="Consolas" w:eastAsia="Consolas"/>
           <w:sz w:val="13"/>
         </w:rPr>
-        <w:t>│   ├── AppSettings.cs  261</w:t>
+        <w:t>│   ├── AppSettings.cs  282</w:t>
       </w:r>
     </w:p>
     <w:p>
@@ -4158,7 +4158,7 @@
           <w:rFonts w:ascii="Consolas" w:hAnsi="Consolas" w:eastAsia="Consolas"/>
           <w:sz w:val="13"/>
         </w:rPr>
-        <w:t>│   ├── AiCatalogService.cs  431</w:t>
+        <w:t>│   ├── AiCatalogService.cs  434</w:t>
       </w:r>
     </w:p>
     <w:p>
@@ -4494,7 +4494,7 @@
           <w:rFonts w:ascii="Consolas" w:hAnsi="Consolas" w:eastAsia="Consolas"/>
           <w:sz w:val="13"/>
         </w:rPr>
-        <w:t>│   ├── FastCatalogRules.cs  448</w:t>
+        <w:t>│   ├── FastCatalogRules.cs  533</w:t>
       </w:r>
     </w:p>
     <w:p>
@@ -5874,7 +5874,7 @@
           <w:rFonts w:ascii="Consolas" w:hAnsi="Consolas" w:eastAsia="Consolas"/>
           <w:sz w:val="13"/>
         </w:rPr>
-        <w:t>│       ├── fsgreq.html  387</w:t>
+        <w:t>│       ├── fsgreq.html  401</w:t>
       </w:r>
     </w:p>
     <w:p>
@@ -6650,7 +6650,7 @@
           <w:rFonts w:ascii="Consolas" w:hAnsi="Consolas" w:eastAsia="Consolas"/>
           <w:sz w:val="13"/>
         </w:rPr>
-        <w:t>│   ├── CaptionTranslator.cs  195</w:t>
+        <w:t>│   ├── CaptionTranslator.cs  225</w:t>
       </w:r>
     </w:p>
     <w:p>
@@ -6674,7 +6674,7 @@
           <w:rFonts w:ascii="Consolas" w:hAnsi="Consolas" w:eastAsia="Consolas"/>
           <w:sz w:val="13"/>
         </w:rPr>
-        <w:t>│   ├── EditorBridge.cs  1407</w:t>
+        <w:t>│   ├── EditorBridge.cs  1427</w:t>
       </w:r>
     </w:p>
     <w:p>
@@ -6890,6 +6890,18 @@
           <w:rFonts w:ascii="Consolas" w:hAnsi="Consolas" w:eastAsia="Consolas"/>
           <w:sz w:val="13"/>
         </w:rPr>
+        <w:t>│   ├── TranslateDictionary.cs  370</w:t>
+      </w:r>
+    </w:p>
+    <w:p>
+      <w:pPr>
+        <w:spacing w:after="0" w:before="0" w:line="240" w:lineRule="auto"/>
+      </w:pPr>
+      <w:r>
+        <w:rPr>
+          <w:rFonts w:ascii="Consolas" w:hAnsi="Consolas" w:eastAsia="Consolas"/>
+          <w:sz w:val="13"/>
+        </w:rPr>
         <w:t>│   └── ViewerSettings.cs  181</w:t>
       </w:r>
     </w:p>
@@ -7070,7 +7082,7 @@
           <w:rFonts w:ascii="Consolas" w:hAnsi="Consolas" w:eastAsia="Consolas"/>
           <w:sz w:val="13"/>
         </w:rPr>
-        <w:t>│   ├── contextmenu.js  886</w:t>
+        <w:t>│   ├── contextmenu.js  1105</w:t>
       </w:r>
     </w:p>
     <w:p>
@@ -7214,7 +7226,7 @@
           <w:rFonts w:ascii="Consolas" w:hAnsi="Consolas" w:eastAsia="Consolas"/>
           <w:sz w:val="13"/>
         </w:rPr>
-        <w:t>│   ├── keys.js  204</w:t>
+        <w:t>│   ├── keys.js  205</w:t>
       </w:r>
     </w:p>
     <w:p>
@@ -7322,7 +7334,7 @@
           <w:rFonts w:ascii="Consolas" w:hAnsi="Consolas" w:eastAsia="Consolas"/>
           <w:sz w:val="13"/>
         </w:rPr>
-        <w:t>│   ├── shell.js  634</w:t>
+        <w:t>│   ├── shell.js  636</w:t>
       </w:r>
     </w:p>
     <w:p>
@@ -7430,7 +7442,7 @@
           <w:rFonts w:ascii="Consolas" w:hAnsi="Consolas" w:eastAsia="Consolas"/>
           <w:sz w:val="13"/>
         </w:rPr>
-        <w:t>├── BcodeViewer.App.csproj  48</w:t>
+        <w:t>├── BcodeViewer.App.csproj  50</w:t>
       </w:r>
     </w:p>
     <w:p>
@@ -10235,7 +10247,7 @@
                 <w:b w:val="0"/>
                 <w:sz w:val="16"/>
               </w:rPr>
-              <w:t>Note (New) → nút 🤖 AI tạo danh mục / Ctrl+Alt+I (note.aiCatalog, chỉ ở tab Note (New)). AI đọc Request Content (đã Sync từ nvphyc) + tên bảng / tên-kiểu cột App Data (không gửi dữ liệu dòng), trả JSON {loai, tom_tat, can_bang, cau_hoi, ghi_chu, spec}; spec = dạng JSON của trang quicklist.html (QuickListService.FromPageJson). can_bang = AI xin cột bảng → tự gửi rồi hỏi lại (≤3 lượt). Spec nạp như khôi phục cấu hình (aiLoad → loadColumns → applySaved); bảng AI đề xuất chưa có → cột lấy từ spec + script CREATE TABLE (CatalogCloneService.BuildTableScript, chỉ copy, không chạy). Câu hỏi trả lời ngay trong khung AI. Không ghi file/DB: người dùng bấm Tạo file như thường. Gọi Claude (ưu tiên) / Gemini qua AiChatService (dùng chung với Ctrl+I của SQL Query); lịch sử ở AiHistoryStore loại "Danh mục". Chưa có API key → FastCatalogRules (không AI, không token): đọc "danh mục X: cột, cột…" theo quy ước FBO (dm + chữ đầu các từ, ma_/ten_/ten_2, nh_xx1, ghi_chu, status, datetime0/2, user_id0/2), tra ngược tiêu đề → field (lookup thường dùng, HeaderDictionary.json, header.xml qua FieldDictionaryService.Entries), bảng dm.. có sẵn → cột thật, danh mục trùng tên trong Controllers\Dir → hỏi lại; trả JSON cùng dạng AI nên chuẩn hoá + giao diện dùng chung.</w:t>
+              <w:t>Note (New) hoặc khung chi tiết của Báo cáo yêu cầu FSG → nút 🤖 AI tạo danh mục / Ctrl+Alt+I (note.aiCatalog, chỉ ở 2 tab đó). AI đọc Request Content (đã Sync từ nvphyc) + tên bảng / tên-kiểu cột App Data (không gửi dữ liệu dòng), trả JSON {loai, tom_tat, can_bang, cau_hoi, ghi_chu, spec}; spec = dạng JSON của trang quicklist.html (QuickListService.FromPageJson). can_bang = AI xin cột bảng → tự gửi rồi hỏi lại (≤3 lượt). Spec nạp như khôi phục cấu hình (aiLoad → loadColumns → applySaved); bảng AI đề xuất chưa có → cột lấy từ spec + script CREATE TABLE (CatalogCloneService.BuildTableScript, chỉ copy, không chạy). Câu hỏi trả lời ngay trong khung AI. Không ghi file/DB: người dùng bấm Tạo file như thường. Gọi Claude (ưu tiên) / Gemini qua AiChatService (dùng chung với Ctrl+I của SQL Query); lịch sử ở AiHistoryStore loại "Danh mục". Chưa có API key → FastCatalogRules (không AI, không token): đọc "danh mục X: cột, cột…" theo quy ước FBO (bảng mới = tiền tố AppSettings.NewCatalogTablePrefix, mặc định zdm, + chữ đầu các từ; chi tiết = bảng + ct; AI prompt cũng dùng tiền tố này; ma_/ten_/ten_2, nh_xx1, ghi_chu, status, datetime0/2, user_id0/2), tra ngược tiêu đề → field (lookup thường dùng, HeaderDictionary.json, header.xml qua FieldDictionaryService.Entries), bảng dm.. có sẵn → cột thật, danh mục trùng tên trong Controllers\Dir → hỏi lại; trả JSON cùng dạng AI nên chuẩn hoá + giao diện dùng chung.</w:t>
             </w:r>
           </w:p>
         </w:tc>
@@ -10865,7 +10877,7 @@
                 <w:b w:val="0"/>
                 <w:sz w:val="16"/>
               </w:rPr>
-              <w:t>Bung web đăng nhập Workspace.LoginWLink, tự điền user/pass bằng JS injection.</w:t>
+              <w:t>Bung web đăng nhập Workspace.LoginWLink, tự điền user/pass bằng JS injection. Khung chi tiết y/c có nút 🤖 AI tạo danh mục (#dtAi, fsgReq.aiCatalog / Ctrl+Alt+I) → FsgRequirementReportControl.AiCatalogRequested → MainForm.OpenQuickListWithAi (như Note (New)).</w:t>
             </w:r>
           </w:p>
         </w:tc>
@@ -12617,7 +12629,7 @@
                 <w:b/>
                 <w:sz w:val="16"/>
               </w:rPr>
-              <w:t>Dịch caption v → e</w:t>
+              <w:t>Dịch caption v → e + Từ điển dịch</w:t>
             </w:r>
           </w:p>
         </w:tc>
@@ -12635,7 +12647,7 @@
                 <w:b w:val="0"/>
                 <w:sz w:val="16"/>
               </w:rPr>
-              <w:t>Host/CaptionTranslator.cs; EditorBridge.BeginTranslateCaptions</w:t>
+              <w:t>Host/CaptionTranslator.cs; Settings/TranslateDictionary.cs; EditorBridge.BeginTranslateCaptions/Begin*TranslateDict; Web/contextmenu.js (showTranslateHeaders, showTranslateDictionary)</w:t>
             </w:r>
           </w:p>
         </w:tc>
@@ -12653,7 +12665,7 @@
                 <w:b w:val="0"/>
                 <w:sz w:val="16"/>
               </w:rPr>
-              <w:t>Engine google (không key) / gemini / claude chọn ở Settings.</w:t>
+              <w:t>Engine google (không key) / gemini / claude chọn ở Settings. Sang English: tra Từ điển dịch TRƯỚC — viewer-translate-dict.json của người dùng thắng từ có sẵn (header.xml, HeaderDictionary.json link từ Bcode.App, quicklist-headers.json, Vocab/Abbr chép từ HeaderTranslator) — chỉ caption không có mới gửi engine. Khớp bỏ hoa/khoảng trắng/: cuối; bỏ dấu chỉ khi caption gõ không dấu; ghép cụm dài nhất + tiền tố Mã X → X Code. Hộp Từ điển dịch: menu Actions, phím tool.translateDict (keys.js, mặc định trống); nút Lưu vào từ điển trong hộp Dịch caption.</w:t>
             </w:r>
           </w:p>
         </w:tc>
@@ -14503,7 +14515,7 @@
                 <w:b w:val="0"/>
                 <w:sz w:val="17"/>
               </w:rPr>
-              <w:t>Note (New): AI tạo danh mục từ y/c đang chọn</w:t>
+              <w:t>Note (New) / Yêu cầu FSG: AI tạo danh mục từ y/c đang chọn</w:t>
             </w:r>
           </w:p>
         </w:tc>
@@ -15536,7 +15548,7 @@
                 <w:b w:val="0"/>
                 <w:sz w:val="16"/>
               </w:rPr>
-              <w:t>ViewerSettings, Hint Code, file gần đây, theme (cũng có thư mục viewer-themes, hint-cache, history).</w:t>
+              <w:t>ViewerSettings, Hint Code, file gần đây, theme (cũng có thư mục viewer-themes, hint-cache, history); viewer-translate-dict.json = Từ điển dịch Việt → Anh.</w:t>
             </w:r>
           </w:p>
         </w:tc>

</xml_diff>

<commit_message>
bo sung check yeu cau lien quan
</commit_message>
<xml_diff>
--- a/Cấu trúc Bcode  BcodeViewer (v3 - Tóm tắt).docx
+++ b/Cấu trúc Bcode  BcodeViewer (v3 - Tóm tắt).docx
@@ -2034,7 +2034,7 @@
           <w:rFonts w:ascii="Consolas" w:hAnsi="Consolas" w:eastAsia="Consolas"/>
           <w:sz w:val="13"/>
         </w:rPr>
-        <w:t>│   ├── FsgRequirementReportControl.cs  167</w:t>
+        <w:t>│   ├── FsgRequirementReportControl.cs  199</w:t>
       </w:r>
     </w:p>
     <w:p>
@@ -2982,7 +2982,7 @@
           <w:rFonts w:ascii="Consolas" w:hAnsi="Consolas" w:eastAsia="Consolas"/>
           <w:sz w:val="13"/>
         </w:rPr>
-        <w:t>│   ├── WCommandTreeControl.cs  814</w:t>
+        <w:t>│   ├── WCommandTreeControl.cs  833</w:t>
       </w:r>
     </w:p>
     <w:p>
@@ -3414,7 +3414,7 @@
           <w:rFonts w:ascii="Consolas" w:hAnsi="Consolas" w:eastAsia="Consolas"/>
           <w:sz w:val="13"/>
         </w:rPr>
-        <w:t>│   ├── MainForm.cs  3492</w:t>
+        <w:t>│   ├── MainForm.cs  3500</w:t>
       </w:r>
     </w:p>
     <w:p>
@@ -5322,7 +5322,7 @@
           <w:rFonts w:ascii="Consolas" w:hAnsi="Consolas" w:eastAsia="Consolas"/>
           <w:sz w:val="13"/>
         </w:rPr>
-        <w:t>│   ├── ShortcutRegistry.cs  321</w:t>
+        <w:t>│   ├── ShortcutRegistry.cs  322</w:t>
       </w:r>
     </w:p>
     <w:p>
@@ -5874,7 +5874,7 @@
           <w:rFonts w:ascii="Consolas" w:hAnsi="Consolas" w:eastAsia="Consolas"/>
           <w:sz w:val="13"/>
         </w:rPr>
-        <w:t>│       ├── fsgreq.html  401</w:t>
+        <w:t>│       ├── fsgreq.html  444</w:t>
       </w:r>
     </w:p>
     <w:p>
@@ -9799,7 +9799,7 @@
                 <w:b w:val="0"/>
                 <w:sz w:val="16"/>
               </w:rPr>
-              <w:t>New (Insert/F4), Edit F3, Delete F8, Gen Script Menu F12, Check WCommand, Refresh F5; Design = mở ScreenDesigner; Ctrl+F5 chạy menu. Ô (C) trên thanh lọc (cả cây Mobile) = chỉ hiện menu customize (tên có (C) / (*)) kèm menu cha — WCommandService.FilterCustom, lọc trên bản sao. Chuột phải "Menu Name: Bar2 / Bar" (phím wcommand.menuName) = đổi tên hiển thị tiếng Việt ↔ tiếng Anh cho cả cây WCommand và Mobile, nhớ ở %AppData%\Bcode\menu_name_bar2.txt.</w:t>
+              <w:t>New (Insert/F4), Edit F3, Delete F8, Gen Script Menu F12, Check WCommand, Refresh F5; Design = mở ScreenDesigner; Ctrl+F5 chạy menu. Ô (C) trên thanh lọc (cả cây Mobile) = chỉ hiện menu customize (tên có (C) / (*)) kèm menu cha — WCommandService.FilterCustom, lọc trên bản sao. Chuột phải "Menu Name: Bar2 / Bar" (phím wcommand.menuName) = đổi tên hiển thị tiếng Việt ↔ tiếng Anh cho cả cây WCommand và Mobile, nhớ ở %AppData%\Bcode\menu_name_bar2.txt. Chuột phải "Yêu cầu liên quan (QLYC)…" (phím wcommand.requirements, mặc định trống; không có ở cây Mobile) → RequirementsRequested(MenuQuery: wmenu_id, Bar/Bar2, id menu con + menu cha) → MainForm.OpenFsgRequirementReportTab(menu) → tab Yêu cầu FSG lọc theo menu.</w:t>
             </w:r>
           </w:p>
         </w:tc>
@@ -10877,7 +10877,7 @@
                 <w:b w:val="0"/>
                 <w:sz w:val="16"/>
               </w:rPr>
-              <w:t>Bung web đăng nhập Workspace.LoginWLink, tự điền user/pass bằng JS injection. Khung chi tiết y/c có nút 🤖 AI tạo danh mục (#dtAi, fsgReq.aiCatalog / Ctrl+Alt+I) → FsgRequirementReportControl.AiCatalogRequested → MainForm.OpenQuickListWithAi (như Note (New)).</w:t>
+              <w:t>Bung web đăng nhập Workspace.LoginWLink, tự điền user/pass bằng JS injection. Khung chi tiết y/c có nút 🤖 AI tạo danh mục (#dtAi, fsgReq.aiCatalog / Ctrl+Alt+I) → FsgRequirementReportControl.AiCatalogRequested → MainForm.OpenQuickListWithAi (như Note (New)). Lọc theo menu (chuột phải cây WCommand → ShowForMenu, chờ _web.IsReady → fsgReq.menuFilter): menuWhy trong fsgreq.html — y/c cùng ma_da (= Project ID) và 1) menu_id = wmenu_id, 2) menu_id của menu con, 3) ten_menu_ngan = Bar/Bar2 (bỏ hoa/dấu/(C)/(*)), 4) nội dung chứa trọn tên menu khi y/c gắn menu chung xx.00.00 / menu cha hoặc trên dòng "Đường dẫn:". Dữ liệu từ fsg-requirements.json; dự án chưa có thì kéo ngầm (keepFilters: không đổi ô lọc đã lưu; 0 y/c → lưu mục rỗng).</w:t>
             </w:r>
           </w:p>
         </w:tc>

</xml_diff>

<commit_message>
bcode| bo sung f12 biến @
</commit_message>
<xml_diff>
--- a/Cấu trúc Bcode  BcodeViewer (v3 - Tóm tắt).docx
+++ b/Cấu trúc Bcode  BcodeViewer (v3 - Tóm tắt).docx
@@ -2646,7 +2646,7 @@
           <w:rFonts w:ascii="Consolas" w:hAnsi="Consolas" w:eastAsia="Consolas"/>
           <w:sz w:val="13"/>
         </w:rPr>
-        <w:t>│   ├── NativeSqlControl.cs  849</w:t>
+        <w:t>│   ├── NativeSqlControl.cs  1763</w:t>
       </w:r>
     </w:p>
     <w:p>
@@ -2850,6 +2850,18 @@
           <w:rFonts w:ascii="Consolas" w:hAnsi="Consolas" w:eastAsia="Consolas"/>
           <w:sz w:val="13"/>
         </w:rPr>
+        <w:t>│   ├── SqlPeekPanel.cs  100</w:t>
+      </w:r>
+    </w:p>
+    <w:p>
+      <w:pPr>
+        <w:spacing w:after="0" w:before="0" w:line="240" w:lineRule="auto"/>
+      </w:pPr>
+      <w:r>
+        <w:rPr>
+          <w:rFonts w:ascii="Consolas" w:hAnsi="Consolas" w:eastAsia="Consolas"/>
+          <w:sz w:val="13"/>
+        </w:rPr>
         <w:t>│   ├── SqlProfilerControl.cs  1565</w:t>
       </w:r>
     </w:p>
@@ -3606,6 +3618,18 @@
           <w:rFonts w:ascii="Consolas" w:hAnsi="Consolas" w:eastAsia="Consolas"/>
           <w:sz w:val="13"/>
         </w:rPr>
+        <w:t>│   ├── SqlAiEditForm.cs  107</w:t>
+      </w:r>
+    </w:p>
+    <w:p>
+      <w:pPr>
+        <w:spacing w:after="0" w:before="0" w:line="240" w:lineRule="auto"/>
+      </w:pPr>
+      <w:r>
+        <w:rPr>
+          <w:rFonts w:ascii="Consolas" w:hAnsi="Consolas" w:eastAsia="Consolas"/>
+          <w:sz w:val="13"/>
+        </w:rPr>
         <w:t>│   ├── SqlHistoryForm.cs  329</w:t>
       </w:r>
     </w:p>
@@ -3786,7 +3810,7 @@
           <w:rFonts w:ascii="Consolas" w:hAnsi="Consolas" w:eastAsia="Consolas"/>
           <w:sz w:val="13"/>
         </w:rPr>
-        <w:t>│   ├── AppSettings.cs  282</w:t>
+        <w:t>│   ├── AppSettings.cs  285</w:t>
       </w:r>
     </w:p>
     <w:p>
@@ -4915,6 +4939,18 @@
           <w:sz w:val="13"/>
         </w:rPr>
         <w:t>│   ├── SourceIndexService.cs  262</w:t>
+      </w:r>
+    </w:p>
+    <w:p>
+      <w:pPr>
+        <w:spacing w:after="0" w:before="0" w:line="240" w:lineRule="auto"/>
+      </w:pPr>
+      <w:r>
+        <w:rPr>
+          <w:rFonts w:ascii="Consolas" w:hAnsi="Consolas" w:eastAsia="Consolas"/>
+          <w:sz w:val="13"/>
+        </w:rPr>
+        <w:t>│   ├── SqlAiAssist.cs  349</w:t>
       </w:r>
     </w:p>
     <w:p>
@@ -11972,7 +12008,7 @@
                 <w:b w:val="0"/>
                 <w:sz w:val="16"/>
               </w:rPr>
-              <w:t>Controls/NativeSqlControl.cs + NativeResultPane.cs + NativeSqlHints.cs + SqlScintilla.cs; NativeLookupControl, NativeCommandPanel, NativeTableBar + NativeStructPanel, NativeAdvanceNoteControl, NativeCheckMailControl, NativeWeeklyMailControl, NativeCompareObjectsControl, NativeQueryHistoryControl, NativeStringBeautyControl; MonacoPreviewControl.Native.cs; NativeFindBar.cs</w:t>
+              <w:t>Controls/NativeSqlControl.cs + NativeResultPane.cs + NativeSqlHints.cs + SqlScintilla.cs + SqlPeekPanel.cs; Services/SqlAiAssist.cs; Forms/SqlAiEditForm.cs; NativeLookupControl, NativeCommandPanel, NativeTableBar + NativeStructPanel, NativeAdvanceNoteControl, NativeCheckMailControl, NativeWeeklyMailControl, NativeCompareObjectsControl, NativeQueryHistoryControl, NativeStringBeautyControl; MonacoPreviewControl.Native.cs; NativeFindBar.cs</w:t>
             </w:r>
           </w:p>
         </w:tc>
@@ -11990,7 +12026,7 @@
                 <w:b w:val="0"/>
                 <w:sz w:val="16"/>
               </w:rPr>
-              <w:t>MainForm chọn theo UiMode.IsNative. SQL Query: Scintilla; kết quả 2 kiểu Xếp chồng (kéo đổi cao từng bảng) / Từng tab như resultview.html; tab Pivot = trang sqlpivot.html (WebView tạo khi bấm Pivot, nhận diện bằng PivotDetector.DetectForScript); Ctrl+chuột phải chèn định nghĩa object lên đầu + GO. Note (New) (NativeAdvanceNoteControl) đủ như advnote.html: tick-tất-cả ở tiêu đề danh sách, gợi ý tên table (SuggestPopup, khớp đầu trước/chứa sau), Mở tất cả script, xem nội dung mục gói có tô màu SQL/FCode, Request Content tô như richreq.js, nhớ "Tách theo từng y/c" (AppSettings.NoteSplit). Còn thiếu so với Web: peek F12, AI Ctrl+I/ghost, tuỳ biến thanh nút, Debug từng bước.</w:t>
+              <w:t>MainForm chọn theo UiMode.IsNative. SQL Query: Scintilla; kết quả 2 kiểu Xếp chồng (kéo đổi cao từng bảng) / Từng tab như resultview.html; tab Pivot = trang sqlpivot.html (WebView tạo khi bấm Pivot, nhận diện bằng PivotDetector.DetectForScript); Ctrl+chuột phải chèn định nghĩa object lên đầu + GO. Note (New) (NativeAdvanceNoteControl) đủ như advnote.html: tick-tất-cả ở tiêu đề danh sách, gợi ý tên table (SuggestPopup, khớp đầu trước/chứa sau), Mở tất cả script, xem nội dung mục gói có tô màu SQL/FCode, Request Content tô như richreq.js, nhớ "Tách theo từng y/c" (AppSettings.NoteSplit). Tab SQL Query native đã ngang Web: Debug từng bước (StepPlan của SqlStepPlanner, breakpoint = marker Scintilla ở lề 1, dòng sắp chạy = marker nền + mũi tên, thanh Step/Continue/To cursor/Stop; F10, Ctrl+F10, Shift+F5), AI Ctrl+I (SqlAiEditForm) + ghost-text (SqlAiAssist dùng chung prompt/engine với Web; hiện thành annotation chữ xám dưới dòng con trỏ, Tab nhận, Esc bỏ, Alt+\ gọi tay, tự gợi ý ở procedure/function), F12 peek (SqlPeekPanel: F12 xem tiếp, Ctrl+F12 mở tab, Esc lùi), thanh nút tuỳ biến (RebuildBar đọc SqlBarLayout — chung file sqlbar_layout.json với Web, “Tùy chỉnh thanh…” dùng QuickAccessForm), Check Fields, kéo thả file .sql vào editor, cỡ chữ lưu chung (AppSettings.SqlEditorZoom). Gợi ý cột theo ngữ cảnh có sẵn từ NativeSqlHints (chạy sqlhints.js). Khác Web chủ ý: không có ghost chèn giữa dòng (Scintilla không hỗ trợ).</w:t>
             </w:r>
           </w:p>
         </w:tc>

</xml_diff>

<commit_message>
fix ai goi y
</commit_message>
<xml_diff>
--- a/Cấu trúc Bcode  BcodeViewer (v3 - Tóm tắt).docx
+++ b/Cấu trúc Bcode  BcodeViewer (v3 - Tóm tắt).docx
@@ -2646,7 +2646,7 @@
           <w:rFonts w:ascii="Consolas" w:hAnsi="Consolas" w:eastAsia="Consolas"/>
           <w:sz w:val="13"/>
         </w:rPr>
-        <w:t>│   ├── NativeSqlControl.cs  1763</w:t>
+        <w:t>│   ├── NativeSqlControl.cs  1859</w:t>
       </w:r>
     </w:p>
     <w:p>
@@ -2766,7 +2766,7 @@
           <w:rFonts w:ascii="Consolas" w:hAnsi="Consolas" w:eastAsia="Consolas"/>
           <w:sz w:val="13"/>
         </w:rPr>
-        <w:t>│   ├── RawSqlControl.cs  2451</w:t>
+        <w:t>│   ├── RawSqlControl.cs  2456</w:t>
       </w:r>
     </w:p>
     <w:p>
@@ -2850,7 +2850,7 @@
           <w:rFonts w:ascii="Consolas" w:hAnsi="Consolas" w:eastAsia="Consolas"/>
           <w:sz w:val="13"/>
         </w:rPr>
-        <w:t>│   ├── SqlPeekPanel.cs  100</w:t>
+        <w:t>│   ├── SqlPeekPanel.cs  128</w:t>
       </w:r>
     </w:p>
     <w:p>
@@ -4182,7 +4182,7 @@
           <w:rFonts w:ascii="Consolas" w:hAnsi="Consolas" w:eastAsia="Consolas"/>
           <w:sz w:val="13"/>
         </w:rPr>
-        <w:t>│   ├── AiCatalogService.cs  434</w:t>
+        <w:t>│   ├── AiCatalogService.cs  449</w:t>
       </w:r>
     </w:p>
     <w:p>
@@ -4518,7 +4518,7 @@
           <w:rFonts w:ascii="Consolas" w:hAnsi="Consolas" w:eastAsia="Consolas"/>
           <w:sz w:val="13"/>
         </w:rPr>
-        <w:t>│   ├── FastCatalogRules.cs  533</w:t>
+        <w:t>│   ├── FastCatalogRules.cs  814</w:t>
       </w:r>
     </w:p>
     <w:p>
@@ -5358,7 +5358,7 @@
           <w:rFonts w:ascii="Consolas" w:hAnsi="Consolas" w:eastAsia="Consolas"/>
           <w:sz w:val="13"/>
         </w:rPr>
-        <w:t>│   ├── ShortcutRegistry.cs  322</w:t>
+        <w:t>│   ├── ShortcutRegistry.cs  324</w:t>
       </w:r>
     </w:p>
     <w:p>
@@ -6222,7 +6222,7 @@
           <w:rFonts w:ascii="Consolas" w:hAnsi="Consolas" w:eastAsia="Consolas"/>
           <w:sz w:val="13"/>
         </w:rPr>
-        <w:t>│       ├── sqleditor.html  1474</w:t>
+        <w:t>│       ├── sqleditor.html  1516</w:t>
       </w:r>
     </w:p>
     <w:p>
@@ -10283,7 +10283,7 @@
                 <w:b w:val="0"/>
                 <w:sz w:val="16"/>
               </w:rPr>
-              <w:t>Note (New) hoặc khung chi tiết của Báo cáo yêu cầu FSG → nút 🤖 AI tạo danh mục / Ctrl+Alt+I (note.aiCatalog, chỉ ở 2 tab đó). AI đọc Request Content (đã Sync từ nvphyc) + tên bảng / tên-kiểu cột App Data (không gửi dữ liệu dòng), trả JSON {loai, tom_tat, can_bang, cau_hoi, ghi_chu, spec}; spec = dạng JSON của trang quicklist.html (QuickListService.FromPageJson). can_bang = AI xin cột bảng → tự gửi rồi hỏi lại (≤3 lượt). Spec nạp như khôi phục cấu hình (aiLoad → loadColumns → applySaved); bảng AI đề xuất chưa có → cột lấy từ spec + script CREATE TABLE (CatalogCloneService.BuildTableScript, chỉ copy, không chạy). Câu hỏi trả lời ngay trong khung AI. Không ghi file/DB: người dùng bấm Tạo file như thường. Gọi Claude (ưu tiên) / Gemini qua AiChatService (dùng chung với Ctrl+I của SQL Query); lịch sử ở AiHistoryStore loại "Danh mục". Chưa có API key → FastCatalogRules (không AI, không token): đọc "danh mục X: cột, cột…" theo quy ước FBO (bảng mới = tiền tố AppSettings.NewCatalogTablePrefix, mặc định zdm, + chữ đầu các từ; chi tiết = bảng + ct; AI prompt cũng dùng tiền tố này; ma_/ten_/ten_2, nh_xx1, ghi_chu, status, datetime0/2, user_id0/2), tra ngược tiêu đề → field (lookup thường dùng, HeaderDictionary.json, header.xml qua FieldDictionaryService.Entries), bảng dm.. có sẵn → cột thật, danh mục trùng tên trong Controllers\Dir → hỏi lại; trả JSON cùng dạng AI nên chuẩn hoá + giao diện dùng chung.</w:t>
+              <w:t>Note (New) hoặc khung chi tiết của Báo cáo yêu cầu FSG → nút 🤖 AI tạo danh mục / Ctrl+Alt+I (note.aiCatalog, chỉ ở 2 tab đó). AI đọc Request Content (đã Sync từ nvphyc) + tên bảng / tên-kiểu cột App Data (không gửi dữ liệu dòng), trả JSON {loai, tom_tat, can_bang, cau_hoi, ghi_chu, spec}; spec = dạng JSON của trang quicklist.html (QuickListService.FromPageJson). can_bang = AI xin cột bảng → tự gửi rồi hỏi lại (≤3 lượt). Spec nạp như khôi phục cấu hình (aiLoad → loadColumns → applySaved); bảng AI đề xuất chưa có → cột lấy từ spec + script CREATE TABLE (CatalogCloneService.BuildTableScript, chỉ copy, không chạy). Câu hỏi trả lời ngay trong khung AI. Không ghi file/DB: người dùng bấm Tạo file như thường. Gọi Claude (ưu tiên) / Gemini qua AiChatService (dùng chung với Ctrl+I của SQL Query); lịch sử ở AiHistoryStore loại "Danh mục". Chưa có API key → FastCatalogRules (không AI, không token): đọc "danh mục X: cột, cột…" theo quy ước FBO (bảng mới = tiền tố AppSettings.NewCatalogTablePrefix, mặc định zdm, + chữ đầu các từ; chi tiết = bảng + ct; AI prompt cũng dùng tiền tố này; ma_/ten_/ten_2, nh_xx1, ghi_chu, status, datetime0/2, user_id0/2), tra ngược tiêu đề → field (lookup thường dùng, HeaderDictionary.json, header.xml qua FieldDictionaryService.Entries), bảng dm.. có sẵn → cột thật, danh mục trùng tên trong Controllers\Dir → hỏi lại; trả JSON cùng dạng AI nên chuẩn hoá + giao diện dùng chung. Màn khai báo số liệu (menu mới "Cập nhật dự toán", không phải "Danh mục …"): FastCatalogRules.DataScreenAsync — bảng = tiền tố bỏ dm + tên menu (zdutoan), không mã-tên/Lookup, khoá = cột chiều (bỏ cột "không bắt buộc") + hỏi xác nhận, "theo 12 tháng/mỗi tháng" → 12 cột/chỉ tiêu (MonthBase: ns_dt01..12) hoặc lưới theo tháng; cụm "Lookup từ Danh mục X" bị che khi tìm tên màn, X tra qua ResolveLookupNoun (lookup thường dùng → header.xml "X 1" → danh mục trong source); kiểu theo mô tả (tiền/SL/giá numeric(19,4), nam/lần int, bắt buộc → NOT NULL), cột lookup lấy kiểu cột mã bảng nguồn. LookupHints gửi kèm prompt AI (mục LOOKUP CHUẨN); prompt AI có phần DATA-ENTRY SCREENS (@@DATAPREFIX@@).</w:t>
             </w:r>
           </w:p>
         </w:tc>

</xml_diff>

<commit_message>
bcode| bo sung ctrl + 4 mo fsg fbo nhanh, fix ux ui qlyc
</commit_message>
<xml_diff>
--- a/Cấu trúc Bcode  BcodeViewer (v3 - Tóm tắt).docx
+++ b/Cấu trúc Bcode  BcodeViewer (v3 - Tóm tắt).docx
@@ -3426,7 +3426,7 @@
           <w:rFonts w:ascii="Consolas" w:hAnsi="Consolas" w:eastAsia="Consolas"/>
           <w:sz w:val="13"/>
         </w:rPr>
-        <w:t>│   ├── MainForm.cs  3500</w:t>
+        <w:t>│   ├── MainForm.cs  3504</w:t>
       </w:r>
     </w:p>
     <w:p>
@@ -5910,7 +5910,7 @@
           <w:rFonts w:ascii="Consolas" w:hAnsi="Consolas" w:eastAsia="Consolas"/>
           <w:sz w:val="13"/>
         </w:rPr>
-        <w:t>│       ├── fsgreq.html  444</w:t>
+        <w:t>│       ├── fsgreq.html  714</w:t>
       </w:r>
     </w:p>
     <w:p>
@@ -7678,7 +7678,7 @@
           <w:rFonts w:ascii="Consolas" w:hAnsi="Consolas" w:eastAsia="Consolas"/>
           <w:sz w:val="13"/>
         </w:rPr>
-        <w:t>├── Bcode.ScreenDesigner.csproj  34</w:t>
+        <w:t>├── Bcode.ScreenDesigner.csproj  41</w:t>
       </w:r>
     </w:p>
     <w:p>
@@ -7714,7 +7714,7 @@
           <w:rFonts w:ascii="Consolas" w:hAnsi="Consolas" w:eastAsia="Consolas"/>
           <w:sz w:val="13"/>
         </w:rPr>
-        <w:t>└── Program.cs  21</w:t>
+        <w:t>└── Program.cs  28</w:t>
       </w:r>
     </w:p>
     <w:p>
@@ -8066,7 +8066,7 @@
           <w:rFonts w:ascii="Consolas" w:hAnsi="Consolas" w:eastAsia="Consolas"/>
           <w:sz w:val="13"/>
         </w:rPr>
-        <w:t>└── Program.cs  94</w:t>
+        <w:t>└── Program.cs  90</w:t>
       </w:r>
     </w:p>
     <w:p>
@@ -8110,7 +8110,7 @@
           <w:rFonts w:ascii="Consolas" w:hAnsi="Consolas" w:eastAsia="Consolas"/>
           <w:sz w:val="13"/>
         </w:rPr>
-        <w:t>└── LicenseCodec.cs  99</w:t>
+        <w:t>└── LicenseCodec.cs  93</w:t>
       </w:r>
     </w:p>
     <w:p>
@@ -8498,7 +8498,7 @@
                 <w:b w:val="0"/>
                 <w:sz w:val="16"/>
               </w:rPr>
-              <w:t>Mở khoá Decrypt SQL Object, Create RPT &amp; XML, Excel → FRX, Tạo báo cáo (MainForm.RequireLicense). Mã máy = TÊN_MÁY|G-MachineGuid (HKLM\SOFTWARE\Microsoft\Cryptography), không đọc được thì U-UUID bo mạch (SMBIOS qua GetSystemFirmwareTable) — đi theo máy, đổi mạng không mất key (LicenseService.HardwareIds); Check khớp định danh phần cứng HOẶC mọi IPv4 nên key cũ cấp theo IP vẫn dùng được. KeyGen hiện loại định danh (LicenseCodec.DescribeMachineId), mã từ Bcode cũ (IP) thì nhắc cập nhật.</w:t>
+              <w:t>Mở khoá Decrypt SQL Object, Create RPT &amp; XML, Excel → FRX, Tạo báo cáo, Báo cáo yêu cầu FSG, Thiết kế màn hình, Khai báo API, Tạo cấu trúc API, Tạo nhanh danh mục (cả AI tạo danh mục), Clone danh mục — gọi MainForm.RequireLicense ở điểm vào (OpenQuickList, LaunchScreenDesigner, OpenFsgRequirementReportTab, _toolSpecs api_config / api_schema_builder / catalog_clone). Mã máy = TÊN_MÁY|G-MachineGuid (HKLM\SOFTWARE\Microsoft\Cryptography), không đọc được thì U-UUID bo mạch (SMBIOS qua GetSystemFirmwareTable) — đi theo máy, đổi mạng không mất key (LicenseService.HardwareIds); Check khớp định danh phần cứng HOẶC mọi IPv4 nên key cũ cấp theo IP vẫn dùng được. KeyGen hiện loại định danh (LicenseCodec.DescribeMachineId), mã từ Bcode cũ (IP) thì nhắc cập nhật.</w:t>
             </w:r>
           </w:p>
         </w:tc>

</xml_diff>

<commit_message>
bcode| bo sung tên menu khi lọc bảng, bổ sung check partition structure khi chuột phải vào tên bảng
</commit_message>
<xml_diff>
--- a/Cấu trúc Bcode  BcodeViewer (v3 - Tóm tắt).docx
+++ b/Cấu trúc Bcode  BcodeViewer (v3 - Tóm tắt).docx
@@ -2538,6 +2538,18 @@
           <w:rFonts w:ascii="Consolas" w:hAnsi="Consolas" w:eastAsia="Consolas"/>
           <w:sz w:val="13"/>
         </w:rPr>
+        <w:t>│   ├── NativePages.PartitionCheck.cs  43</w:t>
+      </w:r>
+    </w:p>
+    <w:p>
+      <w:pPr>
+        <w:spacing w:after="0" w:before="0" w:line="240" w:lineRule="auto"/>
+      </w:pPr>
+      <w:r>
+        <w:rPr>
+          <w:rFonts w:ascii="Consolas" w:hAnsi="Consolas" w:eastAsia="Consolas"/>
+          <w:sz w:val="13"/>
+        </w:rPr>
         <w:t>│   ├── NativePages.Profiler.cs  78</w:t>
       </w:r>
     </w:p>
@@ -2562,7 +2574,7 @@
           <w:rFonts w:ascii="Consolas" w:hAnsi="Consolas" w:eastAsia="Consolas"/>
           <w:sz w:val="13"/>
         </w:rPr>
-        <w:t>│   ├── NativePages.Register.cs  50</w:t>
+        <w:t>│   ├── NativePages.Register.cs  51</w:t>
       </w:r>
     </w:p>
     <w:p>
@@ -2694,7 +2706,7 @@
           <w:rFonts w:ascii="Consolas" w:hAnsi="Consolas" w:eastAsia="Consolas"/>
           <w:sz w:val="13"/>
         </w:rPr>
-        <w:t>│   ├── NativeTableBar.cs  163</w:t>
+        <w:t>│   ├── NativeTableBar.cs  228</w:t>
       </w:r>
     </w:p>
     <w:p>
@@ -2862,7 +2874,7 @@
           <w:rFonts w:ascii="Consolas" w:hAnsi="Consolas" w:eastAsia="Consolas"/>
           <w:sz w:val="13"/>
         </w:rPr>
-        <w:t>│   ├── SqlProfilerControl.cs  1565</w:t>
+        <w:t>│   ├── SqlProfilerControl.cs  1657</w:t>
       </w:r>
     </w:p>
     <w:p>
@@ -2958,7 +2970,7 @@
           <w:rFonts w:ascii="Consolas" w:hAnsi="Consolas" w:eastAsia="Consolas"/>
           <w:sz w:val="13"/>
         </w:rPr>
-        <w:t>│   ├── TableEditControl.cs  1896</w:t>
+        <w:t>│   ├── TableEditControl.cs  1976</w:t>
       </w:r>
     </w:p>
     <w:p>
@@ -2994,7 +3006,7 @@
           <w:rFonts w:ascii="Consolas" w:hAnsi="Consolas" w:eastAsia="Consolas"/>
           <w:sz w:val="13"/>
         </w:rPr>
-        <w:t>│   ├── WCommandTreeControl.cs  833</w:t>
+        <w:t>│   ├── WCommandTreeControl.cs  901</w:t>
       </w:r>
     </w:p>
     <w:p>
@@ -3426,7 +3438,7 @@
           <w:rFonts w:ascii="Consolas" w:hAnsi="Consolas" w:eastAsia="Consolas"/>
           <w:sz w:val="13"/>
         </w:rPr>
-        <w:t>│   ├── MainForm.cs  3504</w:t>
+        <w:t>│   ├── MainForm.cs  3604</w:t>
       </w:r>
     </w:p>
     <w:p>
@@ -3450,7 +3462,7 @@
           <w:rFonts w:ascii="Consolas" w:hAnsi="Consolas" w:eastAsia="Consolas"/>
           <w:sz w:val="13"/>
         </w:rPr>
-        <w:t>│   ├── MainForm.Session.cs  373</w:t>
+        <w:t>│   ├── MainForm.Session.cs  374</w:t>
       </w:r>
     </w:p>
     <w:p>
@@ -3486,6 +3498,18 @@
           <w:rFonts w:ascii="Consolas" w:hAnsi="Consolas" w:eastAsia="Consolas"/>
           <w:sz w:val="13"/>
         </w:rPr>
+        <w:t>│   ├── PartitionCheckForm.cs  58</w:t>
+      </w:r>
+    </w:p>
+    <w:p>
+      <w:pPr>
+        <w:spacing w:after="0" w:before="0" w:line="240" w:lineRule="auto"/>
+      </w:pPr>
+      <w:r>
+        <w:rPr>
+          <w:rFonts w:ascii="Consolas" w:hAnsi="Consolas" w:eastAsia="Consolas"/>
+          <w:sz w:val="13"/>
+        </w:rPr>
         <w:t>│   ├── ProjectActions.cs  52</w:t>
       </w:r>
     </w:p>
@@ -3522,7 +3546,7 @@
           <w:rFonts w:ascii="Consolas" w:hAnsi="Consolas" w:eastAsia="Consolas"/>
           <w:sz w:val="13"/>
         </w:rPr>
-        <w:t>│   ├── QuickLaunchLoginForm.cs  509</w:t>
+        <w:t>│   ├── QuickLaunchLoginForm.cs  541</w:t>
       </w:r>
     </w:p>
     <w:p>
@@ -5106,7 +5130,19 @@
           <w:rFonts w:ascii="Consolas" w:hAnsi="Consolas" w:eastAsia="Consolas"/>
           <w:sz w:val="13"/>
         </w:rPr>
-        <w:t>│   ├── TableDataService.cs  449</w:t>
+        <w:t>│   ├── TableDataService.cs  511</w:t>
+      </w:r>
+    </w:p>
+    <w:p>
+      <w:pPr>
+        <w:spacing w:after="0" w:before="0" w:line="240" w:lineRule="auto"/>
+      </w:pPr>
+      <w:r>
+        <w:rPr>
+          <w:rFonts w:ascii="Consolas" w:hAnsi="Consolas" w:eastAsia="Consolas"/>
+          <w:sz w:val="13"/>
+        </w:rPr>
+        <w:t>│   ├── TableMenuService.cs  191</w:t>
       </w:r>
     </w:p>
     <w:p>
@@ -5142,7 +5178,7 @@
           <w:rFonts w:ascii="Consolas" w:hAnsi="Consolas" w:eastAsia="Consolas"/>
           <w:sz w:val="13"/>
         </w:rPr>
-        <w:t>│   ├── WCommandService.cs  811</w:t>
+        <w:t>│   ├── WCommandService.cs  812</w:t>
       </w:r>
     </w:p>
     <w:p>
@@ -5358,7 +5394,7 @@
           <w:rFonts w:ascii="Consolas" w:hAnsi="Consolas" w:eastAsia="Consolas"/>
           <w:sz w:val="13"/>
         </w:rPr>
-        <w:t>│   ├── ShortcutRegistry.cs  324</w:t>
+        <w:t>│   ├── ShortcutRegistry.cs  325</w:t>
       </w:r>
     </w:p>
     <w:p>
@@ -5466,7 +5502,7 @@
           <w:rFonts w:ascii="Consolas" w:hAnsi="Consolas" w:eastAsia="Consolas"/>
           <w:sz w:val="13"/>
         </w:rPr>
-        <w:t>│   └── WebViewEnvironment.cs  250</w:t>
+        <w:t>│   └── WebViewEnvironment.cs  255</w:t>
       </w:r>
     </w:p>
     <w:p>
@@ -6042,6 +6078,18 @@
           <w:rFonts w:ascii="Consolas" w:hAnsi="Consolas" w:eastAsia="Consolas"/>
           <w:sz w:val="13"/>
         </w:rPr>
+        <w:t>│       ├── partitioncheck.html  49</w:t>
+      </w:r>
+    </w:p>
+    <w:p>
+      <w:pPr>
+        <w:spacing w:after="0" w:before="0" w:line="240" w:lineRule="auto"/>
+      </w:pPr>
+      <w:r>
+        <w:rPr>
+          <w:rFonts w:ascii="Consolas" w:hAnsi="Consolas" w:eastAsia="Consolas"/>
+          <w:sz w:val="13"/>
+        </w:rPr>
         <w:t>│       ├── projects.html  100</w:t>
       </w:r>
     </w:p>
@@ -6378,7 +6426,7 @@
           <w:rFonts w:ascii="Consolas" w:hAnsi="Consolas" w:eastAsia="Consolas"/>
           <w:sz w:val="13"/>
         </w:rPr>
-        <w:t>│       ├── tablebar.html  237</w:t>
+        <w:t>│       ├── tablebar.html  283</w:t>
       </w:r>
     </w:p>
     <w:p>
@@ -8066,7 +8114,7 @@
           <w:rFonts w:ascii="Consolas" w:hAnsi="Consolas" w:eastAsia="Consolas"/>
           <w:sz w:val="13"/>
         </w:rPr>
-        <w:t>└── Program.cs  90</w:t>
+        <w:t>└── Program.cs  94</w:t>
       </w:r>
     </w:p>
     <w:p>
@@ -8645,7 +8693,7 @@
                 <w:b w:val="0"/>
                 <w:sz w:val="16"/>
               </w:rPr>
-              <w:t>Topbar: Settings, Actions, Script (Add/View/Clear/Save/Copy), Triển khai, Tool mở rộng, Claude, Gemini, Trợ giúp, chọn WS + nút ⟳ Refresh database (MainForm.RefreshDatabaseAsync, phím db.refresh: bỏ cache SQL Object App+Sys, gợi ý bảng/cột/procedure, tên bảng tab Table rồi nạp lại cây) + Sys/App, theme, Quick Access.</w:t>
+              <w:t>Topbar: Settings, Actions, Script (Add/View/Clear/Save/Copy), Triển khai, Tool mở rộng, Claude, Gemini, Trợ giúp, chọn WS + nút ⟳ Refresh database (MainForm.RefreshDatabaseAsync, phím db.refresh: bỏ cache SQL Object App+Sys, gợi ý bảng/cột/procedure, tên bảng + menu của bảng ở tab Table rồi nạp lại cây) + Sys/App, theme, Quick Access.</w:t>
             </w:r>
           </w:p>
         </w:tc>
@@ -9334,7 +9382,7 @@
                 <w:b w:val="0"/>
                 <w:sz w:val="16"/>
               </w:rPr>
-              <w:t>Controls/TableEditControl.cs; Services/TableDataService.cs, DataScriptService.cs; Forms/ListEditorForm.cs, RowDetailForm.cs, GotoColumnForm.cs; Web/Shell/tablebar.html, tablestruct.html</w:t>
+              <w:t>Controls/TableEditControl.cs, NativeTableBar.cs; Services/TableDataService.cs, DataScriptService.cs, TableMenuService.cs; Forms/ListEditorForm.cs, RowDetailForm.cs, GotoColumnForm.cs, PartitionCheckForm.cs; Web/Shell/tablebar.html, tablestruct.html, partitioncheck.html; MainForm.WireTableMenu</w:t>
             </w:r>
           </w:p>
         </w:tc>
@@ -9352,7 +9400,7 @@
                 <w:b w:val="0"/>
                 <w:sz w:val="16"/>
               </w:rPr>
-              <w:t>Sửa dữ liệu kiểu Excel; ô Top mặc định 0 = tất cả (Command mới mặc định TOP 500); Add Script = DELETE + INSERT; F1 chi tiết dòng, F3 khai báo nhanh danh sách.</w:t>
+              <w:t>Sửa dữ liệu kiểu Excel; ô Top mặc định 0 = tất cả (Command mới mặc định TOP 500); Add Script = DELETE + INSERT; F1 chi tiết dòng, F3 khai báo nhanh danh sách. Dòng "Menu: Phiếu nhập kho (inctpnd.aspx)" dưới Where/Order (tablebar.html .menu-row / NativeTableBar.SetMenus; ẩn khi không tra được → thanh giữ chiều cao cũ): TableMenuService.FindAsync tra theo gốc tên bảng (bỏ $yyyymm/$000000/$log) — 1) dmct9 (App): c$/m$/d$/i$ → url → menu wcommand có link cùng trang aspx; 2) controller của menu: CommandTableService.ResolveIn (Dir table= + Grid chi tiết; table="&amp;Tag;" tra &lt;!ENTITY&gt; trong file Dir). Cache theo workspace + số menu trên cây, ⟳ Refresh database = Forget. Gõ thì chờ 300 ms, tải xong bảng thì tra ngay. Bấm menu → MenuRevealRequested → hiện cây WCommand + RevealAsync (chỉ chọn node, không mở File Lookup). Menu trùng tên ở nhiều phân hệ → thêm [phân hệ]; tối đa 4 + "+N". Chuột phải ô Table khi là bảng phân kỳ (xxx$yyyymm) → "Check Partitions Struct" (tablebar.html contextmenu → action table-context; App: NativeTableBar.ContextMenuHook bắt WM_CONTEXTMENU; bảng khác giữ menu mặc định) → Forms/PartitionCheckForm + Web/Shell/partitioncheck.html (App: Controls/NativePages.PartitionCheck.cs): TableDataService.CheckPartitionStructureAsync so mọi {prefix}$dddddd với {prefix}$000000 (1 câu INFORMATION_SCHEMA.COLUMNS) — thiếu / thừa cột, khác kiểu hoặc null, khác thứ tự cột; "Tables are same structure" khi giống hết; Copy ra Tab-separated.</w:t>
             </w:r>
           </w:p>
         </w:tc>

</xml_diff>

<commit_message>
bcode| fix ko mo dc webview
</commit_message>
<xml_diff>
--- a/Cấu trúc Bcode  BcodeViewer (v3 - Tóm tắt).docx
+++ b/Cấu trúc Bcode  BcodeViewer (v3 - Tóm tắt).docx
@@ -2970,7 +2970,7 @@
           <w:rFonts w:ascii="Consolas" w:hAnsi="Consolas" w:eastAsia="Consolas"/>
           <w:sz w:val="13"/>
         </w:rPr>
-        <w:t>│   ├── TableEditControl.cs  1976</w:t>
+        <w:t>│   ├── TableEditControl.cs  1983</w:t>
       </w:r>
     </w:p>
     <w:p>
@@ -3438,7 +3438,7 @@
           <w:rFonts w:ascii="Consolas" w:hAnsi="Consolas" w:eastAsia="Consolas"/>
           <w:sz w:val="13"/>
         </w:rPr>
-        <w:t>│   ├── MainForm.cs  3604</w:t>
+        <w:t>│   ├── MainForm.cs  3607</w:t>
       </w:r>
     </w:p>
     <w:p>
@@ -5502,7 +5502,7 @@
           <w:rFonts w:ascii="Consolas" w:hAnsi="Consolas" w:eastAsia="Consolas"/>
           <w:sz w:val="13"/>
         </w:rPr>
-        <w:t>│   └── WebViewEnvironment.cs  255</w:t>
+        <w:t>│   └── WebViewEnvironment.cs  390</w:t>
       </w:r>
     </w:p>
     <w:p>
@@ -9029,7 +9029,7 @@
                 <w:b w:val="0"/>
                 <w:sz w:val="16"/>
               </w:rPr>
-              <w:t>WebFrameHost = 1 WebView2 + nhiều iframe (framehost.html) để bớt RAM; RawSqlControl dùng nó cho khung kết quả (MergeSqlResultFrames) và tuỳ chọn gộp thanh nút + editor (MergeSqlBarEditor; mọi chỗ chạm trang qua EdExec/BarExec). WebBarHost.Sleepable + ISleepableTab = ngủ đông tab công cụ (Note, Lịch sử SQL, Check Mail, Setup eInvoice). BCODE_DATA_DIR = thư mục dữ liệu riêng để chạy thử. WebMenu = menu native theo theme. WebViewEnvironment: 1 môi trường WebView2 dùng chung + phím tắt toàn cục.</w:t>
+              <w:t>WebFrameHost = 1 WebView2 + nhiều iframe (framehost.html) để bớt RAM; RawSqlControl dùng nó cho khung kết quả (MergeSqlResultFrames) và tuỳ chọn gộp thanh nút + editor (MergeSqlBarEditor; mọi chỗ chạm trang qua EdExec/BarExec). WebBarHost.Sleepable + ISleepableTab = ngủ đông tab công cụ (Note, Lịch sử SQL, Check Mail, Setup eInvoice). BCODE_DATA_DIR = thư mục dữ liệu riêng để chạy thử. WebMenu = menu native theo theme. WebViewEnvironment: 1 môi trường WebView2 dùng chung + phím tắt toàn cục; thư mục dữ liệu %AppData%\Bcode\WebView2 bận (0x800700AA — trình duyệt cũ chưa thoát / Bcode khác giữ; lỗi lộ ra ở EnsureCoreWebView2Async) → InitAsync gọi RecoverBusyAsync: thử lại 5 × 600 ms rồi dùng hồ sơ phụ WebView2-&lt;n&gt;, báo ở thanh trạng thái (TempProfileNote) + webview2.log; hồ sơ phụ không còn ai giữ (khoá được EBWebView\lockfile) tự dọn sau khi controller đầu tiên tạo xong.</w:t>
             </w:r>
           </w:p>
         </w:tc>
@@ -16641,6 +16641,18 @@
           <w:sz w:val="19"/>
         </w:rPr>
         <w:t>BcodeViewer KHÔNG nhận BCODE_DATA_DIR (BcodePaths.cs của Viewer chưa đồng bộ với Bcode) — chạy thử Viewer là ghi thẳng vào %AppData%\Bcode\viewer-*.json thật: sao lưu trước. Chạy 1 bản mỗi phiên Windows; đo / điều khiển trang bằng WEBVIEW2_ADDITIONAL_BROWSER_ARGUMENTS=--remote-debugging-port=9333 + CDP (Runtime.evaluate).</w:t>
+      </w:r>
+    </w:p>
+    <w:p>
+      <w:pPr>
+        <w:pStyle w:val="ListBullet"/>
+        <w:spacing w:after="40"/>
+      </w:pPr>
+      <w:r>
+        <w:rPr>
+          <w:sz w:val="19"/>
+        </w:rPr>
+        <w:t>WebView2 dùng chung 1 thư mục dữ liệu giữa nhiều tiến trình được nếu tham số tạo môi trường tương thích (không tham số nhập được trình duyệt đang có tham số; WEBVIEW2_ADDITIONAL_BROWSER_ARGUMENTS không tính) — muốn giả lập lỗi 0x800700AA thì giữ độc quyền file EBWebView\lockfile của thư mục đó từ tiến trình khác.</w:t>
       </w:r>
     </w:p>
     <w:p>

</xml_diff>

<commit_message>
bcode| fix bo sung cap source
</commit_message>
<xml_diff>
--- a/Cấu trúc Bcode  BcodeViewer (v3 - Tóm tắt).docx
+++ b/Cấu trúc Bcode  BcodeViewer (v3 - Tóm tắt).docx
@@ -1998,7 +1998,19 @@
           <w:rFonts w:ascii="Consolas" w:hAnsi="Consolas" w:eastAsia="Consolas"/>
           <w:sz w:val="13"/>
         </w:rPr>
-        <w:t>│   ├── FileLookupControl.cs  1415</w:t>
+        <w:t>│   ├── FileLookupControl.cs  1425</w:t>
+      </w:r>
+    </w:p>
+    <w:p>
+      <w:pPr>
+        <w:spacing w:after="0" w:before="0" w:line="240" w:lineRule="auto"/>
+      </w:pPr>
+      <w:r>
+        <w:rPr>
+          <w:rFonts w:ascii="Consolas" w:hAnsi="Consolas" w:eastAsia="Consolas"/>
+          <w:sz w:val="13"/>
+        </w:rPr>
+        <w:t>│   ├── FileLookupControl.QuickGrant.cs  148</w:t>
       </w:r>
     </w:p>
     <w:p>
@@ -2430,7 +2442,7 @@
           <w:rFonts w:ascii="Consolas" w:hAnsi="Consolas" w:eastAsia="Consolas"/>
           <w:sz w:val="13"/>
         </w:rPr>
-        <w:t>│   ├── NativePages.Dialogs4.cs  368</w:t>
+        <w:t>│   ├── NativePages.Dialogs4.cs  393</w:t>
       </w:r>
     </w:p>
     <w:p>
@@ -2454,7 +2466,7 @@
           <w:rFonts w:ascii="Consolas" w:hAnsi="Consolas" w:eastAsia="Consolas"/>
           <w:sz w:val="13"/>
         </w:rPr>
-        <w:t>│   ├── NativePages.FileLookup.cs  140</w:t>
+        <w:t>│   ├── NativePages.FileLookup.cs  162</w:t>
       </w:r>
     </w:p>
     <w:p>
@@ -2718,7 +2730,7 @@
           <w:rFonts w:ascii="Consolas" w:hAnsi="Consolas" w:eastAsia="Consolas"/>
           <w:sz w:val="13"/>
         </w:rPr>
-        <w:t>│   ├── NativeWeeklyMailControl.cs  366</w:t>
+        <w:t>│   ├── NativeWeeklyMailControl.cs  680</w:t>
       </w:r>
     </w:p>
     <w:p>
@@ -3066,7 +3078,7 @@
           <w:rFonts w:ascii="Consolas" w:hAnsi="Consolas" w:eastAsia="Consolas"/>
           <w:sz w:val="13"/>
         </w:rPr>
-        <w:t>│   └── WeeklyMailControl.cs  116</w:t>
+        <w:t>│   └── WeeklyMailControl.cs  245</w:t>
       </w:r>
     </w:p>
     <w:p>
@@ -3090,7 +3102,7 @@
           <w:rFonts w:ascii="Consolas" w:hAnsi="Consolas" w:eastAsia="Consolas"/>
           <w:sz w:val="13"/>
         </w:rPr>
-        <w:t>│   ├── AddSourceForm.cs  305</w:t>
+        <w:t>│   ├── AddSourceForm.cs  309</w:t>
       </w:r>
     </w:p>
     <w:p>
@@ -3366,7 +3378,7 @@
           <w:rFonts w:ascii="Consolas" w:hAnsi="Consolas" w:eastAsia="Consolas"/>
           <w:sz w:val="13"/>
         </w:rPr>
-        <w:t>│   ├── GrantSourceForm.cs  187</w:t>
+        <w:t>│   ├── GrantSourceForm.cs  198</w:t>
       </w:r>
     </w:p>
     <w:p>
@@ -3438,7 +3450,7 @@
           <w:rFonts w:ascii="Consolas" w:hAnsi="Consolas" w:eastAsia="Consolas"/>
           <w:sz w:val="13"/>
         </w:rPr>
-        <w:t>│   ├── MainForm.cs  3607</w:t>
+        <w:t>│   ├── MainForm.cs  3608</w:t>
       </w:r>
     </w:p>
     <w:p>
@@ -3642,6 +3654,18 @@
           <w:rFonts w:ascii="Consolas" w:hAnsi="Consolas" w:eastAsia="Consolas"/>
           <w:sz w:val="13"/>
         </w:rPr>
+        <w:t>│   ├── SourceViewForm.cs  58</w:t>
+      </w:r>
+    </w:p>
+    <w:p>
+      <w:pPr>
+        <w:spacing w:after="0" w:before="0" w:line="240" w:lineRule="auto"/>
+      </w:pPr>
+      <w:r>
+        <w:rPr>
+          <w:rFonts w:ascii="Consolas" w:hAnsi="Consolas" w:eastAsia="Consolas"/>
+          <w:sz w:val="13"/>
+        </w:rPr>
         <w:t>│   ├── SqlAiEditForm.cs  107</w:t>
       </w:r>
     </w:p>
@@ -3942,6 +3966,18 @@
           <w:rFonts w:ascii="Consolas" w:hAnsi="Consolas" w:eastAsia="Consolas"/>
           <w:sz w:val="13"/>
         </w:rPr>
+        <w:t>│   ├── WeeklyMailSent.cs  68</w:t>
+      </w:r>
+    </w:p>
+    <w:p>
+      <w:pPr>
+        <w:spacing w:after="0" w:before="0" w:line="240" w:lineRule="auto"/>
+      </w:pPr>
+      <w:r>
+        <w:rPr>
+          <w:rFonts w:ascii="Consolas" w:hAnsi="Consolas" w:eastAsia="Consolas"/>
+          <w:sz w:val="13"/>
+        </w:rPr>
         <w:t>│   ├── WeeklyMailTemplate.cs  20</w:t>
       </w:r>
     </w:p>
@@ -4758,7 +4794,7 @@
           <w:rFonts w:ascii="Consolas" w:hAnsi="Consolas" w:eastAsia="Consolas"/>
           <w:sz w:val="13"/>
         </w:rPr>
-        <w:t>│   ├── MailTestService.cs  164</w:t>
+        <w:t>│   ├── MailTestService.cs  168</w:t>
       </w:r>
     </w:p>
     <w:p>
@@ -4950,7 +4986,7 @@
           <w:rFonts w:ascii="Consolas" w:hAnsi="Consolas" w:eastAsia="Consolas"/>
           <w:sz w:val="13"/>
         </w:rPr>
-        <w:t>│   ├── SourceGrantService.cs  262</w:t>
+        <w:t>│   ├── SourceGrantService.cs  311</w:t>
       </w:r>
     </w:p>
     <w:p>
@@ -5190,7 +5226,19 @@
           <w:rFonts w:ascii="Consolas" w:hAnsi="Consolas" w:eastAsia="Consolas"/>
           <w:sz w:val="13"/>
         </w:rPr>
-        <w:t>│   ├── WeeklyMailStore.cs  48</w:t>
+        <w:t>│   ├── WeeklyMailHistory.cs  483</w:t>
+      </w:r>
+    </w:p>
+    <w:p>
+      <w:pPr>
+        <w:spacing w:after="0" w:before="0" w:line="240" w:lineRule="auto"/>
+      </w:pPr>
+      <w:r>
+        <w:rPr>
+          <w:rFonts w:ascii="Consolas" w:hAnsi="Consolas" w:eastAsia="Consolas"/>
+          <w:sz w:val="13"/>
+        </w:rPr>
+        <w:t>│   ├── WeeklyMailStore.cs  77</w:t>
       </w:r>
     </w:p>
     <w:p>
@@ -5550,7 +5598,7 @@
           <w:rFonts w:ascii="Consolas" w:hAnsi="Consolas" w:eastAsia="Consolas"/>
           <w:sz w:val="13"/>
         </w:rPr>
-        <w:t>│       ├── addsource.html  210</w:t>
+        <w:t>│       ├── addsource.html  226</w:t>
       </w:r>
     </w:p>
     <w:p>
@@ -5886,7 +5934,7 @@
           <w:rFonts w:ascii="Consolas" w:hAnsi="Consolas" w:eastAsia="Consolas"/>
           <w:sz w:val="13"/>
         </w:rPr>
-        <w:t>│       ├── filelookuppreview.html  70</w:t>
+        <w:t>│       ├── filelookuppreview.html  98</w:t>
       </w:r>
     </w:p>
     <w:p>
@@ -5970,7 +6018,7 @@
           <w:rFonts w:ascii="Consolas" w:hAnsi="Consolas" w:eastAsia="Consolas"/>
           <w:sz w:val="13"/>
         </w:rPr>
-        <w:t>│       ├── grantsource.html  113</w:t>
+        <w:t>│       ├── grantsource.html  132</w:t>
       </w:r>
     </w:p>
     <w:p>
@@ -6546,7 +6594,7 @@
           <w:rFonts w:ascii="Consolas" w:hAnsi="Consolas" w:eastAsia="Consolas"/>
           <w:sz w:val="13"/>
         </w:rPr>
-        <w:t>│       └── weeklymail.html  353</w:t>
+        <w:t>│       └── weeklymail.html  556</w:t>
       </w:r>
     </w:p>
     <w:p>
@@ -9977,7 +10025,7 @@
                 <w:b w:val="0"/>
                 <w:sz w:val="16"/>
               </w:rPr>
-              <w:t>Controls/FileLookupControl.cs (1500 dòng), MonacoPreviewControl.cs; Services/FileLookupService.cs, FileParseCache.cs, EntityCheckService.cs; Web/Shell/filelookupbar.html, filelookuppreview.html, filepreview.html, searchbox.html, entitypeek.html; Forms/EntityMultiPeekForm.cs</w:t>
+              <w:t>Controls/FileLookupControl.cs (1500 dòng), FileLookupControl.QuickGrant.cs, MonacoPreviewControl.cs; Services/FileLookupService.cs, FileParseCache.cs, EntityCheckService.cs; Web/Shell/filelookupbar.html, filelookuppreview.html, filepreview.html, searchbox.html, entitypeek.html; Forms/EntityMultiPeekForm.cs</w:t>
             </w:r>
           </w:p>
         </w:tc>
@@ -9995,7 +10043,7 @@
                 <w:b w:val="0"/>
                 <w:sz w:val="16"/>
               </w:rPr>
-              <w:t>Cây file theo menu, cache theo dự án (%AppData%\Bcode\FileLookupCache), tô đỏ entity thiếu, tìm nội dung, Edit in BcodeViewer (Process.Start).</w:t>
+              <w:t>Cây file theo menu, cache theo dự án (%AppData%\Bcode\FileLookupCache), tô đỏ entity thiếu, tìm nội dung, Edit in BcodeViewer (Process.Start). Cấp source nhanh (FileLookupControl.QuickGrant.cs): chọn file .f Dir/Grid/Filter → dòng 2 thanh xem trước (filelookuppreview.html window.setSource; App: FileLookupPreviewBarPage) hiện phiên bản + thư mục kho (SourceGrantService.ResolveNearestLower: phiên bản dự án, không có thì phiên bản thấp hơn gần nhất cùng 3 chữ đầu; DetectVersion: nhiều phiên bản cùng số thì ưu tiên cùng 3 chữ đầu rồi 2 chữ đầu — FBISP24 → FBOR2SP24, không lấy TT24 của kho FAP), bấm nhãn = SourceViewForm, nút Cấp source = hỏi xác nhận rồi CopyRows; danh sách phiên bản cache 5 phút.</w:t>
             </w:r>
           </w:p>
         </w:tc>
@@ -10033,7 +10081,7 @@
                 <w:b w:val="0"/>
                 <w:sz w:val="16"/>
               </w:rPr>
-              <w:t>Forms/AddSourceForm.cs, GrantSourceForm.cs, CopyMultiFileForm.cs, CopySourceStandardForm.cs; Services/SourceGrantService.cs; Web/Shell/addsource.html, grantsource.html, copymulti.html, copysourcestandard.html</w:t>
+              <w:t>Forms/AddSourceForm.cs, GrantSourceForm.cs, SourceViewForm.cs, CopyMultiFileForm.cs, CopySourceStandardForm.cs; Services/SourceGrantService.cs; Web/Shell/addsource.html, grantsource.html, copymulti.html, copysourcestandard.html</w:t>
             </w:r>
           </w:p>
         </w:tc>
@@ -10051,7 +10099,7 @@
                 <w:b w:val="0"/>
                 <w:sz w:val="16"/>
               </w:rPr>
-              <w:t>Kho SourceCollection theo phiên bản; chỉ đọc kho, hỏi trước khi ghi đè.</w:t>
+              <w:t>Kho SourceCollection theo phiên bản; chỉ đọc kho, hỏi trước khi ghi đè. View source (cả 2 hộp thoại, App: NativePages.Dialogs4.cs) = SourceViewForm xem file trong kho sắp cấp bằng MonacoPreviewControl (chỉ đọc, F12 mở Include/entity ngay trong cửa sổ).</w:t>
             </w:r>
           </w:p>
         </w:tc>
@@ -10707,6 +10755,62 @@
           </w:p>
         </w:tc>
       </w:tr>
+      <w:tr>
+        <w:tc>
+          <w:tcPr>
+            <w:tcW w:type="dxa" w:w="2041"/>
+          </w:tcPr>
+          <w:p>
+            <w:pPr>
+              <w:spacing w:after="20"/>
+            </w:pPr>
+            <w:r/>
+            <w:r>
+              <w:rPr>
+                <w:b/>
+                <w:sz w:val="16"/>
+              </w:rPr>
+              <w:t>Mail kế hoạch tuần (menu Triển khai)</w:t>
+            </w:r>
+          </w:p>
+        </w:tc>
+        <w:tc>
+          <w:tcPr>
+            <w:tcW w:type="dxa" w:w="3969"/>
+          </w:tcPr>
+          <w:p>
+            <w:pPr>
+              <w:spacing w:after="20"/>
+            </w:pPr>
+            <w:r/>
+            <w:r>
+              <w:rPr>
+                <w:b w:val="0"/>
+                <w:sz w:val="16"/>
+              </w:rPr>
+              <w:t>Controls/WeeklyMailControl.cs (Web: Web/Shell/weeklymail.html), NativeWeeklyMailControl.cs (App); Services/WeeklyMailStore.cs, WeeklyMailHistory.cs, MailTestService.cs; Models/WeeklyMailTemplate.cs, WeeklyMailSent.cs</w:t>
+            </w:r>
+          </w:p>
+        </w:tc>
+        <w:tc>
+          <w:tcPr>
+            <w:tcW w:type="dxa" w:w="3855"/>
+          </w:tcPr>
+          <w:p>
+            <w:pPr>
+              <w:spacing w:after="20"/>
+            </w:pPr>
+            <w:r/>
+            <w:r>
+              <w:rPr>
+                <w:b w:val="0"/>
+                <w:sz w:val="16"/>
+              </w:rPr>
+              <w:t>Mẫu mail theo dự án, gửi SMTP (MailTestService.RunAsync, hook prepare/sent) — luôn hỏi xác nhận người nhận. Tab con "Đã gửi &amp; phản hồi": thư gửi thành công lưu .eml + index.json ở weeklymail-sent\, tuỳ chọn APPEND lên thư mục Sent qua IMAP (SMTP không tự lưu Sent); Kiểm tra phản hồi = IMAP INBOX, khớp In-Reply-To/References với Message-ID đã gửi (dự phòng: tiêu đề Re:/TL: + tiêu đề gốc → thư gốc gần nhất trước ngày nhận), tải về weeklymail-sent\replies\; Reply / Reply all đặt In-Reply-To + References, trích dẫn kiểu Outlook, chữ ký của mẫu; Gửi lại thư cũ. IMAP + "Nhớ mật khẩu" (DPAPI, ApiProjectStore.Protect) ở weeklymail-imap.json — KHÔNG ghi vào checkmail.json vì tab Check Mail ghi đè cả file.</w:t>
+            </w:r>
+          </w:p>
+        </w:tc>
+      </w:tr>
     </w:tbl>
     <w:p>
       <w:pPr>
@@ -15857,6 +15961,62 @@
                 <w:sz w:val="16"/>
               </w:rPr>
               <w:t>Lịch sử AI, Template giao diện, theme, bố cục thanh SQL, cấu hình eInvoice/mail, key bản quyền.</w:t>
+            </w:r>
+          </w:p>
+        </w:tc>
+      </w:tr>
+      <w:tr>
+        <w:tc>
+          <w:tcPr>
+            <w:tcW w:type="dxa" w:w="3685"/>
+          </w:tcPr>
+          <w:p>
+            <w:pPr>
+              <w:spacing w:after="20"/>
+            </w:pPr>
+            <w:r/>
+            <w:r>
+              <w:rPr>
+                <w:b/>
+                <w:sz w:val="16"/>
+              </w:rPr>
+              <w:t>…\weeklymail.json, weeklymail-imap.json, weeklymail-sent\ (index.json, *.eml, replies\)</w:t>
+            </w:r>
+          </w:p>
+        </w:tc>
+        <w:tc>
+          <w:tcPr>
+            <w:tcW w:type="dxa" w:w="964"/>
+          </w:tcPr>
+          <w:p>
+            <w:pPr>
+              <w:spacing w:after="20"/>
+            </w:pPr>
+            <w:r/>
+            <w:r>
+              <w:rPr>
+                <w:b w:val="0"/>
+                <w:sz w:val="16"/>
+              </w:rPr>
+              <w:t>Bcode</w:t>
+            </w:r>
+          </w:p>
+        </w:tc>
+        <w:tc>
+          <w:tcPr>
+            <w:tcW w:type="dxa" w:w="5216"/>
+          </w:tcPr>
+          <w:p>
+            <w:pPr>
+              <w:spacing w:after="20"/>
+            </w:pPr>
+            <w:r/>
+            <w:r>
+              <w:rPr>
+                <w:b w:val="0"/>
+                <w:sz w:val="16"/>
+              </w:rPr>
+              <w:t>Mail kế hoạch tuần: mẫu, cấu hình IMAP + mật khẩu nhớ (DPAPI), thư đã gửi và phản hồi đã tải.</w:t>
             </w:r>
           </w:p>
         </w:tc>

</xml_diff>

<commit_message>
bcode| bo sung thong bao ghi chu qlyc
</commit_message>
<xml_diff>
--- a/Cấu trúc Bcode  BcodeViewer (v3 - Tóm tắt).docx
+++ b/Cấu trúc Bcode  BcodeViewer (v3 - Tóm tắt).docx
@@ -2046,7 +2046,7 @@
           <w:rFonts w:ascii="Consolas" w:hAnsi="Consolas" w:eastAsia="Consolas"/>
           <w:sz w:val="13"/>
         </w:rPr>
-        <w:t>│   ├── FsgRequirementReportControl.cs  199</w:t>
+        <w:t>│   ├── FsgRequirementReportControl.cs  221</w:t>
       </w:r>
     </w:p>
     <w:p>
@@ -2658,7 +2658,7 @@
           <w:rFonts w:ascii="Consolas" w:hAnsi="Consolas" w:eastAsia="Consolas"/>
           <w:sz w:val="13"/>
         </w:rPr>
-        <w:t>│   ├── NativeShellBars.cs  254</w:t>
+        <w:t>│   ├── NativeShellBars.cs  271</w:t>
       </w:r>
     </w:p>
     <w:p>
@@ -2982,7 +2982,7 @@
           <w:rFonts w:ascii="Consolas" w:hAnsi="Consolas" w:eastAsia="Consolas"/>
           <w:sz w:val="13"/>
         </w:rPr>
-        <w:t>│   ├── TableEditControl.cs  1983</w:t>
+        <w:t>│   ├── TableEditControl.cs  1986</w:t>
       </w:r>
     </w:p>
     <w:p>
@@ -3354,6 +3354,18 @@
           <w:rFonts w:ascii="Consolas" w:hAnsi="Consolas" w:eastAsia="Consolas"/>
           <w:sz w:val="13"/>
         </w:rPr>
+        <w:t>│   ├── FsgNotifyForm.cs  75</w:t>
+      </w:r>
+    </w:p>
+    <w:p>
+      <w:pPr>
+        <w:spacing w:after="0" w:before="0" w:line="240" w:lineRule="auto"/>
+      </w:pPr>
+      <w:r>
+        <w:rPr>
+          <w:rFonts w:ascii="Consolas" w:hAnsi="Consolas" w:eastAsia="Consolas"/>
+          <w:sz w:val="13"/>
+        </w:rPr>
         <w:t>│   ├── FsgRequirementCrawlerForm.cs  618</w:t>
       </w:r>
     </w:p>
@@ -3450,7 +3462,19 @@
           <w:rFonts w:ascii="Consolas" w:hAnsi="Consolas" w:eastAsia="Consolas"/>
           <w:sz w:val="13"/>
         </w:rPr>
-        <w:t>│   ├── MainForm.cs  3608</w:t>
+        <w:t>│   ├── MainForm.cs  3615</w:t>
+      </w:r>
+    </w:p>
+    <w:p>
+      <w:pPr>
+        <w:spacing w:after="0" w:before="0" w:line="240" w:lineRule="auto"/>
+      </w:pPr>
+      <w:r>
+        <w:rPr>
+          <w:rFonts w:ascii="Consolas" w:hAnsi="Consolas" w:eastAsia="Consolas"/>
+          <w:sz w:val="13"/>
+        </w:rPr>
+        <w:t>│   ├── MainForm.FsgNotify.cs  105</w:t>
       </w:r>
     </w:p>
     <w:p>
@@ -4650,6 +4674,18 @@
           <w:rFonts w:ascii="Consolas" w:hAnsi="Consolas" w:eastAsia="Consolas"/>
           <w:sz w:val="13"/>
         </w:rPr>
+        <w:t>│   ├── FsgNotifyService.cs  445</w:t>
+      </w:r>
+    </w:p>
+    <w:p>
+      <w:pPr>
+        <w:spacing w:after="0" w:before="0" w:line="240" w:lineRule="auto"/>
+      </w:pPr>
+      <w:r>
+        <w:rPr>
+          <w:rFonts w:ascii="Consolas" w:hAnsi="Consolas" w:eastAsia="Consolas"/>
+          <w:sz w:val="13"/>
+        </w:rPr>
         <w:t>│   ├── FsgProjectLookupService.cs  490</w:t>
       </w:r>
     </w:p>
@@ -5046,7 +5082,7 @@
           <w:rFonts w:ascii="Consolas" w:hAnsi="Consolas" w:eastAsia="Consolas"/>
           <w:sz w:val="13"/>
         </w:rPr>
-        <w:t>│   ├── SqlFormatterService.cs  144</w:t>
+        <w:t>│   ├── SqlFormatterService.cs  152</w:t>
       </w:r>
     </w:p>
     <w:p>
@@ -5178,7 +5214,7 @@
           <w:rFonts w:ascii="Consolas" w:hAnsi="Consolas" w:eastAsia="Consolas"/>
           <w:sz w:val="13"/>
         </w:rPr>
-        <w:t>│   ├── TableMenuService.cs  191</w:t>
+        <w:t>│   ├── TableMenuService.cs  194</w:t>
       </w:r>
     </w:p>
     <w:p>
@@ -5370,7 +5406,7 @@
           <w:rFonts w:ascii="Consolas" w:hAnsi="Consolas" w:eastAsia="Consolas"/>
           <w:sz w:val="13"/>
         </w:rPr>
-        <w:t>│   ├── IconGlyphs.cs  191</w:t>
+        <w:t>│   ├── IconGlyphs.cs  208</w:t>
       </w:r>
     </w:p>
     <w:p>
@@ -5442,7 +5478,7 @@
           <w:rFonts w:ascii="Consolas" w:hAnsi="Consolas" w:eastAsia="Consolas"/>
           <w:sz w:val="13"/>
         </w:rPr>
-        <w:t>│   ├── ShortcutRegistry.cs  325</w:t>
+        <w:t>│   ├── ShortcutRegistry.cs  326</w:t>
       </w:r>
     </w:p>
     <w:p>
@@ -5994,7 +6030,19 @@
           <w:rFonts w:ascii="Consolas" w:hAnsi="Consolas" w:eastAsia="Consolas"/>
           <w:sz w:val="13"/>
         </w:rPr>
-        <w:t>│       ├── fsgreq.html  714</w:t>
+        <w:t>│       ├── fsgnotify.html  136</w:t>
+      </w:r>
+    </w:p>
+    <w:p>
+      <w:pPr>
+        <w:spacing w:after="0" w:before="0" w:line="240" w:lineRule="auto"/>
+      </w:pPr>
+      <w:r>
+        <w:rPr>
+          <w:rFonts w:ascii="Consolas" w:hAnsi="Consolas" w:eastAsia="Consolas"/>
+          <w:sz w:val="13"/>
+        </w:rPr>
+        <w:t>│       ├── fsgreq.html  724</w:t>
       </w:r>
     </w:p>
     <w:p>
@@ -6498,7 +6546,7 @@
           <w:rFonts w:ascii="Consolas" w:hAnsi="Consolas" w:eastAsia="Consolas"/>
           <w:sz w:val="13"/>
         </w:rPr>
-        <w:t>│       ├── topbar.html  170</w:t>
+        <w:t>│       ├── topbar.html  183</w:t>
       </w:r>
     </w:p>
     <w:p>
@@ -8741,7 +8789,7 @@
                 <w:b w:val="0"/>
                 <w:sz w:val="16"/>
               </w:rPr>
-              <w:t>Topbar: Settings, Actions, Script (Add/View/Clear/Save/Copy), Triển khai, Tool mở rộng, Claude, Gemini, Trợ giúp, chọn WS + nút ⟳ Refresh database (MainForm.RefreshDatabaseAsync, phím db.refresh: bỏ cache SQL Object App+Sys, gợi ý bảng/cột/procedure, tên bảng + menu của bảng ở tab Table rồi nạp lại cây) + Sys/App, theme, Quick Access.</w:t>
+              <w:t>Topbar: Settings, Actions, Script (Add/View/Clear/Save/Copy), Triển khai, Tool mở rộng, Claude, Gemini, Trợ giúp, chọn WS + nút ⟳ Refresh database (MainForm.RefreshDatabaseAsync, phím db.refresh: bỏ cache SQL Object App+Sys, gợi ý bảng/cột/procedure, tên bảng + menu của bảng ở tab Table rồi nạp lại cây) + Sys/App, theme, chuông 🔔 Thông báo y/c FSG (#btnNotify / NativeTopBar.SetNotifyCount, action notify), Quick Access.</w:t>
             </w:r>
           </w:p>
         </w:tc>
@@ -11085,6 +11133,62 @@
                 <w:b/>
                 <w:sz w:val="16"/>
               </w:rPr>
+              <w:t>Thông báo y/c FSG (chuông 🔔)</w:t>
+            </w:r>
+          </w:p>
+        </w:tc>
+        <w:tc>
+          <w:tcPr>
+            <w:tcW w:type="dxa" w:w="3969"/>
+          </w:tcPr>
+          <w:p>
+            <w:pPr>
+              <w:spacing w:after="20"/>
+            </w:pPr>
+            <w:r/>
+            <w:r>
+              <w:rPr>
+                <w:b w:val="0"/>
+                <w:sz w:val="16"/>
+              </w:rPr>
+              <w:t>Services/FsgNotifyService.cs; Forms/FsgNotifyForm.cs, MainForm.FsgNotify.cs; Web/Shell/fsgnotify.html; topbar.html (#btnNotify, window.setNotify) + NativeShellBars.cs (NativeTopBar.SetNotifyCount, IconGlyph.Bell); FsgRequirementReportControl (StoreUpdated, ShowRequirement → fsgReq.openReq, RecordFetch)</w:t>
+            </w:r>
+          </w:p>
+        </w:tc>
+        <w:tc>
+          <w:tcPr>
+            <w:tcW w:type="dxa" w:w="3855"/>
+          </w:tcPr>
+          <w:p>
+            <w:pPr>
+              <w:spacing w:after="20"/>
+            </w:pPr>
+            <w:r/>
+            <w:r>
+              <w:rPr>
+                <w:b w:val="0"/>
+                <w:sz w:val="16"/>
+              </w:rPr>
+              <w:t>Kéo NGẦM định kỳ (mặc định 10 phút, cả khi không mở tab; vòng 30 s trong FsgNotifyService.Start) y/c có ma_lt1 = AppSettings.NoteProgrammer (tuỳ chọn cả ma_nv1) của các dự án đã lưu trong fsg-requirements.json (≤150 mã/lần, chỉ đọc), so theo ma_da + fcode1 (trùng khoá ghép theo Pair) với bản lưu: ghi chú có dòng mới (bỏ dòng [TÊN]: của chính mình, bỏ phần [LT:…]), đổi trang_thai, y/c mới giao cho mình, đổi ngay_ht → thông báo; rồi upsert các dòng đó vào fsg-requirements.json + StoreUpdated (tab đang mở vẽ lại). "Kéo về" tay ở tab cũng so (RecordFetch). Tránh báo ồ ạt: dự án chưa có y/c của mình → không báo "mới giao"; dự án lưu không có ghi chú nào → không so ghi chú. Lỗi mạng/VPN im lặng (LastError). Nhiều tiến trình Bcode: mutex Local\Bcode.FsgNotify + LastPoll trong file, tiến trình khác thấy file đổi thì nạp lại. Cài đặt + lịch sử (500) ở %AppData%\Bcode\fsg-notify.json. Khung (WebDialogForm, cả chế độ App) đặt góc phải dưới thanh trên: Tất cả/Chưa xem, ✓ / Đã xem tất cả, Kiểm tra ngay, ⚙ Cài đặt (bật, ô Lập trình, chu kỳ, loại, triển khai, toast). Bấm dòng → OpenFsgRequirementReportTab + ShowRequirement (khung chi tiết, nút 🤖 giữ nguyên). Toast = balloon NotifyIcon khi Form.ActiveForm null. Phím app.fsgNotify (mặc định trống). Cần key như Báo cáo yêu cầu FSG.</w:t>
+            </w:r>
+          </w:p>
+        </w:tc>
+      </w:tr>
+      <w:tr>
+        <w:tc>
+          <w:tcPr>
+            <w:tcW w:type="dxa" w:w="2041"/>
+          </w:tcPr>
+          <w:p>
+            <w:pPr>
+              <w:spacing w:after="20"/>
+            </w:pPr>
+            <w:r/>
+            <w:r>
+              <w:rPr>
+                <w:b/>
+                <w:sz w:val="16"/>
+              </w:rPr>
               <w:t>Claude / Gemini nhúng</w:t>
             </w:r>
           </w:p>
@@ -15924,7 +16028,7 @@
                 <w:b/>
                 <w:sz w:val="16"/>
               </w:rPr>
-              <w:t>…\ai-history.json, ui-template.json, ui-themes, sqlbar_layout.json, einvoice.json, checkmail.json, fsg-requirements.json, license.key</w:t>
+              <w:t>…\ai-history.json, ui-template.json, ui-themes, sqlbar_layout.json, einvoice.json, checkmail.json, fsg-requirements.json, fsg-notify.json, license.key</w:t>
             </w:r>
           </w:p>
         </w:tc>
@@ -15960,7 +16064,7 @@
                 <w:b w:val="0"/>
                 <w:sz w:val="16"/>
               </w:rPr>
-              <w:t>Lịch sử AI, Template giao diện, theme, bố cục thanh SQL, cấu hình eInvoice/mail, key bản quyền.</w:t>
+              <w:t>Lịch sử AI, Template giao diện, theme, bố cục thanh SQL, cấu hình eInvoice/mail, y/c FSG đã kéo + thông báo y/c (chuông 🔔), key bản quyền.</w:t>
             </w:r>
           </w:p>
         </w:tc>

</xml_diff>

<commit_message>
bcode| fix thông báo fsg yêu cầu, fix f12 cấp source, fix view source, fix f12 lại dạng chỉ mục, fix thỉnh thoảng treo khi mở sql profiler và chuyển tab khác
</commit_message>
<xml_diff>
--- a/Cấu trúc Bcode  BcodeViewer (v3 - Tóm tắt).docx
+++ b/Cấu trúc Bcode  BcodeViewer (v3 - Tóm tắt).docx
@@ -2046,7 +2046,7 @@
           <w:rFonts w:ascii="Consolas" w:hAnsi="Consolas" w:eastAsia="Consolas"/>
           <w:sz w:val="13"/>
         </w:rPr>
-        <w:t>│   ├── FsgRequirementReportControl.cs  234</w:t>
+        <w:t>│   ├── FsgRequirementReportControl.cs  248</w:t>
       </w:r>
     </w:p>
     <w:p>
@@ -2154,19 +2154,19 @@
           <w:rFonts w:ascii="Consolas" w:hAnsi="Consolas" w:eastAsia="Consolas"/>
           <w:sz w:val="13"/>
         </w:rPr>
-        <w:t>│   ├── MonacoPreviewControl.cs  214</w:t>
-      </w:r>
-    </w:p>
-    <w:p>
-      <w:pPr>
-        <w:spacing w:after="0" w:before="0" w:line="240" w:lineRule="auto"/>
-      </w:pPr>
-      <w:r>
-        <w:rPr>
-          <w:rFonts w:ascii="Consolas" w:hAnsi="Consolas" w:eastAsia="Consolas"/>
-          <w:sz w:val="13"/>
-        </w:rPr>
-        <w:t>│   ├── MonacoPreviewControl.Native.cs  101</w:t>
+        <w:t>│   ├── MonacoPreviewControl.cs  215</w:t>
+      </w:r>
+    </w:p>
+    <w:p>
+      <w:pPr>
+        <w:spacing w:after="0" w:before="0" w:line="240" w:lineRule="auto"/>
+      </w:pPr>
+      <w:r>
+        <w:rPr>
+          <w:rFonts w:ascii="Consolas" w:hAnsi="Consolas" w:eastAsia="Consolas"/>
+          <w:sz w:val="13"/>
+        </w:rPr>
+        <w:t>│   ├── MonacoPreviewControl.Native.cs  102</w:t>
       </w:r>
     </w:p>
     <w:p>
@@ -2814,7 +2814,19 @@
           <w:rFonts w:ascii="Consolas" w:hAnsi="Consolas" w:eastAsia="Consolas"/>
           <w:sz w:val="13"/>
         </w:rPr>
-        <w:t>│   ├── ScriptEditorControl.cs  1210</w:t>
+        <w:t>│   ├── ScriptEditorControl.cs  1214</w:t>
+      </w:r>
+    </w:p>
+    <w:p>
+      <w:pPr>
+        <w:spacing w:after="0" w:before="0" w:line="240" w:lineRule="auto"/>
+      </w:pPr>
+      <w:r>
+        <w:rPr>
+          <w:rFonts w:ascii="Consolas" w:hAnsi="Consolas" w:eastAsia="Consolas"/>
+          <w:sz w:val="13"/>
+        </w:rPr>
+        <w:t>│   ├── ScriptEditorControl.EntityIndex.cs  176</w:t>
       </w:r>
     </w:p>
     <w:p>
@@ -2886,7 +2898,7 @@
           <w:rFonts w:ascii="Consolas" w:hAnsi="Consolas" w:eastAsia="Consolas"/>
           <w:sz w:val="13"/>
         </w:rPr>
-        <w:t>│   ├── SqlProfilerControl.cs  1657</w:t>
+        <w:t>│   ├── SqlProfilerControl.cs  1737</w:t>
       </w:r>
     </w:p>
     <w:p>
@@ -3462,7 +3474,7 @@
           <w:rFonts w:ascii="Consolas" w:hAnsi="Consolas" w:eastAsia="Consolas"/>
           <w:sz w:val="13"/>
         </w:rPr>
-        <w:t>│   ├── MainForm.cs  3615</w:t>
+        <w:t>│   ├── MainForm.cs  3617</w:t>
       </w:r>
     </w:p>
     <w:p>
@@ -3678,7 +3690,7 @@
           <w:rFonts w:ascii="Consolas" w:hAnsi="Consolas" w:eastAsia="Consolas"/>
           <w:sz w:val="13"/>
         </w:rPr>
-        <w:t>│   ├── SourceViewForm.cs  58</w:t>
+        <w:t>│   ├── SourceViewForm.cs  81</w:t>
       </w:r>
     </w:p>
     <w:p>
@@ -4674,7 +4686,7 @@
           <w:rFonts w:ascii="Consolas" w:hAnsi="Consolas" w:eastAsia="Consolas"/>
           <w:sz w:val="13"/>
         </w:rPr>
-        <w:t>│   ├── FsgNotifyService.cs  511</w:t>
+        <w:t>│   ├── FsgNotifyService.cs  550</w:t>
       </w:r>
     </w:p>
     <w:p>
@@ -6054,7 +6066,7 @@
           <w:rFonts w:ascii="Consolas" w:hAnsi="Consolas" w:eastAsia="Consolas"/>
           <w:sz w:val="13"/>
         </w:rPr>
-        <w:t>│       ├── fsgreq.html  726</w:t>
+        <w:t>│       ├── fsgreq.html  746</w:t>
       </w:r>
     </w:p>
     <w:p>
@@ -8222,7 +8234,7 @@
           <w:rFonts w:ascii="Consolas" w:hAnsi="Consolas" w:eastAsia="Consolas"/>
           <w:sz w:val="13"/>
         </w:rPr>
-        <w:t>└── Program.cs  94</w:t>
+        <w:t>└── Program.cs  90</w:t>
       </w:r>
     </w:p>
     <w:p>
@@ -11422,7 +11434,7 @@
                 <w:b w:val="0"/>
                 <w:sz w:val="16"/>
               </w:rPr>
-              <w:t>Controls/ScriptEditorControl.cs, SqlSyntaxHighlighter.cs, UndoRedoTracker.cs, SuggestPopup.cs; UI/LineNumberGutter.cs</w:t>
+              <w:t>Controls/ScriptEditorControl.cs (+ .EntityIndex.cs: chỉ mục entity cho F12), SqlSyntaxHighlighter.cs, UndoRedoTracker.cs, SuggestPopup.cs; UI/LineNumberGutter.cs</w:t>
             </w:r>
           </w:p>
         </w:tc>

</xml_diff>

<commit_message>
bcode| Cập nhật lại tài liệu kiến trúc
</commit_message>
<xml_diff>
--- a/Cấu trúc Bcode  BcodeViewer (v3 - Tóm tắt).docx
+++ b/Cấu trúc Bcode  BcodeViewer (v3 - Tóm tắt).docx
@@ -21,7 +21,7 @@
           <w:b w:val="0"/>
           <w:sz w:val="20"/>
         </w:rPr>
-        <w:t>BẢN TÓM TẮT (tra cứu nhanh) · v3 · cập nhật 15/10/2026 · @Bee · thay thế bản v2 (02/10/2026)</w:t>
+        <w:t>BẢN TÓM TẮT (tra cứu nhanh) · v3 · cập nhật 21/10/2026 · @Bee · thay thế bản v2 (02/10/2026)</w:t>
       </w:r>
     </w:p>
     <w:p>
@@ -90,7 +90,7 @@
         <w:rPr>
           <w:sz w:val="20"/>
         </w:rPr>
-        <w:t>Bộ Bcode gồm 4 chương trình (.exe) + 1 thư viện nhúng, cùng nằm trong solution Bcode.sln (D:\Bee\Tool\Bcode), đều xoay quanh FastBusiness ERP và định dạng file điều khiển "FCode" (controller XML kiểu Dir/Grid/Filter/Report, SQL và JavaScript nhúng bên trong).</w:t>
+        <w:t>Bộ Bcode gồm 4 chương trình (.exe) + 1 thư viện nhúng, cùng nằm trong solution Bcode.sln (D:\Bee\Tool\BcodeProject\Bcode-main), đều xoay quanh FastBusiness ERP và định dạng file điều khiển "FCode" (controller XML kiểu Dir/Grid/Filter/Report, SQL và JavaScript nhúng bên trong).</w:t>
       </w:r>
     </w:p>
     <w:p>
@@ -102,7 +102,7 @@
         <w:rPr>
           <w:sz w:val="20"/>
         </w:rPr>
-        <w:t>Bcode.App (Bcode.exe) — bộ công cụ quản trị/triển khai ERP, bản dựng lại của FCode: SQL Query/Table/Command, WCommand, File Lookup, Gen Update, Advance Note, API LT3, tạo báo cáo, check LCTT/CĐKT, biên bản Word... Gần như mọi màn hình là một trang HTML trong WebView2 (Web/Shell/*.html), C# chỉ giữ dữ liệu và nghiệp vụ.</w:t>
+        <w:t>Bcode.App (Bcode.exe) — bộ công cụ quản trị/triển khai ERP, bản dựng lại của FCode: SQL Query/Table/Command, WCommand, File Lookup, Gen Update, Advance Note, API LT3, tạo báo cáo, check LCTT/CĐKT, biên bản Word... Gần như mọi màn hình là một trang HTML trong WebView2 (Web/Shell/*.html), C# chỉ giữ dữ liệu và nghiệp vụ. Có 2 chế độ giao diện chọn lúc mở (--web / --native): Web (WebView2) và App (WinForms tự vẽ — NativePage / NK.* / Native*Control thay trang HTML, cùng giao thức action nên nghiệp vụ dùng chung).</w:t>
       </w:r>
     </w:p>
     <w:p>
@@ -755,7 +755,7 @@
                 <w:b w:val="0"/>
                 <w:sz w:val="17"/>
               </w:rPr>
-              <w:t>214 .cs + ~90 trang Web/Shell; tham chiếu Libs/*.dll, build kèm ScreenDesigner (chép vào ScreenDesigner\ cạnh exe)</w:t>
+              <w:t>306 .cs (Controls 101, Forms 62, Services 103; ~74 file Native* của chế độ App) + 80 trang Web/Shell; tham chiếu Libs/*.dll, build kèm ScreenDesigner (chép vào ScreenDesigner\ cạnh exe); docs/HuongDanSuDung.md chép thành Help\ cạnh exe</w:t>
             </w:r>
           </w:p>
         </w:tc>
@@ -829,7 +829,7 @@
                 <w:b w:val="0"/>
                 <w:sz w:val="17"/>
               </w:rPr>
-              <w:t>30 .cs + ~30 file Web (Monaco bundle ở Web/vs — vendor, bỏ qua)</w:t>
+              <w:t>32 .cs + 32 file Web (Monaco bundle ở Web/vs — vendor, bỏ qua)</w:t>
             </w:r>
           </w:p>
         </w:tc>
@@ -849,7 +849,7 @@
                 <w:b/>
                 <w:sz w:val="17"/>
               </w:rPr>
-              <w:t>src/Bcode.ScreenDesigner</w:t>
+              <w:t>docs/</w:t>
             </w:r>
           </w:p>
         </w:tc>
@@ -867,7 +867,7 @@
                 <w:b w:val="0"/>
                 <w:sz w:val="17"/>
               </w:rPr>
-              <w:t>BcodeScreenDesigner.exe</w:t>
+              <w:t>(tài liệu)</w:t>
             </w:r>
           </w:p>
         </w:tc>
@@ -885,7 +885,7 @@
                 <w:b w:val="0"/>
                 <w:sz w:val="17"/>
               </w:rPr>
-              <w:t>WinExe</w:t>
+              <w:t>—</w:t>
             </w:r>
           </w:p>
         </w:tc>
@@ -903,7 +903,7 @@
                 <w:b w:val="0"/>
                 <w:sz w:val="17"/>
               </w:rPr>
-              <w:t>DesignerBridge + Web/designer.*; dùng lại dirpreview.js/entity.js của Viewer</w:t>
+              <w:t>HuongDanSuDung.md = hướng dẫn người dùng cuối, cũng là nội dung tab Trợ giúp (Ctrl+F1); docs/images = ảnh chụp đánh số</w:t>
             </w:r>
           </w:p>
         </w:tc>
@@ -923,7 +923,7 @@
                 <w:b/>
                 <w:sz w:val="17"/>
               </w:rPr>
-              <w:t>src/Bcode.ReportBuilder</w:t>
+              <w:t>src/Bcode.ScreenDesigner</w:t>
             </w:r>
           </w:p>
         </w:tc>
@@ -941,7 +941,7 @@
                 <w:b w:val="0"/>
                 <w:sz w:val="17"/>
               </w:rPr>
-              <w:t>Bcode.ReportBuilder.dll</w:t>
+              <w:t>BcodeScreenDesigner.exe</w:t>
             </w:r>
           </w:p>
         </w:tc>
@@ -959,7 +959,7 @@
                 <w:b w:val="0"/>
                 <w:sz w:val="17"/>
               </w:rPr>
-              <w:t>Library (ConfuserEx khi Release)</w:t>
+              <w:t>WinExe</w:t>
             </w:r>
           </w:p>
         </w:tc>
@@ -977,7 +977,7 @@
                 <w:b w:val="0"/>
                 <w:sz w:val="17"/>
               </w:rPr>
-              <w:t>Module "Tạo báo cáo" kiểu Power BI; build tự chép vào Bcode.App/Libs; extern alias "rb"</w:t>
+              <w:t>DesignerBridge + Web/designer.*; dùng lại dirpreview.js/entity.js của Viewer</w:t>
             </w:r>
           </w:p>
         </w:tc>
@@ -997,7 +997,7 @@
                 <w:b/>
                 <w:sz w:val="17"/>
               </w:rPr>
-              <w:t>src/Bcode.KeyGen</w:t>
+              <w:t>src/Bcode.ReportBuilder</w:t>
             </w:r>
           </w:p>
         </w:tc>
@@ -1015,7 +1015,7 @@
                 <w:b w:val="0"/>
                 <w:sz w:val="17"/>
               </w:rPr>
-              <w:t>Bcode.KeyGen.exe</w:t>
+              <w:t>Bcode.ReportBuilder.dll</w:t>
             </w:r>
           </w:p>
         </w:tc>
@@ -1033,7 +1033,7 @@
                 <w:b w:val="0"/>
                 <w:sz w:val="17"/>
               </w:rPr>
-              <w:t>WinExe</w:t>
+              <w:t>Library (ConfuserEx khi Release)</w:t>
             </w:r>
           </w:p>
         </w:tc>
@@ -1051,7 +1051,7 @@
                 <w:b w:val="0"/>
                 <w:sz w:val="17"/>
               </w:rPr>
-              <w:t>Cấp key bản quyền theo máy (chỉ người phát hành)</w:t>
+              <w:t>Module "Tạo báo cáo" kiểu Power BI; build tự chép vào Bcode.App/Libs; extern alias "rb"</w:t>
             </w:r>
           </w:p>
         </w:tc>
@@ -1071,7 +1071,7 @@
                 <w:b/>
                 <w:sz w:val="17"/>
               </w:rPr>
-              <w:t>src/Shared</w:t>
+              <w:t>src/Bcode.KeyGen</w:t>
             </w:r>
           </w:p>
         </w:tc>
@@ -1089,7 +1089,7 @@
                 <w:b w:val="0"/>
                 <w:sz w:val="17"/>
               </w:rPr>
-              <w:t>(file link)</w:t>
+              <w:t>Bcode.KeyGen.exe</w:t>
             </w:r>
           </w:p>
         </w:tc>
@@ -1107,7 +1107,7 @@
                 <w:b w:val="0"/>
                 <w:sz w:val="17"/>
               </w:rPr>
-              <w:t>—</w:t>
+              <w:t>WinExe</w:t>
             </w:r>
           </w:p>
         </w:tc>
@@ -1125,7 +1125,7 @@
                 <w:b w:val="0"/>
                 <w:sz w:val="17"/>
               </w:rPr>
-              <w:t>AiWebHelper.cs (nhúng claude.ai/gemini), LicenseCodec.cs (bcrypt(SHA256(key|máy|IP)))</w:t>
+              <w:t>Cấp key bản quyền theo máy (chỉ người phát hành)</w:t>
             </w:r>
           </w:p>
         </w:tc>
@@ -1145,7 +1145,7 @@
                 <w:b/>
                 <w:sz w:val="17"/>
               </w:rPr>
-              <w:t>tools/lt3-api-docs</w:t>
+              <w:t>src/Shared</w:t>
             </w:r>
           </w:p>
         </w:tc>
@@ -1163,7 +1163,7 @@
                 <w:b w:val="0"/>
                 <w:sz w:val="17"/>
               </w:rPr>
-              <w:t>(node)</w:t>
+              <w:t>(file link)</w:t>
             </w:r>
           </w:p>
         </w:tc>
@@ -1181,7 +1181,7 @@
                 <w:b w:val="0"/>
                 <w:sz w:val="17"/>
               </w:rPr>
-              <w:t>fetch.mjs + convert.mjs</w:t>
+              <w:t>—</w:t>
             </w:r>
           </w:p>
         </w:tc>
@@ -1199,6 +1199,80 @@
                 <w:b w:val="0"/>
                 <w:sz w:val="17"/>
               </w:rPr>
+              <w:t>AiWebHelper.cs (nhúng claude.ai/gemini), LicenseCodec.cs (bcrypt(SHA256(key|máy|IP)))</w:t>
+            </w:r>
+          </w:p>
+        </w:tc>
+      </w:tr>
+      <w:tr>
+        <w:tc>
+          <w:tcPr>
+            <w:tcW w:type="dxa" w:w="2041"/>
+          </w:tcPr>
+          <w:p>
+            <w:pPr>
+              <w:spacing w:after="20"/>
+            </w:pPr>
+            <w:r/>
+            <w:r>
+              <w:rPr>
+                <w:b/>
+                <w:sz w:val="17"/>
+              </w:rPr>
+              <w:t>tools/lt3-api-docs</w:t>
+            </w:r>
+          </w:p>
+        </w:tc>
+        <w:tc>
+          <w:tcPr>
+            <w:tcW w:type="dxa" w:w="2041"/>
+          </w:tcPr>
+          <w:p>
+            <w:pPr>
+              <w:spacing w:after="20"/>
+            </w:pPr>
+            <w:r/>
+            <w:r>
+              <w:rPr>
+                <w:b w:val="0"/>
+                <w:sz w:val="17"/>
+              </w:rPr>
+              <w:t>(node)</w:t>
+            </w:r>
+          </w:p>
+        </w:tc>
+        <w:tc>
+          <w:tcPr>
+            <w:tcW w:type="dxa" w:w="1701"/>
+          </w:tcPr>
+          <w:p>
+            <w:pPr>
+              <w:spacing w:after="20"/>
+            </w:pPr>
+            <w:r/>
+            <w:r>
+              <w:rPr>
+                <w:b w:val="0"/>
+                <w:sz w:val="17"/>
+              </w:rPr>
+              <w:t>fetch.mjs + convert.mjs</w:t>
+            </w:r>
+          </w:p>
+        </w:tc>
+        <w:tc>
+          <w:tcPr>
+            <w:tcW w:type="dxa" w:w="4082"/>
+          </w:tcPr>
+          <w:p>
+            <w:pPr>
+              <w:spacing w:after="20"/>
+            </w:pPr>
+            <w:r/>
+            <w:r>
+              <w:rPr>
+                <w:b w:val="0"/>
+                <w:sz w:val="17"/>
+              </w:rPr>
               <w:t>Tải tài liệu API chuẩn LT3 → Templates/Api/lt3-standard.json</w:t>
             </w:r>
           </w:p>
@@ -1225,7 +1299,7 @@
       <w:r>
         <w:drawing>
           <wp:inline xmlns:a="http://schemas.openxmlformats.org/drawingml/2006/main" xmlns:pic="http://schemas.openxmlformats.org/drawingml/2006/picture">
-            <wp:extent cx="6336000" cy="4090413"/>
+            <wp:extent cx="6336000" cy="3756582"/>
             <wp:docPr id="1" name="Picture 1"/>
             <wp:cNvGraphicFramePr>
               <a:graphicFrameLocks noChangeAspect="1"/>
@@ -1246,7 +1320,7 @@
                   <pic:spPr>
                     <a:xfrm>
                       <a:off x="0" y="0"/>
-                      <a:ext cx="6336000" cy="4090413"/>
+                      <a:ext cx="6336000" cy="3756582"/>
                     </a:xfrm>
                     <a:prstGeom prst="rect"/>
                   </pic:spPr>
@@ -1289,7 +1363,7 @@
       <w:r>
         <w:drawing>
           <wp:inline xmlns:a="http://schemas.openxmlformats.org/drawingml/2006/main" xmlns:pic="http://schemas.openxmlformats.org/drawingml/2006/picture">
-            <wp:extent cx="6336000" cy="4907692"/>
+            <wp:extent cx="6336000" cy="5164923"/>
             <wp:docPr id="2" name="Picture 2"/>
             <wp:cNvGraphicFramePr>
               <a:graphicFrameLocks noChangeAspect="1"/>
@@ -1310,7 +1384,7 @@
                   <pic:spPr>
                     <a:xfrm>
                       <a:off x="0" y="0"/>
-                      <a:ext cx="6336000" cy="4907692"/>
+                      <a:ext cx="6336000" cy="5164923"/>
                     </a:xfrm>
                     <a:prstGeom prst="rect"/>
                   </pic:spPr>
@@ -1584,7 +1658,7 @@
       <w:r>
         <w:drawing>
           <wp:inline xmlns:a="http://schemas.openxmlformats.org/drawingml/2006/main" xmlns:pic="http://schemas.openxmlformats.org/drawingml/2006/picture">
-            <wp:extent cx="5376622" cy="8460000"/>
+            <wp:extent cx="4714371" cy="8460000"/>
             <wp:docPr id="5" name="Picture 5"/>
             <wp:cNvGraphicFramePr>
               <a:graphicFrameLocks noChangeAspect="1"/>
@@ -1605,7 +1679,7 @@
                   <pic:spPr>
                     <a:xfrm>
                       <a:off x="0" y="0"/>
-                      <a:ext cx="5376622" cy="8460000"/>
+                      <a:ext cx="4714371" cy="8460000"/>
                     </a:xfrm>
                     <a:prstGeom prst="rect"/>
                   </pic:spPr>
@@ -1636,7 +1710,7 @@
       <w:r>
         <w:drawing>
           <wp:inline xmlns:a="http://schemas.openxmlformats.org/drawingml/2006/main" xmlns:pic="http://schemas.openxmlformats.org/drawingml/2006/picture">
-            <wp:extent cx="6336000" cy="7003139"/>
+            <wp:extent cx="6336000" cy="7511973"/>
             <wp:docPr id="6" name="Picture 6"/>
             <wp:cNvGraphicFramePr>
               <a:graphicFrameLocks noChangeAspect="1"/>
@@ -1657,7 +1731,7 @@
                   <pic:spPr>
                     <a:xfrm>
                       <a:off x="0" y="0"/>
-                      <a:ext cx="6336000" cy="7003139"/>
+                      <a:ext cx="6336000" cy="7511973"/>
                     </a:xfrm>
                     <a:prstGeom prst="rect"/>
                   </pic:spPr>
@@ -1690,7 +1764,7 @@
           <w:b w:val="0"/>
           <w:sz w:val="18"/>
         </w:rPr>
-        <w:t>Tự sinh từ ổ đĩa ngày 15/10/2026. Số cuối dòng = số dòng file. Đã bỏ bin/, obj/, Libs/ (DLL) và Web/vs/ (Monaco vendor); thư mục có &gt;60 file chỉ ghi số lượng.</w:t>
+        <w:t>Tự sinh từ ổ đĩa ngày 21/10/2026. Số cuối dòng = số dòng file. Đã bỏ bin/, obj/, Libs/ (DLL) và Web/vs/ (Monaco vendor); thư mục có &gt;60 file chỉ ghi số lượng.</w:t>
       </w:r>
     </w:p>
     <w:p>
@@ -1998,7 +2072,7 @@
           <w:rFonts w:ascii="Consolas" w:hAnsi="Consolas" w:eastAsia="Consolas"/>
           <w:sz w:val="13"/>
         </w:rPr>
-        <w:t>│   ├── FileLookupControl.cs  1425</w:t>
+        <w:t>│   ├── FileLookupControl.cs  1340</w:t>
       </w:r>
     </w:p>
     <w:p>
@@ -2826,7 +2900,7 @@
           <w:rFonts w:ascii="Consolas" w:hAnsi="Consolas" w:eastAsia="Consolas"/>
           <w:sz w:val="13"/>
         </w:rPr>
-        <w:t>│   ├── ScriptEditorControl.EntityIndex.cs  176</w:t>
+        <w:t>│   ├── ScriptEditorControl.EntityIndex.cs  178</w:t>
       </w:r>
     </w:p>
     <w:p>
@@ -3474,7 +3548,7 @@
           <w:rFonts w:ascii="Consolas" w:hAnsi="Consolas" w:eastAsia="Consolas"/>
           <w:sz w:val="13"/>
         </w:rPr>
-        <w:t>│   ├── MainForm.cs  3617</w:t>
+        <w:t>│   ├── MainForm.cs  3623</w:t>
       </w:r>
     </w:p>
     <w:p>
@@ -3690,7 +3764,7 @@
           <w:rFonts w:ascii="Consolas" w:hAnsi="Consolas" w:eastAsia="Consolas"/>
           <w:sz w:val="13"/>
         </w:rPr>
-        <w:t>│   ├── SourceViewForm.cs  81</w:t>
+        <w:t>│   ├── SourceViewForm.cs  125</w:t>
       </w:r>
     </w:p>
     <w:p>
@@ -8234,7 +8308,7 @@
           <w:rFonts w:ascii="Consolas" w:hAnsi="Consolas" w:eastAsia="Consolas"/>
           <w:sz w:val="13"/>
         </w:rPr>
-        <w:t>└── Program.cs  90</w:t>
+        <w:t>└── Program.cs  94</w:t>
       </w:r>
     </w:p>
     <w:p>
@@ -8424,7 +8498,7 @@
                 <w:b w:val="0"/>
                 <w:sz w:val="16"/>
               </w:rPr>
-              <w:t>Forms/ProjectPickerForm.cs, ConnectionSettingsForm.cs, EditProjectForm.cs; Web/Shell/projects.html, connections.html, editproject.html; Services/DbConnectionService.cs; Models/Workspace.cs</w:t>
+              <w:t>Forms/ProjectPickerForm.cs (Web), NativeProjectPickerForm.cs (App), ProjectActions.cs (IProjectPicker + dữ liệu/thao tác dùng chung 2 giao diện), ConnectionSettingsForm.cs, EditProjectForm.cs;Web/Shell/projects.html, connections.html, editproject.html; Services/DbConnectionService.cs; Models/Workspace.cs</w:t>
             </w:r>
           </w:p>
         </w:tc>
@@ -9093,7 +9167,7 @@
                 <w:b w:val="0"/>
                 <w:sz w:val="16"/>
               </w:rPr>
-              <w:t>Giữ Shift khi mở = chế độ an toàn (bỏ CSS/HTML ghi đè). Template chỉnh font/màu/vị trí nút từng vùng.</w:t>
+              <w:t>Giữ Shift khi mở = chế độ an toàn (bỏ CSS/HTML ghi đè). Template chỉnh font/màu/vị trí nút từng vùng. ThemeManager.ThemeChanged là event TĨNH: đăng ký bằng ThemeManager.Subscribe(owner, handler) (tự gỡ khi owner Dispose) — lambda += không gỡ giữ control đã đóng trong RAM. Font đậm dùng ThemeManager.BoldFont (cache UiTemplate.GetFont), menu/toolbar dùng FlatToolStripRenderer.Shared. Chế độ App: thanh tiêu đề cửa sổ theo theme (ThemeManager.ApplyTitleBar: DWM dark mode, Win11 tô nền/chữ/viền = PanelAlt/Text/Border); chữ nút primary của toolbar = OnAccent, bo góc theo Template.</w:t>
             </w:r>
           </w:p>
         </w:tc>
@@ -9149,7 +9223,7 @@
                 <w:b w:val="0"/>
                 <w:sz w:val="16"/>
               </w:rPr>
-              <w:t>WebFrameHost = 1 WebView2 + nhiều iframe (framehost.html) để bớt RAM; RawSqlControl dùng nó cho khung kết quả (MergeSqlResultFrames) và tuỳ chọn gộp thanh nút + editor (MergeSqlBarEditor; mọi chỗ chạm trang qua EdExec/BarExec). WebBarHost.Sleepable + ISleepableTab = ngủ đông tab công cụ (Note, Lịch sử SQL, Check Mail, Setup eInvoice). BCODE_DATA_DIR = thư mục dữ liệu riêng để chạy thử. WebMenu = menu native theo theme. WebViewEnvironment: 1 môi trường WebView2 dùng chung + phím tắt toàn cục; thư mục dữ liệu %AppData%\Bcode\WebView2 bận (0x800700AA — trình duyệt cũ chưa thoát / Bcode khác giữ; lỗi lộ ra ở EnsureCoreWebView2Async) → InitAsync gọi RecoverBusyAsync: thử lại 5 × 600 ms rồi dùng hồ sơ phụ WebView2-&lt;n&gt;, báo ở thanh trạng thái (TempProfileNote) + webview2.log; hồ sơ phụ không còn ai giữ (khoá được EBWebView\lockfile) tự dọn sau khi controller đầu tiên tạo xong.</w:t>
+              <w:t>WebFrameHost = 1 WebView2 + nhiều iframe (framehost.html) để bớt RAM; RawSqlControl dùng nó cho khung kết quả (MergeSqlResultFrames) và tuỳ chọn gộp thanh nút + editor (MergeSqlBarEditor; mọi chỗ chạm trang qua EdExec/BarExec). WebBarHost.Sleepable + ISleepableTab = ngủ đông tab công cụ (Note, Lịch sử SQL, Check Mail, Setup eInvoice). BCODE_DATA_DIR = thư mục dữ liệu riêng để chạy thử. WebMenu = menu native theo theme; menu dài lăn chuột được (WebMenu.WheelScroller: IMessageFilter bắt WM_MOUSEWHEEL khi con trỏ trên menu / menu con → ToolStripDropDownMenu.ScrollInternal qua reflection, 3 mục/nấc, nuốt thông điệp). WebViewEnvironment: 1 môi trường WebView2 dùng chung + phím tắt toàn cục; thư mục dữ liệu %AppData%\Bcode\WebView2 bận (0x800700AA — trình duyệt cũ chưa thoát / Bcode khác giữ; lỗi lộ ra ở EnsureCoreWebView2Async) → InitAsync gọi RecoverBusyAsync: thử lại 5 × 600 ms rồi dùng hồ sơ phụ WebView2-&lt;n&gt;, báo ở thanh trạng thái (TempProfileNote) + webview2.log; hồ sơ phụ không còn ai giữ (khoá được EBWebView\lockfile) tự dọn sau khi controller đầu tiên tạo xong.</w:t>
             </w:r>
           </w:p>
         </w:tc>
@@ -9390,7 +9464,7 @@
                 <w:b w:val="0"/>
                 <w:sz w:val="16"/>
               </w:rPr>
-              <w:t>Services/SqlHintCatalog.cs, SqlHintService.cs, SqlHintPopular.cs, SqlFieldTransform.cs; Web/Shell/sqlhints.js, sqlhints-help.html; Controls/SqlHintsHelpControl.cs</w:t>
+              <w:t>Services/SqlHintCatalog.cs, SqlHintService.cs, SqlHintPopular.cs, SqlFieldTransform.cs, SqlHintEngine.cs; Web/Shell/sqlhints.js, sqlhints-help.html; Controls/SqlHintsHelpControl.cs; App: Controls/NativeSqlHints.cs + HintPopup.cs + SnippetSession.cs</w:t>
             </w:r>
           </w:p>
         </w:tc>
@@ -9408,7 +9482,7 @@
                 <w:b w:val="0"/>
                 <w:sz w:val="16"/>
               </w:rPr>
-              <w:t>Provider Monaco, hook onDidType; dữ liệu procedure/function/options lấy từ DB đang chọn. Xem memory bcode-sql-hints-gotchas.</w:t>
+              <w:t>Provider Monaco, hook onDidType; dữ liệu procedure/function/options lấy từ DB đang chọn. Xem memory bcode-sql-hints-gotchas, bcode-sql-typing-perf (provider tên bảng chạy mỗi phím trên ~15k bảng → phải cache/giới hạn). Chế độ App: SqlHintEngine chạy NGUYÊN Web/Shell/sqlhints.js bằng Jint (JS thuần .NET, không WebView2; vỏ "Monaco" giả gom provider; 1 engine dùng chung, nạp lười ~90 ms) trả HintItem (Start/End = khoảng thay thế), chữ ký tham số, cảnh báo biến chưa khai — sửa sqlhints.js / SqlHintCatalog là cả 2 chế độ cùng đổi; HintPopup = khung gợi ý nổi KHÔNG nhận focus (ô loại S/ƒ/P/▫ + chi tiết + xem trước); SnippetSession = chèn snippet kiểu Monaco vào Scintilla (${1:mặc định}, ${1|a,b|}, $0; Tab/Shift+Tab qua ô, ô cùng số chép theo).</w:t>
             </w:r>
           </w:p>
         </w:tc>
@@ -9502,7 +9576,7 @@
                 <w:b w:val="0"/>
                 <w:sz w:val="16"/>
               </w:rPr>
-              <w:t>Controls/TableEditControl.cs, NativeTableBar.cs; Services/TableDataService.cs, DataScriptService.cs, TableMenuService.cs; Forms/ListEditorForm.cs, RowDetailForm.cs, GotoColumnForm.cs, PartitionCheckForm.cs; Web/Shell/tablebar.html, tablestruct.html, partitioncheck.html; MainForm.WireTableMenu</w:t>
+              <w:t>Controls/TableEditControl.cs, NativeTableBar.cs; Services/TableDataService.cs, DataScriptService.cs, TableMenuService.cs; Forms/ListEditorForm.cs, RowDetailForm.cs, GotoColumnForm.cs, PartitionCheckForm.cs, ColumnDesignForm.cs; Web/Shell/tablebar.html, tablestruct.html, partitioncheck.html, listeditor.html, rowdetail.html, columndesign.html; MainForm.WireTableMenu</w:t>
             </w:r>
           </w:p>
         </w:tc>
@@ -9520,7 +9594,7 @@
                 <w:b w:val="0"/>
                 <w:sz w:val="16"/>
               </w:rPr>
-              <w:t>Sửa dữ liệu kiểu Excel; ô Top mặc định 0 = tất cả (Command mới mặc định TOP 500); Add Script = DELETE + INSERT; F1 chi tiết dòng, F3 khai báo nhanh danh sách. Dòng "Menu: Phiếu nhập kho (inctpnd.aspx)" dưới Where/Order (tablebar.html .menu-row / NativeTableBar.SetMenus; ẩn khi không tra được → thanh giữ chiều cao cũ): TableMenuService.FindAsync tra theo gốc tên bảng (bỏ $yyyymm/$000000/$log) — 1) dmct9 (App): c$/m$/d$/i$ → url → menu wcommand có link cùng trang aspx; 2) controller của menu: CommandTableService.ResolveIn (Dir table= + Grid chi tiết; table="&amp;Tag;" tra &lt;!ENTITY&gt; trong file Dir). Cache theo workspace + số menu trên cây, ⟳ Refresh database = Forget. Gõ thì chờ 300 ms, tải xong bảng thì tra ngay. Bấm menu → MenuRevealRequested → hiện cây WCommand + RevealAsync (chỉ chọn node, không mở File Lookup). Menu trùng tên ở nhiều phân hệ → thêm [phân hệ]; tối đa 4 + "+N". Chuột phải ô Table khi là bảng phân kỳ (xxx$yyyymm) → "Check Partitions Struct" (tablebar.html contextmenu → action table-context; App: NativeTableBar.ContextMenuHook bắt WM_CONTEXTMENU; bảng khác giữ menu mặc định) → Forms/PartitionCheckForm + Web/Shell/partitioncheck.html (App: Controls/NativePages.PartitionCheck.cs): TableDataService.CheckPartitionStructureAsync so mọi {prefix}$dddddd với {prefix}$000000 (1 câu INFORMATION_SCHEMA.COLUMNS) — thiếu / thừa cột, khác kiểu hoặc null, khác thứ tự cột; "Tables are same structure" khi giống hết; Copy ra Tab-separated.</w:t>
+              <w:t>Sửa dữ liệu kiểu Excel; Add New Column / Edit Column = ColumnDesignForm (bảng Name/Type/Length/Not NULL như hộp Design của FCode, App: ColumnDesignPage trong NativePages.Dialogs.cs) → BuildColumnScript (Gen Add / Alter Column); ô Top mặc định 0 = tất cả (Command mới mặc định TOP 500); Add Script = DELETE + INSERT; F1 chi tiết dòng, F3 khai báo nhanh danh sách. Dòng "Menu: Phiếu nhập kho (inctpnd.aspx)" dưới Where/Order (tablebar.html .menu-row / NativeTableBar.SetMenus; ẩn khi không tra được → thanh giữ chiều cao cũ): TableMenuService.FindAsync tra theo gốc tên bảng (bỏ $yyyymm/$000000/$log) — 1) dmct9 (App): c$/m$/d$/i$ → url → menu wcommand có link cùng trang aspx; 2) controller của menu: CommandTableService.ResolveIn (Dir table= + Grid chi tiết; table="&amp;Tag;" tra &lt;!ENTITY&gt; trong file Dir). Cache theo workspace + số menu trên cây, ⟳ Refresh database = Forget. Gõ thì chờ 300 ms, tải xong bảng thì tra ngay. Bấm menu → MenuRevealRequested → hiện cây WCommand + RevealAsync (chỉ chọn node, không mở File Lookup). Menu trùng tên ở nhiều phân hệ → thêm [phân hệ]; tối đa 4 + "+N". Chuột phải ô Table khi là bảng phân kỳ (xxx$yyyymm) → "Check Partitions Struct" (tablebar.html contextmenu → action table-context; App: NativeTableBar.ContextMenuHook bắt WM_CONTEXTMENU; bảng khác giữ menu mặc định) → Forms/PartitionCheckForm + Web/Shell/partitioncheck.html (App: Controls/NativePages.PartitionCheck.cs): TableDataService.CheckPartitionStructureAsync so mọi {prefix}$dddddd với {prefix}$000000 (1 câu INFORMATION_SCHEMA.COLUMNS) — thiếu / thừa cột, khác kiểu hoặc null, khác thứ tự cột; "Tables are same structure" khi giống hết; Copy ra Tab-separated.</w:t>
             </w:r>
           </w:p>
         </w:tc>
@@ -9558,7 +9632,7 @@
                 <w:b w:val="0"/>
                 <w:sz w:val="16"/>
               </w:rPr>
-              <w:t>Controls/SqlQueryControl.cs, LookupControl.cs; Services/SqlQueryService.cs, LookupService.cs, PeriodTableQueryService.cs; Web/Shell/commandquery.html, lookup.html</w:t>
+              <w:t>Controls/SqlQueryControl.cs, LookupControl.cs (App: NativeLookupControl.cs, NativeCommandPanel.cs); Services/SqlQueryService.cs, LookupService.cs, PeriodTableQueryService.cs, SqlDefinitionIndex.cs; Web/Shell/commandquery.html, lookup.html</w:t>
             </w:r>
           </w:p>
         </w:tc>
@@ -9576,7 +9650,7 @@
                 <w:b w:val="0"/>
                 <w:sz w:val="16"/>
               </w:rPr>
-              <w:t>Command tự chèn TOP 500, tự UNION bảng kỳ $000000, khung Fields bên trái.</w:t>
+              <w:t>Command tự chèn TOP 500, tự UNION bảng kỳ $000000, khung Fields bên trái. Lookup tìm "chữ có trong procedure" (như Search Text của FCode) qua SqlDefinitionIndex: giữ định nghĩa sys.sql_modules trong RAM + bản gz %AppData%\Bcode\sql-definitions theo (server, database), mỗi lần tìm chỉ hỏi danh sách object + modify_date rồi nạp lại phần đổi.</w:t>
             </w:r>
           </w:p>
         </w:tc>
@@ -10115,7 +10189,7 @@
                 <w:b w:val="0"/>
                 <w:sz w:val="16"/>
               </w:rPr>
-              <w:t>Cây file theo menu, cache theo dự án (%AppData%\Bcode\FileLookupCache), tô đỏ entity thiếu, tìm nội dung, Edit in BcodeViewer (Process.Start). Cấp source nhanh (FileLookupControl.QuickGrant.cs): chọn file .f Dir/Grid/Filter → dòng 2 thanh xem trước (filelookuppreview.html window.setSource; App: FileLookupPreviewBarPage) hiện phiên bản + thư mục kho (SourceGrantService.ResolveNearestLower: phiên bản dự án, không có thì phiên bản thấp hơn gần nhất cùng 3 chữ đầu; DetectVersion: nhiều phiên bản cùng số thì ưu tiên cùng 3 chữ đầu rồi 2 chữ đầu — FBISP24 → FBOR2SP24, không lấy TT24 của kho FAP), bấm nhãn = SourceViewForm, nút Cấp source = hỏi xác nhận rồi CopyRows; danh sách phiên bản cache 5 phút.</w:t>
+              <w:t>Cây file theo menu, cache theo dự án (%AppData%\Bcode\FileLookupCache), tô đỏ entity thiếu, tìm nội dung, Edit in BcodeViewer (Process.Start). Cấp source nhanh (FileLookupControl.QuickGrant.cs): chọn file .f Dir/Grid/Filter → dòng 2 thanh xem trước (filelookuppreview.html window.setSource; App: FileLookupPreviewBarPage) hiện phiên bản + thư mục kho (SourceGrantService.ResolveNearestLower: phiên bản dự án, không có thì phiên bản thấp hơn gần nhất cùng 3 chữ đầu; DetectVersion: nhiều phiên bản cùng số thì ưu tiên cùng 3 chữ đầu rồi 2 chữ đầu — FBISP24 → FBOR2SP24, không lấy TT24 của kho FAP), bấm nhãn = SourceViewForm, nút Cấp source = hỏi xác nhận rồi CopyRows; danh sách phiên bản cache 5 phút. Search Box (tìm nội dung) theo luật ở Template → tab "Tìm file" (uitemplate.html #tabSearch ↔ UiTemplateForm search-get/set/default ↔ AppSettings.Search*; FileLookupService.SetSearchRules / SearchRuleSet): File Type *.* chỉ quét "Đuôi file được tìm" (SearchIncludeExtensions, mặc định .xml .f .txt .js .sql .ent .xsd .css .config .json .html; trống = mọi đuôi), trừ "Đuôi luôn bỏ qua" và "nhị phân"; gõ rõ đuôi (*.cs) thì không xét danh sách; thư mục quét trong Controllers, bỏ .f đã biên dịch ở Dir/Filter/Grid, bỏ file &gt; N MB.</w:t>
             </w:r>
           </w:p>
         </w:tc>
@@ -12250,7 +12324,7 @@
                 <w:b w:val="0"/>
                 <w:sz w:val="16"/>
               </w:rPr>
-              <w:t>Mọi kích thước qua NativeSkin.S(px) / RowHeight = DPI × UiScale.Factor (cùng hệ số với cỡ chữ). NK.GridRow = hàng chia cột tỉ lệ, không xuống dòng (weight 0 = cột vừa nội dung cho nhãn/nút); NK.Padded bọc hàng có lề. CardPanel: tiêu đề + chú thích chỉ chiếm phần trống tới cụm nút RightBar (hẹp → cắt "…" + tooltip, không đè nút). PillButton chế độ App nhờ control cha vẽ nền dưới góc bo và chặn bán kính &lt; nửa cạnh ngắn. SmoothListBox vẽ từng dòng qua ảnh đệm (không nháy). ThemeManager.Apply (native) tự: double-buffer, UseMnemonic=false, thanh cuộn tối.</w:t>
+              <w:t>Mọi kích thước qua NativeSkin.S(px) / RowHeight = DPI × UiScale.Factor (cùng hệ số với cỡ chữ). NK.GridRow = hàng chia cột tỉ lệ, không xuống dòng (weight 0 = cột vừa nội dung cho nhãn/nút); NK.Padded bọc hàng có lề. CardPanel: tiêu đề + chú thích chỉ chiếm phần trống tới cụm nút RightBar (hẹp → cắt "…" + tooltip, không đè nút). PillButton chế độ App nhờ control cha vẽ nền dưới góc bo và chặn bán kính &lt; nửa cạnh ngắn. SmoothListBox vẽ từng dòng qua ảnh đệm (không nháy). ThemeManager.Apply (native) tự: double-buffer, UseMnemonic=false, thanh cuộn tối. Chú thích di chuột: NK.Tip(control, text) — 1 ToolTip chung mỗi form (gắn khi control vào form, gỡ khi control Dispose); KHÔNG new ToolTip() cho từng nút. DropDownButton &gt; 12 mục mở khung danh sách (ToolStripDropDown + ThemedListBox, cao tối đa 18 dòng, thanh cuộn tối, lăn chuột / ↑↓ / Enter / Esc, mục chọn ở giữa) như &lt;select&gt; của Web; ≤ 12 mục vẫn là WebMenu.</w:t>
             </w:r>
           </w:p>
         </w:tc>
@@ -12306,7 +12380,7 @@
                 <w:b w:val="0"/>
                 <w:sz w:val="16"/>
               </w:rPr>
-              <w:t>MainForm chọn theo UiMode.IsNative. SQL Query: Scintilla; kết quả 2 kiểu Xếp chồng (kéo đổi cao từng bảng) / Từng tab như resultview.html; tab Pivot = trang sqlpivot.html (WebView tạo khi bấm Pivot, nhận diện bằng PivotDetector.DetectForScript); Ctrl+chuột phải chèn định nghĩa object lên đầu + GO. Note (New) (NativeAdvanceNoteControl) đủ như advnote.html: tick-tất-cả ở tiêu đề danh sách, gợi ý tên table (SuggestPopup, khớp đầu trước/chứa sau), Mở tất cả script, xem nội dung mục gói có tô màu SQL/FCode, Request Content tô như richreq.js, nhớ "Tách theo từng y/c" (AppSettings.NoteSplit). Tab SQL Query native đã ngang Web: Debug từng bước (StepPlan của SqlStepPlanner, breakpoint = marker Scintilla ở lề 1, dòng sắp chạy = marker nền + mũi tên, thanh Step/Continue/To cursor/Stop; F10, Ctrl+F10, Shift+F5), AI Ctrl+I (SqlAiEditForm) + ghost-text (SqlAiAssist dùng chung prompt/engine với Web; hiện thành annotation chữ xám dưới dòng con trỏ, Tab nhận, Esc bỏ, Alt+\ gọi tay, tự gợi ý ở procedure/function), F12 peek (SqlPeekPanel: F12 xem tiếp, Ctrl+F12 mở tab, Esc lùi), thanh nút tuỳ biến (RebuildBar đọc SqlBarLayout — chung file sqlbar_layout.json với Web, “Tùy chỉnh thanh…” dùng QuickAccessForm), Check Fields, kéo thả file .sql vào editor, cỡ chữ lưu chung (AppSettings.SqlEditorZoom). Gợi ý cột theo ngữ cảnh có sẵn từ NativeSqlHints (chạy sqlhints.js). Khác Web chủ ý: không có ghost chèn giữa dòng (Scintilla không hỗ trợ).</w:t>
+              <w:t>MainForm chọn theo UiMode.IsNative. SQL Query: Scintilla; kết quả 2 kiểu Xếp chồng (kéo đổi cao từng bảng) / Từng tab như resultview.html; tab Pivot = trang sqlpivot.html (WebView tạo khi bấm Pivot, nhận diện bằng PivotDetector.DetectForScript); Ctrl+chuột phải chèn định nghĩa object lên đầu + GO. Note (New) (NativeAdvanceNoteControl) đủ như advnote.html: tick-tất-cả ở tiêu đề danh sách, gợi ý tên table (SuggestPopup, khớp đầu trước/chứa sau), Mở tất cả script, xem nội dung mục gói có tô màu SQL/FCode, Request Content tô như richreq.js, nhớ "Tách theo từng y/c" (AppSettings.NoteSplit). Tab SQL Query native đã ngang Web: Debug từng bước (StepPlan của SqlStepPlanner, breakpoint = marker Scintilla ở lề 1, dòng sắp chạy = marker nền + mũi tên, thanh Step/Continue/To cursor/Stop; F10, Ctrl+F10, Shift+F5), AI Ctrl+I (SqlAiEditForm) + ghost-text (SqlAiAssist dùng chung prompt/engine với Web; hiện thành annotation chữ xám dưới dòng con trỏ, Tab nhận, Esc bỏ, Alt+\ gọi tay, tự gợi ý ở procedure/function), F12 peek (SqlPeekPanel: F12 xem tiếp, Ctrl+F12 mở tab, Esc lùi), thanh nút tuỳ biến (RebuildBar đọc SqlBarLayout — chung file sqlbar_layout.json với Web, “Tùy chỉnh thanh…” dùng QuickAccessForm), Check Fields, kéo thả file .sql vào editor, cỡ chữ lưu chung (AppSettings.SqlEditorZoom). Gợi ý cột theo ngữ cảnh có sẵn từ NativeSqlHints (chạy sqlhints.js). Khác Web chủ ý: không có ghost chèn giữa dòng (Scintilla không hỗ trợ). Ctrl+S = lưu .sql (editor.save, mặc định Ctrl+S cả 2 chế độ), Ctrl+F = thanh tìm (editor.find — chỉ chế độ App: ShortcutDef.NativeDefault; Web dùng Ctrl+F của Monaco): NativeFindBar nổi góc trên-phải khung editor (rộng ≤ 420 px thiết kế, góc bo lấy nền editor qua UnderColor), không phân biệt hoa thường, quay vòng, "2/3", Enter/F3 · Shift+Enter · Esc. SqlScintilla.Configure chặn ký tự điều khiển (Ctrl+chữ chưa gắn lệnh từng chèn DC3/ACK) cho MỌI editor Scintilla — editor mới phải đi qua Configure.</w:t>
             </w:r>
           </w:p>
         </w:tc>
@@ -12814,7 +12888,7 @@
                 <w:b w:val="0"/>
                 <w:sz w:val="16"/>
               </w:rPr>
-              <w:t>Goto Response/Command/Function (F11), Open File Config, Chạy SQL, Dịch caption (Ctrl+Alt+T), Clone file, Get Hash Source, Ctrl+I (AI).</w:t>
+              <w:t>Goto Response/Command/Function (F11), Goto Function (F11 tại con trỏ), Goto File: &lt;controller&gt; (chỉ trên dòng &lt;items controller="X"&gt;), Open Folder &gt; (Images, App_Data\Controllers\Options|Lookup|Templates…) + Image File &gt;, Open File Config, Chạy SQL, Dịch caption (Ctrl+Alt+T), Clone file, Get Hash Source, Ctrl+I (AI). Phần mở thư mục/file chạy qua EditorBridge (host).</w:t>
             </w:r>
           </w:p>
         </w:tc>
@@ -12834,7 +12908,7 @@
                 <w:b/>
                 <w:sz w:val="16"/>
               </w:rPr>
-              <w:t>Lịch sử cục bộ + diff + phát hiện file đổi</w:t>
+              <w:t>Lịch sử cục bộ + lịch sử chung + diff + phát hiện file đổi</w:t>
             </w:r>
           </w:p>
         </w:tc>
@@ -12852,7 +12926,7 @@
                 <w:b w:val="0"/>
                 <w:sz w:val="16"/>
               </w:rPr>
-              <w:t>Web/history.js; Settings/LocalHistoryStore.cs; EditorBridge.BeginGetFileHistory/GetHistorySnapshot/GetFileWriteTimeUtc</w:t>
+              <w:t>Web/history.js; Settings/LocalHistoryStore.cs, SharedHistoryStore.cs; EditorBridge.BeginGetFileHistory/GetHistorySnapshot/GetFileWriteTimeUtc</w:t>
             </w:r>
           </w:p>
         </w:tc>
@@ -12870,6 +12944,7 @@
                 <w:b w:val="0"/>
                 <w:sz w:val="16"/>
               </w:rPr>
+              <w:t>LocalHistoryStore = chỉ trên máy người sửa. SharedHistoryStore = lịch sử CHUNG đặt trong dự án (thư mục "History" mà Bcode dùng cho lịch sử procedure, dưới "_files") để mọi máy cùng thấy, có ghi ai sửa.</w:t>
             </w:r>
           </w:p>
         </w:tc>
@@ -13559,6 +13634,62 @@
           </w:p>
         </w:tc>
       </w:tr>
+      <w:tr>
+        <w:tc>
+          <w:tcPr>
+            <w:tcW w:type="dxa" w:w="2041"/>
+          </w:tcPr>
+          <w:p>
+            <w:pPr>
+              <w:spacing w:after="20"/>
+            </w:pPr>
+            <w:r/>
+            <w:r>
+              <w:rPr>
+                <w:b/>
+                <w:sz w:val="16"/>
+              </w:rPr>
+              <w:t>Check Field (kiểu FCodeViewer)</w:t>
+            </w:r>
+          </w:p>
+        </w:tc>
+        <w:tc>
+          <w:tcPr>
+            <w:tcW w:type="dxa" w:w="3969"/>
+          </w:tcPr>
+          <w:p>
+            <w:pPr>
+              <w:spacing w:after="20"/>
+            </w:pPr>
+            <w:r/>
+            <w:r>
+              <w:rPr>
+                <w:b w:val="0"/>
+                <w:sz w:val="16"/>
+              </w:rPr>
+              <w:t>Web/checkfield.js (BcodeCheckField)</w:t>
+            </w:r>
+          </w:p>
+        </w:tc>
+        <w:tc>
+          <w:tcPr>
+            <w:tcW w:type="dxa" w:w="3855"/>
+          </w:tcPr>
+          <w:p>
+            <w:pPr>
+              <w:spacing w:after="20"/>
+            </w:pPr>
+            <w:r/>
+            <w:r>
+              <w:rPr>
+                <w:b w:val="0"/>
+                <w:sz w:val="16"/>
+              </w:rPr>
+              <w:t>Đọc &lt;fields&gt; của file Grid / Dir đang mở, đối chiếu &lt;views&gt; (Grid: &lt;field name&gt;; Dir: [biến] trong &lt;item&gt;): Declare · Duplicate Declare · Allow Contain · View · Duplicate View, kèm đoạn XML view để copy. Tab Header: HeaderV/HeaderE; Grid tick/bỏ tick cột View để thêm/bớt &lt;field name&gt;. Chỉ đọc source đang mở; sửa đều qua editor (Ctrl+Z được).</w:t>
+            </w:r>
+          </w:p>
+        </w:tc>
+      </w:tr>
     </w:tbl>
     <w:p>
       <w:pPr>
@@ -14165,7 +14296,7 @@
                 <w:b w:val="0"/>
                 <w:sz w:val="16"/>
               </w:rPr>
-              <w:t>Web/templates.js; Settings/HintSnippetStore.cs, FileTemplateStore.cs</w:t>
+              <w:t>Web/templates.js; Settings/HintSnippetStore.cs, FileTemplateStore.cs; HintCodeForm.cs + Web/hint-editor.html (bản WinForms dự phòng, Monaco nhỏ); UI/WaitCursorScope.cs</w:t>
             </w:r>
           </w:p>
         </w:tc>
@@ -14183,6 +14314,7 @@
                 <w:b w:val="0"/>
                 <w:sz w:val="16"/>
               </w:rPr>
+              <w:t>WaitCursorScope = đồng hồ cát trong khối using quanh các lần nạp mẫu/snippet dùng chung (đã chuyển sang await).</w:t>
             </w:r>
           </w:p>
         </w:tc>
@@ -14737,7 +14869,7 @@
                 <w:b/>
                 <w:sz w:val="17"/>
               </w:rPr>
-              <w:t>Ctrl+3 / Ctrl+5</w:t>
+              <w:t>Ctrl+3 / Ctrl+4 / Ctrl+5</w:t>
             </w:r>
           </w:p>
         </w:tc>
@@ -14755,7 +14887,7 @@
                 <w:b w:val="0"/>
                 <w:sz w:val="17"/>
               </w:rPr>
-              <w:t>SQL Profiler / mở Program Path</w:t>
+              <w:t>SQL Profiler / FSG FBO (ở cây WCommand: mở FBO, tự đăng nhập rồi vào đúng menu) / mở Program Path</w:t>
             </w:r>
           </w:p>
         </w:tc>
@@ -15022,6 +15154,44 @@
                 <w:sz w:val="17"/>
               </w:rPr>
               <w:t>Chạy, Beauty, xem nhanh object, mở object sang tab mới, wrap, AI, gọi gợi ý AI, lưu vào Lịch sử SQL</w:t>
+            </w:r>
+          </w:p>
+        </w:tc>
+      </w:tr>
+      <w:tr>
+        <w:tc>
+          <w:tcPr>
+            <w:tcW w:type="dxa" w:w="3628"/>
+          </w:tcPr>
+          <w:p>
+            <w:pPr>
+              <w:spacing w:after="20"/>
+            </w:pPr>
+            <w:r/>
+            <w:r>
+              <w:rPr>
+                <w:b/>
+                <w:sz w:val="17"/>
+              </w:rPr>
+              <w:t>Editor SQL: Ctrl+S / Ctrl+F</w:t>
+            </w:r>
+          </w:p>
+        </w:tc>
+        <w:tc>
+          <w:tcPr>
+            <w:tcW w:type="dxa" w:w="6236"/>
+          </w:tcPr>
+          <w:p>
+            <w:pPr>
+              <w:spacing w:after="20"/>
+            </w:pPr>
+            <w:r/>
+            <w:r>
+              <w:rPr>
+                <w:b w:val="0"/>
+                <w:sz w:val="17"/>
+              </w:rPr>
+              <w:t>Lưu file .sql (cả 2 chế độ) / thanh tìm nổi góc phải (chế độ App; Web dùng Ctrl+F của Monaco)</w:t>
             </w:r>
           </w:p>
         </w:tc>
@@ -15940,6 +16110,62 @@
                 <w:b/>
                 <w:sz w:val="16"/>
               </w:rPr>
+              <w:t>…\sql-definitions\&lt;hash&gt;.gz</w:t>
+            </w:r>
+          </w:p>
+        </w:tc>
+        <w:tc>
+          <w:tcPr>
+            <w:tcW w:type="dxa" w:w="964"/>
+          </w:tcPr>
+          <w:p>
+            <w:pPr>
+              <w:spacing w:after="20"/>
+            </w:pPr>
+            <w:r/>
+            <w:r>
+              <w:rPr>
+                <w:b w:val="0"/>
+                <w:sz w:val="16"/>
+              </w:rPr>
+              <w:t>Bcode</w:t>
+            </w:r>
+          </w:p>
+        </w:tc>
+        <w:tc>
+          <w:tcPr>
+            <w:tcW w:type="dxa" w:w="5216"/>
+          </w:tcPr>
+          <w:p>
+            <w:pPr>
+              <w:spacing w:after="20"/>
+            </w:pPr>
+            <w:r/>
+            <w:r>
+              <w:rPr>
+                <w:b w:val="0"/>
+                <w:sz w:val="16"/>
+              </w:rPr>
+              <w:t>SqlDefinitionIndex: định nghĩa procedure/function/view/trigger theo (server, database) cho Lookup tìm chữ trong procedure (xoá được, tự dựng lại).</w:t>
+            </w:r>
+          </w:p>
+        </w:tc>
+      </w:tr>
+      <w:tr>
+        <w:tc>
+          <w:tcPr>
+            <w:tcW w:type="dxa" w:w="3685"/>
+          </w:tcPr>
+          <w:p>
+            <w:pPr>
+              <w:spacing w:after="20"/>
+            </w:pPr>
+            <w:r/>
+            <w:r>
+              <w:rPr>
+                <w:b/>
+                <w:sz w:val="16"/>
+              </w:rPr>
               <w:t>…\AdvanceNotes\, Notes\, session\, sql-history\, query-history\, quickreport-backup\, Backups\, Traces\</w:t>
             </w:r>
           </w:p>
@@ -16838,7 +17064,7 @@
                 <w:b w:val="0"/>
                 <w:sz w:val="17"/>
               </w:rPr>
-              <w:t>1) Controls/NativePages.&lt;Ten&gt;.cs: lớp kế thừa NativePage, dựng bằng NK.* / CardPanel (kích thước qua NativeSkin.S), Dispatch các lời gọi "ns.fn" mà C# chủ gọi xuống, Post(new { action = ... }) đúng tên action của trang HTML  2) đăng ký 1 dòng ở NativePages.Register.cs ("&lt;ten&gt;.html")  3) control chủ (WebBarHost) không phải sửa. Control dùng WebView2 thô: thêm nhánh if (UiMode.IsNative). Không đụng trang HTML / nhánh Web.</w:t>
+              <w:t>1) Controls/NativePages.&lt;Ten&gt;.cs: lớp kế thừa NativePage, dựng bằng NK.* / CardPanel (kích thước qua NativeSkin.S), Dispatch các lời gọi "ns.fn" mà C# chủ gọi xuống, Post(new { action = ... }) đúng tên action của trang HTML  2) đăng ký 1 dòng ở NativePages.Register.cs ("&lt;ten&gt;.html")  3) control chủ (WebBarHost) không phải sửa. Control dùng WebView2 thô: thêm nhánh if (UiMode.IsNative). Không đụng trang HTML / nhánh Web. Theo đổi theme: ThemeManager.Subscribe(this, …) (không ThemeChanged += lambda); chú thích: NK.Tip; editor Scintilla: SqlScintilla.Configure; ô chọn: DropDownButton.</w:t>
             </w:r>
           </w:p>
         </w:tc>
@@ -16858,7 +17084,7 @@
                 <w:b/>
                 <w:sz w:val="17"/>
               </w:rPr>
-              <w:t>Xem thử màn hình native không cần chạy Bcode / database</w:t>
+              <w:t>Cập nhật tài liệu cấu trúc (file này, STRUCTURE-TREE.md, 2 file .docx, sơ đồ)</w:t>
             </w:r>
           </w:p>
         </w:tc>
@@ -16876,6 +17102,44 @@
                 <w:b w:val="0"/>
                 <w:sz w:val="17"/>
               </w:rPr>
+              <w:t>Sửa _docwork/content.py (bảng tính năng) + _docwork/diagrams.py (sơ đồ: dg_overview, dg_bcode, dg_viewer, 2 cây tính năng) → chạy diagrams.py, build.py (bản tóm tắt + STRUCTURE.md + STRUCTURE-TREE.md tự quét ổ đĩa), FULL=1 build.py (bản đầy đủ). Cần Python có python-docx + lxml + matplotlib: C:\Python\python.exe có docx/lxml nhưng THIẾU matplotlib, `py` mặc định là 3.13t thiếu lxml → tạo venv riêng (python -m venv … ; pip install matplotlib python-docx lxml). Script tự tính gốc repo từ vị trí _docwork (không còn cứng đường dẫn).</w:t>
+            </w:r>
+          </w:p>
+        </w:tc>
+      </w:tr>
+      <w:tr>
+        <w:tc>
+          <w:tcPr>
+            <w:tcW w:type="dxa" w:w="2494"/>
+          </w:tcPr>
+          <w:p>
+            <w:pPr>
+              <w:spacing w:after="20"/>
+            </w:pPr>
+            <w:r/>
+            <w:r>
+              <w:rPr>
+                <w:b/>
+                <w:sz w:val="17"/>
+              </w:rPr>
+              <w:t>Xem thử màn hình native không cần chạy Bcode / database</w:t>
+            </w:r>
+          </w:p>
+        </w:tc>
+        <w:tc>
+          <w:tcPr>
+            <w:tcW w:type="dxa" w:w="7370"/>
+          </w:tcPr>
+          <w:p>
+            <w:pPr>
+              <w:spacing w:after="20"/>
+            </w:pPr>
+            <w:r/>
+            <w:r>
+              <w:rPr>
+                <w:b w:val="0"/>
+                <w:sz w:val="17"/>
+              </w:rPr>
               <w:t>Chương trình "pageshot" (scratchpad của phiên, xem memory bcode-native-mode): nạp lớp NativePage từ Bcode.dll bằng reflection, Dispatch dữ liệu mẫu, chụp bằng PrintWindow; có chế độ bar (WebBarHost), results (NativeResultPane), scintilla FCODE|TSQL, form &lt;Lớp&gt;. Kiểm màu bằng GetStyleAt / đọc pixel, đừng tin ảnh thu nhỏ.</w:t>
             </w:r>
           </w:p>
@@ -17084,7 +17348,7 @@
         <w:rPr>
           <w:sz w:val="19"/>
         </w:rPr>
-        <w:t>Scintilla.NET 5: không có Lexer.Container (ném lỗi) — tự tô bằng SCI_SETILEXER(null) + StyleNeeded; LexerName vẫn báo tên cũ sau khi gỡ.</w:t>
+        <w:t>Scintilla.NET 5: không có Lexer.Container (ném lỗi) — tự tô bằng SCI_SETILEXER(null) + StyleNeeded; LexerName vẫn báo tên cũ sau khi gỡ. Ctrl + chữ chưa gắn lệnh: Windows vẫn gửi WM_CHAR mã điều khiển và Scintilla CHÈN vào văn bản (Ctrl+S → DC3, Ctrl+F → ACK) — SqlScintilla.Configure gắn KeyPress chặn; editor Scintilla nào không qua Configure sẽ bị lại.</w:t>
       </w:r>
     </w:p>
     <w:p>
@@ -17096,7 +17360,7 @@
         <w:rPr>
           <w:sz w:val="19"/>
         </w:rPr>
-        <w:t>Write Schema → .rpt (RptSchemaService): SDK Crystal là .NET Framework nên chạy qua powershell.exe 5.1; script tạm phải ghi UTF-8 CÓ BOM (không BOM = đọc theo ANSI, hỏng tiếng Việt → lỗi cú pháp). Khoá kết nối ADO.NET (XML) là "File Path " (có dấu cách cuối). Đổi nguồn mà xsd mới thiếu cột report đang dùng thì Crystal âm thầm XOÁ ô / tham chiếu đó khỏi layout — form đã cảnh báo và sao lưu .rpt.bak.</w:t>
+        <w:t>Rò RAM kiểu event tĩnh: ThemeManager.ThemeChanged (static) giữ mọi handler → lambda += không gỡ làm control / form / tab đã đóng sống mãi (từng gặp ở CardPanel = mọi thẻ native, NativeQueryHistory, MonacoPreview.Native, EntityMultiPeek.Native, ScriptPopup, Setup eInvoice). Dùng ThemeManager.Subscribe(owner, handler). Tương tự: new ToolTip() mỗi nút giữ tham chiếu control + 1 cửa sổ Windows → dùng NK.Tip; Font/Region GDI tạo trong Apply/OnPaint phải dùng cache hoặc using.</w:t>
       </w:r>
     </w:p>
     <w:p>
@@ -17108,15 +17372,7 @@
         <w:rPr>
           <w:sz w:val="19"/>
         </w:rPr>
-        <w:t>Chế độ App: nhiều control Dock=Top trong 1 panel có thể bị đảo z-order khi đổi Visible / tạo handle (khung nội dung nhảy lên trên lưới) — thứ tự quan trọng thì đặt lại bằng Controls.SetChildIndex mỗi lần hiện. Cột DataGridView rộng cố định cắt chữ khi phóng to: dùng AutoSizeMode AllCells/ColumnHeader + SortMode NotSortable; cột hẹp thì ẩn dần cột phụ thay vì cuộn ngang.</w:t>
-      </w:r>
-    </w:p>
-    <w:p>
-      <w:pPr>
-        <w:pStyle w:val="Heading1"/>
-      </w:pPr>
-      <w:r>
-        <w:t>K. Thay đổi so với v2 (02/10/2026)</w:t>
+        <w:t>Hai chế độ cùng 1 code: phím mặc định khác nhau theo chế độ khai bằng ShortcutDef.NativeDefault (Default đọc UiMode lúc gọi, không lúc khởi tạo static). Code dùng chung Web/App (ThemeManager, FlatToolStripRenderer, PillButton, ThemedForm) muốn chỉ đổi chế độ App thì bọc if (UiMode.IsNative).</w:t>
       </w:r>
     </w:p>
     <w:p>
@@ -17128,7 +17384,7 @@
         <w:rPr>
           <w:sz w:val="19"/>
         </w:rPr>
-        <w:t>Mới ở Bcode.App: Command Palette, tab switcher, nhóm công cụ, khôi phục phiên + ngủ đông, Chế độ hiệu năng, Template giao diện/UiScale/UiOverrides/ShortcutRegistry, WebFrameHost (giảm RAM), SQL history + Lịch sử SQL + So sánh object + Ai đang dùng, gợi ý code SQL, debug từng bước, Check Include, Check LCTT/CĐKT, Biên bản Word, Tạo nhanh danh mục, Tạo báo cáo (Bcode.ReportBuilder), Create RPT &amp; XML, Excel → FRX, Check Mail, Setup eInvoice dạng tab, Báo cáo yêu cầu FSG, Cấp source/Copy to nhiều file, key bản quyền (+Bcode.KeyGen), Claude/Gemini nhúng, API chuẩn LT3.</w:t>
+        <w:t>Write Schema → .rpt (RptSchemaService): SDK Crystal là .NET Framework nên chạy qua powershell.exe 5.1; script tạm phải ghi UTF-8 CÓ BOM (không BOM = đọc theo ANSI, hỏng tiếng Việt → lỗi cú pháp). Khoá kết nối ADO.NET (XML) là "File Path " (có dấu cách cuối). Đổi nguồn mà xsd mới thiếu cột report đang dùng thì Crystal âm thầm XOÁ ô / tham chiếu đó khỏi layout — form đã cảnh báo và sao lưu .rpt.bak.</w:t>
       </w:r>
     </w:p>
     <w:p>
@@ -17140,7 +17396,15 @@
         <w:rPr>
           <w:sz w:val="19"/>
         </w:rPr>
-        <w:t>Project mới: Bcode.ScreenDesigner, Bcode.ReportBuilder, Bcode.KeyGen, Shared/, tools/lt3-api-docs.</w:t>
+        <w:t>Chế độ App: nhiều control Dock=Top trong 1 panel có thể bị đảo z-order khi đổi Visible / tạo handle (khung nội dung nhảy lên trên lưới) — thứ tự quan trọng thì đặt lại bằng Controls.SetChildIndex mỗi lần hiện. Cột DataGridView rộng cố định cắt chữ khi phóng to: dùng AutoSizeMode AllCells/ColumnHeader + SortMode NotSortable; cột hẹp thì ẩn dần cột phụ thay vì cuộn ngang.</w:t>
+      </w:r>
+    </w:p>
+    <w:p>
+      <w:pPr>
+        <w:pStyle w:val="Heading1"/>
+      </w:pPr>
+      <w:r>
+        <w:t>K. Thay đổi so với v2 (02/10/2026)</w:t>
       </w:r>
     </w:p>
     <w:p>
@@ -17152,7 +17416,7 @@
         <w:rPr>
           <w:sz w:val="19"/>
         </w:rPr>
-        <w:t>BcodeViewer: giao diện chuyển sang web shell (shell.js, ui.js, keys.js, quickopen.js, tabswitcher.js, mailpreview.js); thêm CaptionTranslator, IncludeTree, VsCodeThemeImporter, FcodeFieldDictionary; QuickOpenForm.cs (WinForms) đã bỏ — thay bằng quickopen.js.</w:t>
+        <w:t>Mới ở Bcode.App: Command Palette, tab switcher, nhóm công cụ, khôi phục phiên + ngủ đông, Chế độ hiệu năng, Template giao diện/UiScale/UiOverrides/ShortcutRegistry, WebFrameHost (giảm RAM), SQL history + Lịch sử SQL + So sánh object + Ai đang dùng, gợi ý code SQL, debug từng bước, Check Include, Check LCTT/CĐKT, Biên bản Word, Tạo nhanh danh mục, Tạo báo cáo (Bcode.ReportBuilder), Create RPT &amp; XML, Excel → FRX, Check Mail, Setup eInvoice dạng tab, Báo cáo yêu cầu FSG, Cấp source/Copy to nhiều file, key bản quyền (+Bcode.KeyGen), Claude/Gemini nhúng, API chuẩn LT3.</w:t>
       </w:r>
     </w:p>
     <w:p>
@@ -17164,7 +17428,87 @@
         <w:rPr>
           <w:sz w:val="19"/>
         </w:rPr>
+        <w:t>Project mới: Bcode.ScreenDesigner, Bcode.ReportBuilder, Bcode.KeyGen, Shared/, tools/lt3-api-docs.</w:t>
+      </w:r>
+    </w:p>
+    <w:p>
+      <w:pPr>
+        <w:pStyle w:val="ListBullet"/>
+        <w:spacing w:after="40"/>
+      </w:pPr>
+      <w:r>
+        <w:rPr>
+          <w:sz w:val="19"/>
+        </w:rPr>
+        <w:t>BcodeViewer: giao diện chuyển sang web shell (shell.js, ui.js, keys.js, quickopen.js, tabswitcher.js, mailpreview.js); thêm CaptionTranslator, IncludeTree, VsCodeThemeImporter, FcodeFieldDictionary; QuickOpenForm.cs (WinForms) đã bỏ — thay bằng quickopen.js.</w:t>
+      </w:r>
+    </w:p>
+    <w:p>
+      <w:pPr>
+        <w:pStyle w:val="ListBullet"/>
+        <w:spacing w:after="40"/>
+      </w:pPr>
+      <w:r>
+        <w:rPr>
+          <w:sz w:val="19"/>
+        </w:rPr>
         <w:t>Sửa nhận định cũ: pipe Bcode.Control.&lt;session&gt; NAY ĐANG DÙNG cho lệnh "sql|" ("Debug trong Bcode"); lệnh "fsg|" vẫn còn handler nhưng F5 của Viewer đi thẳng MenuLauncher (mở trình duyệt). v2 ghi là chưa ai gọi.</w:t>
+      </w:r>
+    </w:p>
+    <w:p>
+      <w:pPr>
+        <w:pStyle w:val="Heading1"/>
+      </w:pPr>
+      <w:r>
+        <w:t>L. Thay đổi 15/10 → 21/10/2026</w:t>
+      </w:r>
+    </w:p>
+    <w:p>
+      <w:pPr>
+        <w:pStyle w:val="ListBullet"/>
+        <w:spacing w:after="40"/>
+      </w:pPr>
+      <w:r>
+        <w:rPr>
+          <w:sz w:val="19"/>
+        </w:rPr>
+        <w:t>Chế độ App (WinForms) gần ngang chế độ Web: SQL Query native có Debug từng bước, AI Ctrl+I + ghost, F12 peek, thanh nút tuỳ biến, Ctrl+S lưu / Ctrl+F thanh tìm nổi góc phải; gợi ý SQL chạy nguyên sqlhints.js bằng Jint (SqlHintEngine); ô chọn dài thành khung danh sách; menu dài lăn chuột được; thanh tiêu đề theo theme; sửa rò RAM (ThemeManager.Subscribe, NK.Tip, font/region/renderer dùng chung); chặn ký tự điều khiển trong mọi editor Scintilla.</w:t>
+      </w:r>
+    </w:p>
+    <w:p>
+      <w:pPr>
+        <w:pStyle w:val="ListBullet"/>
+        <w:spacing w:after="40"/>
+      </w:pPr>
+      <w:r>
+        <w:rPr>
+          <w:sz w:val="19"/>
+        </w:rPr>
+        <w:t>Mới ở Bcode.App: Mobile (bảng dvcommand + MobileService), Trợ giúp (docs/HuongDanSuDung.md, Ctrl+F1), Thông báo yêu cầu FSG (chuông 🔔, kéo nvphyc định kỳ), lọc Yêu cầu FSG theo menu (chuột phải cây WCommand), AI tạo danh mục từ yêu cầu (+ bộ luật FastCatalogRules khi chưa có API key, màn khai báo số liệu), Write Schema .xsd d1..dN + cập nhật .rpt, Table: dòng "Menu:" của bảng + Check Partitions Struct + thiết kế cột, Lookup tìm chữ trong procedure (SqlDefinitionIndex), Mail kế hoạch tuần (Sent, phản hồi, Reply), Ctrl+O dự án khác mở cửa sổ mới, FSG FBO Ctrl+4 + F12 DevTools gắn bên phải, tự xử lý WebView2 bận (0x800700AA), Template → Tìm file có "Đuôi file được tìm".</w:t>
+      </w:r>
+    </w:p>
+    <w:p>
+      <w:pPr>
+        <w:pStyle w:val="ListBullet"/>
+        <w:spacing w:after="40"/>
+      </w:pPr>
+      <w:r>
+        <w:rPr>
+          <w:sz w:val="19"/>
+        </w:rPr>
+        <w:t>BcodeViewer: Ctrl+Tab nhẹ (không dựng lại cây, không treo khi đang xem trước Dir), menu chuột phải Goto File / Goto Function / Open Folder / Image File, Open Web.config, Check Field, Từ điển dịch, lịch sử chung trong dự án (SharedHistoryStore), log độ mượt (perfwatch.js).</w:t>
+      </w:r>
+    </w:p>
+    <w:p>
+      <w:pPr>
+        <w:pStyle w:val="ListBullet"/>
+        <w:spacing w:after="40"/>
+      </w:pPr>
+      <w:r>
+        <w:rPr>
+          <w:sz w:val="19"/>
+        </w:rPr>
+        <w:t>Tài liệu: script _docwork tự tính gốc repo (không còn cứng D:\Bee\Tool\Bcode); sơ đồ thêm lớp Chế độ App và nhánh "Chế độ App" trong cây tính năng.</w:t>
       </w:r>
     </w:p>
     <w:sectPr>

</xml_diff>

<commit_message>
bcode, bcodeviewer| fix 1 loat thu
</commit_message>
<xml_diff>
--- a/Cấu trúc Bcode  BcodeViewer (v3 - Tóm tắt).docx
+++ b/Cấu trúc Bcode  BcodeViewer (v3 - Tóm tắt).docx
@@ -1710,7 +1710,7 @@
       <w:r>
         <w:drawing>
           <wp:inline xmlns:a="http://schemas.openxmlformats.org/drawingml/2006/main" xmlns:pic="http://schemas.openxmlformats.org/drawingml/2006/picture">
-            <wp:extent cx="6336000" cy="7511973"/>
+            <wp:extent cx="6336000" cy="7732914"/>
             <wp:docPr id="6" name="Picture 6"/>
             <wp:cNvGraphicFramePr>
               <a:graphicFrameLocks noChangeAspect="1"/>
@@ -1731,7 +1731,7 @@
                   <pic:spPr>
                     <a:xfrm>
                       <a:off x="0" y="0"/>
-                      <a:ext cx="6336000" cy="7511973"/>
+                      <a:ext cx="6336000" cy="7732914"/>
                     </a:xfrm>
                     <a:prstGeom prst="rect"/>
                   </pic:spPr>
@@ -2144,6 +2144,18 @@
           <w:rFonts w:ascii="Consolas" w:hAnsi="Consolas" w:eastAsia="Consolas"/>
           <w:sz w:val="13"/>
         </w:rPr>
+        <w:t>│   ├── GoToBox.cs  288</w:t>
+      </w:r>
+    </w:p>
+    <w:p>
+      <w:pPr>
+        <w:spacing w:after="0" w:before="0" w:line="240" w:lineRule="auto"/>
+      </w:pPr>
+      <w:r>
+        <w:rPr>
+          <w:rFonts w:ascii="Consolas" w:hAnsi="Consolas" w:eastAsia="Consolas"/>
+          <w:sz w:val="13"/>
+        </w:rPr>
         <w:t>│   ├── HelpControl.cs  90</w:t>
       </w:r>
     </w:p>
@@ -2228,19 +2240,19 @@
           <w:rFonts w:ascii="Consolas" w:hAnsi="Consolas" w:eastAsia="Consolas"/>
           <w:sz w:val="13"/>
         </w:rPr>
-        <w:t>│   ├── MonacoPreviewControl.cs  215</w:t>
-      </w:r>
-    </w:p>
-    <w:p>
-      <w:pPr>
-        <w:spacing w:after="0" w:before="0" w:line="240" w:lineRule="auto"/>
-      </w:pPr>
-      <w:r>
-        <w:rPr>
-          <w:rFonts w:ascii="Consolas" w:hAnsi="Consolas" w:eastAsia="Consolas"/>
-          <w:sz w:val="13"/>
-        </w:rPr>
-        <w:t>│   ├── MonacoPreviewControl.Native.cs  102</w:t>
+        <w:t>│   ├── MonacoPreviewControl.cs  210</w:t>
+      </w:r>
+    </w:p>
+    <w:p>
+      <w:pPr>
+        <w:spacing w:after="0" w:before="0" w:line="240" w:lineRule="auto"/>
+      </w:pPr>
+      <w:r>
+        <w:rPr>
+          <w:rFonts w:ascii="Consolas" w:hAnsi="Consolas" w:eastAsia="Consolas"/>
+          <w:sz w:val="13"/>
+        </w:rPr>
+        <w:t>│   ├── MonacoPreviewControl.Native.cs  134</w:t>
       </w:r>
     </w:p>
     <w:p>
@@ -2732,7 +2744,7 @@
           <w:rFonts w:ascii="Consolas" w:hAnsi="Consolas" w:eastAsia="Consolas"/>
           <w:sz w:val="13"/>
         </w:rPr>
-        <w:t>│   ├── NativeShellBars.cs  271</w:t>
+        <w:t>│   ├── NativeShellBars.cs  295</w:t>
       </w:r>
     </w:p>
     <w:p>
@@ -2888,7 +2900,19 @@
           <w:rFonts w:ascii="Consolas" w:hAnsi="Consolas" w:eastAsia="Consolas"/>
           <w:sz w:val="13"/>
         </w:rPr>
-        <w:t>│   ├── ScriptEditorControl.cs  1214</w:t>
+        <w:t>│   ├── SafeTreeView.cs  40</w:t>
+      </w:r>
+    </w:p>
+    <w:p>
+      <w:pPr>
+        <w:spacing w:after="0" w:before="0" w:line="240" w:lineRule="auto"/>
+      </w:pPr>
+      <w:r>
+        <w:rPr>
+          <w:rFonts w:ascii="Consolas" w:hAnsi="Consolas" w:eastAsia="Consolas"/>
+          <w:sz w:val="13"/>
+        </w:rPr>
+        <w:t>│   ├── ScriptEditorControl.cs  1087</w:t>
       </w:r>
     </w:p>
     <w:p>
@@ -3548,7 +3572,7 @@
           <w:rFonts w:ascii="Consolas" w:hAnsi="Consolas" w:eastAsia="Consolas"/>
           <w:sz w:val="13"/>
         </w:rPr>
-        <w:t>│   ├── MainForm.cs  3623</w:t>
+        <w:t>│   ├── MainForm.cs  3648</w:t>
       </w:r>
     </w:p>
     <w:p>
@@ -3872,7 +3896,7 @@
           <w:rFonts w:ascii="Consolas" w:hAnsi="Consolas" w:eastAsia="Consolas"/>
           <w:sz w:val="13"/>
         </w:rPr>
-        <w:t>│   ├── UiTemplateForm.cs  651</w:t>
+        <w:t>│   ├── UiTemplateForm.cs  660</w:t>
       </w:r>
     </w:p>
     <w:p>
@@ -5600,7 +5624,7 @@
           <w:rFonts w:ascii="Consolas" w:hAnsi="Consolas" w:eastAsia="Consolas"/>
           <w:sz w:val="13"/>
         </w:rPr>
-        <w:t>│   ├── ThemeManager.cs  715</w:t>
+        <w:t>│   ├── ThemeManager.cs  718</w:t>
       </w:r>
     </w:p>
     <w:p>
@@ -5660,7 +5684,7 @@
           <w:rFonts w:ascii="Consolas" w:hAnsi="Consolas" w:eastAsia="Consolas"/>
           <w:sz w:val="13"/>
         </w:rPr>
-        <w:t>│   ├── UiTemplate.cs  475</w:t>
+        <w:t>│   ├── UiTemplate.cs  505</w:t>
       </w:r>
     </w:p>
     <w:p>
@@ -6080,7 +6104,7 @@
           <w:rFonts w:ascii="Consolas" w:hAnsi="Consolas" w:eastAsia="Consolas"/>
           <w:sz w:val="13"/>
         </w:rPr>
-        <w:t>│       ├── filepreview.html  157</w:t>
+        <w:t>│       ├── filepreview.html  194</w:t>
       </w:r>
     </w:p>
     <w:p>
@@ -6644,7 +6668,7 @@
           <w:rFonts w:ascii="Consolas" w:hAnsi="Consolas" w:eastAsia="Consolas"/>
           <w:sz w:val="13"/>
         </w:rPr>
-        <w:t>│       ├── topbar.html  183</w:t>
+        <w:t>│       ├── topbar.html  202</w:t>
       </w:r>
     </w:p>
     <w:p>
@@ -6680,7 +6704,7 @@
           <w:rFonts w:ascii="Consolas" w:hAnsi="Consolas" w:eastAsia="Consolas"/>
           <w:sz w:val="13"/>
         </w:rPr>
-        <w:t>│       ├── uitemplate.html  1094</w:t>
+        <w:t>│       ├── uitemplate.html  1098</w:t>
       </w:r>
     </w:p>
     <w:p>
@@ -6752,7 +6776,7 @@
           <w:rFonts w:ascii="Consolas" w:hAnsi="Consolas" w:eastAsia="Consolas"/>
           <w:sz w:val="13"/>
         </w:rPr>
-        <w:t>├── Bcode.App.csproj  140</w:t>
+        <w:t>├── Bcode.App.csproj  141</w:t>
       </w:r>
     </w:p>
     <w:p>
@@ -6952,7 +6976,7 @@
           <w:rFonts w:ascii="Consolas" w:hAnsi="Consolas" w:eastAsia="Consolas"/>
           <w:sz w:val="13"/>
         </w:rPr>
-        <w:t>│   ├── EditorBridge.cs  1427</w:t>
+        <w:t>│   ├── EditorBridge.cs  1436</w:t>
       </w:r>
     </w:p>
     <w:p>
@@ -6988,6 +7012,18 @@
           <w:rFonts w:ascii="Consolas" w:hAnsi="Consolas" w:eastAsia="Consolas"/>
           <w:sz w:val="13"/>
         </w:rPr>
+        <w:t>│   ├── SearchFileCache.cs  139</w:t>
+      </w:r>
+    </w:p>
+    <w:p>
+      <w:pPr>
+        <w:spacing w:after="0" w:before="0" w:line="240" w:lineRule="auto"/>
+      </w:pPr>
+      <w:r>
+        <w:rPr>
+          <w:rFonts w:ascii="Consolas" w:hAnsi="Consolas" w:eastAsia="Consolas"/>
+          <w:sz w:val="13"/>
+        </w:rPr>
         <w:t>│   ├── SqlRunnerService.cs  560</w:t>
       </w:r>
     </w:p>
@@ -7024,7 +7060,7 @@
           <w:rFonts w:ascii="Consolas" w:hAnsi="Consolas" w:eastAsia="Consolas"/>
           <w:sz w:val="13"/>
         </w:rPr>
-        <w:t>│   └── WorkspaceSearchService.cs  311</w:t>
+        <w:t>│   └── WorkspaceSearchService.cs  336</w:t>
       </w:r>
     </w:p>
     <w:p>
@@ -7180,7 +7216,7 @@
           <w:rFonts w:ascii="Consolas" w:hAnsi="Consolas" w:eastAsia="Consolas"/>
           <w:sz w:val="13"/>
         </w:rPr>
-        <w:t>│   └── ViewerSettings.cs  181</w:t>
+        <w:t>│   └── ViewerSettings.cs  195</w:t>
       </w:r>
     </w:p>
     <w:p>
@@ -7384,7 +7420,7 @@
           <w:rFonts w:ascii="Consolas" w:hAnsi="Consolas" w:eastAsia="Consolas"/>
           <w:sz w:val="13"/>
         </w:rPr>
-        <w:t>│   ├── dirview.js  292</w:t>
+        <w:t>│   ├── dirview.js  437</w:t>
       </w:r>
     </w:p>
     <w:p>
@@ -7420,7 +7456,7 @@
           <w:rFonts w:ascii="Consolas" w:hAnsi="Consolas" w:eastAsia="Consolas"/>
           <w:sz w:val="13"/>
         </w:rPr>
-        <w:t>│   ├── entity.js  1323</w:t>
+        <w:t>│   ├── entity.js  1344</w:t>
       </w:r>
     </w:p>
     <w:p>
@@ -7444,7 +7480,7 @@
           <w:rFonts w:ascii="Consolas" w:hAnsi="Consolas" w:eastAsia="Consolas"/>
           <w:sz w:val="13"/>
         </w:rPr>
-        <w:t>│   ├── goto.js  285</w:t>
+        <w:t>│   ├── goto.js  296</w:t>
       </w:r>
     </w:p>
     <w:p>
@@ -7492,19 +7528,19 @@
           <w:rFonts w:ascii="Consolas" w:hAnsi="Consolas" w:eastAsia="Consolas"/>
           <w:sz w:val="13"/>
         </w:rPr>
-        <w:t>│   ├── index.html  231</w:t>
-      </w:r>
-    </w:p>
-    <w:p>
-      <w:pPr>
-        <w:spacing w:after="0" w:before="0" w:line="240" w:lineRule="auto"/>
-      </w:pPr>
-      <w:r>
-        <w:rPr>
-          <w:rFonts w:ascii="Consolas" w:hAnsi="Consolas" w:eastAsia="Consolas"/>
-          <w:sz w:val="13"/>
-        </w:rPr>
-        <w:t>│   ├── keys.js  205</w:t>
+        <w:t>│   ├── index.html  232</w:t>
+      </w:r>
+    </w:p>
+    <w:p>
+      <w:pPr>
+        <w:spacing w:after="0" w:before="0" w:line="240" w:lineRule="auto"/>
+      </w:pPr>
+      <w:r>
+        <w:rPr>
+          <w:rFonts w:ascii="Consolas" w:hAnsi="Consolas" w:eastAsia="Consolas"/>
+          <w:sz w:val="13"/>
+        </w:rPr>
+        <w:t>│   ├── keys.js  210</w:t>
       </w:r>
     </w:p>
     <w:p>
@@ -7600,19 +7636,19 @@
           <w:rFonts w:ascii="Consolas" w:hAnsi="Consolas" w:eastAsia="Consolas"/>
           <w:sz w:val="13"/>
         </w:rPr>
-        <w:t>│   ├── settings.js  589</w:t>
-      </w:r>
-    </w:p>
-    <w:p>
-      <w:pPr>
-        <w:spacing w:after="0" w:before="0" w:line="240" w:lineRule="auto"/>
-      </w:pPr>
-      <w:r>
-        <w:rPr>
-          <w:rFonts w:ascii="Consolas" w:hAnsi="Consolas" w:eastAsia="Consolas"/>
-          <w:sz w:val="13"/>
-        </w:rPr>
-        <w:t>│   ├── shell.js  636</w:t>
+        <w:t>│   ├── settings.js  693</w:t>
+      </w:r>
+    </w:p>
+    <w:p>
+      <w:pPr>
+        <w:spacing w:after="0" w:before="0" w:line="240" w:lineRule="auto"/>
+      </w:pPr>
+      <w:r>
+        <w:rPr>
+          <w:rFonts w:ascii="Consolas" w:hAnsi="Consolas" w:eastAsia="Consolas"/>
+          <w:sz w:val="13"/>
+        </w:rPr>
+        <w:t>│   ├── shell.js  603</w:t>
       </w:r>
     </w:p>
     <w:p>
@@ -7636,7 +7672,7 @@
           <w:rFonts w:ascii="Consolas" w:hAnsi="Consolas" w:eastAsia="Consolas"/>
           <w:sz w:val="13"/>
         </w:rPr>
-        <w:t>│   ├── style.css  956</w:t>
+        <w:t>│   ├── style.css  961</w:t>
       </w:r>
     </w:p>
     <w:p>
@@ -7685,6 +7721,18 @@
           <w:sz w:val="13"/>
         </w:rPr>
         <w:t>│   ├── theme.js  207</w:t>
+      </w:r>
+    </w:p>
+    <w:p>
+      <w:pPr>
+        <w:spacing w:after="0" w:before="0" w:line="240" w:lineRule="auto"/>
+      </w:pPr>
+      <w:r>
+        <w:rPr>
+          <w:rFonts w:ascii="Consolas" w:hAnsi="Consolas" w:eastAsia="Consolas"/>
+          <w:sz w:val="13"/>
+        </w:rPr>
+        <w:t>│   ├── toolbar.js  594</w:t>
       </w:r>
     </w:p>
     <w:p>
@@ -9167,7 +9215,7 @@
                 <w:b w:val="0"/>
                 <w:sz w:val="16"/>
               </w:rPr>
-              <w:t>Giữ Shift khi mở = chế độ an toàn (bỏ CSS/HTML ghi đè). Template chỉnh font/màu/vị trí nút từng vùng. ThemeManager.ThemeChanged là event TĨNH: đăng ký bằng ThemeManager.Subscribe(owner, handler) (tự gỡ khi owner Dispose) — lambda += không gỡ giữ control đã đóng trong RAM. Font đậm dùng ThemeManager.BoldFont (cache UiTemplate.GetFont), menu/toolbar dùng FlatToolStripRenderer.Shared. Chế độ App: thanh tiêu đề cửa sổ theo theme (ThemeManager.ApplyTitleBar: DWM dark mode, Win11 tô nền/chữ/viền = PanelAlt/Text/Border); chữ nút primary của toolbar = OnAccent, bo góc theo Template.</w:t>
+              <w:t>Giữ Shift khi mở = chế độ an toàn (bỏ CSS/HTML ghi đè). Template chỉnh font/màu/vị trí nút từng vùng. Thanh trên: UiTemplate.ScriptOrder = thứ tự nút có sẵn (TopButtons: Script + deploy/ext/claude/gemini/help) và "tool:key" = nút thanh công cụ kéo lên (TopOrder/TopToolKeys; topbar.html applyLayout, NativeTopBar.SetScriptLayout; RebuildToolsBar bỏ các nút đó, nhóm Quick Access giữ nguyên). Cây vẽ tay dùng Controls/SafeTreeView.cs (chặn NRE TreeView.CustomDraw khi Áp dụng đổi ItemHeight). ThemeManager.ThemeChanged là event TĨNH: đăng ký bằng ThemeManager.Subscribe(owner, handler) (tự gỡ khi owner Dispose) — lambda += không gỡ giữ control đã đóng trong RAM. Font đậm dùng ThemeManager.BoldFont (cache UiTemplate.GetFont), menu/toolbar dùng FlatToolStripRenderer.Shared. Chế độ App: thanh tiêu đề cửa sổ theo theme (ThemeManager.ApplyTitleBar: DWM dark mode, Win11 tô nền/chữ/viền = PanelAlt/Text/Border); chữ nút primary của toolbar = OnAccent, bo góc theo Template.</w:t>
             </w:r>
           </w:p>
         </w:tc>
@@ -10171,7 +10219,7 @@
                 <w:b w:val="0"/>
                 <w:sz w:val="16"/>
               </w:rPr>
-              <w:t>Controls/FileLookupControl.cs (1500 dòng), FileLookupControl.QuickGrant.cs, MonacoPreviewControl.cs; Services/FileLookupService.cs, FileParseCache.cs, EntityCheckService.cs; Web/Shell/filelookupbar.html, filelookuppreview.html, filepreview.html, searchbox.html, entitypeek.html; Forms/EntityMultiPeekForm.cs</w:t>
+              <w:t>Controls/FileLookupControl.cs (1500 dòng), FileLookupControl.QuickGrant.cs, MonacoPreviewControl.cs (Web/Shell/filepreview.html: Ctrl+G Go to dùng chung goto.js của BcodeViewer, link lúc build như theme.js; chế độ App + ScriptEditorControl: Controls/GoToBox.cs = bản C# của goto.js — Scan cho ra y hệt (đã so 300 file mẫu / 6.736 mục), hộp WinForms vẽ theo CSS #gotoBox, khung Scintilla tô mục hay dùng bằng indicator 16/17 + marker 20/21; vị trí ScintillaNET tính theo KÝ TỰ — MonacoPreviewControl.Native.Pos, trước đây đổi sang byte làm Ctrl+G / F12 lệch ở file có tiếng Việt); Services/FileLookupService.cs, FileParseCache.cs, EntityCheckService.cs; Web/Shell/filelookupbar.html, filelookuppreview.html, filepreview.html, searchbox.html, entitypeek.html; Forms/EntityMultiPeekForm.cs</w:t>
             </w:r>
           </w:p>
         </w:tc>
@@ -13612,7 +13660,7 @@
                 <w:b w:val="0"/>
                 <w:sz w:val="16"/>
               </w:rPr>
-              <w:t>Web/search.js; Host/WorkspaceSearchService.cs; EditorBridge.BeginSearchWorkspace/BeginReplaceInWorkspace</w:t>
+              <w:t>Web/search.js; Host/WorkspaceSearchService.cs, SearchFileCache.cs; EditorBridge.BeginSearchWorkspace/BeginReplaceInWorkspace</w:t>
             </w:r>
           </w:p>
         </w:tc>
@@ -13630,6 +13678,7 @@
                 <w:b w:val="0"/>
                 <w:sz w:val="16"/>
               </w:rPr>
+              <w:t>Đọc 12 file song song (PLINQ AsOrdered — giữ thứ tự kết quả) + SearchFileCache nhớ nội dung theo kích thước + giờ sửa lấy từ lượt liệt kê thư mục, lưu nén ở %LocalAppData%\BcodeViewer\searchcache. Đo App_Data 11.000 file trên UNC, từ không có: 378 s → lần đầu 39 s, lần sau 0,2 s, sau khi mở lại 1,5 s. Tra entity cả project (SearchFiles, F12) dùng chung bản nhớ; F12 trên &amp;lt; &amp;gt; &amp;amp; &amp;#..; / &lt;!ENTITY, SYSTEM thì báo ngay (entity.js notEntityReason) — trước đây quét tới giới hạn 6 s.</w:t>
             </w:r>
           </w:p>
         </w:tc>
@@ -13852,6 +13901,62 @@
                 <w:b/>
                 <w:sz w:val="16"/>
               </w:rPr>
+              <w:t>Dòng thiết kế &lt;item value="mặt nạ: [biến]..."&gt; (tô màu, hover, cờ)</w:t>
+            </w:r>
+          </w:p>
+        </w:tc>
+        <w:tc>
+          <w:tcPr>
+            <w:tcW w:type="dxa" w:w="3969"/>
+          </w:tcPr>
+          <w:p>
+            <w:pPr>
+              <w:spacing w:after="20"/>
+            </w:pPr>
+            <w:r/>
+            <w:r>
+              <w:rPr>
+                <w:b w:val="0"/>
+                <w:sz w:val="16"/>
+              </w:rPr>
+              <w:t>Web/dirview.js; style.css (.fcd-*)</w:t>
+            </w:r>
+          </w:p>
+        </w:tc>
+        <w:tc>
+          <w:tcPr>
+            <w:tcW w:type="dxa" w:w="3855"/>
+          </w:tcPr>
+          <w:p>
+            <w:pPr>
+              <w:spacing w:after="20"/>
+            </w:pPr>
+            <w:r/>
+            <w:r>
+              <w:rPr>
+                <w:b w:val="0"/>
+                <w:sz w:val="16"/>
+              </w:rPr>
+              <w:t>Tô màu mặt nạ/biến/bề rộng; hover biến = bề rộng + Header + dòng "Cờ" (vị trí/giá trị trong mặt nạ). Chuột hoặc con trỏ trên biến ↔ chữ số mặt nạ → tô khung cả cặp (decoration theo editor, hookEditor). Ghép biến ↔ chữ số y hệt dirpreview.parseRows ('1' thứ n + các '0' sau); &amp;entity; ngoài [..] hoặc giữa mặt nạ → viền đứt / "không xác định". parse() nhớ theo versionId.</w:t>
+            </w:r>
+          </w:p>
+        </w:tc>
+      </w:tr>
+      <w:tr>
+        <w:tc>
+          <w:tcPr>
+            <w:tcW w:type="dxa" w:w="2041"/>
+          </w:tcPr>
+          <w:p>
+            <w:pPr>
+              <w:spacing w:after="20"/>
+            </w:pPr>
+            <w:r/>
+            <w:r>
+              <w:rPr>
+                <w:b/>
+                <w:sz w:val="16"/>
+              </w:rPr>
               <w:t>Xem trước mail/SMS mẫu (Alt+P ở Message.xml...)</w:t>
             </w:r>
           </w:p>
@@ -14147,6 +14252,62 @@
                 <w:sz w:val="16"/>
               </w:rPr>
               <w:t>Cây file nhóm theo Project do MainForm giữ rồi đẩy sang trang. Actions: Clear Structure App / Open Web.config / Refresh Web.config (MainForm.ClearStructureApp, OpenWebConfig, RefreshWebConfig — site theo file đang mở, WorkspaceConnection.ResolveSourceRoot). Ngôn ngữ tô màu theo đuôi: editor.js detectLanguage (.config/.xsd… = xml, đuôi lạ có nội dung XML = xml).</w:t>
+            </w:r>
+          </w:p>
+        </w:tc>
+      </w:tr>
+      <w:tr>
+        <w:tc>
+          <w:tcPr>
+            <w:tcW w:type="dxa" w:w="2041"/>
+          </w:tcPr>
+          <w:p>
+            <w:pPr>
+              <w:spacing w:after="20"/>
+            </w:pPr>
+            <w:r/>
+            <w:r>
+              <w:rPr>
+                <w:b/>
+                <w:sz w:val="16"/>
+              </w:rPr>
+              <w:t>Thanh công cụ tuỳ biến (ghim, nhóm, kéo thả, vị trí)</w:t>
+            </w:r>
+          </w:p>
+        </w:tc>
+        <w:tc>
+          <w:tcPr>
+            <w:tcW w:type="dxa" w:w="3969"/>
+          </w:tcPr>
+          <w:p>
+            <w:pPr>
+              <w:spacing w:after="20"/>
+            </w:pPr>
+            <w:r/>
+            <w:r>
+              <w:rPr>
+                <w:b w:val="0"/>
+                <w:sz w:val="16"/>
+              </w:rPr>
+              <w:t>Web/toolbar.js (BcodeTbModel, BcodeToolbar); shell.js SHELL_TOOLBAR (icon, cmd); keys.js bar.group1..9; settings.js (Bố cục); Settings/ViewerSettings.cs ToolbarOrder/ToolbarGroups/HiddenToolbarItems/LayoutPrefs</w:t>
+            </w:r>
+          </w:p>
+        </w:tc>
+        <w:tc>
+          <w:tcPr>
+            <w:tcW w:type="dxa" w:w="3855"/>
+          </w:tcPr>
+          <w:p>
+            <w:pPr>
+              <w:spacing w:after="20"/>
+            </w:pPr>
+            <w:r/>
+            <w:r>
+              <w:rPr>
+                <w:b w:val="0"/>
+                <w:sz w:val="16"/>
+              </w:rPr>
+              <w:t>Như Quick Access + nhóm công cụ của Bcode, làm lại trong trang. Token: tên nút / "|" / "cmd:&lt;id&gt;" / "grp:&lt;id&gt;"; nhóm = nút "Tên ▾" thả menu, Alt+N (bar.groupN) mở nhóm thứ N; bỏ ghim = hiddenToolbar (chạy lại ở ⚙ Toolbar → Nút chưa ghim). Kéo thả trên thanh tự làm bằng mousedown/mousemove (nút giữ focus editor nên không dùng HTML5 drag); thả giữa nút nhóm = cho vào nhóm. Gợi ý nhóm = BcodeTbModel.SUGGESTED/suggest (menu ⚙ Toolbar, chuột phải thanh, Settings → Bố cục). layout.toolbarPos top|menu|bottom (#shellBottom tạo khi cần), layout.toolbarStyle text|both|icon. Thứ tự trùng mặc định + không nhóm → lưu rỗng (nút mới của bản cập nhật tự chèn cạnh nút đứng trước nó — BcodeTbModel.normalize).</w:t>
             </w:r>
           </w:p>
         </w:tc>

</xml_diff>

<commit_message>
bcode| fix menu kéo thiếu folder lookup ở chứng từ
</commit_message>
<xml_diff>
--- a/Cấu trúc Bcode  BcodeViewer (v3 - Tóm tắt).docx
+++ b/Cấu trúc Bcode  BcodeViewer (v3 - Tóm tắt).docx
@@ -4688,6 +4688,18 @@
           <w:rFonts w:ascii="Consolas" w:hAnsi="Consolas" w:eastAsia="Consolas"/>
           <w:sz w:val="13"/>
         </w:rPr>
+        <w:t>│   ├── DtdIncludeResolver.cs  196</w:t>
+      </w:r>
+    </w:p>
+    <w:p>
+      <w:pPr>
+        <w:spacing w:after="0" w:before="0" w:line="240" w:lineRule="auto"/>
+      </w:pPr>
+      <w:r>
+        <w:rPr>
+          <w:rFonts w:ascii="Consolas" w:hAnsi="Consolas" w:eastAsia="Consolas"/>
+          <w:sz w:val="13"/>
+        </w:rPr>
         <w:t>│   ├── EInvoiceSetupService.cs  179</w:t>
       </w:r>
     </w:p>
@@ -4748,19 +4760,19 @@
           <w:rFonts w:ascii="Consolas" w:hAnsi="Consolas" w:eastAsia="Consolas"/>
           <w:sz w:val="13"/>
         </w:rPr>
-        <w:t>│   ├── FileLookupService.cs  1165</w:t>
-      </w:r>
-    </w:p>
-    <w:p>
-      <w:pPr>
-        <w:spacing w:after="0" w:before="0" w:line="240" w:lineRule="auto"/>
-      </w:pPr>
-      <w:r>
-        <w:rPr>
-          <w:rFonts w:ascii="Consolas" w:hAnsi="Consolas" w:eastAsia="Consolas"/>
-          <w:sz w:val="13"/>
-        </w:rPr>
-        <w:t>│   ├── FileParseCache.cs  373</w:t>
+        <w:t>│   ├── FileLookupService.cs  1213</w:t>
+      </w:r>
+    </w:p>
+    <w:p>
+      <w:pPr>
+        <w:spacing w:after="0" w:before="0" w:line="240" w:lineRule="auto"/>
+      </w:pPr>
+      <w:r>
+        <w:rPr>
+          <w:rFonts w:ascii="Consolas" w:hAnsi="Consolas" w:eastAsia="Consolas"/>
+          <w:sz w:val="13"/>
+        </w:rPr>
+        <w:t>│   ├── FileParseCache.cs  375</w:t>
       </w:r>
     </w:p>
     <w:p>
@@ -10219,7 +10231,7 @@
                 <w:b w:val="0"/>
                 <w:sz w:val="16"/>
               </w:rPr>
-              <w:t>Controls/FileLookupControl.cs (1500 dòng), FileLookupControl.QuickGrant.cs, MonacoPreviewControl.cs (Web/Shell/filepreview.html: Ctrl+G Go to dùng chung goto.js của BcodeViewer, link lúc build như theme.js; chế độ App + ScriptEditorControl: Controls/GoToBox.cs = bản C# của goto.js — Scan cho ra y hệt (đã so 300 file mẫu / 6.736 mục), hộp WinForms vẽ theo CSS #gotoBox, khung Scintilla tô mục hay dùng bằng indicator 16/17 + marker 20/21; vị trí ScintillaNET tính theo KÝ TỰ — MonacoPreviewControl.Native.Pos, trước đây đổi sang byte làm Ctrl+G / F12 lệch ở file có tiếng Việt); Services/FileLookupService.cs, FileParseCache.cs, EntityCheckService.cs; Web/Shell/filelookupbar.html, filelookuppreview.html, filepreview.html, searchbox.html, entitypeek.html; Forms/EntityMultiPeekForm.cs</w:t>
+              <w:t>Controls/FileLookupControl.cs (1500 dòng), FileLookupControl.QuickGrant.cs, MonacoPreviewControl.cs (Web/Shell/filepreview.html: Ctrl+G Go to dùng chung goto.js của BcodeViewer, link lúc build như theme.js; chế độ App + ScriptEditorControl: Controls/GoToBox.cs = bản C# của goto.js — Scan cho ra y hệt (đã so 300 file mẫu / 6.736 mục), hộp WinForms vẽ theo CSS #gotoBox, khung Scintilla tô mục hay dùng bằng indicator 16/17 + marker 20/21; vị trí ScintillaNET tính theo KÝ TỰ — MonacoPreviewControl.Native.Pos, trước đây đổi sang byte làm Ctrl+G / F12 lệch ở file có tiếng Việt); Services/FileLookupService.cs, FileParseCache.cs, DtdIncludeResolver.cs, EntityCheckService.cs; Web/Shell/filelookupbar.html, filelookuppreview.html, filepreview.html, searchbox.html, entitypeek.html; Forms/EntityMultiPeekForm.cs</w:t>
             </w:r>
           </w:p>
         </w:tc>
@@ -10237,7 +10249,7 @@
                 <w:b w:val="0"/>
                 <w:sz w:val="16"/>
               </w:rPr>
-              <w:t>Cây file theo menu, cache theo dự án (%AppData%\Bcode\FileLookupCache), tô đỏ entity thiếu, tìm nội dung, Edit in BcodeViewer (Process.Start). Cấp source nhanh (FileLookupControl.QuickGrant.cs): chọn file .f Dir/Grid/Filter → dòng 2 thanh xem trước (filelookuppreview.html window.setSource; App: FileLookupPreviewBarPage) hiện phiên bản + thư mục kho (SourceGrantService.ResolveNearestLower: phiên bản dự án, không có thì phiên bản thấp hơn gần nhất cùng 3 chữ đầu; DetectVersion: nhiều phiên bản cùng số thì ưu tiên cùng 3 chữ đầu rồi 2 chữ đầu — FBISP24 → FBOR2SP24, không lấy TT24 của kho FAP), bấm nhãn = SourceViewForm, nút Cấp source = hỏi xác nhận rồi CopyRows; danh sách phiên bản cache 5 phút. Search Box (tìm nội dung) theo luật ở Template → tab "Tìm file" (uitemplate.html #tabSearch ↔ UiTemplateForm search-get/set/default ↔ AppSettings.Search*; FileLookupService.SetSearchRules / SearchRuleSet): File Type *.* chỉ quét "Đuôi file được tìm" (SearchIncludeExtensions, mặc định .xml .f .txt .js .sql .ent .xsd .css .config .json .html; trống = mọi đuôi), trừ "Đuôi luôn bỏ qua" và "nhị phân"; gõ rõ đuôi (*.cs) thì không xét danh sách; thư mục quét trong Controllers, bỏ .f đã biên dịch ở Dir/Filter/Grid, bỏ file &gt; N MB.</w:t>
+              <w:t>Cây file theo menu (dò như FCode — đối chiếu menu SVTran của VPMILK: include đọc như trình đọc XML qua DtdIncludeResolver — chỉ entity được gọi %X;/&amp;X;, mọi đuôi file, bỏ khối &lt;![%X;[ IGNORE; controller="&amp;X;..." và showForm(]]&gt;&amp;X;&lt;![CDATA[...) trong chính file thì thay entity; thư mục Lookup = controller đuôi "Lookup" / @$relType = "Lookup" (ExtractLookupControllerNames, cache "lkp"); bảng sysrelative của DB Sys KHÔNG phải nguồn FCode dùng; đổi luật dò thì tăng FileParseCache.SchemaVersion), cache theo dự án (%AppData%\Bcode\FileLookupCache), tô đỏ entity thiếu, tìm nội dung, Edit in BcodeViewer (Process.Start). Cấp source nhanh (FileLookupControl.QuickGrant.cs): chọn file .f Dir/Grid/Filter → dòng 2 thanh xem trước (filelookuppreview.html window.setSource; App: FileLookupPreviewBarPage) hiện phiên bản + thư mục kho (SourceGrantService.ResolveNearestLower: phiên bản dự án, không có thì phiên bản thấp hơn gần nhất cùng 3 chữ đầu; DetectVersion: nhiều phiên bản cùng số thì ưu tiên cùng 3 chữ đầu rồi 2 chữ đầu — FBISP24 → FBOR2SP24, không lấy TT24 của kho FAP), bấm nhãn = SourceViewForm, nút Cấp source = hỏi xác nhận rồi CopyRows; danh sách phiên bản cache 5 phút. Search Box (tìm nội dung) theo luật ở Template → tab "Tìm file" (uitemplate.html #tabSearch ↔ UiTemplateForm search-get/set/default ↔ AppSettings.Search*; FileLookupService.SetSearchRules / SearchRuleSet): File Type *.* chỉ quét "Đuôi file được tìm" (SearchIncludeExtensions, mặc định .xml .f .txt .js .sql .ent .xsd .css .config .json .html; trống = mọi đuôi), trừ "Đuôi luôn bỏ qua" và "nhị phân"; gõ rõ đuôi (*.cs) thì không xét danh sách; thư mục quét trong Controllers, bỏ .f đã biên dịch ở Dir/Filter/Grid, bỏ file &gt; N MB.</w:t>
             </w:r>
           </w:p>
         </w:tc>

</xml_diff>

<commit_message>
bcode| fix lọc ngay lookup
</commit_message>
<xml_diff>
--- a/Cấu trúc Bcode  BcodeViewer (v3 - Tóm tắt).docx
+++ b/Cấu trúc Bcode  BcodeViewer (v3 - Tóm tắt).docx
@@ -2072,7 +2072,7 @@
           <w:rFonts w:ascii="Consolas" w:hAnsi="Consolas" w:eastAsia="Consolas"/>
           <w:sz w:val="13"/>
         </w:rPr>
-        <w:t>│   ├── FileLookupControl.cs  1340</w:t>
+        <w:t>│   ├── FileLookupControl.cs  1345</w:t>
       </w:r>
     </w:p>
     <w:p>
@@ -2552,7 +2552,7 @@
           <w:rFonts w:ascii="Consolas" w:hAnsi="Consolas" w:eastAsia="Consolas"/>
           <w:sz w:val="13"/>
         </w:rPr>
-        <w:t>│   ├── NativePages.FileLookup.cs  162</w:t>
+        <w:t>│   ├── NativePages.FileLookup.cs  170</w:t>
       </w:r>
     </w:p>
     <w:p>
@@ -6092,7 +6092,7 @@
           <w:rFonts w:ascii="Consolas" w:hAnsi="Consolas" w:eastAsia="Consolas"/>
           <w:sz w:val="13"/>
         </w:rPr>
-        <w:t>│       ├── filelookupbar.html  165</w:t>
+        <w:t>│       ├── filelookupbar.html  171</w:t>
       </w:r>
     </w:p>
     <w:p>
@@ -7660,7 +7660,7 @@
           <w:rFonts w:ascii="Consolas" w:hAnsi="Consolas" w:eastAsia="Consolas"/>
           <w:sz w:val="13"/>
         </w:rPr>
-        <w:t>│   ├── shell.js  603</w:t>
+        <w:t>│   ├── shell.js  615</w:t>
       </w:r>
     </w:p>
     <w:p>
@@ -7744,7 +7744,7 @@
           <w:rFonts w:ascii="Consolas" w:hAnsi="Consolas" w:eastAsia="Consolas"/>
           <w:sz w:val="13"/>
         </w:rPr>
-        <w:t>│   ├── toolbar.js  594</w:t>
+        <w:t>│   ├── toolbar.js  599</w:t>
       </w:r>
     </w:p>
     <w:p>
@@ -10249,7 +10249,7 @@
                 <w:b w:val="0"/>
                 <w:sz w:val="16"/>
               </w:rPr>
-              <w:t>Cây file theo menu (dò như FCode — đối chiếu menu SVTran của VPMILK: include đọc như trình đọc XML qua DtdIncludeResolver — chỉ entity được gọi %X;/&amp;X;, mọi đuôi file, bỏ khối &lt;![%X;[ IGNORE; controller="&amp;X;..." và showForm(]]&gt;&amp;X;&lt;![CDATA[...) trong chính file thì thay entity; thư mục Lookup = controller đuôi "Lookup" / @$relType = "Lookup" (ExtractLookupControllerNames, cache "lkp"); bảng sysrelative của DB Sys KHÔNG phải nguồn FCode dùng; đổi luật dò thì tăng FileParseCache.SchemaVersion), cache theo dự án (%AppData%\Bcode\FileLookupCache), tô đỏ entity thiếu, tìm nội dung, Edit in BcodeViewer (Process.Start). Cấp source nhanh (FileLookupControl.QuickGrant.cs): chọn file .f Dir/Grid/Filter → dòng 2 thanh xem trước (filelookuppreview.html window.setSource; App: FileLookupPreviewBarPage) hiện phiên bản + thư mục kho (SourceGrantService.ResolveNearestLower: phiên bản dự án, không có thì phiên bản thấp hơn gần nhất cùng 3 chữ đầu; DetectVersion: nhiều phiên bản cùng số thì ưu tiên cùng 3 chữ đầu rồi 2 chữ đầu — FBISP24 → FBOR2SP24, không lấy TT24 của kho FAP), bấm nhãn = SourceViewForm, nút Cấp source = hỏi xác nhận rồi CopyRows; danh sách phiên bản cache 5 phút. Search Box (tìm nội dung) theo luật ở Template → tab "Tìm file" (uitemplate.html #tabSearch ↔ UiTemplateForm search-get/set/default ↔ AppSettings.Search*; FileLookupService.SetSearchRules / SearchRuleSet): File Type *.* chỉ quét "Đuôi file được tìm" (SearchIncludeExtensions, mặc định .xml .f .txt .js .sql .ent .xsd .css .config .json .html; trống = mọi đuôi), trừ "Đuôi luôn bỏ qua" và "nhị phân"; gõ rõ đuôi (*.cs) thì không xét danh sách; thư mục quét trong Controllers, bỏ .f đã biên dịch ở Dir/Filter/Grid, bỏ file &gt; N MB.</w:t>
+              <w:t>Cây file theo menu (dò như FCode — đối chiếu menu SVTran của VPMILK: include đọc như trình đọc XML qua DtdIncludeResolver — chỉ entity được gọi %X;/&amp;X;, mọi đuôi file, bỏ khối &lt;![%X;[ IGNORE; controller="&amp;X;..." và showForm(]]&gt;&amp;X;&lt;![CDATA[...) trong chính file thì thay entity; thư mục Lookup = controller đuôi "Lookup" / @$relType = "Lookup" (ExtractLookupControllerNames, cache "lkp"); bảng sysrelative của DB Sys KHÔNG phải nguồn FCode dùng; đổi luật dò thì tăng FileParseCache.SchemaVersion), cache theo dự án (%AppData%\Bcode\FileLookupCache), tô đỏ entity thiếu, tìm nội dung, Edit in BcodeViewer (Process.Start). Ô Search (lọc tên, debounce 200 ms, Enter = lọc ngay; App: FileLookupBarPage): gõ chữ = tìm cả thư mục Path, đang ở cây menu thì nhớ _menuBeforeSearch → xoá trắng quay lại cây menu đó. Cấp source nhanh (FileLookupControl.QuickGrant.cs): chọn file .f Dir/Grid/Filter → dòng 2 thanh xem trước (filelookuppreview.html window.setSource; App: FileLookupPreviewBarPage) hiện phiên bản + thư mục kho (SourceGrantService.ResolveNearestLower: phiên bản dự án, không có thì phiên bản thấp hơn gần nhất cùng 3 chữ đầu; DetectVersion: nhiều phiên bản cùng số thì ưu tiên cùng 3 chữ đầu rồi 2 chữ đầu — FBISP24 → FBOR2SP24, không lấy TT24 của kho FAP), bấm nhãn = SourceViewForm, nút Cấp source = hỏi xác nhận rồi CopyRows; danh sách phiên bản cache 5 phút. Search Box (tìm nội dung) theo luật ở Template → tab "Tìm file" (uitemplate.html #tabSearch ↔ UiTemplateForm search-get/set/default ↔ AppSettings.Search*; FileLookupService.SetSearchRules / SearchRuleSet): File Type *.* chỉ quét "Đuôi file được tìm" (SearchIncludeExtensions, mặc định .xml .f .txt .js .sql .ent .xsd .css .config .json .html; trống = mọi đuôi), trừ "Đuôi luôn bỏ qua" và "nhị phân"; gõ rõ đuôi (*.cs) thì không xét danh sách; thư mục quét trong Controllers, bỏ .f đã biên dịch ở Dir/Filter/Grid, bỏ file &gt; N MB.</w:t>
             </w:r>
           </w:p>
         </w:tc>

</xml_diff>

<commit_message>
bcode| bo sung f2 rename file
</commit_message>
<xml_diff>
--- a/Cấu trúc Bcode  BcodeViewer (v3 - Tóm tắt).docx
+++ b/Cấu trúc Bcode  BcodeViewer (v3 - Tóm tắt).docx
@@ -2072,7 +2072,7 @@
           <w:rFonts w:ascii="Consolas" w:hAnsi="Consolas" w:eastAsia="Consolas"/>
           <w:sz w:val="13"/>
         </w:rPr>
-        <w:t>│   ├── FileLookupControl.cs  1345</w:t>
+        <w:t>│   ├── FileLookupControl.cs  1361</w:t>
       </w:r>
     </w:p>
     <w:p>
@@ -2096,6 +2096,18 @@
           <w:rFonts w:ascii="Consolas" w:hAnsi="Consolas" w:eastAsia="Consolas"/>
           <w:sz w:val="13"/>
         </w:rPr>
+        <w:t>│   ├── FileLookupControl.Rename.cs  317</w:t>
+      </w:r>
+    </w:p>
+    <w:p>
+      <w:pPr>
+        <w:spacing w:after="0" w:before="0" w:line="240" w:lineRule="auto"/>
+      </w:pPr>
+      <w:r>
+        <w:rPr>
+          <w:rFonts w:ascii="Consolas" w:hAnsi="Consolas" w:eastAsia="Consolas"/>
+          <w:sz w:val="13"/>
+        </w:rPr>
         <w:t>│   ├── FileReferenceControl.cs  195</w:t>
       </w:r>
     </w:p>
@@ -3332,7 +3344,7 @@
           <w:rFonts w:ascii="Consolas" w:hAnsi="Consolas" w:eastAsia="Consolas"/>
           <w:sz w:val="13"/>
         </w:rPr>
-        <w:t>│   ├── ColumnDesignForm.cs  57</w:t>
+        <w:t>│   ├── ColumnDesignForm.cs  60</w:t>
       </w:r>
     </w:p>
     <w:p>
@@ -3572,7 +3584,7 @@
           <w:rFonts w:ascii="Consolas" w:hAnsi="Consolas" w:eastAsia="Consolas"/>
           <w:sz w:val="13"/>
         </w:rPr>
-        <w:t>│   ├── MainForm.cs  3648</w:t>
+        <w:t>│   ├── MainForm.cs  3651</w:t>
       </w:r>
     </w:p>
     <w:p>
@@ -3704,7 +3716,7 @@
           <w:rFonts w:ascii="Consolas" w:hAnsi="Consolas" w:eastAsia="Consolas"/>
           <w:sz w:val="13"/>
         </w:rPr>
-        <w:t>│   ├── QuickListForm.cs  491</w:t>
+        <w:t>│   ├── QuickListForm.cs  579</w:t>
       </w:r>
     </w:p>
     <w:p>
@@ -4724,7 +4736,7 @@
           <w:rFonts w:ascii="Consolas" w:hAnsi="Consolas" w:eastAsia="Consolas"/>
           <w:sz w:val="13"/>
         </w:rPr>
-        <w:t>│   ├── FastCatalogRules.cs  814</w:t>
+        <w:t>│   ├── FastCatalogRules.cs  832</w:t>
       </w:r>
     </w:p>
     <w:p>
@@ -4760,19 +4772,19 @@
           <w:rFonts w:ascii="Consolas" w:hAnsi="Consolas" w:eastAsia="Consolas"/>
           <w:sz w:val="13"/>
         </w:rPr>
-        <w:t>│   ├── FileLookupService.cs  1213</w:t>
-      </w:r>
-    </w:p>
-    <w:p>
-      <w:pPr>
-        <w:spacing w:after="0" w:before="0" w:line="240" w:lineRule="auto"/>
-      </w:pPr>
-      <w:r>
-        <w:rPr>
-          <w:rFonts w:ascii="Consolas" w:hAnsi="Consolas" w:eastAsia="Consolas"/>
-          <w:sz w:val="13"/>
-        </w:rPr>
-        <w:t>│   ├── FileParseCache.cs  375</w:t>
+        <w:t>│   ├── FileLookupService.cs  1236</w:t>
+      </w:r>
+    </w:p>
+    <w:p>
+      <w:pPr>
+        <w:spacing w:after="0" w:before="0" w:line="240" w:lineRule="auto"/>
+      </w:pPr>
+      <w:r>
+        <w:rPr>
+          <w:rFonts w:ascii="Consolas" w:hAnsi="Consolas" w:eastAsia="Consolas"/>
+          <w:sz w:val="13"/>
+        </w:rPr>
+        <w:t>│   ├── FileParseCache.cs  403</w:t>
       </w:r>
     </w:p>
     <w:p>
@@ -5048,7 +5060,7 @@
           <w:rFonts w:ascii="Consolas" w:hAnsi="Consolas" w:eastAsia="Consolas"/>
           <w:sz w:val="13"/>
         </w:rPr>
-        <w:t>│   ├── QuickListService.cs  682</w:t>
+        <w:t>│   ├── QuickListService.cs  828</w:t>
       </w:r>
     </w:p>
     <w:p>
@@ -5612,7 +5624,7 @@
           <w:rFonts w:ascii="Consolas" w:hAnsi="Consolas" w:eastAsia="Consolas"/>
           <w:sz w:val="13"/>
         </w:rPr>
-        <w:t>│   ├── ShortcutRegistry.cs  329</w:t>
+        <w:t>│   ├── ShortcutRegistry.cs  332</w:t>
       </w:r>
     </w:p>
     <w:p>
@@ -6356,7 +6368,7 @@
           <w:rFonts w:ascii="Consolas" w:hAnsi="Consolas" w:eastAsia="Consolas"/>
           <w:sz w:val="13"/>
         </w:rPr>
-        <w:t>│       ├── quicklist.html  1325</w:t>
+        <w:t>│       ├── quicklist.html  1504</w:t>
       </w:r>
     </w:p>
     <w:p>
@@ -10231,7 +10243,7 @@
                 <w:b w:val="0"/>
                 <w:sz w:val="16"/>
               </w:rPr>
-              <w:t>Controls/FileLookupControl.cs (1500 dòng), FileLookupControl.QuickGrant.cs, MonacoPreviewControl.cs (Web/Shell/filepreview.html: Ctrl+G Go to dùng chung goto.js của BcodeViewer, link lúc build như theme.js; chế độ App + ScriptEditorControl: Controls/GoToBox.cs = bản C# của goto.js — Scan cho ra y hệt (đã so 300 file mẫu / 6.736 mục), hộp WinForms vẽ theo CSS #gotoBox, khung Scintilla tô mục hay dùng bằng indicator 16/17 + marker 20/21; vị trí ScintillaNET tính theo KÝ TỰ — MonacoPreviewControl.Native.Pos, trước đây đổi sang byte làm Ctrl+G / F12 lệch ở file có tiếng Việt); Services/FileLookupService.cs, FileParseCache.cs, DtdIncludeResolver.cs, EntityCheckService.cs; Web/Shell/filelookupbar.html, filelookuppreview.html, filepreview.html, searchbox.html, entitypeek.html; Forms/EntityMultiPeekForm.cs</w:t>
+              <w:t>Controls/FileLookupControl.cs (1500 dòng), FileLookupControl.QuickGrant.cs, FileLookupControl.Rename.cs, MonacoPreviewControl.cs (Web/Shell/filepreview.html: Ctrl+G Go to dùng chung goto.js của BcodeViewer, link lúc build như theme.js; chế độ App + ScriptEditorControl: Controls/GoToBox.cs = bản C# của goto.js — Scan cho ra y hệt (đã so 300 file mẫu / 6.736 mục), hộp WinForms vẽ theo CSS #gotoBox, khung Scintilla tô mục hay dùng bằng indicator 16/17 + marker 20/21; vị trí ScintillaNET tính theo KÝ TỰ — MonacoPreviewControl.Native.Pos, trước đây đổi sang byte làm Ctrl+G / F12 lệch ở file có tiếng Việt); Services/FileLookupService.cs, FileParseCache.cs, DtdIncludeResolver.cs, EntityCheckService.cs; Web/Shell/filelookupbar.html, filelookuppreview.html, filepreview.html, searchbox.html, entitypeek.html; Forms/EntityMultiPeekForm.cs</w:t>
             </w:r>
           </w:p>
         </w:tc>
@@ -10249,7 +10261,7 @@
                 <w:b w:val="0"/>
                 <w:sz w:val="16"/>
               </w:rPr>
-              <w:t>Cây file theo menu (dò như FCode — đối chiếu menu SVTran của VPMILK: include đọc như trình đọc XML qua DtdIncludeResolver — chỉ entity được gọi %X;/&amp;X;, mọi đuôi file, bỏ khối &lt;![%X;[ IGNORE; controller="&amp;X;..." và showForm(]]&gt;&amp;X;&lt;![CDATA[...) trong chính file thì thay entity; thư mục Lookup = controller đuôi "Lookup" / @$relType = "Lookup" (ExtractLookupControllerNames, cache "lkp"); bảng sysrelative của DB Sys KHÔNG phải nguồn FCode dùng; đổi luật dò thì tăng FileParseCache.SchemaVersion), cache theo dự án (%AppData%\Bcode\FileLookupCache), tô đỏ entity thiếu, tìm nội dung, Edit in BcodeViewer (Process.Start). Ô Search (lọc tên, debounce 200 ms, Enter = lọc ngay; App: FileLookupBarPage): gõ chữ = tìm cả thư mục Path, đang ở cây menu thì nhớ _menuBeforeSearch → xoá trắng quay lại cây menu đó. Cấp source nhanh (FileLookupControl.QuickGrant.cs): chọn file .f Dir/Grid/Filter → dòng 2 thanh xem trước (filelookuppreview.html window.setSource; App: FileLookupPreviewBarPage) hiện phiên bản + thư mục kho (SourceGrantService.ResolveNearestLower: phiên bản dự án, không có thì phiên bản thấp hơn gần nhất cùng 3 chữ đầu; DetectVersion: nhiều phiên bản cùng số thì ưu tiên cùng 3 chữ đầu rồi 2 chữ đầu — FBISP24 → FBOR2SP24, không lấy TT24 của kho FAP), bấm nhãn = SourceViewForm, nút Cấp source = hỏi xác nhận rồi CopyRows; danh sách phiên bản cache 5 phút. Search Box (tìm nội dung) theo luật ở Template → tab "Tìm file" (uitemplate.html #tabSearch ↔ UiTemplateForm search-get/set/default ↔ AppSettings.Search*; FileLookupService.SetSearchRules / SearchRuleSet): File Type *.* chỉ quét "Đuôi file được tìm" (SearchIncludeExtensions, mặc định .xml .f .txt .js .sql .ent .xsd .css .config .json .html; trống = mọi đuôi), trừ "Đuôi luôn bỏ qua" và "nhị phân"; gõ rõ đuôi (*.cs) thì không xét danh sách; thư mục quét trong Controllers, bỏ .f đã biên dịch ở Dir/Filter/Grid, bỏ file &gt; N MB.</w:t>
+              <w:t>Cây file theo menu (dò như FCode — đối chiếu menu SVTran của VPMILK: include đọc như trình đọc XML qua DtdIncludeResolver — chỉ entity được gọi %X;/&amp;X;, mọi đuôi file, bỏ khối &lt;![%X;[ IGNORE; controller="&amp;X;..." và showForm(]]&gt;&amp;X;&lt;![CDATA[...) trong chính file thì thay entity; thư mục Lookup = controller đuôi "Lookup" / @$relType = "Lookup" (ExtractLookupControllerNames, cache "lkp"); bảng sysrelative của DB Sys KHÔNG phải nguồn FCode dùng; đổi luật dò thì tăng FileParseCache.SchemaVersion), cache theo dự án (%AppData%\Bcode\FileLookupCache), tô đỏ entity thiếu, tìm nội dung, Edit in BcodeViewer (Process.Start). Ô Search (lọc tên, debounce 200 ms, Enter = lọc ngay; App: FileLookupBarPage): gõ chữ = tìm cả thư mục Path, đang ở cây menu thì nhớ _menuBeforeSearch → xoá trắng quay lại cây menu đó. Cấp source nhanh (FileLookupControl.QuickGrant.cs): chọn file .f Dir/Grid/Filter → dòng 2 thanh xem trước (filelookuppreview.html window.setSource; App: FileLookupPreviewBarPage) hiện phiên bản + thư mục kho (SourceGrantService.ResolveNearestLower: phiên bản dự án, không có thì phiên bản thấp hơn gần nhất cùng 3 chữ đầu; DetectVersion: nhiều phiên bản cùng số thì ưu tiên cùng 3 chữ đầu rồi 2 chữ đầu — FBISP24 → FBOR2SP24, không lấy TT24 của kho FAP), bấm nhãn = SourceViewForm, nút Cấp source = hỏi xác nhận rồi CopyRows; danh sách phiên bản cache 5 phút. Search Box (tìm nội dung) theo luật ở Template → tab "Tìm file" (uitemplate.html #tabSearch ↔ UiTemplateForm search-get/set/default ↔ AppSettings.Search*; FileLookupService.SetSearchRules / SearchRuleSet): File Type *.* chỉ quét "Đuôi file được tìm" (SearchIncludeExtensions, mặc định .xml .f .txt .js .sql .ent .xsd .css .config .json .html; trống = mọi đuôi), trừ "Đuôi luôn bỏ qua" và "nhị phân"; gõ rõ đuôi (*.cs) thì không xét danh sách; thư mục quét trong Controllers, bỏ .f đã biên dịch ở Dir/Filter/Grid, bỏ file &gt; N MB. Đổi tên file (FileLookupControl.Rename.cs): F2 (phím fileLookup.rename, phạm vi Tree) / chuột phải Rename... = sửa nhãn tại chỗ (LabelEdit chỉ bật lúc đổi tên, BeforeLabelEdit chặn node khác; ô sửa mất focus ngay lúc vừa mở — khung xem trước đang nạp — thì mở lại 1 lần) → File.Move; không gõ đuôi = giữ đuôi, đổi đuôi hỏi Yes/No/Cancel, trùng tên / ký tự sai mở lại ô sửa, file khoá báo rõ; cặp cùng tên khác đuôi cùng thư mục hỏi (mặc định Không). FileLookupService.NotifyFileRenamed sửa chỉ mục file trong bộ nhớ + bản lưu file-index (thay bản FileIndex mới, không sửa list tại chỗ), FileParseCache.ForgetFile bỏ mục dính tên cũ (cả trên đĩa ở lần ghi kế), rồi event FileRenamed → mọi tab File Lookup sửa node + khung xem trước (không dựng lại cây). Sau đó tra nền chỗ còn nhắc tên cũ bằng SourceIndexService.FindLinesAsync (dòng include / controller= / SYSTEM / showForm...) — chỉ báo.</w:t>
             </w:r>
           </w:p>
         </w:tc>
@@ -10529,7 +10541,7 @@
                 <w:b w:val="0"/>
                 <w:sz w:val="16"/>
               </w:rPr>
-              <w:t>Mẫu là file thường, placeholder [#TEN#]/{{Ten}}; sửa mẫu là đổi kết quả không cần build. Tạo nhanh danh mục nằm trong menu "Tool mở rộng" (ExtToolKeys); nút Dịch dùng chung GoogleTranslateService với form tạo command.</w:t>
+              <w:t>Mẫu là file thường, placeholder [#TEN#]/{{Ten}}; sửa mẫu là đổi kết quả không cần build. Tạo nhanh danh mục nằm trong menu "Tool mở rộng" (ExtToolKeys); nút Dịch dùng chung GoogleTranslateService với form tạo command. Bảng chưa có trong App Data = bảng mới (QuickListForm.LoadColumnsAsync → cột chuẩn FastCatalogRules.StandardColumns; đang có cột bảng khác thì trang giữ làm clone, spec.sourceTable); + Thêm cột / ✎ = ColumnDesignForm (hint riêng), cột cờ added. Tab Script = QuickListService.BuildTableScript: bảng mới → CatalogCloneService.BuildTableScript (PK ghép), bảng có sẵn → TableEditControl.BuildColumnScript ADD; Copy / Add Script (MainForm.AddGeneratedScript) / Mở SQL Query (OpenViewerScriptTab), không chạy. Tên bảng ghi cứng trong mẫu (table=, &amp;Tag;/&lt;!ENTITY&gt;, baseTable, SQL from/join/into/update/delete/table, object_id) → bảng mới: QuickListService.RetargetTables (mẫu chuẩn [#TABLE#] không đổi).</w:t>
             </w:r>
           </w:p>
         </w:tc>
@@ -15441,6 +15453,44 @@
                 <w:sz w:val="17"/>
               </w:rPr>
               <w:t>Chi tiết dòng, khai báo nhanh, thêm, xoá, nhân bản, chèn sau, copy giá trị, set NULL</w:t>
+            </w:r>
+          </w:p>
+        </w:tc>
+      </w:tr>
+      <w:tr>
+        <w:tc>
+          <w:tcPr>
+            <w:tcW w:type="dxa" w:w="3628"/>
+          </w:tcPr>
+          <w:p>
+            <w:pPr>
+              <w:spacing w:after="20"/>
+            </w:pPr>
+            <w:r/>
+            <w:r>
+              <w:rPr>
+                <w:b/>
+                <w:sz w:val="17"/>
+              </w:rPr>
+              <w:t>Cây file File Lookup: F2 / F5 / F4</w:t>
+            </w:r>
+          </w:p>
+        </w:tc>
+        <w:tc>
+          <w:tcPr>
+            <w:tcW w:type="dxa" w:w="6236"/>
+          </w:tcPr>
+          <w:p>
+            <w:pPr>
+              <w:spacing w:after="20"/>
+            </w:pPr>
+            <w:r/>
+            <w:r>
+              <w:rPr>
+                <w:b w:val="0"/>
+                <w:sz w:val="17"/>
+              </w:rPr>
+              <w:t>Đổi tên file / quét lại / nhân bản tab File Lookup</w:t>
             </w:r>
           </w:p>
         </w:tc>

</xml_diff>

<commit_message>
bcode| bo sung zoom
</commit_message>
<xml_diff>
--- a/Cấu trúc Bcode  BcodeViewer (v3 - Tóm tắt).docx
+++ b/Cấu trúc Bcode  BcodeViewer (v3 - Tóm tắt).docx
@@ -2768,7 +2768,7 @@
           <w:rFonts w:ascii="Consolas" w:hAnsi="Consolas" w:eastAsia="Consolas"/>
           <w:sz w:val="13"/>
         </w:rPr>
-        <w:t>│   ├── NativeSqlControl.cs  1859</w:t>
+        <w:t>│   ├── NativeSqlControl.cs  1903</w:t>
       </w:r>
     </w:p>
     <w:p>
@@ -6512,7 +6512,7 @@
           <w:rFonts w:ascii="Consolas" w:hAnsi="Consolas" w:eastAsia="Consolas"/>
           <w:sz w:val="13"/>
         </w:rPr>
-        <w:t>│       ├── sqleditor.html  1533</w:t>
+        <w:t>│       ├── sqleditor.html  1577</w:t>
       </w:r>
     </w:p>
     <w:p>
@@ -7468,7 +7468,7 @@
           <w:rFonts w:ascii="Consolas" w:hAnsi="Consolas" w:eastAsia="Consolas"/>
           <w:sz w:val="13"/>
         </w:rPr>
-        <w:t>│   ├── editor.js  1718</w:t>
+        <w:t>│   ├── editor.js  1719</w:t>
       </w:r>
     </w:p>
     <w:p>
@@ -7552,7 +7552,7 @@
           <w:rFonts w:ascii="Consolas" w:hAnsi="Consolas" w:eastAsia="Consolas"/>
           <w:sz w:val="13"/>
         </w:rPr>
-        <w:t>│   ├── index.html  232</w:t>
+        <w:t>│   ├── index.html  233</w:t>
       </w:r>
     </w:p>
     <w:p>
@@ -7768,7 +7768,19 @@
           <w:rFonts w:ascii="Consolas" w:hAnsi="Consolas" w:eastAsia="Consolas"/>
           <w:sz w:val="13"/>
         </w:rPr>
-        <w:t>│   └── ui.js  134</w:t>
+        <w:t>│   ├── ui.js  134</w:t>
+      </w:r>
+    </w:p>
+    <w:p>
+      <w:pPr>
+        <w:spacing w:after="0" w:before="0" w:line="240" w:lineRule="auto"/>
+      </w:pPr>
+      <w:r>
+        <w:rPr>
+          <w:rFonts w:ascii="Consolas" w:hAnsi="Consolas" w:eastAsia="Consolas"/>
+          <w:sz w:val="13"/>
+        </w:rPr>
+        <w:t>│   └── zoombar.js  65</w:t>
       </w:r>
     </w:p>
     <w:p>
@@ -8380,7 +8392,7 @@
           <w:rFonts w:ascii="Consolas" w:hAnsi="Consolas" w:eastAsia="Consolas"/>
           <w:sz w:val="13"/>
         </w:rPr>
-        <w:t>└── Program.cs  94</w:t>
+        <w:t>└── Program.cs  90</w:t>
       </w:r>
     </w:p>
     <w:p>
@@ -13017,6 +13029,62 @@
                 <w:sz w:val="16"/>
               </w:rPr>
               <w:t>LocalHistoryStore = chỉ trên máy người sửa. SharedHistoryStore = lịch sử CHUNG đặt trong dự án (thư mục "History" mà Bcode dùng cho lịch sử procedure, dưới "_files") để mọi máy cùng thấy, có ghi ai sửa.</w:t>
+            </w:r>
+          </w:p>
+        </w:tc>
+      </w:tr>
+      <w:tr>
+        <w:tc>
+          <w:tcPr>
+            <w:tcW w:type="dxa" w:w="2041"/>
+          </w:tcPr>
+          <w:p>
+            <w:pPr>
+              <w:spacing w:after="20"/>
+            </w:pPr>
+            <w:r/>
+            <w:r>
+              <w:rPr>
+                <w:b/>
+                <w:sz w:val="16"/>
+              </w:rPr>
+              <w:t>Thanh % phóng to chữ (Ctrl + lăn chuột)</w:t>
+            </w:r>
+          </w:p>
+        </w:tc>
+        <w:tc>
+          <w:tcPr>
+            <w:tcW w:type="dxa" w:w="3969"/>
+          </w:tcPr>
+          <w:p>
+            <w:pPr>
+              <w:spacing w:after="20"/>
+            </w:pPr>
+            <w:r/>
+            <w:r>
+              <w:rPr>
+                <w:b w:val="0"/>
+                <w:sz w:val="16"/>
+              </w:rPr>
+              <w:t>Web/zoombar.js (Monaco fontZoomIn/Out/Reset; Bcode: sqleditor.html #zoomBar, NativeSqlControl.ShowZoomBar)</w:t>
+            </w:r>
+          </w:p>
+        </w:tc>
+        <w:tc>
+          <w:tcPr>
+            <w:tcW w:type="dxa" w:w="3855"/>
+          </w:tcPr>
+          <w:p>
+            <w:pPr>
+              <w:spacing w:after="20"/>
+            </w:pPr>
+            <w:r/>
+            <w:r>
+              <w:rPr>
+                <w:b w:val="0"/>
+                <w:sz w:val="16"/>
+              </w:rPr>
+              <w:t>Hiện góc phải trên editor, tự ẩn sau 2,5 giây; nút − + Đặt lại.</w:t>
             </w:r>
           </w:p>
         </w:tc>

</xml_diff>

<commit_message>
bcode| fix lỗi ngầm
</commit_message>
<xml_diff>
--- a/Cấu trúc Bcode  BcodeViewer (v3 - Tóm tắt).docx
+++ b/Cấu trúc Bcode  BcodeViewer (v3 - Tóm tắt).docx
@@ -2888,7 +2888,7 @@
           <w:rFonts w:ascii="Consolas" w:hAnsi="Consolas" w:eastAsia="Consolas"/>
           <w:sz w:val="13"/>
         </w:rPr>
-        <w:t>│   ├── RawSqlControl.cs  2456</w:t>
+        <w:t>│   ├── RawSqlControl.cs  2538</w:t>
       </w:r>
     </w:p>
     <w:p>
@@ -2984,7 +2984,7 @@
           <w:rFonts w:ascii="Consolas" w:hAnsi="Consolas" w:eastAsia="Consolas"/>
           <w:sz w:val="13"/>
         </w:rPr>
-        <w:t>│   ├── SqlObjectTreeControl.cs  467</w:t>
+        <w:t>│   ├── SqlObjectTreeControl.cs  497</w:t>
       </w:r>
     </w:p>
     <w:p>
@@ -3176,7 +3176,7 @@
           <w:rFonts w:ascii="Consolas" w:hAnsi="Consolas" w:eastAsia="Consolas"/>
           <w:sz w:val="13"/>
         </w:rPr>
-        <w:t>│   ├── WebFrameHost.cs  200</w:t>
+        <w:t>│   ├── WebFrameHost.cs  210</w:t>
       </w:r>
     </w:p>
     <w:p>
@@ -3584,7 +3584,7 @@
           <w:rFonts w:ascii="Consolas" w:hAnsi="Consolas" w:eastAsia="Consolas"/>
           <w:sz w:val="13"/>
         </w:rPr>
-        <w:t>│   ├── MainForm.cs  3651</w:t>
+        <w:t>│   ├── MainForm.cs  3676</w:t>
       </w:r>
     </w:p>
     <w:p>
@@ -3680,7 +3680,7 @@
           <w:rFonts w:ascii="Consolas" w:hAnsi="Consolas" w:eastAsia="Consolas"/>
           <w:sz w:val="13"/>
         </w:rPr>
-        <w:t>│   ├── ProjectPickerForm.cs  102</w:t>
+        <w:t>│   ├── ProjectPickerForm.cs  108</w:t>
       </w:r>
     </w:p>
     <w:p>
@@ -5732,7 +5732,7 @@
           <w:rFonts w:ascii="Consolas" w:hAnsi="Consolas" w:eastAsia="Consolas"/>
           <w:sz w:val="13"/>
         </w:rPr>
-        <w:t>│   └── WebViewEnvironment.cs  395</w:t>
+        <w:t>│   └── WebViewEnvironment.cs  400</w:t>
       </w:r>
     </w:p>
     <w:p>
@@ -6164,7 +6164,7 @@
           <w:rFonts w:ascii="Consolas" w:hAnsi="Consolas" w:eastAsia="Consolas"/>
           <w:sz w:val="13"/>
         </w:rPr>
-        <w:t>│       ├── framehost.html  49</w:t>
+        <w:t>│       ├── framehost.html  55</w:t>
       </w:r>
     </w:p>
     <w:p>
@@ -6512,7 +6512,7 @@
           <w:rFonts w:ascii="Consolas" w:hAnsi="Consolas" w:eastAsia="Consolas"/>
           <w:sz w:val="13"/>
         </w:rPr>
-        <w:t>│       ├── sqleditor.html  1577</w:t>
+        <w:t>│       ├── sqleditor.html  1576</w:t>
       </w:r>
     </w:p>
     <w:p>
@@ -6608,7 +6608,7 @@
           <w:rFonts w:ascii="Consolas" w:hAnsi="Consolas" w:eastAsia="Consolas"/>
           <w:sz w:val="13"/>
         </w:rPr>
-        <w:t>│       ├── sqlquerybar.html  379</w:t>
+        <w:t>│       ├── sqlquerybar.html  409</w:t>
       </w:r>
     </w:p>
     <w:p>
@@ -7780,7 +7780,7 @@
           <w:rFonts w:ascii="Consolas" w:hAnsi="Consolas" w:eastAsia="Consolas"/>
           <w:sz w:val="13"/>
         </w:rPr>
-        <w:t>│   └── zoombar.js  65</w:t>
+        <w:t>│   └── zoombar.js  99</w:t>
       </w:r>
     </w:p>
     <w:p>
@@ -8392,7 +8392,7 @@
           <w:rFonts w:ascii="Consolas" w:hAnsi="Consolas" w:eastAsia="Consolas"/>
           <w:sz w:val="13"/>
         </w:rPr>
-        <w:t>└── Program.cs  90</w:t>
+        <w:t>└── Program.cs  94</w:t>
       </w:r>
     </w:p>
     <w:p>
@@ -17532,6 +17532,18 @@
           <w:sz w:val="19"/>
         </w:rPr>
         <w:t>Mỗi tab SQL Query ≈ 4 WebView2 ~125 MB → đã gộp bằng WebFrameHost / ngủ đông (memory bcode-startup-ram-findings).</w:t>
+      </w:r>
+    </w:p>
+    <w:p>
+      <w:pPr>
+        <w:pStyle w:val="ListBullet"/>
+        <w:spacing w:after="40"/>
+      </w:pPr>
+      <w:r>
+        <w:rPr>
+          <w:sz w:val="19"/>
+        </w:rPr>
+        <w:t>Host ảo bcode.shell / bcode.user (SetVirtualHostNameToFolderMapping): mỗi lần điều hướng (trang chính, iframe) WebView2 vẫn hỏi DNS hệ thống ~100 ms, có lúc ~2 s — WebViewEnvironment thêm --host-resolver-rules="MAP … ~NOTFOUND" để trả lời ngay. Mở tab SQL Query (Web) đo trong %AppData%\Bcode\apply-timing.log (dòng "SQL Query: …": từng chặng WebView2 → thanh → Monaco → mở màn); tab mới che bằng màn nền tới khi thanh + editor cùng sẵn sàng (RawSqlControl._curtain). BcodeViewer / ScreenDesigner chưa có luật này.</w:t>
       </w:r>
     </w:p>
     <w:p>

</xml_diff>

<commit_message>
bcode| fix ctrl + tab, bcodeviewer| chỉnh lại focus rõ hơn cho các file, dự án, bổ sung tắt file toàn dự án, tắt theo folder
</commit_message>
<xml_diff>
--- a/Cấu trúc Bcode  BcodeViewer (v3 - Tóm tắt).docx
+++ b/Cấu trúc Bcode  BcodeViewer (v3 - Tóm tắt).docx
@@ -2888,7 +2888,7 @@
           <w:rFonts w:ascii="Consolas" w:hAnsi="Consolas" w:eastAsia="Consolas"/>
           <w:sz w:val="13"/>
         </w:rPr>
-        <w:t>│   ├── RawSqlControl.cs  2538</w:t>
+        <w:t>│   ├── RawSqlControl.cs  2539</w:t>
       </w:r>
     </w:p>
     <w:p>
@@ -3008,7 +3008,7 @@
           <w:rFonts w:ascii="Consolas" w:hAnsi="Consolas" w:eastAsia="Consolas"/>
           <w:sz w:val="13"/>
         </w:rPr>
-        <w:t>│   ├── SqlProfilerControl.cs  1737</w:t>
+        <w:t>│   ├── SqlProfilerControl.cs  1732</w:t>
       </w:r>
     </w:p>
     <w:p>
@@ -3584,7 +3584,7 @@
           <w:rFonts w:ascii="Consolas" w:hAnsi="Consolas" w:eastAsia="Consolas"/>
           <w:sz w:val="13"/>
         </w:rPr>
-        <w:t>│   ├── MainForm.cs  3676</w:t>
+        <w:t>│   ├── MainForm.cs  3651</w:t>
       </w:r>
     </w:p>
     <w:p>
@@ -3872,7 +3872,7 @@
           <w:rFonts w:ascii="Consolas" w:hAnsi="Consolas" w:eastAsia="Consolas"/>
           <w:sz w:val="13"/>
         </w:rPr>
-        <w:t>│   ├── TabSwitcherForm.cs  131</w:t>
+        <w:t>│   ├── TabSwitcherForm.cs  175</w:t>
       </w:r>
     </w:p>
     <w:p>
@@ -5732,7 +5732,7 @@
           <w:rFonts w:ascii="Consolas" w:hAnsi="Consolas" w:eastAsia="Consolas"/>
           <w:sz w:val="13"/>
         </w:rPr>
-        <w:t>│   └── WebViewEnvironment.cs  400</w:t>
+        <w:t>│   └── WebViewEnvironment.cs  373</w:t>
       </w:r>
     </w:p>
     <w:p>
@@ -6512,7 +6512,7 @@
           <w:rFonts w:ascii="Consolas" w:hAnsi="Consolas" w:eastAsia="Consolas"/>
           <w:sz w:val="13"/>
         </w:rPr>
-        <w:t>│       ├── sqleditor.html  1576</w:t>
+        <w:t>│       ├── sqleditor.html  1577</w:t>
       </w:r>
     </w:p>
     <w:p>
@@ -7180,7 +7180,7 @@
           <w:rFonts w:ascii="Consolas" w:hAnsi="Consolas" w:eastAsia="Consolas"/>
           <w:sz w:val="13"/>
         </w:rPr>
-        <w:t>│   ├── RecentFilesStore.cs  151</w:t>
+        <w:t>│   ├── RecentFilesStore.cs  187</w:t>
       </w:r>
     </w:p>
     <w:p>
@@ -7408,7 +7408,7 @@
           <w:rFonts w:ascii="Consolas" w:hAnsi="Consolas" w:eastAsia="Consolas"/>
           <w:sz w:val="13"/>
         </w:rPr>
-        <w:t>│   ├── completion.js  2367</w:t>
+        <w:t>│   ├── completion.js  2372</w:t>
       </w:r>
     </w:p>
     <w:p>
@@ -7660,19 +7660,19 @@
           <w:rFonts w:ascii="Consolas" w:hAnsi="Consolas" w:eastAsia="Consolas"/>
           <w:sz w:val="13"/>
         </w:rPr>
-        <w:t>│   ├── settings.js  693</w:t>
-      </w:r>
-    </w:p>
-    <w:p>
-      <w:pPr>
-        <w:spacing w:after="0" w:before="0" w:line="240" w:lineRule="auto"/>
-      </w:pPr>
-      <w:r>
-        <w:rPr>
-          <w:rFonts w:ascii="Consolas" w:hAnsi="Consolas" w:eastAsia="Consolas"/>
-          <w:sz w:val="13"/>
-        </w:rPr>
-        <w:t>│   ├── shell.js  615</w:t>
+        <w:t>│   ├── settings.js  696</w:t>
+      </w:r>
+    </w:p>
+    <w:p>
+      <w:pPr>
+        <w:spacing w:after="0" w:before="0" w:line="240" w:lineRule="auto"/>
+      </w:pPr>
+      <w:r>
+        <w:rPr>
+          <w:rFonts w:ascii="Consolas" w:hAnsi="Consolas" w:eastAsia="Consolas"/>
+          <w:sz w:val="13"/>
+        </w:rPr>
+        <w:t>│   ├── shell.js  806</w:t>
       </w:r>
     </w:p>
     <w:p>
@@ -7696,19 +7696,19 @@
           <w:rFonts w:ascii="Consolas" w:hAnsi="Consolas" w:eastAsia="Consolas"/>
           <w:sz w:val="13"/>
         </w:rPr>
-        <w:t>│   ├── style.css  961</w:t>
-      </w:r>
-    </w:p>
-    <w:p>
-      <w:pPr>
-        <w:spacing w:after="0" w:before="0" w:line="240" w:lineRule="auto"/>
-      </w:pPr>
-      <w:r>
-        <w:rPr>
-          <w:rFonts w:ascii="Consolas" w:hAnsi="Consolas" w:eastAsia="Consolas"/>
-          <w:sz w:val="13"/>
-        </w:rPr>
-        <w:t>│   ├── tabs.js  236</w:t>
+        <w:t>│   ├── style.css  988</w:t>
+      </w:r>
+    </w:p>
+    <w:p>
+      <w:pPr>
+        <w:spacing w:after="0" w:before="0" w:line="240" w:lineRule="auto"/>
+      </w:pPr>
+      <w:r>
+        <w:rPr>
+          <w:rFonts w:ascii="Consolas" w:hAnsi="Consolas" w:eastAsia="Consolas"/>
+          <w:sz w:val="13"/>
+        </w:rPr>
+        <w:t>│   ├── tabs.js  247</w:t>
       </w:r>
     </w:p>
     <w:p>
@@ -7816,19 +7816,19 @@
           <w:rFonts w:ascii="Consolas" w:hAnsi="Consolas" w:eastAsia="Consolas"/>
           <w:sz w:val="13"/>
         </w:rPr>
-        <w:t>├── HintCodeForm.cs  516</w:t>
-      </w:r>
-    </w:p>
-    <w:p>
-      <w:pPr>
-        <w:spacing w:after="0" w:before="0" w:line="240" w:lineRule="auto"/>
-      </w:pPr>
-      <w:r>
-        <w:rPr>
-          <w:rFonts w:ascii="Consolas" w:hAnsi="Consolas" w:eastAsia="Consolas"/>
-          <w:sz w:val="13"/>
-        </w:rPr>
-        <w:t>├── MainForm.cs  2658</w:t>
+        <w:t>├── HintCodeForm.cs  518</w:t>
+      </w:r>
+    </w:p>
+    <w:p>
+      <w:pPr>
+        <w:spacing w:after="0" w:before="0" w:line="240" w:lineRule="auto"/>
+      </w:pPr>
+      <w:r>
+        <w:rPr>
+          <w:rFonts w:ascii="Consolas" w:hAnsi="Consolas" w:eastAsia="Consolas"/>
+          <w:sz w:val="13"/>
+        </w:rPr>
+        <w:t>├── MainForm.cs  2691</w:t>
       </w:r>
     </w:p>
     <w:p>
@@ -8028,7 +8028,7 @@
           <w:rFonts w:ascii="Consolas" w:hAnsi="Consolas" w:eastAsia="Consolas"/>
           <w:sz w:val="13"/>
         </w:rPr>
-        <w:t>├── MainForm.cs  61</w:t>
+        <w:t>├── MainForm.cs  74</w:t>
       </w:r>
     </w:p>
     <w:p>
@@ -9083,7 +9083,7 @@
                 <w:b w:val="0"/>
                 <w:sz w:val="16"/>
               </w:rPr>
-              <w:t>Ctrl+P; giữ Ctrl rồi Tab = hộp chọn tab; chuột phải vùng tab = menu "Mở nhanh".</w:t>
+              <w:t>Ctrl+P; Ctrl+Tab = hộp chọn tab hiện ngay (MainForm.OpenTabSwitcher từ phím tắt tab.next/tab.prev khi đang giữ Ctrl), thả Ctrl là chuyển — hộp dò GetAsyncKeyState vì keyup Ctrl hay lạc vào WebView2; chuột phải vùng tab = menu "Mở nhanh".</w:t>
             </w:r>
           </w:p>
         </w:tc>
@@ -14343,7 +14343,7 @@
                 <w:b w:val="0"/>
                 <w:sz w:val="16"/>
               </w:rPr>
-              <w:t>Cây file nhóm theo Project do MainForm giữ rồi đẩy sang trang. Actions: Clear Structure App / Open Web.config / Refresh Web.config (MainForm.ClearStructureApp, OpenWebConfig, RefreshWebConfig — site theo file đang mở, WorkspaceConnection.ResolveSourceRoot). Ngôn ngữ tô màu theo đuôi: editor.js detectLanguage (.config/.xsd… = xml, đuôi lạ có nội dung XML = xml).</w:t>
+              <w:t>Cây file nhóm theo Project do MainForm giữ rồi đẩy sang trang. Tô file đang mở: .active (file trên editor), .open (đang mở ở tab khác — editor.openPaths), .hasActive (dự án/thư mục chứa file đó — shell.activeChain), cập nhật ở setTree và setActive (đường nhanh). Nút ✕ trên dòng dự án = shell.closeProject: closeProjectTabs (editor.closeDoc, file chưa lưu hỏi, huỷ thì dừng) rồi tree.forgetProject (host chỉ RemoveProject, không qua RemoveTreeNode để khỏi closeActive nhầm); chuột phải dự án còn "Đóng mọi tab" (chỉ closeProjectTabs). Dòng thư mục cũng có ✕: closeProject → tree.forgetFiles (RecentFilesStore.RemoveMany các file của thư mục). File: icon tròn chữ cái thư mục + vạch dọc màu thư mục (renderRow nhận nút cha). Thanh File Path (renderBreadcrumb): đường dẫn đầy đủ, nhãn bấm = copy, cuộn ngang. Thư mục trong dự án theo MainForm.FolderOrder (Dir, Filter, Grid, Lookup, Report, Template, ...). Kéo thả file trong cùng thư mục: shell.beginFileDrag (mousemove/mouseup ở document, không dùng HTML5 drag vì cây có thể bị dựng lại giữa chừng) → tree.reorder → RecentFilesStore.SetFileOrder (FileOrder trong viewer-recent-files.json; GroupedByProject xếp file theo FileOrder rồi ABC). Cây đang hiện thì thanh tab chỉ giữ file không có trong cây (tabs.js items; Settings → Bố cục layout.tabstripWithTree = như cũ). Actions: Clear Structure App / Open Web.config / Refresh Web.config (MainForm.ClearStructureApp, OpenWebConfig, RefreshWebConfig — site theo file đang mở, WorkspaceConnection.ResolveSourceRoot). Ngôn ngữ tô màu theo đuôi: editor.js detectLanguage (.config/.xsd… = xml, đuôi lạ có nội dung XML = xml).</w:t>
             </w:r>
           </w:p>
         </w:tc>
@@ -15292,7 +15292,7 @@
                 <w:b w:val="0"/>
                 <w:sz w:val="17"/>
               </w:rPr>
-              <w:t>Tab kế / đóng / mở lại tab vừa đóng</w:t>
+              <w:t>Hộp chọn tab (thả Ctrl để chuyển) / đóng / mở lại tab vừa đóng</w:t>
             </w:r>
           </w:p>
         </w:tc>

</xml_diff>

<commit_message>
bcodeviewer| bổ sung giữ ctrl + tab
</commit_message>
<xml_diff>
--- a/Cấu trúc Bcode  BcodeViewer (v3 - Tóm tắt).docx
+++ b/Cấu trúc Bcode  BcodeViewer (v3 - Tóm tắt).docx
@@ -7696,7 +7696,7 @@
           <w:rFonts w:ascii="Consolas" w:hAnsi="Consolas" w:eastAsia="Consolas"/>
           <w:sz w:val="13"/>
         </w:rPr>
-        <w:t>│   ├── style.css  988</w:t>
+        <w:t>│   ├── style.css  995</w:t>
       </w:r>
     </w:p>
     <w:p>
@@ -7720,7 +7720,7 @@
           <w:rFonts w:ascii="Consolas" w:hAnsi="Consolas" w:eastAsia="Consolas"/>
           <w:sz w:val="13"/>
         </w:rPr>
-        <w:t>│   ├── tabswitcher.js  145</w:t>
+        <w:t>│   ├── tabswitcher.js  212</w:t>
       </w:r>
     </w:p>
     <w:p>
@@ -13140,7 +13140,7 @@
                 <w:b w:val="0"/>
                 <w:sz w:val="16"/>
               </w:rPr>
-              <w:t>Danh sách file do host quét (có cache), trang chỉ lọc. Ctrl+Tab bấm nhanh như Bcode: Settings → Bố cục → "Ctrl+Tab bấm nhanh" = Tab tới (A→B→C) hoặc Tab song song (A⇄B, theo MRU) — lưu ở layout.tabSwitchMode; giữ Ctrl rồi Tab = hộp chọn tab.</w:t>
+              <w:t>Danh sách file do host quét (có cache), trang chỉ lọc. Ctrl+Tab bấm nhanh như Bcode: Settings → Bố cục → "Ctrl+Tab bấm nhanh" = Tab tới (A→B→C) hoặc Tab song song (A⇄B, theo MRU) — lưu ở layout.tabSwitchMode; giữ Ctrl rồi Tab, hoặc Ctrl+Tab rồi giữ Ctrl &gt;= 400 ms (holdTimer) = hộp chọn tab kiểu FCodeViewer (cột Header thư mục\file + Path đầy đủ, dòng Previous:, nhóm theo dự án + thư mục site trước \App_Data\). tabswitcher.js nghe phím ở WINDOW capture — keys.js (document capture) chặn Ctrl+Tab bằng stopImmediatePropagation.</w:t>
             </w:r>
           </w:p>
         </w:tc>

</xml_diff>

<commit_message>
bcode| fix 1 vài lổ hỗng bảo mật
</commit_message>
<xml_diff>
--- a/Cấu trúc Bcode  BcodeViewer (v3 - Tóm tắt).docx
+++ b/Cấu trúc Bcode  BcodeViewer (v3 - Tóm tắt).docx
@@ -138,7 +138,7 @@
         <w:rPr>
           <w:sz w:val="20"/>
         </w:rPr>
-        <w:t>Chia sẻ giữa các chương trình: (1) %AppData%\Bcode\settings.json (workspace, kết nối CSDL) do Bcode ghi, BcodeViewer/ScreenDesigner đọc; BcodePaths.cs là bản sao giống hệt ở mỗi app để chọn đúng thư mục ghi được. (2) Code link bằng &lt;Compile Include&gt; chứ không chép: Shared/AiWebHelper.cs (Bcode + Viewer), Shared/LicenseCodec.cs (Bcode + KeyGen), Host/IncludeTree.cs (Viewer + ScreenDesigner), Monaco/theme.js/fcode-language.js của Viewer (Bcode dùng cho preview File Lookup).</w:t>
+        <w:t>Chia sẻ giữa các chương trình: (1) %AppData%\Bcode\settings.json (workspace, kết nối CSDL) do Bcode ghi, BcodeViewer/ScreenDesigner đọc; BcodePaths.cs là bản sao giống hệt ở mỗi app để chọn đúng thư mục ghi được. (2) Code link bằng &lt;Compile Include&gt; chứ không chép: Shared/AiWebHelper.cs (Bcode + Viewer), Shared/LicenseCodec.cs (Bcode + KeyGen), Shared/DpapiText.cs (Bcode + Viewer: mật khẩu / API key trong settings.json mã hoá DPAPI), Host/IncludeTree.cs (Viewer + ScreenDesigner), Monaco/theme.js/fcode-language.js của Viewer (Bcode dùng cho preview File Lookup).</w:t>
       </w:r>
     </w:p>
     <w:p>
@@ -1199,7 +1199,7 @@
                 <w:b w:val="0"/>
                 <w:sz w:val="17"/>
               </w:rPr>
-              <w:t>AiWebHelper.cs (nhúng claude.ai/gemini), LicenseCodec.cs (bcrypt(SHA256(key|máy|IP)))</w:t>
+              <w:t>AiWebHelper.cs (nhúng claude.ai/gemini), LicenseCodec.cs (bcrypt(SHA256(key|máy|IP))), DpapiText.cs (DpapiText + ProtectedText: mã hoá DPAPI trường bí mật khi ghi JSON)</w:t>
             </w:r>
           </w:p>
         </w:tc>
@@ -2048,7 +2048,7 @@
           <w:rFonts w:ascii="Consolas" w:hAnsi="Consolas" w:eastAsia="Consolas"/>
           <w:sz w:val="13"/>
         </w:rPr>
-        <w:t>│   ├── DecryptSqlObjectControl.cs  230</w:t>
+        <w:t>│   ├── DecryptSqlObjectControl.cs  233</w:t>
       </w:r>
     </w:p>
     <w:p>
@@ -2072,7 +2072,7 @@
           <w:rFonts w:ascii="Consolas" w:hAnsi="Consolas" w:eastAsia="Consolas"/>
           <w:sz w:val="13"/>
         </w:rPr>
-        <w:t>│   ├── FileLookupControl.cs  1361</w:t>
+        <w:t>│   ├── FileLookupControl.cs  1367</w:t>
       </w:r>
     </w:p>
     <w:p>
@@ -2756,7 +2756,7 @@
           <w:rFonts w:ascii="Consolas" w:hAnsi="Consolas" w:eastAsia="Consolas"/>
           <w:sz w:val="13"/>
         </w:rPr>
-        <w:t>│   ├── NativeShellBars.cs  295</w:t>
+        <w:t>│   ├── NativeShellBars.cs  296</w:t>
       </w:r>
     </w:p>
     <w:p>
@@ -3044,7 +3044,7 @@
           <w:rFonts w:ascii="Consolas" w:hAnsi="Consolas" w:eastAsia="Consolas"/>
           <w:sz w:val="13"/>
         </w:rPr>
-        <w:t>│   ├── SqlScintilla.cs  137</w:t>
+        <w:t>│   ├── SqlScintilla.cs  153</w:t>
       </w:r>
     </w:p>
     <w:p>
@@ -3104,7 +3104,7 @@
           <w:rFonts w:ascii="Consolas" w:hAnsi="Consolas" w:eastAsia="Consolas"/>
           <w:sz w:val="13"/>
         </w:rPr>
-        <w:t>│   ├── TableEditControl.cs  1986</w:t>
+        <w:t>│   ├── TableEditControl.cs  2007</w:t>
       </w:r>
     </w:p>
     <w:p>
@@ -3584,7 +3584,7 @@
           <w:rFonts w:ascii="Consolas" w:hAnsi="Consolas" w:eastAsia="Consolas"/>
           <w:sz w:val="13"/>
         </w:rPr>
-        <w:t>│   ├── MainForm.cs  3656</w:t>
+        <w:t>│   ├── MainForm.cs  3701</w:t>
       </w:r>
     </w:p>
     <w:p>
@@ -3776,7 +3776,7 @@
           <w:rFonts w:ascii="Consolas" w:hAnsi="Consolas" w:eastAsia="Consolas"/>
           <w:sz w:val="13"/>
         </w:rPr>
-        <w:t>│   ├── SetupEInvoiceForm.cs  356</w:t>
+        <w:t>│   ├── SetupEInvoiceForm.cs  368</w:t>
       </w:r>
     </w:p>
     <w:p>
@@ -3908,7 +3908,7 @@
           <w:rFonts w:ascii="Consolas" w:hAnsi="Consolas" w:eastAsia="Consolas"/>
           <w:sz w:val="13"/>
         </w:rPr>
-        <w:t>│   ├── UiTemplateForm.cs  660</w:t>
+        <w:t>│   ├── UiTemplateForm.cs  683</w:t>
       </w:r>
     </w:p>
     <w:p>
@@ -4004,7 +4004,7 @@
           <w:rFonts w:ascii="Consolas" w:hAnsi="Consolas" w:eastAsia="Consolas"/>
           <w:sz w:val="13"/>
         </w:rPr>
-        <w:t>│   ├── AppSettings.cs  285</w:t>
+        <w:t>│   ├── AppSettings.cs  298</w:t>
       </w:r>
     </w:p>
     <w:p>
@@ -4136,7 +4136,55 @@
           <w:rFonts w:ascii="Consolas" w:hAnsi="Consolas" w:eastAsia="Consolas"/>
           <w:sz w:val="13"/>
         </w:rPr>
-        <w:t>│   └── Workspace.cs  105</w:t>
+        <w:t>│   └── Workspace.cs  122</w:t>
+      </w:r>
+    </w:p>
+    <w:p>
+      <w:pPr>
+        <w:spacing w:after="0" w:before="0" w:line="240" w:lineRule="auto"/>
+      </w:pPr>
+      <w:r>
+        <w:rPr>
+          <w:rFonts w:ascii="Consolas" w:hAnsi="Consolas" w:eastAsia="Consolas"/>
+          <w:sz w:val="13"/>
+        </w:rPr>
+        <w:t>├── Secrets/</w:t>
+      </w:r>
+    </w:p>
+    <w:p>
+      <w:pPr>
+        <w:spacing w:after="0" w:before="0" w:line="240" w:lineRule="auto"/>
+      </w:pPr>
+      <w:r>
+        <w:rPr>
+          <w:rFonts w:ascii="Consolas" w:hAnsi="Consolas" w:eastAsia="Consolas"/>
+          <w:sz w:val="13"/>
+        </w:rPr>
+        <w:t>│   ├── LocalSecrets.cs  30</w:t>
+      </w:r>
+    </w:p>
+    <w:p>
+      <w:pPr>
+        <w:spacing w:after="0" w:before="0" w:line="240" w:lineRule="auto"/>
+      </w:pPr>
+      <w:r>
+        <w:rPr>
+          <w:rFonts w:ascii="Consolas" w:hAnsi="Consolas" w:eastAsia="Consolas"/>
+          <w:sz w:val="13"/>
+        </w:rPr>
+        <w:t>│   ├── LocalSecrets.Empty.cs  38</w:t>
+      </w:r>
+    </w:p>
+    <w:p>
+      <w:pPr>
+        <w:spacing w:after="0" w:before="0" w:line="240" w:lineRule="auto"/>
+      </w:pPr>
+      <w:r>
+        <w:rPr>
+          <w:rFonts w:ascii="Consolas" w:hAnsi="Consolas" w:eastAsia="Consolas"/>
+          <w:sz w:val="13"/>
+        </w:rPr>
+        <w:t>│   └── README.md  19</w:t>
       </w:r>
     </w:p>
     <w:p>
@@ -4652,7 +4700,7 @@
           <w:rFonts w:ascii="Consolas" w:hAnsi="Consolas" w:eastAsia="Consolas"/>
           <w:sz w:val="13"/>
         </w:rPr>
-        <w:t>│   ├── DecryptSqlCredentialStore.cs  77</w:t>
+        <w:t>│   ├── DecryptSqlCredentialStore.cs  73</w:t>
       </w:r>
     </w:p>
     <w:p>
@@ -4676,7 +4724,7 @@
           <w:rFonts w:ascii="Consolas" w:hAnsi="Consolas" w:eastAsia="Consolas"/>
           <w:sz w:val="13"/>
         </w:rPr>
-        <w:t>│   ├── DecryptSqlSecret.cs  12</w:t>
+        <w:t>│   ├── DecryptSqlSecret.cs  16</w:t>
       </w:r>
     </w:p>
     <w:p>
@@ -4712,7 +4760,7 @@
           <w:rFonts w:ascii="Consolas" w:hAnsi="Consolas" w:eastAsia="Consolas"/>
           <w:sz w:val="13"/>
         </w:rPr>
-        <w:t>│   ├── EInvoiceSetupService.cs  179</w:t>
+        <w:t>│   ├── EInvoiceSetupService.cs  185</w:t>
       </w:r>
     </w:p>
     <w:p>
@@ -4820,7 +4868,7 @@
           <w:rFonts w:ascii="Consolas" w:hAnsi="Consolas" w:eastAsia="Consolas"/>
           <w:sz w:val="13"/>
         </w:rPr>
-        <w:t>│   ├── FsgProjectLookupService.cs  490</w:t>
+        <w:t>│   ├── FsgProjectLookupService.cs  501</w:t>
       </w:r>
     </w:p>
     <w:p>
@@ -5336,7 +5384,7 @@
           <w:rFonts w:ascii="Consolas" w:hAnsi="Consolas" w:eastAsia="Consolas"/>
           <w:sz w:val="13"/>
         </w:rPr>
-        <w:t>│   ├── TableDataService.cs  511</w:t>
+        <w:t>│   ├── TableDataService.cs  521</w:t>
       </w:r>
     </w:p>
     <w:p>
@@ -5708,7 +5756,7 @@
           <w:rFonts w:ascii="Consolas" w:hAnsi="Consolas" w:eastAsia="Consolas"/>
           <w:sz w:val="13"/>
         </w:rPr>
-        <w:t>│   ├── UiTemplate.cs  505</w:t>
+        <w:t>│   ├── UiTemplate.cs  509</w:t>
       </w:r>
     </w:p>
     <w:p>
@@ -6692,7 +6740,7 @@
           <w:rFonts w:ascii="Consolas" w:hAnsi="Consolas" w:eastAsia="Consolas"/>
           <w:sz w:val="13"/>
         </w:rPr>
-        <w:t>│       ├── topbar.html  202</w:t>
+        <w:t>│       ├── topbar.html  203</w:t>
       </w:r>
     </w:p>
     <w:p>
@@ -6728,7 +6776,7 @@
           <w:rFonts w:ascii="Consolas" w:hAnsi="Consolas" w:eastAsia="Consolas"/>
           <w:sz w:val="13"/>
         </w:rPr>
-        <w:t>│       ├── uitemplate.html  1098</w:t>
+        <w:t>│       ├── uitemplate.html  1099</w:t>
       </w:r>
     </w:p>
     <w:p>
@@ -6800,7 +6848,7 @@
           <w:rFonts w:ascii="Consolas" w:hAnsi="Consolas" w:eastAsia="Consolas"/>
           <w:sz w:val="13"/>
         </w:rPr>
-        <w:t>├── Bcode.App.csproj  141</w:t>
+        <w:t>├── Bcode.App.csproj  148</w:t>
       </w:r>
     </w:p>
     <w:p>
@@ -7072,7 +7120,7 @@
           <w:rFonts w:ascii="Consolas" w:hAnsi="Consolas" w:eastAsia="Consolas"/>
           <w:sz w:val="13"/>
         </w:rPr>
-        <w:t>│   ├── WorkspaceConnection.cs  318</w:t>
+        <w:t>│   ├── WorkspaceConnection.cs  324</w:t>
       </w:r>
     </w:p>
     <w:p>
@@ -7240,7 +7288,7 @@
           <w:rFonts w:ascii="Consolas" w:hAnsi="Consolas" w:eastAsia="Consolas"/>
           <w:sz w:val="13"/>
         </w:rPr>
-        <w:t>│   └── ViewerSettings.cs  195</w:t>
+        <w:t>│   └── ViewerSettings.cs  203</w:t>
       </w:r>
     </w:p>
     <w:p>
@@ -7804,7 +7852,7 @@
           <w:rFonts w:ascii="Consolas" w:hAnsi="Consolas" w:eastAsia="Consolas"/>
           <w:sz w:val="13"/>
         </w:rPr>
-        <w:t>├── BcodeViewer.App.csproj  50</w:t>
+        <w:t>├── BcodeViewer.App.csproj  52</w:t>
       </w:r>
     </w:p>
     <w:p>
@@ -7828,7 +7876,7 @@
           <w:rFonts w:ascii="Consolas" w:hAnsi="Consolas" w:eastAsia="Consolas"/>
           <w:sz w:val="13"/>
         </w:rPr>
-        <w:t>├── MainForm.cs  2691</w:t>
+        <w:t>├── MainForm.cs  2715</w:t>
       </w:r>
     </w:p>
     <w:p>
@@ -8425,6 +8473,18 @@
           <w:sz w:val="13"/>
         </w:rPr>
         <w:t>├── AiWebHelper.cs  373</w:t>
+      </w:r>
+    </w:p>
+    <w:p>
+      <w:pPr>
+        <w:spacing w:after="0" w:before="0" w:line="240" w:lineRule="auto"/>
+      </w:pPr>
+      <w:r>
+        <w:rPr>
+          <w:rFonts w:ascii="Consolas" w:hAnsi="Consolas" w:eastAsia="Consolas"/>
+          <w:sz w:val="13"/>
+        </w:rPr>
+        <w:t>├── DpapiText.cs  134</w:t>
       </w:r>
     </w:p>
     <w:p>
@@ -16269,7 +16329,7 @@
                 <w:b w:val="0"/>
                 <w:sz w:val="16"/>
               </w:rPr>
-              <w:t>AppSettings: workspace, kết nối, đường dẫn, UiScale, FileLookupCacheMode, tool order/nhóm... Viewer + Designer đọc.</w:t>
+              <w:t>AppSettings: workspace, kết nối, đường dẫn, UiScale, FileLookupCacheMode, tool order/nhóm... Viewer + Designer đọc. Password / WebLoginPassword / ProfilerLoginPassword / API key ghi dạng "dpapi:&lt;base64&gt;" (ProtectedText, tên JSON giữ nguyên; chuỗi cũ chữ thường vẫn đọc được, lần ghi sau tự mã hoá) — chép sang máy / tài khoản khác thì Workspace.PasswordUnreadable, thanh trạng thái báo nhập lại.</w:t>
             </w:r>
           </w:p>
         </w:tc>
@@ -17448,6 +17508,18 @@
       </w:pPr>
       <w:r>
         <w:t>Bẫy đã biết &amp; ghi chú</w:t>
+      </w:r>
+    </w:p>
+    <w:p>
+      <w:pPr>
+        <w:pStyle w:val="ListBullet"/>
+        <w:spacing w:after="40"/>
+      </w:pPr>
+      <w:r>
+        <w:rPr>
+          <w:sz w:val="19"/>
+        </w:rPr>
+        <w:t>Bí mật (tài khoản DAC của Decrypt SQL Object, kết nối FSG_A, mật khẩu mặc định server nội bộ / Profiler, khoá RSA mẫu của Setup eInvoice) KHÔNG nằm trong source: ở src/Bcode.App/Secrets/LocalSecrets.cs (gitignore, mỗi máy build tự chép vào). Không có file thì csproj build bản rỗng LocalSecrets.Empty.cs — tính năng đó báo "build thiếu file bí mật" (DecryptSqlSecret.Available, FsgProjectLookupService.Available, EInvoiceSetupService.MissingKeysError). Thêm bí mật mới: thêm hằng vào CẢ HAI file, đừng ghi cứng vào code (repo GitHub có lúc để public). Xem Secrets/README.md.</w:t>
       </w:r>
     </w:p>
     <w:p>

</xml_diff>

<commit_message>
Fix gợi ý tạo danh mục
</commit_message>
<xml_diff>
--- a/Cấu trúc Bcode  BcodeViewer (v3 - Tóm tắt).docx
+++ b/Cấu trúc Bcode  BcodeViewer (v3 - Tóm tắt).docx
@@ -1964,7 +1964,7 @@
           <w:rFonts w:ascii="Consolas" w:hAnsi="Consolas" w:eastAsia="Consolas"/>
           <w:sz w:val="13"/>
         </w:rPr>
-        <w:t>│   ├── AdvanceNoteControl.cs  487</w:t>
+        <w:t>│   ├── AdvanceNoteControl.cs  497</w:t>
       </w:r>
     </w:p>
     <w:p>
@@ -2132,19 +2132,19 @@
           <w:rFonts w:ascii="Consolas" w:hAnsi="Consolas" w:eastAsia="Consolas"/>
           <w:sz w:val="13"/>
         </w:rPr>
-        <w:t>│   ├── FsgRequirementReportControl.cs  248</w:t>
-      </w:r>
-    </w:p>
-    <w:p>
-      <w:pPr>
-        <w:spacing w:after="0" w:before="0" w:line="240" w:lineRule="auto"/>
-      </w:pPr>
-      <w:r>
-        <w:rPr>
-          <w:rFonts w:ascii="Consolas" w:hAnsi="Consolas" w:eastAsia="Consolas"/>
-          <w:sz w:val="13"/>
-        </w:rPr>
-        <w:t>│   ├── GenUpdatePackageControl.cs  443</w:t>
+        <w:t>│   ├── FsgRequirementReportControl.cs  255</w:t>
+      </w:r>
+    </w:p>
+    <w:p>
+      <w:pPr>
+        <w:spacing w:after="0" w:before="0" w:line="240" w:lineRule="auto"/>
+      </w:pPr>
+      <w:r>
+        <w:rPr>
+          <w:rFonts w:ascii="Consolas" w:hAnsi="Consolas" w:eastAsia="Consolas"/>
+          <w:sz w:val="13"/>
+        </w:rPr>
+        <w:t>│   ├── GenUpdatePackageControl.cs  452</w:t>
       </w:r>
     </w:p>
     <w:p>
@@ -2288,7 +2288,7 @@
           <w:rFonts w:ascii="Consolas" w:hAnsi="Consolas" w:eastAsia="Consolas"/>
           <w:sz w:val="13"/>
         </w:rPr>
-        <w:t>│   ├── NativeAdvanceNoteControl.cs  1075</w:t>
+        <w:t>│   ├── NativeAdvanceNoteControl.cs  1089</w:t>
       </w:r>
     </w:p>
     <w:p>
@@ -2660,7 +2660,7 @@
           <w:rFonts w:ascii="Consolas" w:hAnsi="Consolas" w:eastAsia="Consolas"/>
           <w:sz w:val="13"/>
         </w:rPr>
-        <w:t>│   ├── NativePages.Profiler.cs  78</w:t>
+        <w:t>│   ├── NativePages.Profiler.cs  79</w:t>
       </w:r>
     </w:p>
     <w:p>
@@ -3008,7 +3008,7 @@
           <w:rFonts w:ascii="Consolas" w:hAnsi="Consolas" w:eastAsia="Consolas"/>
           <w:sz w:val="13"/>
         </w:rPr>
-        <w:t>│   ├── SqlProfilerControl.cs  1732</w:t>
+        <w:t>│   ├── SqlProfilerControl.cs  1838</w:t>
       </w:r>
     </w:p>
     <w:p>
@@ -3584,7 +3584,7 @@
           <w:rFonts w:ascii="Consolas" w:hAnsi="Consolas" w:eastAsia="Consolas"/>
           <w:sz w:val="13"/>
         </w:rPr>
-        <w:t>│   ├── MainForm.cs  3714</w:t>
+        <w:t>│   ├── MainForm.cs  3745</w:t>
       </w:r>
     </w:p>
     <w:p>
@@ -3716,7 +3716,7 @@
           <w:rFonts w:ascii="Consolas" w:hAnsi="Consolas" w:eastAsia="Consolas"/>
           <w:sz w:val="13"/>
         </w:rPr>
-        <w:t>│   ├── QuickListForm.cs  579</w:t>
+        <w:t>│   ├── QuickListForm.cs  760</w:t>
       </w:r>
     </w:p>
     <w:p>
@@ -4004,7 +4004,7 @@
           <w:rFonts w:ascii="Consolas" w:hAnsi="Consolas" w:eastAsia="Consolas"/>
           <w:sz w:val="13"/>
         </w:rPr>
-        <w:t>│   ├── AppSettings.cs  298</w:t>
+        <w:t>│   ├── AppSettings.cs  300</w:t>
       </w:r>
     </w:p>
     <w:p>
@@ -4340,7 +4340,7 @@
           <w:rFonts w:ascii="Consolas" w:hAnsi="Consolas" w:eastAsia="Consolas"/>
           <w:sz w:val="13"/>
         </w:rPr>
-        <w:t>│   │   ├── ReportDeployService.cs  134</w:t>
+        <w:t>│   │   ├── ReportDeployService.cs  141</w:t>
       </w:r>
     </w:p>
     <w:p>
@@ -4436,7 +4436,7 @@
           <w:rFonts w:ascii="Consolas" w:hAnsi="Consolas" w:eastAsia="Consolas"/>
           <w:sz w:val="13"/>
         </w:rPr>
-        <w:t>│   ├── AiCatalogService.cs  449</w:t>
+        <w:t>│   ├── AiCatalogService.cs  581</w:t>
       </w:r>
     </w:p>
     <w:p>
@@ -4592,6 +4592,18 @@
           <w:rFonts w:ascii="Consolas" w:hAnsi="Consolas" w:eastAsia="Consolas"/>
           <w:sz w:val="13"/>
         </w:rPr>
+        <w:t>│   ├── CatalogFieldMemory.cs  104</w:t>
+      </w:r>
+    </w:p>
+    <w:p>
+      <w:pPr>
+        <w:spacing w:after="0" w:before="0" w:line="240" w:lineRule="auto"/>
+      </w:pPr>
+      <w:r>
+        <w:rPr>
+          <w:rFonts w:ascii="Consolas" w:hAnsi="Consolas" w:eastAsia="Consolas"/>
+          <w:sz w:val="13"/>
+        </w:rPr>
         <w:t>│   ├── CfsFast.cs  213</w:t>
       </w:r>
     </w:p>
@@ -4784,7 +4796,19 @@
           <w:rFonts w:ascii="Consolas" w:hAnsi="Consolas" w:eastAsia="Consolas"/>
           <w:sz w:val="13"/>
         </w:rPr>
-        <w:t>│   ├── FastCatalogRules.cs  832</w:t>
+        <w:t>│   ├── FastCatalogCheck.cs  200</w:t>
+      </w:r>
+    </w:p>
+    <w:p>
+      <w:pPr>
+        <w:spacing w:after="0" w:before="0" w:line="240" w:lineRule="auto"/>
+      </w:pPr>
+      <w:r>
+        <w:rPr>
+          <w:rFonts w:ascii="Consolas" w:hAnsi="Consolas" w:eastAsia="Consolas"/>
+          <w:sz w:val="13"/>
+        </w:rPr>
+        <w:t>│   ├── FastCatalogRules.cs  974</w:t>
       </w:r>
     </w:p>
     <w:p>
@@ -5120,7 +5144,7 @@
           <w:rFonts w:ascii="Consolas" w:hAnsi="Consolas" w:eastAsia="Consolas"/>
           <w:sz w:val="13"/>
         </w:rPr>
-        <w:t>│   ├── QuickReportService.cs  636</w:t>
+        <w:t>│   ├── QuickReportService.cs  637</w:t>
       </w:r>
     </w:p>
     <w:p>
@@ -5204,6 +5228,18 @@
           <w:rFonts w:ascii="Consolas" w:hAnsi="Consolas" w:eastAsia="Consolas"/>
           <w:sz w:val="13"/>
         </w:rPr>
+        <w:t>│   ├── SourceFieldIndex.cs  237</w:t>
+      </w:r>
+    </w:p>
+    <w:p>
+      <w:pPr>
+        <w:spacing w:after="0" w:before="0" w:line="240" w:lineRule="auto"/>
+      </w:pPr>
+      <w:r>
+        <w:rPr>
+          <w:rFonts w:ascii="Consolas" w:hAnsi="Consolas" w:eastAsia="Consolas"/>
+          <w:sz w:val="13"/>
+        </w:rPr>
         <w:t>│   ├── SourceGrantService.cs  311</w:t>
       </w:r>
     </w:p>
@@ -5672,7 +5708,7 @@
           <w:rFonts w:ascii="Consolas" w:hAnsi="Consolas" w:eastAsia="Consolas"/>
           <w:sz w:val="13"/>
         </w:rPr>
-        <w:t>│   ├── ShortcutRegistry.cs  332</w:t>
+        <w:t>│   ├── ShortcutRegistry.cs  333</w:t>
       </w:r>
     </w:p>
     <w:p>
@@ -5840,7 +5876,7 @@
           <w:rFonts w:ascii="Consolas" w:hAnsi="Consolas" w:eastAsia="Consolas"/>
           <w:sz w:val="13"/>
         </w:rPr>
-        <w:t>│       ├── advnote.html  700</w:t>
+        <w:t>│       ├── advnote.html  710</w:t>
       </w:r>
     </w:p>
     <w:p>
@@ -6236,7 +6272,7 @@
           <w:rFonts w:ascii="Consolas" w:hAnsi="Consolas" w:eastAsia="Consolas"/>
           <w:sz w:val="13"/>
         </w:rPr>
-        <w:t>│       ├── fsgreq.html  746</w:t>
+        <w:t>│       ├── fsgreq.html  760</w:t>
       </w:r>
     </w:p>
     <w:p>
@@ -6416,7 +6452,7 @@
           <w:rFonts w:ascii="Consolas" w:hAnsi="Consolas" w:eastAsia="Consolas"/>
           <w:sz w:val="13"/>
         </w:rPr>
-        <w:t>│       ├── quicklist.html  1504</w:t>
+        <w:t>│       ├── quicklist.html  1666</w:t>
       </w:r>
     </w:p>
     <w:p>
@@ -6644,7 +6680,7 @@
           <w:rFonts w:ascii="Consolas" w:hAnsi="Consolas" w:eastAsia="Consolas"/>
           <w:sz w:val="13"/>
         </w:rPr>
-        <w:t>│       ├── sqlprofilerbar.html  147</w:t>
+        <w:t>│       ├── sqlprofilerbar.html  149</w:t>
       </w:r>
     </w:p>
     <w:p>
@@ -10501,7 +10537,7 @@
                 <w:b w:val="0"/>
                 <w:sz w:val="16"/>
               </w:rPr>
-              <w:t>Ctrl+Shift+G. Cấu trúc gói Script\app|sys\*.sql + Web\... dùng chung với Advance Note. Script procedure/function/view/trigger trong gói (Gen nhanh Store, Note (New)/Gen All) = SqlObjectBrowserService.GetDeployScriptAsync: IF EXISTS (sysobjects, xType, IsEncrypted = 0) DROP ... GO + CREATE gốc; table không bao giờ DROP; object mã hoá chỉ ra dòng nhắc.</w:t>
+              <w:t>Ctrl+Shift+G. Cấu trúc gói Script\app\APP_Script.sql | Script\sys\SYS_Script.sql + Web\... dùng chung với Advance Note (lúc tạo gói gọi GenAllService.CombineScripts + CreatePackage như Note (New)).Script procedure/function/view/trigger trong gói (Gen nhanh Store, Note (New)/Gen All) = SqlObjectBrowserService.GetDeployScriptAsync: IF EXISTS (sysobjects, xType, IsEncrypted = 0) DROP ... GO + CREATE gốc; table không bao giờ DROP; object mã hoá chỉ ra dòng nhắc.</w:t>
             </w:r>
           </w:p>
         </w:tc>
@@ -10651,7 +10687,7 @@
                 <w:b w:val="0"/>
                 <w:sz w:val="16"/>
               </w:rPr>
-              <w:t>Services/AiCatalogService.cs, AiChatService.cs, FastCatalogRules.cs (không API key); Forms/QuickListForm.cs (StartAi, RunAiAsync); Web/Shell/quicklist.html (#aiBox, quick.aiState / aiLoad); Controls/AdvanceNoteControl.cs + NativeAdvanceNoteControl.cs (AiCatalogRequested, RequestAiCatalog); Web/Shell/advnote.html (btnAiCatalog); MainForm.OpenQuickListWithAi</w:t>
+              <w:t>Services/AiCatalogService.cs, AiChatService.cs, FastCatalogRules.cs (không API key / nút Theo luật Fast), SourceFieldIndex.cs, CatalogFieldMemory.cs, FastCatalogCheck.cs; Forms/QuickListForm.cs (StartAi, RunAiAsync, FastCheckAsync, LearnEdits); Web/Shell/quicklist.html (#aiBox, quick.aiState / aiLoad); Controls/AdvanceNoteControl.cs + NativeAdvanceNoteControl.cs (AiCatalogRequested, RequestAiCatalog); Web/Shell/advnote.html (btnAiCatalog); MainForm.OpenQuickListWithAi</w:t>
             </w:r>
           </w:p>
         </w:tc>
@@ -10669,7 +10705,7 @@
                 <w:b w:val="0"/>
                 <w:sz w:val="16"/>
               </w:rPr>
-              <w:t>Note (New) hoặc khung chi tiết của Báo cáo yêu cầu FSG → nút 🤖 AI tạo danh mục / Ctrl+Alt+I (note.aiCatalog, chỉ ở 2 tab đó). AI đọc Request Content (đã Sync từ nvphyc) + tên bảng / tên-kiểu cột App Data (không gửi dữ liệu dòng), trả JSON {loai, tom_tat, can_bang, cau_hoi, ghi_chu, spec}; spec = dạng JSON của trang quicklist.html (QuickListService.FromPageJson). can_bang = AI xin cột bảng → tự gửi rồi hỏi lại (≤3 lượt). Spec nạp như khôi phục cấu hình (aiLoad → loadColumns → applySaved); bảng AI đề xuất chưa có → cột lấy từ spec + script CREATE TABLE (CatalogCloneService.BuildTableScript, chỉ copy, không chạy). Câu hỏi trả lời ngay trong khung AI. Không ghi file/DB: người dùng bấm Tạo file như thường. Gọi Claude (ưu tiên) / Gemini qua AiChatService (dùng chung với Ctrl+I của SQL Query); lịch sử ở AiHistoryStore loại "Danh mục". Chưa có API key → FastCatalogRules (không AI, không token): đọc "danh mục X: cột, cột…" theo quy ước FBO (bảng mới = tiền tố AppSettings.NewCatalogTablePrefix, mặc định zdm, + chữ đầu các từ; chi tiết = bảng + ct; AI prompt cũng dùng tiền tố này; ma_/ten_/ten_2, nh_xx1, ghi_chu, status, datetime0/2, user_id0/2), tra ngược tiêu đề → field (lookup thường dùng, HeaderDictionary.json, header.xml qua FieldDictionaryService.Entries), bảng dm.. có sẵn → cột thật, danh mục trùng tên trong Controllers\Dir → hỏi lại; trả JSON cùng dạng AI nên chuẩn hoá + giao diện dùng chung. Màn khai báo số liệu (menu mới "Cập nhật dự toán", không phải "Danh mục …"): FastCatalogRules.DataScreenAsync — bảng = tiền tố bỏ dm + tên menu (zdutoan), không mã-tên/Lookup, khoá = cột chiều (bỏ cột "không bắt buộc") + hỏi xác nhận, "theo 12 tháng/mỗi tháng" → 12 cột/chỉ tiêu (MonthBase: ns_dt01..12) hoặc lưới theo tháng; cụm "Lookup từ Danh mục X" bị che khi tìm tên màn, X tra qua ResolveLookupNoun (lookup thường dùng → header.xml "X 1" → danh mục trong source); kiểu theo mô tả (tiền/SL/giá numeric(19,4), nam/lần int, bắt buộc → NOT NULL), cột lookup lấy kiểu cột mã bảng nguồn. LookupHints gửi kèm prompt AI (mục LOOKUP CHUẨN); prompt AI có phần DATA-ENTRY SCREENS (@@DATAPREFIX@@).</w:t>
+              <w:t>Note (New) hoặc khung chi tiết của Báo cáo yêu cầu FSG → nút 🤖 AI tạo danh mục / Ctrl+Alt+I (note.aiCatalog, chỉ ở 2 tab đó). AI đọc Request Content (đã Sync từ nvphyc) + tên bảng / tên-kiểu cột App Data (không gửi dữ liệu dòng), trả JSON {loai, tom_tat, can_bang, cau_hoi, ghi_chu, spec}; spec = dạng JSON của trang quicklist.html (QuickListService.FromPageJson). can_bang = AI xin cột bảng → tự gửi rồi hỏi lại (≤3 lượt). Spec nạp như khôi phục cấu hình (aiLoad → loadColumns → applySaved); bảng AI đề xuất chưa có → cột lấy từ spec + script CREATE TABLE (CatalogCloneService.BuildTableScript, chỉ copy, không chạy). Câu hỏi trả lời ngay trong khung AI. Không ghi file/DB: người dùng bấm Tạo file như thường. Gọi Claude (ưu tiên) / Gemini qua AiChatService (dùng chung với Ctrl+I của SQL Query); lịch sử ở AiHistoryStore loại "Danh mục". Chưa có API key → FastCatalogRules (không AI, không token): đọc "danh mục X: cột, cột…" theo quy ước FBO (bảng mới = tiền tố AppSettings.NewCatalogTablePrefix, mặc định zdm, + chữ đầu các từ; chi tiết = bảng + ct; AI prompt cũng dùng tiền tố này; ma_/ten_/ten_2, nh_xx1, ghi_chu, status, datetime0/2, user_id0/2), tra ngược tiêu đề → field (lookup thường dùng, HeaderDictionary.json, header.xml qua FieldDictionaryService.Entries), bảng dm.. có sẵn → cột thật, danh mục trùng tên trong Controllers\Dir → hỏi lại; trả JSON cùng dạng AI nên chuẩn hoá + giao diện dùng chung. Màn khai báo số liệu (menu mới "Cập nhật dự toán", không phải "Danh mục …"): FastCatalogRules.DataScreenAsync — bảng = tiền tố bỏ dm + tên menu (zdutoan), không mã-tên/Lookup, khoá = cột chiều (bỏ cột "không bắt buộc") + hỏi xác nhận, "theo 12 tháng/mỗi tháng" → 12 cột/chỉ tiêu (MonthBase: ns_dt01..12) hoặc lưới theo tháng; cụm "Lookup từ Danh mục X" bị che khi tìm tên màn, X tra qua ResolveLookupNoun (lookup thường dùng → header.xml "X 1" → danh mục trong source); kiểu theo mô tả (tiền/SL/giá numeric(19,4), nam/lần int, bắt buộc → NOT NULL), cột lookup lấy kiểu cột mã bảng nguồn. LookupHints gửi kèm prompt AI (mục LOOKUP CHUẨN); prompt AI có phần DATA-ENTRY SCREENS (@@DATAPREFIX@@). Nút "Theo luật Fast" (aiRules) ép dùng luật kể cả khi có key (SuggestAsync forceRules). "🔎 AI phân tích" (fsgreq.html dtAna, advnote.html btnAiAnalyze, NativeAdvanceNoteControl; event AiAnalyzeRequested → MainForm.OpenQuickListWithAiAnalyze → QuickListForm.StartAnalyze; phím note.aiAnalyze Ctrl+Alt+Shift+I): AiCatalogService.AnalyzeAsync (AnalyzePrompt) cho AI viết lại y/c theo mẫu luật Fast ("Thêm danh mục X / Gồm các trường: - cột [field]: lookup từ danh mục…, bắt buộc nhập / Chi tiết gồm: … / Cho phép import Excel"), trang hiện #aiAnaPane cho sửa → aiConfirm chạy luật Fast trên nội dung đã xác nhận. Luật đọc "[field kiểu]" (KeepFieldTag / TakeFieldTag / ForceField) và dòng "Chi tiết gồm:". Thứ tự tra tiêu đề → field của luật: mã/tên/ghi chú/status/chiều thời gian (thang, nam, ky, quy int; "Tháng / Năm" tách 2 cột — SplitTimeDims) → CatalogFieldMemory (%AppData%\Bcode\quicklist-fields.json: cột bạn đã sửa so với gợi ý, ghi lúc Tạo file qua cờ "ai" trên từng cột) → SourceFieldIndex (field trong Controllers\Dir của source dự án; cache %AppData%\Bcode\cache\source-fields theo thời gian sửa file; thắng header.xml khi ≥3 file và nhiều hơn field chuẩn; kiểu thật lấy từ bảng của file Dir) → lookup thường dùng / header.xml. AI được gửi mục FIELD DỰ ÁN / ĐÃ CHỐT (ProjectHints). FastCatalogCheck soát spec trước Tạo file (cột hệ thống/status mẫu ghi, ma_/ten_/ten_2, kiểu cột tra cứu, type ↔ kiểu SQL, tiêu đề v/e, lệch dự án / lần đã sửa, controller trùng danh mục khác, khoá/liên kết chi tiết) → nút ⚡ ở thanh dưới (fastCheck, chạy sau 0,7s ngừng sửa); mục "warn" thì Tạo file hỏi lại.</w:t>
             </w:r>
           </w:p>
         </w:tc>

</xml_diff>

<commit_message>
bcode| bổ sung nút theo luật fast
</commit_message>
<xml_diff>
--- a/Cấu trúc Bcode  BcodeViewer (v3 - Tóm tắt).docx
+++ b/Cấu trúc Bcode  BcodeViewer (v3 - Tóm tắt).docx
@@ -1964,7 +1964,7 @@
           <w:rFonts w:ascii="Consolas" w:hAnsi="Consolas" w:eastAsia="Consolas"/>
           <w:sz w:val="13"/>
         </w:rPr>
-        <w:t>│   ├── AdvanceNoteControl.cs  497</w:t>
+        <w:t>│   ├── AdvanceNoteControl.cs  499</w:t>
       </w:r>
     </w:p>
     <w:p>
@@ -2132,7 +2132,7 @@
           <w:rFonts w:ascii="Consolas" w:hAnsi="Consolas" w:eastAsia="Consolas"/>
           <w:sz w:val="13"/>
         </w:rPr>
-        <w:t>│   ├── FsgRequirementReportControl.cs  255</w:t>
+        <w:t>│   ├── FsgRequirementReportControl.cs  256</w:t>
       </w:r>
     </w:p>
     <w:p>
@@ -2288,7 +2288,7 @@
           <w:rFonts w:ascii="Consolas" w:hAnsi="Consolas" w:eastAsia="Consolas"/>
           <w:sz w:val="13"/>
         </w:rPr>
-        <w:t>│   ├── NativeAdvanceNoteControl.cs  1089</w:t>
+        <w:t>│   ├── NativeAdvanceNoteControl.cs  1092</w:t>
       </w:r>
     </w:p>
     <w:p>
@@ -3584,7 +3584,7 @@
           <w:rFonts w:ascii="Consolas" w:hAnsi="Consolas" w:eastAsia="Consolas"/>
           <w:sz w:val="13"/>
         </w:rPr>
-        <w:t>│   ├── MainForm.cs  3745</w:t>
+        <w:t>│   ├── MainForm.cs  3748</w:t>
       </w:r>
     </w:p>
     <w:p>
@@ -3716,7 +3716,7 @@
           <w:rFonts w:ascii="Consolas" w:hAnsi="Consolas" w:eastAsia="Consolas"/>
           <w:sz w:val="13"/>
         </w:rPr>
-        <w:t>│   ├── QuickListForm.cs  760</w:t>
+        <w:t>│   ├── QuickListForm.cs  764</w:t>
       </w:r>
     </w:p>
     <w:p>
@@ -5708,7 +5708,7 @@
           <w:rFonts w:ascii="Consolas" w:hAnsi="Consolas" w:eastAsia="Consolas"/>
           <w:sz w:val="13"/>
         </w:rPr>
-        <w:t>│   ├── ShortcutRegistry.cs  333</w:t>
+        <w:t>│   ├── ShortcutRegistry.cs  334</w:t>
       </w:r>
     </w:p>
     <w:p>
@@ -5876,7 +5876,7 @@
           <w:rFonts w:ascii="Consolas" w:hAnsi="Consolas" w:eastAsia="Consolas"/>
           <w:sz w:val="13"/>
         </w:rPr>
-        <w:t>│       ├── advnote.html  710</w:t>
+        <w:t>│       ├── advnote.html  714</w:t>
       </w:r>
     </w:p>
     <w:p>
@@ -6272,7 +6272,7 @@
           <w:rFonts w:ascii="Consolas" w:hAnsi="Consolas" w:eastAsia="Consolas"/>
           <w:sz w:val="13"/>
         </w:rPr>
-        <w:t>│       ├── fsgreq.html  760</w:t>
+        <w:t>│       ├── fsgreq.html  763</w:t>
       </w:r>
     </w:p>
     <w:p>
@@ -10705,7 +10705,7 @@
                 <w:b w:val="0"/>
                 <w:sz w:val="16"/>
               </w:rPr>
-              <w:t>Note (New) hoặc khung chi tiết của Báo cáo yêu cầu FSG → nút 🤖 AI tạo danh mục / Ctrl+Alt+I (note.aiCatalog, chỉ ở 2 tab đó). AI đọc Request Content (đã Sync từ nvphyc) + tên bảng / tên-kiểu cột App Data (không gửi dữ liệu dòng), trả JSON {loai, tom_tat, can_bang, cau_hoi, ghi_chu, spec}; spec = dạng JSON của trang quicklist.html (QuickListService.FromPageJson). can_bang = AI xin cột bảng → tự gửi rồi hỏi lại (≤3 lượt). Spec nạp như khôi phục cấu hình (aiLoad → loadColumns → applySaved); bảng AI đề xuất chưa có → cột lấy từ spec + script CREATE TABLE (CatalogCloneService.BuildTableScript, chỉ copy, không chạy). Câu hỏi trả lời ngay trong khung AI. Không ghi file/DB: người dùng bấm Tạo file như thường. Gọi Claude (ưu tiên) / Gemini qua AiChatService (dùng chung với Ctrl+I của SQL Query); lịch sử ở AiHistoryStore loại "Danh mục". Chưa có API key → FastCatalogRules (không AI, không token): đọc "danh mục X: cột, cột…" theo quy ước FBO (bảng mới = tiền tố AppSettings.NewCatalogTablePrefix, mặc định zdm, + chữ đầu các từ; chi tiết = bảng + ct; AI prompt cũng dùng tiền tố này; ma_/ten_/ten_2, nh_xx1, ghi_chu, status, datetime0/2, user_id0/2), tra ngược tiêu đề → field (lookup thường dùng, HeaderDictionary.json, header.xml qua FieldDictionaryService.Entries), bảng dm.. có sẵn → cột thật, danh mục trùng tên trong Controllers\Dir → hỏi lại; trả JSON cùng dạng AI nên chuẩn hoá + giao diện dùng chung. Màn khai báo số liệu (menu mới "Cập nhật dự toán", không phải "Danh mục …"): FastCatalogRules.DataScreenAsync — bảng = tiền tố bỏ dm + tên menu (zdutoan), không mã-tên/Lookup, khoá = cột chiều (bỏ cột "không bắt buộc") + hỏi xác nhận, "theo 12 tháng/mỗi tháng" → 12 cột/chỉ tiêu (MonthBase: ns_dt01..12) hoặc lưới theo tháng; cụm "Lookup từ Danh mục X" bị che khi tìm tên màn, X tra qua ResolveLookupNoun (lookup thường dùng → header.xml "X 1" → danh mục trong source); kiểu theo mô tả (tiền/SL/giá numeric(19,4), nam/lần int, bắt buộc → NOT NULL), cột lookup lấy kiểu cột mã bảng nguồn. LookupHints gửi kèm prompt AI (mục LOOKUP CHUẨN); prompt AI có phần DATA-ENTRY SCREENS (@@DATAPREFIX@@). Nút "Theo luật Fast" (aiRules) ép dùng luật kể cả khi có key (SuggestAsync forceRules). "🔎 AI phân tích" (fsgreq.html dtAna, advnote.html btnAiAnalyze, NativeAdvanceNoteControl; event AiAnalyzeRequested → MainForm.OpenQuickListWithAiAnalyze → QuickListForm.StartAnalyze; phím note.aiAnalyze Ctrl+Alt+Shift+I): AiCatalogService.AnalyzeAsync (AnalyzePrompt) cho AI viết lại y/c theo mẫu luật Fast ("Thêm danh mục X / Gồm các trường: - cột [field]: lookup từ danh mục…, bắt buộc nhập / Chi tiết gồm: … / Cho phép import Excel"), trang hiện #aiAnaPane cho sửa → aiConfirm chạy luật Fast trên nội dung đã xác nhận. Luật đọc "[field kiểu]" (KeepFieldTag / TakeFieldTag / ForceField) và dòng "Chi tiết gồm:". Thứ tự tra tiêu đề → field của luật: mã/tên/ghi chú/status/chiều thời gian (thang, nam, ky, quy int; "Tháng / Năm" tách 2 cột — SplitTimeDims) → CatalogFieldMemory (%AppData%\Bcode\quicklist-fields.json: cột bạn đã sửa so với gợi ý, ghi lúc Tạo file qua cờ "ai" trên từng cột) → SourceFieldIndex (field trong Controllers\Dir của source dự án; cache %AppData%\Bcode\cache\source-fields theo thời gian sửa file; thắng header.xml khi ≥3 file và nhiều hơn field chuẩn; kiểu thật lấy từ bảng của file Dir) → lookup thường dùng / header.xml. AI được gửi mục FIELD DỰ ÁN / ĐÃ CHỐT (ProjectHints). FastCatalogCheck soát spec trước Tạo file (cột hệ thống/status mẫu ghi, ma_/ten_/ten_2, kiểu cột tra cứu, type ↔ kiểu SQL, tiêu đề v/e, lệch dự án / lần đã sửa, controller trùng danh mục khác, khoá/liên kết chi tiết) → nút ⚡ ở thanh dưới (fastCheck, chạy sau 0,7s ngừng sửa); mục "warn" thì Tạo file hỏi lại.</w:t>
+              <w:t>Note (New) hoặc khung chi tiết của Báo cáo yêu cầu FSG → nút 🤖 AI tạo danh mục / Ctrl+Alt+I (note.aiCatalog, chỉ ở 2 tab đó). AI đọc Request Content (đã Sync từ nvphyc) + tên bảng / tên-kiểu cột App Data (không gửi dữ liệu dòng), trả JSON {loai, tom_tat, can_bang, cau_hoi, ghi_chu, spec}; spec = dạng JSON của trang quicklist.html (QuickListService.FromPageJson). can_bang = AI xin cột bảng → tự gửi rồi hỏi lại (≤3 lượt). Spec nạp như khôi phục cấu hình (aiLoad → loadColumns → applySaved); bảng AI đề xuất chưa có → cột lấy từ spec + script CREATE TABLE (CatalogCloneService.BuildTableScript, chỉ copy, không chạy). Câu hỏi trả lời ngay trong khung AI. Không ghi file/DB: người dùng bấm Tạo file như thường. Gọi Claude (ưu tiên) / Gemini qua AiChatService (dùng chung với Ctrl+I của SQL Query); lịch sử ở AiHistoryStore loại "Danh mục". Chưa có API key → FastCatalogRules (không AI, không token): đọc "danh mục X: cột, cột…" theo quy ước FBO (bảng mới = tiền tố AppSettings.NewCatalogTablePrefix, mặc định zdm, + chữ đầu các từ; chi tiết = bảng + ct; AI prompt cũng dùng tiền tố này; ma_/ten_/ten_2, nh_xx1, ghi_chu, status, datetime0/2, user_id0/2), tra ngược tiêu đề → field (lookup thường dùng, HeaderDictionary.json, header.xml qua FieldDictionaryService.Entries), bảng dm.. có sẵn → cột thật, danh mục trùng tên trong Controllers\Dir → hỏi lại; trả JSON cùng dạng AI nên chuẩn hoá + giao diện dùng chung. Màn khai báo số liệu (menu mới "Cập nhật dự toán", không phải "Danh mục …"): FastCatalogRules.DataScreenAsync — bảng = tiền tố bỏ dm + tên menu (zdutoan), không mã-tên/Lookup, khoá = cột chiều (bỏ cột "không bắt buộc") + hỏi xác nhận, "theo 12 tháng/mỗi tháng" → 12 cột/chỉ tiêu (MonthBase: ns_dt01..12) hoặc lưới theo tháng; cụm "Lookup từ Danh mục X" bị che khi tìm tên màn, X tra qua ResolveLookupNoun (lookup thường dùng → header.xml "X 1" → danh mục trong source); kiểu theo mô tả (tiền/SL/giá numeric(19,4), nam/lần int, bắt buộc → NOT NULL), cột lookup lấy kiểu cột mã bảng nguồn. LookupHints gửi kèm prompt AI (mục LOOKUP CHUẨN); prompt AI có phần DATA-ENTRY SCREENS (@@DATAPREFIX@@). Nút "Theo luật Fast" (aiRules) ép dùng luật kể cả khi có key (SuggestAsync forceRules). "⚙ Theo luật Fast" (mode rules → QuickListForm.StartRules = StartAi(rules: true); phím note.fastRules Ctrl+Alt+Shift+F) và "🔎 AI phân tích" (mode analyze → QuickListForm.StartAnalyze; phím note.aiAnalyze Ctrl+Alt+Shift+I) — nút fsgreq.html dtRules/dtAna, advnote.html btnFastRules/btnAiAnalyze, NativeAdvanceNoteControl; post catalogAssist {mode} → event CatalogAssistRequested(name, content, mode) → MainForm.OpenQuickListWithAssist: AiCatalogService.AnalyzeAsync (AnalyzePrompt) cho AI viết lại y/c theo mẫu luật Fast ("Thêm danh mục X / Gồm các trường: - cột [field]: lookup từ danh mục…, bắt buộc nhập / Chi tiết gồm: … / Cho phép import Excel"), trang hiện #aiAnaPane cho sửa → aiConfirm chạy luật Fast trên nội dung đã xác nhận. Luật đọc "[field kiểu]" (KeepFieldTag / TakeFieldTag / ForceField) và dòng "Chi tiết gồm:". Thứ tự tra tiêu đề → field của luật: mã/tên/ghi chú/status/chiều thời gian (thang, nam, ky, quy int; "Tháng / Năm" tách 2 cột — SplitTimeDims) → CatalogFieldMemory (%AppData%\Bcode\quicklist-fields.json: cột bạn đã sửa so với gợi ý, ghi lúc Tạo file qua cờ "ai" trên từng cột) → SourceFieldIndex (field trong Controllers\Dir của source dự án; cache %AppData%\Bcode\cache\source-fields theo thời gian sửa file; thắng header.xml khi ≥3 file và nhiều hơn field chuẩn; kiểu thật lấy từ bảng của file Dir) → lookup thường dùng / header.xml. AI được gửi mục FIELD DỰ ÁN / ĐÃ CHỐT (ProjectHints). FastCatalogCheck soát spec trước Tạo file (cột hệ thống/status mẫu ghi, ma_/ten_/ten_2, kiểu cột tra cứu, type ↔ kiểu SQL, tiêu đề v/e, lệch dự án / lần đã sửa, controller trùng danh mục khác, khoá/liên kết chi tiết) → nút ⚡ ở thanh dưới (fastCheck, chạy sau 0,7s ngừng sửa); mục "warn" thì Tạo file hỏi lại.</w:t>
             </w:r>
           </w:p>
         </w:tc>

</xml_diff>

<commit_message>
bcode| bổ sung genupdate nhiều dự án khác nhau
</commit_message>
<xml_diff>
--- a/Cấu trúc Bcode  BcodeViewer (v3 - Tóm tắt).docx
+++ b/Cấu trúc Bcode  BcodeViewer (v3 - Tóm tắt).docx
@@ -90,7 +90,7 @@
         <w:rPr>
           <w:sz w:val="20"/>
         </w:rPr>
-        <w:t>Bộ Bcode gồm 4 chương trình (.exe) + 1 thư viện nhúng, cùng nằm trong solution Bcode.sln (D:\Bee\Tool\BcodeProject\Bcode-main), đều xoay quanh FastBusiness ERP và định dạng file điều khiển "FCode" (controller XML kiểu Dir/Grid/Filter/Report, SQL và JavaScript nhúng bên trong).</w:t>
+        <w:t>Bộ Bcode gồm 5 chương trình (.exe) + 1 thư viện nhúng, cùng nằm trong solution Bcode.sln (D:\Bee\Tool\BcodeProject\Bcode-main), đều xoay quanh FastBusiness ERP và định dạng file điều khiển "FCode" (controller XML kiểu Dir/Grid/Filter/Report, SQL và JavaScript nhúng bên trong).</w:t>
       </w:r>
     </w:p>
     <w:p>
@@ -126,7 +126,7 @@
         <w:rPr>
           <w:sz w:val="20"/>
         </w:rPr>
-        <w:t>Bcode.ScreenDesigner (BcodeScreenDesigner.exe) — thiết kế/xem trước màn hình Dir có dữ liệu mẫu; Bcode mở từ menu "Triển khai" hoặc chuột phải cây WCommand. Bcode.KeyGen — công cụ riêng của người phát hành, cấp key bản quyền gắn theo máy. Bcode.ReportBuilder — thư viện (DLL) "Tạo báo cáo" Bcode tham chiếu.</w:t>
+        <w:t>Bcode.ScreenDesigner (BcodeScreenDesigner.exe) — thiết kế/xem trước màn hình Dir có dữ liệu mẫu; Bcode mở từ menu "Triển khai" hoặc chuột phải cây WCommand. Bcode.KeyGen — công cụ riêng của người phát hành, cấp key bản quyền gắn theo máy. Bcode.ReportBuilder — thư viện (DLL) "Tạo báo cáo" Bcode tham chiếu. BcodeNote.App (BcodeNote.exe) — Note (New) cho NHIỀU dự án: tham chiếu thẳng Bcode.dll (InternalsVisibleTo), dùng lại AdvanceNoteControl/advnote.html, GenAllService, WCommandService, QuickListForm; đọc-ghi cùng AdvanceNotes\&lt;dự án&gt;.json với Bcode.</w:t>
       </w:r>
     </w:p>
     <w:p>
@@ -150,7 +150,7 @@
         <w:rPr>
           <w:sz w:val="20"/>
         </w:rPr>
-        <w:t>Liên lạc giữa tiến trình: Bcode → Viewer bằng Process.Start (file + tên project); Viewer → Bcode qua named pipe Bcode.Control.&lt;session&gt; bằng lệnh "sql|&lt;b64 script&gt;|&lt;b64 tiêu đề&gt;" ("Debug trong Bcode" mở tab SQL Query); Bcode còn xử lý lệnh "fsg|&lt;file&gt;|&lt;project&gt;" nhưng Viewer hiện KHÔNG gửi (F5 của Viewer mở trình duyệt qua Host/MenuLauncher) — Services/ViewerControlServer.cs; Bcode → ScreenDesigner bằng Process.Start --source --project --controller; Viewer chạy 1 bản mỗi phiên Windows (Mutex + pipe BcodeViewer.SingleInstance.&lt;session&gt;).</w:t>
+        <w:t>Liên lạc giữa tiến trình: Bcode → Viewer bằng Process.Start (file + tên project); Viewer → Bcode qua named pipe Bcode.Control.&lt;session&gt; bằng lệnh "sql|&lt;b64 script&gt;|&lt;b64 tiêu đề&gt;" ("Debug trong Bcode" mở tab SQL Query); BcodeNote → Bcode cùng pipe bằng "sqlp|&lt;b64 script&gt;|&lt;b64 tiêu đề&gt;|&lt;b64 dự án&gt;|&lt;0 App/1 Sys&gt;" (mở script gói vào tab SQL Query đúng App/Sys; khác dự án đang mở thì có dòng cảnh báo đầu script — MainForm.OpenProjectScriptTab); Bcode còn xử lý lệnh "fsg|&lt;file&gt;|&lt;project&gt;" nhưng Viewer hiện KHÔNG gửi (F5 của Viewer mở trình duyệt qua Host/MenuLauncher) — Services/ViewerControlServer.cs; Bcode → ScreenDesigner bằng Process.Start --source --project --controller; Viewer chạy 1 bản mỗi phiên Windows (Mutex + pipe BcodeViewer.SingleInstance.&lt;session&gt;).</w:t>
       </w:r>
     </w:p>
     <w:p>
@@ -1126,6 +1126,80 @@
                 <w:sz w:val="17"/>
               </w:rPr>
               <w:t>Cấp key bản quyền theo máy (chỉ người phát hành)</w:t>
+            </w:r>
+          </w:p>
+        </w:tc>
+      </w:tr>
+      <w:tr>
+        <w:tc>
+          <w:tcPr>
+            <w:tcW w:type="dxa" w:w="2041"/>
+          </w:tcPr>
+          <w:p>
+            <w:pPr>
+              <w:spacing w:after="20"/>
+            </w:pPr>
+            <w:r/>
+            <w:r>
+              <w:rPr>
+                <w:b/>
+                <w:sz w:val="17"/>
+              </w:rPr>
+              <w:t>src/BcodeNote.App</w:t>
+            </w:r>
+          </w:p>
+        </w:tc>
+        <w:tc>
+          <w:tcPr>
+            <w:tcW w:type="dxa" w:w="2041"/>
+          </w:tcPr>
+          <w:p>
+            <w:pPr>
+              <w:spacing w:after="20"/>
+            </w:pPr>
+            <w:r/>
+            <w:r>
+              <w:rPr>
+                <w:b w:val="0"/>
+                <w:sz w:val="17"/>
+              </w:rPr>
+              <w:t>BcodeNote.exe</w:t>
+            </w:r>
+          </w:p>
+        </w:tc>
+        <w:tc>
+          <w:tcPr>
+            <w:tcW w:type="dxa" w:w="1701"/>
+          </w:tcPr>
+          <w:p>
+            <w:pPr>
+              <w:spacing w:after="20"/>
+            </w:pPr>
+            <w:r/>
+            <w:r>
+              <w:rPr>
+                <w:b w:val="0"/>
+                <w:sz w:val="17"/>
+              </w:rPr>
+              <w:t>WinExe (ProjectReference Bcode.App)</w:t>
+            </w:r>
+          </w:p>
+        </w:tc>
+        <w:tc>
+          <w:tcPr>
+            <w:tcW w:type="dxa" w:w="4082"/>
+          </w:tcPr>
+          <w:p>
+            <w:pPr>
+              <w:spacing w:after="20"/>
+            </w:pPr>
+            <w:r/>
+            <w:r>
+              <w:rPr>
+                <w:b w:val="0"/>
+                <w:sz w:val="17"/>
+              </w:rPr>
+              <w:t>Note (New) nhiều dự án: NoteHubForm (trái Web/notehub.html: dự án + cây menu; phải AdvanceNoteControl), MenuSuggestForm + Web/notesuggest.html (gợi ý theo menu), BcodePipe (sqlp → Bcode), HubPrefs (%AppData%\Bcode\bcodenote.json). Trang riêng chép vào Web\Shell cạnh exe cùng trang của Bcode; bỏ Monaco/ExcelToFrx/Templates\Cfs khỏi output (target TrimBcodeContent)</w:t>
             </w:r>
           </w:p>
         </w:tc>
@@ -1964,7 +2038,7 @@
           <w:rFonts w:ascii="Consolas" w:hAnsi="Consolas" w:eastAsia="Consolas"/>
           <w:sz w:val="13"/>
         </w:rPr>
-        <w:t>│   ├── AdvanceNoteControl.cs  499</w:t>
+        <w:t>│   ├── AdvanceNoteControl.cs  546</w:t>
       </w:r>
     </w:p>
     <w:p>
@@ -2288,7 +2362,7 @@
           <w:rFonts w:ascii="Consolas" w:hAnsi="Consolas" w:eastAsia="Consolas"/>
           <w:sz w:val="13"/>
         </w:rPr>
-        <w:t>│   ├── NativeAdvanceNoteControl.cs  1092</w:t>
+        <w:t>│   ├── NativeAdvanceNoteControl.cs  1097</w:t>
       </w:r>
     </w:p>
     <w:p>
@@ -3584,7 +3658,7 @@
           <w:rFonts w:ascii="Consolas" w:hAnsi="Consolas" w:eastAsia="Consolas"/>
           <w:sz w:val="13"/>
         </w:rPr>
-        <w:t>│   ├── MainForm.cs  3748</w:t>
+        <w:t>│   ├── MainForm.cs  3801</w:t>
       </w:r>
     </w:p>
     <w:p>
@@ -4412,7 +4486,7 @@
           <w:rFonts w:ascii="Consolas" w:hAnsi="Consolas" w:eastAsia="Consolas"/>
           <w:sz w:val="13"/>
         </w:rPr>
-        <w:t>│   ├── AdvanceNoteService.cs  154</w:t>
+        <w:t>│   ├── AdvanceNoteService.cs  166</w:t>
       </w:r>
     </w:p>
     <w:p>
@@ -4916,6 +4990,18 @@
           <w:rFonts w:ascii="Consolas" w:hAnsi="Consolas" w:eastAsia="Consolas"/>
           <w:sz w:val="13"/>
         </w:rPr>
+        <w:t>│   ├── GenAllService.Suggest.cs  241</w:t>
+      </w:r>
+    </w:p>
+    <w:p>
+      <w:pPr>
+        <w:spacing w:after="0" w:before="0" w:line="240" w:lineRule="auto"/>
+      </w:pPr>
+      <w:r>
+        <w:rPr>
+          <w:rFonts w:ascii="Consolas" w:hAnsi="Consolas" w:eastAsia="Consolas"/>
+          <w:sz w:val="13"/>
+        </w:rPr>
         <w:t>│   ├── GenInsertService.cs  47</w:t>
       </w:r>
     </w:p>
@@ -5456,7 +5542,7 @@
           <w:rFonts w:ascii="Consolas" w:hAnsi="Consolas" w:eastAsia="Consolas"/>
           <w:sz w:val="13"/>
         </w:rPr>
-        <w:t>│   ├── ViewerControlServer.cs  59</w:t>
+        <w:t>│   ├── ViewerControlServer.cs  70</w:t>
       </w:r>
     </w:p>
     <w:p>
@@ -5876,7 +5962,7 @@
           <w:rFonts w:ascii="Consolas" w:hAnsi="Consolas" w:eastAsia="Consolas"/>
           <w:sz w:val="13"/>
         </w:rPr>
-        <w:t>│       ├── advnote.html  714</w:t>
+        <w:t>│       ├── advnote.html  763</w:t>
       </w:r>
     </w:p>
     <w:p>
@@ -6884,7 +6970,7 @@
           <w:rFonts w:ascii="Consolas" w:hAnsi="Consolas" w:eastAsia="Consolas"/>
           <w:sz w:val="13"/>
         </w:rPr>
-        <w:t>├── Bcode.App.csproj  148</w:t>
+        <w:t>├── Bcode.App.csproj  152</w:t>
       </w:r>
     </w:p>
     <w:p>
@@ -10593,7 +10679,63 @@
                 <w:b w:val="0"/>
                 <w:sz w:val="16"/>
               </w:rPr>
-              <w:t>Ctrl+Shift+E / Ctrl+Shift+4. Request lưu %AppData%\Bcode\AdvanceNotes\&lt;ws&gt;.json; "Sync yêu cầu" từ bảng nvphyc.</w:t>
+              <w:t>Ctrl+Shift+E / Ctrl+Shift+4. Request lưu %AppData%\Bcode\AdvanceNotes\&lt;ws&gt;.json; "Sync yêu cầu" từ bảng nvphyc. File dùng chung với BcodeNote.exe: AdvanceNoteControl so dấu file (AdvanceNoteService.Stamp = giờ ghi + kích thước) ở mỗi tin từ trang — tiến trình khác vừa ghi thì nạp lại trước khi lưu; trang focus lại gửi "refresh" để thấy thay đổi bên kia. FlushAsync (advNote.flush → "flushed") ghi phần đang gõ trước khi đổi dự án / đóng; ApplySuggestion → advNote.applySuggest (chỉ THÊM dòng chưa có vào Gen All / File Path / SQL Object App, Sys / Table liên quan; chưa mở y/c thì tạo y/c mới tên theo menu). Bản App (NativeAdvanceNoteControl) chỉ đọc file lúc mở tab.</w:t>
+            </w:r>
+          </w:p>
+        </w:tc>
+      </w:tr>
+      <w:tr>
+        <w:tc>
+          <w:tcPr>
+            <w:tcW w:type="dxa" w:w="2041"/>
+          </w:tcPr>
+          <w:p>
+            <w:pPr>
+              <w:spacing w:after="20"/>
+            </w:pPr>
+            <w:r/>
+            <w:r>
+              <w:rPr>
+                <w:b/>
+                <w:sz w:val="16"/>
+              </w:rPr>
+              <w:t>BcodeNote.exe — Note (New) nhiều dự án</w:t>
+            </w:r>
+          </w:p>
+        </w:tc>
+        <w:tc>
+          <w:tcPr>
+            <w:tcW w:type="dxa" w:w="3969"/>
+          </w:tcPr>
+          <w:p>
+            <w:pPr>
+              <w:spacing w:after="20"/>
+            </w:pPr>
+            <w:r/>
+            <w:r>
+              <w:rPr>
+                <w:b w:val="0"/>
+                <w:sz w:val="16"/>
+              </w:rPr>
+              <w:t>src/BcodeNote.App: Program.cs, NoteHubForm.cs, MenuSuggestForm.cs, BcodePipe.cs, HubPrefs.cs, Web/notehub.html, Web/notesuggest.html; Bcode.App: Services/GenAllService.Suggest.cs (SuggestForMenuAsync, MenuSuggestion, MenuSuggestionPick)</w:t>
+            </w:r>
+          </w:p>
+        </w:tc>
+        <w:tc>
+          <w:tcPr>
+            <w:tcW w:type="dxa" w:w="3855"/>
+          </w:tcPr>
+          <w:p>
+            <w:pPr>
+              <w:spacing w:after="20"/>
+            </w:pPr>
+            <w:r/>
+            <w:r>
+              <w:rPr>
+                <w:b w:val="0"/>
+                <w:sz w:val="16"/>
+              </w:rPr>
+              <w:t>Trái: dự án trong settings.json (số y/c chưa Done) + cây wcommand của dự án (bản lưu menu-cache rồi so chữ ký nhẹ / tải lại); phải: AdvanceNoteControl của dự án đó. Mỗi dự án 1 bộ service + DbConnectionService riêng (ProjectContext) — việc đang chạy của dự án cũ không chạy nhầm database. Chọn menu → ✨ Gợi ý (bấm đôi): GenAllService.SuggestForMenuAsync — controller = sysid / Controller="" của Main\&lt;link&gt; / tên trang; file = FileLookupService.BuildTreeForMenuItem + Main\*.aspx có Controller đó (tick sẵn Main + .f của Dir/Grid/Filter); SQL Object = EXEC trong Dir/Grid/Filter (cache "execprocs", tra App rồi Sys); table = FindTablesAsync (tick sẵn bảng Dir + Grid chi tiết theo CommandTableService); script menu Sys (SuggestMenu: WCommandService.GenerateScriptForCurrentDb cho menu đang chọn + menu cha do NoteHubForm truyền theo cây — cha IsCustom (C)/(*) tick sẵn, menu đang chọn chỉ tick khi bỏ Gen All) → MenuSuggestionPick.MenuScripts → advNote.applySuggest nối vào bottomScriptSys (khối đã có thì bỏ qua) và chuyển sang phần Sys. Lần đầu một dự án ~30 s (quét Main\*.aspx), sau đó ~1 s nhờ FileParseCache. Nút Theo luật Fast / AI phân tích / AI tạo danh mục mở QuickListForm của Bcode (cần key, 1 cửa sổ mỗi dự án). Mở script vào tab Query → pipe sqlp sang Bcode; Bcode chưa mở → ghi .sql vào %TEMP%\BcodeNote\&lt;dự án&gt;\ và mở thư mục. Tham số --project &lt;tên&gt;. Mở từ Bcode: tool "bcode_note" (menu Tool mở rộng — ExtToolKeys, phím tool:bcode_note mặc định trống) và nút 🗂 Nhiều dự án của Note (New) (advnote.html btnNoteHub chỉ hiện khi host nối AdvanceNoteControl.NoteHubRequested; NativeAdvanceNoteControl.NoteHubRequested) → MainForm.LaunchBcodeNoteAsync (FlushAsync tab Note (New) rồi Process.Start --project &lt;dự án đang chọn&gt;; FindBcodeNoteExe: cạnh Bcode.exe hoặc BcodeNote\). Build BcodeNote.App tự chép BcodeNote.exe/.dll/.deps.json/.runtimeconfig.json + Web\Shell\notehub|notesuggest.html sang bin\&lt;cấu hình&gt; của Bcode.App (target CopyNoteBesideBcode, -p:BcodeOutDir). Tiến trình con thừa hưởng biến môi trường: Bcode chạy với BCODE_DATA_DIR thì BcodeNote cũng ghi vào đó.</w:t>
             </w:r>
           </w:p>
         </w:tc>
@@ -16590,6 +16732,62 @@
                 <w:sz w:val="16"/>
               </w:rPr>
               <w:t>Dữ liệu người dùng: Request, ghi chú, phiên tab, lịch sử SQL.</w:t>
+            </w:r>
+          </w:p>
+        </w:tc>
+      </w:tr>
+      <w:tr>
+        <w:tc>
+          <w:tcPr>
+            <w:tcW w:type="dxa" w:w="3685"/>
+          </w:tcPr>
+          <w:p>
+            <w:pPr>
+              <w:spacing w:after="20"/>
+            </w:pPr>
+            <w:r/>
+            <w:r>
+              <w:rPr>
+                <w:b/>
+                <w:sz w:val="16"/>
+              </w:rPr>
+              <w:t>…\bcodenote.json</w:t>
+            </w:r>
+          </w:p>
+        </w:tc>
+        <w:tc>
+          <w:tcPr>
+            <w:tcW w:type="dxa" w:w="964"/>
+          </w:tcPr>
+          <w:p>
+            <w:pPr>
+              <w:spacing w:after="20"/>
+            </w:pPr>
+            <w:r/>
+            <w:r>
+              <w:rPr>
+                <w:b w:val="0"/>
+                <w:sz w:val="16"/>
+              </w:rPr>
+              <w:t>BcodeNote</w:t>
+            </w:r>
+          </w:p>
+        </w:tc>
+        <w:tc>
+          <w:tcPr>
+            <w:tcW w:type="dxa" w:w="5216"/>
+          </w:tcPr>
+          <w:p>
+            <w:pPr>
+              <w:spacing w:after="20"/>
+            </w:pPr>
+            <w:r/>
+            <w:r>
+              <w:rPr>
+                <w:b w:val="0"/>
+                <w:sz w:val="16"/>
+              </w:rPr>
+              <w:t>Dự án mở gần nhất, bề rộng khung trái, thu gọn danh sách dự án. Request vẫn ở AdvanceNotes\ (chung với Bcode).</w:t>
             </w:r>
           </w:p>
         </w:tc>

</xml_diff>

<commit_message>
bổ sung lọc yêu cầu
</commit_message>
<xml_diff>
--- a/Cấu trúc Bcode  BcodeViewer (v3 - Tóm tắt).docx
+++ b/Cấu trúc Bcode  BcodeViewer (v3 - Tóm tắt).docx
@@ -2362,7 +2362,7 @@
           <w:rFonts w:ascii="Consolas" w:hAnsi="Consolas" w:eastAsia="Consolas"/>
           <w:sz w:val="13"/>
         </w:rPr>
-        <w:t>│   ├── NativeAdvanceNoteControl.cs  1097</w:t>
+        <w:t>│   ├── NativeAdvanceNoteControl.cs  1128</w:t>
       </w:r>
     </w:p>
     <w:p>
@@ -5962,7 +5962,7 @@
           <w:rFonts w:ascii="Consolas" w:hAnsi="Consolas" w:eastAsia="Consolas"/>
           <w:sz w:val="13"/>
         </w:rPr>
-        <w:t>│       ├── advnote.html  763</w:t>
+        <w:t>│       ├── advnote.html  780</w:t>
       </w:r>
     </w:p>
     <w:p>
@@ -10679,7 +10679,7 @@
                 <w:b w:val="0"/>
                 <w:sz w:val="16"/>
               </w:rPr>
-              <w:t>Ctrl+Shift+E / Ctrl+Shift+4. Request lưu %AppData%\Bcode\AdvanceNotes\&lt;ws&gt;.json; "Sync yêu cầu" từ bảng nvphyc. File dùng chung với BcodeNote.exe: AdvanceNoteControl so dấu file (AdvanceNoteService.Stamp = giờ ghi + kích thước) ở mỗi tin từ trang — tiến trình khác vừa ghi thì nạp lại trước khi lưu; trang focus lại gửi "refresh" để thấy thay đổi bên kia. FlushAsync (advNote.flush → "flushed") ghi phần đang gõ trước khi đổi dự án / đóng; ApplySuggestion → advNote.applySuggest (chỉ THÊM dòng chưa có vào Gen All / File Path / SQL Object App, Sys / Table liên quan; chưa mở y/c thì tạo y/c mới tên theo menu). Bản App (NativeAdvanceNoteControl) chỉ đọc file lúc mở tab.</w:t>
+              <w:t>Ctrl+Shift+E / Ctrl+Shift+4. Request lưu %AppData%\Bcode\AdvanceNotes\&lt;ws&gt;.json; "Sync yêu cầu" từ bảng nvphyc. File dùng chung với BcodeNote.exe: AdvanceNoteControl so dấu file (AdvanceNoteService.Stamp = giờ ghi + kích thước) ở mỗi tin từ trang — tiến trình khác vừa ghi thì nạp lại trước khi lưu; trang focus lại gửi "refresh" để thấy thay đổi bên kia. FlushAsync (advNote.flush → "flushed") ghi phần đang gõ trước khi đổi dự án / đóng; ApplySuggestion → advNote.applySuggest (chỉ THÊM dòng chưa có vào Gen All / File Path / SQL Object App, Sys / Table liên quan; chưa mở y/c thì tạo y/c mới tên theo menu). Bản App (NativeAdvanceNoteControl) chỉ đọc file lúc mở tab. Ô "Lọc mã y/c" trên Request List (advnote.html #listFilter / NativeAdvanceNoteControl._listFilter): chữ thường bỏ dấu, nhiều mã cách dấu cách / phẩy = khớp một trong các mã; Enter mở y/c đầu tiên khớp, Esc xoá; tick-tất-cả ở tiêu đề chỉ áp các dòng đang hiện, y/c đã tick mà bị ẩn vẫn giữ tick.</w:t>
             </w:r>
           </w:p>
         </w:tc>

</xml_diff>

<commit_message>
cải tiến compare text
</commit_message>
<xml_diff>
--- a/Cấu trúc Bcode  BcodeViewer (v3 - Tóm tắt).docx
+++ b/Cấu trúc Bcode  BcodeViewer (v3 - Tóm tắt).docx
@@ -2422,7 +2422,7 @@
           <w:rFonts w:ascii="Consolas" w:hAnsi="Consolas" w:eastAsia="Consolas"/>
           <w:sz w:val="13"/>
         </w:rPr>
-        <w:t>│   ├── NativeInputs.cs  292</w:t>
+        <w:t>│   ├── NativeInputs.cs  304</w:t>
       </w:r>
     </w:p>
     <w:p>
@@ -2494,7 +2494,7 @@
           <w:rFonts w:ascii="Consolas" w:hAnsi="Consolas" w:eastAsia="Consolas"/>
           <w:sz w:val="13"/>
         </w:rPr>
-        <w:t>│   ├── NativePages.Bars2.cs  104</w:t>
+        <w:t>│   ├── NativePages.Bars2.cs  113</w:t>
       </w:r>
     </w:p>
     <w:p>
@@ -2890,7 +2890,7 @@
           <w:rFonts w:ascii="Consolas" w:hAnsi="Consolas" w:eastAsia="Consolas"/>
           <w:sz w:val="13"/>
         </w:rPr>
-        <w:t>│   ├── NativeTableBar.cs  228</w:t>
+        <w:t>│   ├── NativeTableBar.cs  231</w:t>
       </w:r>
     </w:p>
     <w:p>
@@ -3118,7 +3118,7 @@
           <w:rFonts w:ascii="Consolas" w:hAnsi="Consolas" w:eastAsia="Consolas"/>
           <w:sz w:val="13"/>
         </w:rPr>
-        <w:t>│   ├── SqlScintilla.cs  153</w:t>
+        <w:t>│   ├── SqlScintilla.cs  162</w:t>
       </w:r>
     </w:p>
     <w:p>
@@ -3454,7 +3454,7 @@
           <w:rFonts w:ascii="Consolas" w:hAnsi="Consolas" w:eastAsia="Consolas"/>
           <w:sz w:val="13"/>
         </w:rPr>
-        <w:t>│   ├── CompareTextForm.cs  360</w:t>
+        <w:t>│   ├── CompareTextForm.cs  644</w:t>
       </w:r>
     </w:p>
     <w:p>
@@ -4822,7 +4822,7 @@
           <w:rFonts w:ascii="Consolas" w:hAnsi="Consolas" w:eastAsia="Consolas"/>
           <w:sz w:val="13"/>
         </w:rPr>
-        <w:t>│   ├── DiffService.cs  207</w:t>
+        <w:t>│   ├── DiffService.cs  295</w:t>
       </w:r>
     </w:p>
     <w:p>
@@ -5530,6 +5530,18 @@
           <w:rFonts w:ascii="Consolas" w:hAnsi="Consolas" w:eastAsia="Consolas"/>
           <w:sz w:val="13"/>
         </w:rPr>
+        <w:t>│   ├── TextLanguageDetector.cs  71</w:t>
+      </w:r>
+    </w:p>
+    <w:p>
+      <w:pPr>
+        <w:spacing w:after="0" w:before="0" w:line="240" w:lineRule="auto"/>
+      </w:pPr>
+      <w:r>
+        <w:rPr>
+          <w:rFonts w:ascii="Consolas" w:hAnsi="Consolas" w:eastAsia="Consolas"/>
+          <w:sz w:val="13"/>
+        </w:rPr>
         <w:t>│   ├── UsageSearchService.cs  116</w:t>
       </w:r>
     </w:p>
@@ -6130,7 +6142,7 @@
           <w:rFonts w:ascii="Consolas" w:hAnsi="Consolas" w:eastAsia="Consolas"/>
           <w:sz w:val="13"/>
         </w:rPr>
-        <w:t>│       ├── comparebar.html  121</w:t>
+        <w:t>│       ├── comparebar.html  137</w:t>
       </w:r>
     </w:p>
     <w:p>
@@ -12257,7 +12269,7 @@
                 <w:b w:val="0"/>
                 <w:sz w:val="16"/>
               </w:rPr>
-              <w:t>Forms/CompareTextForm.cs, LibrarySnippetForm.cs; Controls/StringBeautyControl.cs; Services/DiffService.cs, SqlFormatterService.cs, SnippetLibraryService.cs; Web/Shell/stringbeauty.html, library.html</w:t>
+              <w:t>Forms/CompareTextForm.cs, LibrarySnippetForm.cs; Controls/StringBeautyControl.cs; Services/DiffService.cs, TextLanguageDetector.cs, SqlFormatterService.cs, SnippetLibraryService.cs; Web/Shell/comparebar.html (App: NativePages.Bars2.cs CompareBarPage), stringbeauty.html, library.html</w:t>
             </w:r>
           </w:p>
         </w:tc>
@@ -12275,7 +12287,7 @@
                 <w:b w:val="0"/>
                 <w:sz w:val="16"/>
               </w:rPr>
-              <w:t>DiffService = LCS tự viết.</w:t>
+              <w:t>DiffService = Myers/LCS tự viết theo dòng + InlineDiff theo từ (LCS trên token) cho dòng sửa. Compare Text = 4 Scintilla (2 nhập, 2 so sánh) ở CẢ 2 chế độ: tô màu bằng FcodeLexer (XML/SQL) / SqlScintilla.SetLanguage (C#/JS/JSON), ngôn ngữ = ô "Tô màu" hoặc TextLanguageDetector (theo nội dung, không theo đuôi như detectLanguage của editor.js). Màn so sánh: marker nền 10-14, indicator 18 (từ khác), lề 0 RightText = số dòng gốc ghi lười theo đoạn đang thấy (FillMargins — ghi cả 10k dòng mất ~1,5 s), thanh tổng quan DiffOverviewBar; F8 / Shift+F8.</w:t>
             </w:r>
           </w:p>
         </w:tc>

</xml_diff>

<commit_message>
bổ sung ctrl + E xuất file
</commit_message>
<xml_diff>
--- a/Cấu trúc Bcode  BcodeViewer (v3 - Tóm tắt).docx
+++ b/Cấu trúc Bcode  BcodeViewer (v3 - Tóm tắt).docx
@@ -2350,7 +2350,7 @@
           <w:rFonts w:ascii="Consolas" w:hAnsi="Consolas" w:eastAsia="Consolas"/>
           <w:sz w:val="13"/>
         </w:rPr>
-        <w:t>│   ├── MultiResultView.cs  163</w:t>
+        <w:t>│   ├── MultiResultView.cs  194</w:t>
       </w:r>
     </w:p>
     <w:p>
@@ -2818,19 +2818,19 @@
           <w:rFonts w:ascii="Consolas" w:hAnsi="Consolas" w:eastAsia="Consolas"/>
           <w:sz w:val="13"/>
         </w:rPr>
-        <w:t>│   ├── NativeResultPane.cs  301</w:t>
-      </w:r>
-    </w:p>
-    <w:p>
-      <w:pPr>
-        <w:spacing w:after="0" w:before="0" w:line="240" w:lineRule="auto"/>
-      </w:pPr>
-      <w:r>
-        <w:rPr>
-          <w:rFonts w:ascii="Consolas" w:hAnsi="Consolas" w:eastAsia="Consolas"/>
-          <w:sz w:val="13"/>
-        </w:rPr>
-        <w:t>│   ├── NativeShellBars.cs  296</w:t>
+        <w:t>│   ├── NativeResultPane.cs  302</w:t>
+      </w:r>
+    </w:p>
+    <w:p>
+      <w:pPr>
+        <w:spacing w:after="0" w:before="0" w:line="240" w:lineRule="auto"/>
+      </w:pPr>
+      <w:r>
+        <w:rPr>
+          <w:rFonts w:ascii="Consolas" w:hAnsi="Consolas" w:eastAsia="Consolas"/>
+          <w:sz w:val="13"/>
+        </w:rPr>
+        <w:t>│   ├── NativeShellBars.cs  314</w:t>
       </w:r>
     </w:p>
     <w:p>
@@ -2974,7 +2974,19 @@
           <w:rFonts w:ascii="Consolas" w:hAnsi="Consolas" w:eastAsia="Consolas"/>
           <w:sz w:val="13"/>
         </w:rPr>
-        <w:t>│   ├── ResultGridMenu.cs  477</w:t>
+        <w:t>│   ├── ResultExport.cs  135</w:t>
+      </w:r>
+    </w:p>
+    <w:p>
+      <w:pPr>
+        <w:spacing w:after="0" w:before="0" w:line="240" w:lineRule="auto"/>
+      </w:pPr>
+      <w:r>
+        <w:rPr>
+          <w:rFonts w:ascii="Consolas" w:hAnsi="Consolas" w:eastAsia="Consolas"/>
+          <w:sz w:val="13"/>
+        </w:rPr>
+        <w:t>│   ├── ResultGridMenu.cs  530</w:t>
       </w:r>
     </w:p>
     <w:p>
@@ -3658,7 +3670,7 @@
           <w:rFonts w:ascii="Consolas" w:hAnsi="Consolas" w:eastAsia="Consolas"/>
           <w:sz w:val="13"/>
         </w:rPr>
-        <w:t>│   ├── MainForm.cs  3801</w:t>
+        <w:t>│   ├── MainForm.cs  3819</w:t>
       </w:r>
     </w:p>
     <w:p>
@@ -5266,6 +5278,18 @@
           <w:rFonts w:ascii="Consolas" w:hAnsi="Consolas" w:eastAsia="Consolas"/>
           <w:sz w:val="13"/>
         </w:rPr>
+        <w:t>│   ├── ResultExportService.cs  271</w:t>
+      </w:r>
+    </w:p>
+    <w:p>
+      <w:pPr>
+        <w:spacing w:after="0" w:before="0" w:line="240" w:lineRule="auto"/>
+      </w:pPr>
+      <w:r>
+        <w:rPr>
+          <w:rFonts w:ascii="Consolas" w:hAnsi="Consolas" w:eastAsia="Consolas"/>
+          <w:sz w:val="13"/>
+        </w:rPr>
         <w:t>│   ├── SchemaCompareService.cs  79</w:t>
       </w:r>
     </w:p>
@@ -5806,7 +5830,7 @@
           <w:rFonts w:ascii="Consolas" w:hAnsi="Consolas" w:eastAsia="Consolas"/>
           <w:sz w:val="13"/>
         </w:rPr>
-        <w:t>│   ├── ShortcutRegistry.cs  334</w:t>
+        <w:t>│   ├── ShortcutRegistry.cs  339</w:t>
       </w:r>
     </w:p>
     <w:p>
@@ -6586,7 +6610,7 @@
           <w:rFonts w:ascii="Consolas" w:hAnsi="Consolas" w:eastAsia="Consolas"/>
           <w:sz w:val="13"/>
         </w:rPr>
-        <w:t>│       ├── resultview.html  578</w:t>
+        <w:t>│       ├── resultview.html  608</w:t>
       </w:r>
     </w:p>
     <w:p>
@@ -6814,7 +6838,7 @@
           <w:rFonts w:ascii="Consolas" w:hAnsi="Consolas" w:eastAsia="Consolas"/>
           <w:sz w:val="13"/>
         </w:rPr>
-        <w:t>│       ├── statusbar.html  60</w:t>
+        <w:t>│       ├── statusbar.html  75</w:t>
       </w:r>
     </w:p>
     <w:p>
@@ -9984,7 +10008,7 @@
                 <w:b w:val="0"/>
                 <w:sz w:val="16"/>
               </w:rPr>
-              <w:t>Ctrl+Shift+U = Gen Update (Result).</w:t>
+              <w:t>Ctrl+Shift+U = Gen Update (Result). Save as CSV / Excel (.xlsx) ở menu tab Result SQL Query (Controls/ResultExport.cs + Services/ResultExportService.cs; Web: resultview.html post save {table, format, rows} → MultiResultView ghi từ DataTable gốc; App: ResultGridMenu.EnableSave chỉ bật ở NativeResultPane): toàn bộ dòng hoặc dòng đã chọn, chạy nền, ghi file tạm rồi đổi tên; XLSX ghi SAX bằng DocumentFormat.OpenXml (có sẵn qua ClosedXML) — chuỗi = inlineStr giữ số 0 đầu, ngày = số + định dạng dd/mm/yyyy; CSV UTF-8 BOM. Thanh trạng thái báo tiến độ + link Mở file / Mở thư mục (ResultExport.Notice → MainForm.PushStatus(text, file); statusbar.html setStatus(text, links) / NativeStatusBar.SetStatus). Phím result.quickExcel Ctrl+E = xuất nhanh (ResultExport.SaveAsync quick: không SaveFileDialog, ghi %TEMP%\Bcode\Export — dọn file &gt; 7 ngày — rồi mở bằng Excel; Web post save {quick:true}); result.saveXlsx, result.saveCsv trống.</w:t>
             </w:r>
           </w:p>
         </w:tc>

</xml_diff>

<commit_message>
bổ sung gen update
</commit_message>
<xml_diff>
--- a/Cấu trúc Bcode  BcodeViewer (v3 - Tóm tắt).docx
+++ b/Cấu trúc Bcode  BcodeViewer (v3 - Tóm tắt).docx
@@ -2350,7 +2350,7 @@
           <w:rFonts w:ascii="Consolas" w:hAnsi="Consolas" w:eastAsia="Consolas"/>
           <w:sz w:val="13"/>
         </w:rPr>
-        <w:t>│   ├── MultiResultView.cs  194</w:t>
+        <w:t>│   ├── MultiResultView.cs  204</w:t>
       </w:r>
     </w:p>
     <w:p>
@@ -2974,7 +2974,7 @@
           <w:rFonts w:ascii="Consolas" w:hAnsi="Consolas" w:eastAsia="Consolas"/>
           <w:sz w:val="13"/>
         </w:rPr>
-        <w:t>│   ├── ResultExport.cs  135</w:t>
+        <w:t>│   ├── ResultExport.cs  146</w:t>
       </w:r>
     </w:p>
     <w:p>
@@ -4930,19 +4930,19 @@
           <w:rFonts w:ascii="Consolas" w:hAnsi="Consolas" w:eastAsia="Consolas"/>
           <w:sz w:val="13"/>
         </w:rPr>
-        <w:t>│   ├── FileLookupService.cs  1236</w:t>
-      </w:r>
-    </w:p>
-    <w:p>
-      <w:pPr>
-        <w:spacing w:after="0" w:before="0" w:line="240" w:lineRule="auto"/>
-      </w:pPr>
-      <w:r>
-        <w:rPr>
-          <w:rFonts w:ascii="Consolas" w:hAnsi="Consolas" w:eastAsia="Consolas"/>
-          <w:sz w:val="13"/>
-        </w:rPr>
-        <w:t>│   ├── FileParseCache.cs  403</w:t>
+        <w:t>│   ├── FileLookupService.cs  1293</w:t>
+      </w:r>
+    </w:p>
+    <w:p>
+      <w:pPr>
+        <w:spacing w:after="0" w:before="0" w:line="240" w:lineRule="auto"/>
+      </w:pPr>
+      <w:r>
+        <w:rPr>
+          <w:rFonts w:ascii="Consolas" w:hAnsi="Consolas" w:eastAsia="Consolas"/>
+          <w:sz w:val="13"/>
+        </w:rPr>
+        <w:t>│   ├── FileParseCache.cs  405</w:t>
       </w:r>
     </w:p>
     <w:p>
@@ -10491,7 +10491,7 @@
                 <w:b w:val="0"/>
                 <w:sz w:val="16"/>
               </w:rPr>
-              <w:t>Cây file theo menu (dò như FCode — đối chiếu menu SVTran của VPMILK: include đọc như trình đọc XML qua DtdIncludeResolver — chỉ entity được gọi %X;/&amp;X;, mọi đuôi file, bỏ khối &lt;![%X;[ IGNORE; controller="&amp;X;..." và showForm(]]&gt;&amp;X;&lt;![CDATA[...) trong chính file thì thay entity; thư mục Lookup = controller đuôi "Lookup" / @$relType = "Lookup" (ExtractLookupControllerNames, cache "lkp"); bảng sysrelative của DB Sys KHÔNG phải nguồn FCode dùng; đổi luật dò thì tăng FileParseCache.SchemaVersion), cache theo dự án (%AppData%\Bcode\FileLookupCache), tô đỏ entity thiếu, tìm nội dung, Edit in BcodeViewer (Process.Start). Ô Search (lọc tên, debounce 200 ms, Enter = lọc ngay; App: FileLookupBarPage): gõ chữ = tìm cả thư mục Path, đang ở cây menu thì nhớ _menuBeforeSearch → xoá trắng quay lại cây menu đó; gõ đúng tên trang .aspx (arcthd1.aspx) = TryShowMenuForPage → MainForm.MenuForLookupPage (menu lá cây WCommand có Link trỏ trang đó, ưu tiên có sysid) → ShowForMenuItem y như bấm menu, thanh trạng thái ghi tên menu; không có menu thì lọc tên như cũ. Cấp source nhanh (FileLookupControl.QuickGrant.cs): chọn file .f Dir/Grid/Filter → dòng 2 thanh xem trước (filelookuppreview.html window.setSource; App: FileLookupPreviewBarPage) hiện phiên bản + thư mục kho (SourceGrantService.ResolveNearestLower: phiên bản dự án, không có thì phiên bản thấp hơn gần nhất cùng 3 chữ đầu; DetectVersion: nhiều phiên bản cùng số thì ưu tiên cùng 3 chữ đầu rồi 2 chữ đầu — FBISP24 → FBOR2SP24, không lấy TT24 của kho FAP), bấm nhãn = SourceViewForm, nút Cấp source = hỏi xác nhận rồi CopyRows; danh sách phiên bản cache 5 phút. Search Box (tìm nội dung) theo luật ở Template → tab "Tìm file" (uitemplate.html #tabSearch ↔ UiTemplateForm search-get/set/default ↔ AppSettings.Search*; FileLookupService.SetSearchRules / SearchRuleSet): File Type *.* chỉ quét "Đuôi file được tìm" (SearchIncludeExtensions, mặc định .xml .f .txt .js .sql .ent .xsd .css .config .json .html; trống = mọi đuôi), trừ "Đuôi luôn bỏ qua" và "nhị phân"; gõ rõ đuôi (*.cs) thì không xét danh sách; thư mục quét trong Controllers, bỏ .f đã biên dịch ở Dir/Filter/Grid, bỏ file &gt; N MB. Đổi tên file (FileLookupControl.Rename.cs): F2 (phím fileLookup.rename, phạm vi Tree) / chuột phải Rename... = sửa nhãn tại chỗ (LabelEdit chỉ bật lúc đổi tên, BeforeLabelEdit chặn node khác; ô sửa mất focus ngay lúc vừa mở — khung xem trước đang nạp — thì mở lại 1 lần) → File.Move; không gõ đuôi = giữ đuôi, đổi đuôi hỏi Yes/No/Cancel, trùng tên / ký tự sai mở lại ô sửa, file khoá báo rõ; cặp cùng tên khác đuôi cùng thư mục hỏi (mặc định Không). FileLookupService.NotifyFileRenamed sửa chỉ mục file trong bộ nhớ + bản lưu file-index (thay bản FileIndex mới, không sửa list tại chỗ), FileParseCache.ForgetFile bỏ mục dính tên cũ (cả trên đĩa ở lần ghi kế), rồi event FileRenamed → mọi tab File Lookup sửa node + khung xem trước (không dựng lại cây). Sau đó tra nền chỗ còn nhắc tên cũ bằng SourceIndexService.FindLinesAsync (dòng include / controller= / SYSTEM / showForm...) — chỉ báo.</w:t>
+              <w:t>Cây file theo menu (dò như FCode — đối chiếu menu SVTran của VPMILK: include đọc như trình đọc XML qua DtdIncludeResolver — chỉ entity được gọi %X;/&amp;X;, mọi đuôi file, bỏ khối &lt;![%X;[ IGNORE; controller="&amp;X;..." và showForm(]]&gt;&amp;X;&lt;![CDATA[...) trong chính file thì thay entity; thư mục Lookup = controller đuôi "Lookup" / @$relType = "Lookup" (ExtractLookupControllerNames, cache "lkp"); thư mục Report: form in khai controller="X" mang tên controller của menu → Report\X (GLTran → GLTranReport; ExtractReportFormControllers, cache "rptctl" — controller="SVTran" trong AITran.xml thì không lấy), include SYSTEM nằm trong thư mục Report và mang tên controller (Report\Include\GLTranReportBI.xml, GLTranReportSql.txt; BaseCurrency/Separate dùng chung thì không), reportFile ghép entity ("GLTranReport_01&amp;Conditional.GLTranReport.ApprovedBy;" → GLTranReport_01 + GLTranReport_01_a); bảng sysrelative của DB Sys KHÔNG phải nguồn FCode dùng; đổi luật dò thì tăng FileParseCache.SchemaVersion), cache theo dự án (%AppData%\Bcode\FileLookupCache), tô đỏ entity thiếu, tìm nội dung, Edit in BcodeViewer (Process.Start). Ô Search (lọc tên, debounce 200 ms, Enter = lọc ngay; App: FileLookupBarPage): gõ chữ = tìm cả thư mục Path, đang ở cây menu thì nhớ _menuBeforeSearch → xoá trắng quay lại cây menu đó; gõ đúng tên trang .aspx (arcthd1.aspx) = TryShowMenuForPage → MainForm.MenuForLookupPage (menu lá cây WCommand có Link trỏ trang đó, ưu tiên có sysid) → ShowForMenuItem y như bấm menu, thanh trạng thái ghi tên menu; không có menu thì lọc tên như cũ. Cấp source nhanh (FileLookupControl.QuickGrant.cs): chọn file .f Dir/Grid/Filter → dòng 2 thanh xem trước (filelookuppreview.html window.setSource; App: FileLookupPreviewBarPage) hiện phiên bản + thư mục kho (SourceGrantService.ResolveNearestLower: phiên bản dự án, không có thì phiên bản thấp hơn gần nhất cùng 3 chữ đầu; DetectVersion: nhiều phiên bản cùng số thì ưu tiên cùng 3 chữ đầu rồi 2 chữ đầu — FBISP24 → FBOR2SP24, không lấy TT24 của kho FAP), bấm nhãn = SourceViewForm, nút Cấp source = hỏi xác nhận rồi CopyRows; danh sách phiên bản cache 5 phút. Search Box (tìm nội dung) theo luật ở Template → tab "Tìm file" (uitemplate.html #tabSearch ↔ UiTemplateForm search-get/set/default ↔ AppSettings.Search*; FileLookupService.SetSearchRules / SearchRuleSet): File Type *.* chỉ quét "Đuôi file được tìm" (SearchIncludeExtensions, mặc định .xml .f .txt .js .sql .ent .xsd .css .config .json .html; trống = mọi đuôi), trừ "Đuôi luôn bỏ qua" và "nhị phân"; gõ rõ đuôi (*.cs) thì không xét danh sách; thư mục quét trong Controllers, bỏ .f đã biên dịch ở Dir/Filter/Grid, bỏ file &gt; N MB. Đổi tên file (FileLookupControl.Rename.cs): F2 (phím fileLookup.rename, phạm vi Tree) / chuột phải Rename... = sửa nhãn tại chỗ (LabelEdit chỉ bật lúc đổi tên, BeforeLabelEdit chặn node khác; ô sửa mất focus ngay lúc vừa mở — khung xem trước đang nạp — thì mở lại 1 lần) → File.Move; không gõ đuôi = giữ đuôi, đổi đuôi hỏi Yes/No/Cancel, trùng tên / ký tự sai mở lại ô sửa, file khoá báo rõ; cặp cùng tên khác đuôi cùng thư mục hỏi (mặc định Không). FileLookupService.NotifyFileRenamed sửa chỉ mục file trong bộ nhớ + bản lưu file-index (thay bản FileIndex mới, không sửa list tại chỗ), FileParseCache.ForgetFile bỏ mục dính tên cũ (cả trên đĩa ở lần ghi kế), rồi event FileRenamed → mọi tab File Lookup sửa node + khung xem trước (không dựng lại cây). Sau đó tra nền chỗ còn nhắc tên cũ bằng SourceIndexService.FindLinesAsync (dòng include / controller= / SYSTEM / showForm...) — chỉ báo.</w:t>
             </w:r>
           </w:p>
         </w:tc>

</xml_diff>

<commit_message>
bcode| fix khai báo api
</commit_message>
<xml_diff>
--- a/Cấu trúc Bcode  BcodeViewer (v3 - Tóm tắt).docx
+++ b/Cấu trúc Bcode  BcodeViewer (v3 - Tóm tắt).docx
@@ -2350,7 +2350,7 @@
           <w:rFonts w:ascii="Consolas" w:hAnsi="Consolas" w:eastAsia="Consolas"/>
           <w:sz w:val="13"/>
         </w:rPr>
-        <w:t>│   ├── MultiResultView.cs  204</w:t>
+        <w:t>│   ├── MultiResultView.cs  210</w:t>
       </w:r>
     </w:p>
     <w:p>
@@ -2470,7 +2470,7 @@
           <w:rFonts w:ascii="Consolas" w:hAnsi="Consolas" w:eastAsia="Consolas"/>
           <w:sz w:val="13"/>
         </w:rPr>
-        <w:t>│   ├── NativePages.Api.cs  420</w:t>
+        <w:t>│   ├── NativePages.Api.cs  478</w:t>
       </w:r>
     </w:p>
     <w:p>
@@ -2818,7 +2818,7 @@
           <w:rFonts w:ascii="Consolas" w:hAnsi="Consolas" w:eastAsia="Consolas"/>
           <w:sz w:val="13"/>
         </w:rPr>
-        <w:t>│   ├── NativeResultPane.cs  302</w:t>
+        <w:t>│   ├── NativeResultPane.cs  303</w:t>
       </w:r>
     </w:p>
     <w:p>
@@ -2986,7 +2986,7 @@
           <w:rFonts w:ascii="Consolas" w:hAnsi="Consolas" w:eastAsia="Consolas"/>
           <w:sz w:val="13"/>
         </w:rPr>
-        <w:t>│   ├── ResultGridMenu.cs  530</w:t>
+        <w:t>│   ├── ResultGridMenu.cs  602</w:t>
       </w:r>
     </w:p>
     <w:p>
@@ -3334,7 +3334,7 @@
           <w:rFonts w:ascii="Consolas" w:hAnsi="Consolas" w:eastAsia="Consolas"/>
           <w:sz w:val="13"/>
         </w:rPr>
-        <w:t>│   ├── ApiDeclarationForm.cs  163</w:t>
+        <w:t>│   ├── ApiDeclarationForm.cs  173</w:t>
       </w:r>
     </w:p>
     <w:p>
@@ -3670,7 +3670,7 @@
           <w:rFonts w:ascii="Consolas" w:hAnsi="Consolas" w:eastAsia="Consolas"/>
           <w:sz w:val="13"/>
         </w:rPr>
-        <w:t>│   ├── MainForm.cs  3819</w:t>
+        <w:t>│   ├── MainForm.cs  3821</w:t>
       </w:r>
     </w:p>
     <w:p>
@@ -4078,7 +4078,7 @@
           <w:rFonts w:ascii="Consolas" w:hAnsi="Consolas" w:eastAsia="Consolas"/>
           <w:sz w:val="13"/>
         </w:rPr>
-        <w:t>│   ├── ApiProject.cs  46</w:t>
+        <w:t>│   ├── ApiProject.cs  62</w:t>
       </w:r>
     </w:p>
     <w:p>
@@ -4306,19 +4306,19 @@
           <w:rFonts w:ascii="Consolas" w:hAnsi="Consolas" w:eastAsia="Consolas"/>
           <w:sz w:val="13"/>
         </w:rPr>
-        <w:t>│   │   ├── ApiClient.cs  228</w:t>
-      </w:r>
-    </w:p>
-    <w:p>
-      <w:pPr>
-        <w:spacing w:after="0" w:before="0" w:line="240" w:lineRule="auto"/>
-      </w:pPr>
-      <w:r>
-        <w:rPr>
-          <w:rFonts w:ascii="Consolas" w:hAnsi="Consolas" w:eastAsia="Consolas"/>
-          <w:sz w:val="13"/>
-        </w:rPr>
-        <w:t>│   │   ├── ApiProjectStore.cs  127</w:t>
+        <w:t>│   │   ├── ApiClient.cs  298</w:t>
+      </w:r>
+    </w:p>
+    <w:p>
+      <w:pPr>
+        <w:spacing w:after="0" w:before="0" w:line="240" w:lineRule="auto"/>
+      </w:pPr>
+      <w:r>
+        <w:rPr>
+          <w:rFonts w:ascii="Consolas" w:hAnsi="Consolas" w:eastAsia="Consolas"/>
+          <w:sz w:val="13"/>
+        </w:rPr>
+        <w:t>│   │   ├── ApiProjectStore.cs  157</w:t>
       </w:r>
     </w:p>
     <w:p>
@@ -4342,7 +4342,7 @@
           <w:rFonts w:ascii="Consolas" w:hAnsi="Consolas" w:eastAsia="Consolas"/>
           <w:sz w:val="13"/>
         </w:rPr>
-        <w:t>│   │   └── PostmanConverter.cs  158</w:t>
+        <w:t>│   │   └── PostmanConverter.cs  306</w:t>
       </w:r>
     </w:p>
     <w:p>
@@ -5938,7 +5938,7 @@
           <w:rFonts w:ascii="Consolas" w:hAnsi="Consolas" w:eastAsia="Consolas"/>
           <w:sz w:val="13"/>
         </w:rPr>
-        <w:t>│   └── WebViewEnvironment.cs  373</w:t>
+        <w:t>│   └── WebViewEnvironment.cs  384</w:t>
       </w:r>
     </w:p>
     <w:p>
@@ -6022,7 +6022,7 @@
           <w:rFonts w:ascii="Consolas" w:hAnsi="Consolas" w:eastAsia="Consolas"/>
           <w:sz w:val="13"/>
         </w:rPr>
-        <w:t>│       ├── apideclaration.html  376</w:t>
+        <w:t>│       ├── apideclaration.html  416</w:t>
       </w:r>
     </w:p>
     <w:p>
@@ -6610,7 +6610,7 @@
           <w:rFonts w:ascii="Consolas" w:hAnsi="Consolas" w:eastAsia="Consolas"/>
           <w:sz w:val="13"/>
         </w:rPr>
-        <w:t>│       ├── resultview.html  608</w:t>
+        <w:t>│       ├── resultview.html  621</w:t>
       </w:r>
     </w:p>
     <w:p>
@@ -11457,7 +11457,7 @@
                 <w:b w:val="0"/>
                 <w:sz w:val="16"/>
               </w:rPr>
-              <w:t>Menu "Triển khai". Token trần (không Bearer), mật khẩu DPAPI, nhập/xuất Postman v2.1. Xem memory api-declaration-lt3.</w:t>
+              <w:t>Menu "Triển khai". Token trần (không Bearer) hoặc Header tĩnh (không getToken); header chung + header từng form, body raw/urlencoded/formdata/none; mật khẩu + header bí mật DPAPI, nhập/xuất Postman v2.1 giữ header. Bản App: Controls/NativePages.Api.cs. Xem memory api-declaration-lt3.</w:t>
             </w:r>
           </w:p>
         </w:tc>

</xml_diff>

<commit_message>
bcode| update hỏi đáp theo source fast
</commit_message>
<xml_diff>
--- a/Cấu trúc Bcode  BcodeViewer (v3 - Tóm tắt).docx
+++ b/Cấu trúc Bcode  BcodeViewer (v3 - Tóm tắt).docx
@@ -2134,6 +2134,18 @@
           <w:rFonts w:ascii="Consolas" w:hAnsi="Consolas" w:eastAsia="Consolas"/>
           <w:sz w:val="13"/>
         </w:rPr>
+        <w:t>│   ├── FastAskControl.cs  115</w:t>
+      </w:r>
+    </w:p>
+    <w:p>
+      <w:pPr>
+        <w:spacing w:after="0" w:before="0" w:line="240" w:lineRule="auto"/>
+      </w:pPr>
+      <w:r>
+        <w:rPr>
+          <w:rFonts w:ascii="Consolas" w:hAnsi="Consolas" w:eastAsia="Consolas"/>
+          <w:sz w:val="13"/>
+        </w:rPr>
         <w:t>│   ├── FcodeLexer.cs  465</w:t>
       </w:r>
     </w:p>
@@ -2290,7 +2302,7 @@
           <w:rFonts w:ascii="Consolas" w:hAnsi="Consolas" w:eastAsia="Consolas"/>
           <w:sz w:val="13"/>
         </w:rPr>
-        <w:t>│   ├── ISqlTab.cs  57</w:t>
+        <w:t>│   ├── ISqlTab.cs  61</w:t>
       </w:r>
     </w:p>
     <w:p>
@@ -2734,7 +2746,7 @@
           <w:rFonts w:ascii="Consolas" w:hAnsi="Consolas" w:eastAsia="Consolas"/>
           <w:sz w:val="13"/>
         </w:rPr>
-        <w:t>│   ├── NativePages.Profiler.cs  79</w:t>
+        <w:t>│   ├── NativePages.Profiler.cs  80</w:t>
       </w:r>
     </w:p>
     <w:p>
@@ -2842,7 +2854,7 @@
           <w:rFonts w:ascii="Consolas" w:hAnsi="Consolas" w:eastAsia="Consolas"/>
           <w:sz w:val="13"/>
         </w:rPr>
-        <w:t>│   ├── NativeSqlControl.cs  1903</w:t>
+        <w:t>│   ├── NativeSqlControl.cs  2160</w:t>
       </w:r>
     </w:p>
     <w:p>
@@ -2962,7 +2974,7 @@
           <w:rFonts w:ascii="Consolas" w:hAnsi="Consolas" w:eastAsia="Consolas"/>
           <w:sz w:val="13"/>
         </w:rPr>
-        <w:t>│   ├── RawSqlControl.cs  2539</w:t>
+        <w:t>│   ├── RawSqlControl.cs  2803</w:t>
       </w:r>
     </w:p>
     <w:p>
@@ -3094,7 +3106,7 @@
           <w:rFonts w:ascii="Consolas" w:hAnsi="Consolas" w:eastAsia="Consolas"/>
           <w:sz w:val="13"/>
         </w:rPr>
-        <w:t>│   ├── SqlProfilerControl.cs  1838</w:t>
+        <w:t>│   ├── SqlProfilerControl.cs  1861</w:t>
       </w:r>
     </w:p>
     <w:p>
@@ -3190,7 +3202,7 @@
           <w:rFonts w:ascii="Consolas" w:hAnsi="Consolas" w:eastAsia="Consolas"/>
           <w:sz w:val="13"/>
         </w:rPr>
-        <w:t>│   ├── TableEditControl.cs  2007</w:t>
+        <w:t>│   ├── TableEditControl.cs  2120</w:t>
       </w:r>
     </w:p>
     <w:p>
@@ -3670,7 +3682,7 @@
           <w:rFonts w:ascii="Consolas" w:hAnsi="Consolas" w:eastAsia="Consolas"/>
           <w:sz w:val="13"/>
         </w:rPr>
-        <w:t>│   ├── MainForm.cs  3821</w:t>
+        <w:t>│   ├── MainForm.cs  3943</w:t>
       </w:r>
     </w:p>
     <w:p>
@@ -3922,7 +3934,7 @@
           <w:rFonts w:ascii="Consolas" w:hAnsi="Consolas" w:eastAsia="Consolas"/>
           <w:sz w:val="13"/>
         </w:rPr>
-        <w:t>│   ├── StepParamsForm.cs  85</w:t>
+        <w:t>│   ├── StepParamsForm.cs  134</w:t>
       </w:r>
     </w:p>
     <w:p>
@@ -4090,7 +4102,7 @@
           <w:rFonts w:ascii="Consolas" w:hAnsi="Consolas" w:eastAsia="Consolas"/>
           <w:sz w:val="13"/>
         </w:rPr>
-        <w:t>│   ├── AppSettings.cs  300</w:t>
+        <w:t>│   ├── AppSettings.cs  335</w:t>
       </w:r>
     </w:p>
     <w:p>
@@ -4750,7 +4762,7 @@
           <w:rFonts w:ascii="Consolas" w:hAnsi="Consolas" w:eastAsia="Consolas"/>
           <w:sz w:val="13"/>
         </w:rPr>
-        <w:t>│   ├── DataScriptService.cs  109</w:t>
+        <w:t>│   ├── DataScriptService.cs  137</w:t>
       </w:r>
     </w:p>
     <w:p>
@@ -4858,6 +4870,18 @@
           <w:rFonts w:ascii="Consolas" w:hAnsi="Consolas" w:eastAsia="Consolas"/>
           <w:sz w:val="13"/>
         </w:rPr>
+        <w:t>│   ├── DynamicSqlInspector.cs  120</w:t>
+      </w:r>
+    </w:p>
+    <w:p>
+      <w:pPr>
+        <w:spacing w:after="0" w:before="0" w:line="240" w:lineRule="auto"/>
+      </w:pPr>
+      <w:r>
+        <w:rPr>
+          <w:rFonts w:ascii="Consolas" w:hAnsi="Consolas" w:eastAsia="Consolas"/>
+          <w:sz w:val="13"/>
+        </w:rPr>
         <w:t>│   ├── EInvoiceSetupService.cs  185</w:t>
       </w:r>
     </w:p>
@@ -4882,6 +4906,30 @@
           <w:rFonts w:ascii="Consolas" w:hAnsi="Consolas" w:eastAsia="Consolas"/>
           <w:sz w:val="13"/>
         </w:rPr>
+        <w:t>│   ├── FastAskKnowledge.cs  306</w:t>
+      </w:r>
+    </w:p>
+    <w:p>
+      <w:pPr>
+        <w:spacing w:after="0" w:before="0" w:line="240" w:lineRule="auto"/>
+      </w:pPr>
+      <w:r>
+        <w:rPr>
+          <w:rFonts w:ascii="Consolas" w:hAnsi="Consolas" w:eastAsia="Consolas"/>
+          <w:sz w:val="13"/>
+        </w:rPr>
+        <w:t>│   ├── FastAskService.cs  984</w:t>
+      </w:r>
+    </w:p>
+    <w:p>
+      <w:pPr>
+        <w:spacing w:after="0" w:before="0" w:line="240" w:lineRule="auto"/>
+      </w:pPr>
+      <w:r>
+        <w:rPr>
+          <w:rFonts w:ascii="Consolas" w:hAnsi="Consolas" w:eastAsia="Consolas"/>
+          <w:sz w:val="13"/>
+        </w:rPr>
         <w:t>│   ├── FastCatalogCheck.cs  200</w:t>
       </w:r>
     </w:p>
@@ -4906,6 +4954,30 @@
           <w:rFonts w:ascii="Consolas" w:hAnsi="Consolas" w:eastAsia="Consolas"/>
           <w:sz w:val="13"/>
         </w:rPr>
+        <w:t>│   ├── FastGhostMiner.cs  429</w:t>
+      </w:r>
+    </w:p>
+    <w:p>
+      <w:pPr>
+        <w:spacing w:after="0" w:before="0" w:line="240" w:lineRule="auto"/>
+      </w:pPr>
+      <w:r>
+        <w:rPr>
+          <w:rFonts w:ascii="Consolas" w:hAnsi="Consolas" w:eastAsia="Consolas"/>
+          <w:sz w:val="13"/>
+        </w:rPr>
+        <w:t>│   ├── FastGhostRules.cs  838</w:t>
+      </w:r>
+    </w:p>
+    <w:p>
+      <w:pPr>
+        <w:spacing w:after="0" w:before="0" w:line="240" w:lineRule="auto"/>
+      </w:pPr>
+      <w:r>
+        <w:rPr>
+          <w:rFonts w:ascii="Consolas" w:hAnsi="Consolas" w:eastAsia="Consolas"/>
+          <w:sz w:val="13"/>
+        </w:rPr>
         <w:t>│   ├── FCodeConfigImportService.cs  89</w:t>
       </w:r>
     </w:p>
@@ -5422,7 +5494,7 @@
           <w:rFonts w:ascii="Consolas" w:hAnsi="Consolas" w:eastAsia="Consolas"/>
           <w:sz w:val="13"/>
         </w:rPr>
-        <w:t>│   ├── SqlHintCatalog.cs  226</w:t>
+        <w:t>│   ├── SqlHintCatalog.cs  236</w:t>
       </w:r>
     </w:p>
     <w:p>
@@ -5518,19 +5590,19 @@
           <w:rFonts w:ascii="Consolas" w:hAnsi="Consolas" w:eastAsia="Consolas"/>
           <w:sz w:val="13"/>
         </w:rPr>
-        <w:t>│   ├── SqlStepPlanner.cs  325</w:t>
-      </w:r>
-    </w:p>
-    <w:p>
-      <w:pPr>
-        <w:spacing w:after="0" w:before="0" w:line="240" w:lineRule="auto"/>
-      </w:pPr>
-      <w:r>
-        <w:rPr>
-          <w:rFonts w:ascii="Consolas" w:hAnsi="Consolas" w:eastAsia="Consolas"/>
-          <w:sz w:val="13"/>
-        </w:rPr>
-        <w:t>│   ├── TableDataService.cs  521</w:t>
+        <w:t>│   ├── SqlStepPlanner.cs  406</w:t>
+      </w:r>
+    </w:p>
+    <w:p>
+      <w:pPr>
+        <w:spacing w:after="0" w:before="0" w:line="240" w:lineRule="auto"/>
+      </w:pPr>
+      <w:r>
+        <w:rPr>
+          <w:rFonts w:ascii="Consolas" w:hAnsi="Consolas" w:eastAsia="Consolas"/>
+          <w:sz w:val="13"/>
+        </w:rPr>
+        <w:t>│   ├── TableDataService.cs  632</w:t>
       </w:r>
     </w:p>
     <w:p>
@@ -5638,7 +5710,7 @@
           <w:rFonts w:ascii="Consolas" w:hAnsi="Consolas" w:eastAsia="Consolas"/>
           <w:sz w:val="13"/>
         </w:rPr>
-        <w:t>├── Templates/  (3317 file — không liệt kê)</w:t>
+        <w:t>├── Templates/  (3318 file — không liệt kê)</w:t>
       </w:r>
     </w:p>
     <w:p>
@@ -5722,6 +5794,18 @@
           <w:rFonts w:ascii="Consolas" w:hAnsi="Consolas" w:eastAsia="Consolas"/>
           <w:sz w:val="13"/>
         </w:rPr>
+        <w:t>│   ├── FastGhostLearnUi.cs  32</w:t>
+      </w:r>
+    </w:p>
+    <w:p>
+      <w:pPr>
+        <w:spacing w:after="0" w:before="0" w:line="240" w:lineRule="auto"/>
+      </w:pPr>
+      <w:r>
+        <w:rPr>
+          <w:rFonts w:ascii="Consolas" w:hAnsi="Consolas" w:eastAsia="Consolas"/>
+          <w:sz w:val="13"/>
+        </w:rPr>
         <w:t>│   ├── FlatToolStripRenderer.cs  120</w:t>
       </w:r>
     </w:p>
@@ -5830,7 +5914,7 @@
           <w:rFonts w:ascii="Consolas" w:hAnsi="Consolas" w:eastAsia="Consolas"/>
           <w:sz w:val="13"/>
         </w:rPr>
-        <w:t>│   ├── ShortcutRegistry.cs  339</w:t>
+        <w:t>│   ├── ShortcutRegistry.cs  343</w:t>
       </w:r>
     </w:p>
     <w:p>
@@ -6310,6 +6394,18 @@
           <w:rFonts w:ascii="Consolas" w:hAnsi="Consolas" w:eastAsia="Consolas"/>
           <w:sz w:val="13"/>
         </w:rPr>
+        <w:t>│       ├── fastask.html  276</w:t>
+      </w:r>
+    </w:p>
+    <w:p>
+      <w:pPr>
+        <w:spacing w:after="0" w:before="0" w:line="240" w:lineRule="auto"/>
+      </w:pPr>
+      <w:r>
+        <w:rPr>
+          <w:rFonts w:ascii="Consolas" w:hAnsi="Consolas" w:eastAsia="Consolas"/>
+          <w:sz w:val="13"/>
+        </w:rPr>
         <w:t>│       ├── filelookupbar.html  171</w:t>
       </w:r>
     </w:p>
@@ -6718,7 +6814,7 @@
           <w:rFonts w:ascii="Consolas" w:hAnsi="Consolas" w:eastAsia="Consolas"/>
           <w:sz w:val="13"/>
         </w:rPr>
-        <w:t>│       ├── sqleditor.html  1577</w:t>
+        <w:t>│       ├── sqleditor.html  1636</w:t>
       </w:r>
     </w:p>
     <w:p>
@@ -6802,7 +6898,7 @@
           <w:rFonts w:ascii="Consolas" w:hAnsi="Consolas" w:eastAsia="Consolas"/>
           <w:sz w:val="13"/>
         </w:rPr>
-        <w:t>│       ├── sqlprofilerbar.html  149</w:t>
+        <w:t>│       ├── sqlprofilerbar.html  151</w:t>
       </w:r>
     </w:p>
     <w:p>
@@ -9710,7 +9806,7 @@
                 <w:b w:val="0"/>
                 <w:sz w:val="16"/>
               </w:rPr>
-              <w:t>Services/SqlLineAnalyzer.cs, SqlStepPlanner.cs, DebugTargetScanner.cs; Forms/ChooseDebugTargetForm.cs, StepParamsForm.cs</w:t>
+              <w:t>Services/SqlLineAnalyzer.cs, SqlStepPlanner.cs, DebugTargetScanner.cs, DynamicSqlInspector.cs; Forms/ChooseDebugTargetForm.cs, StepParamsForm.cs; RawSqlControl / NativeSqlControl (DebugCommandAsync, DebugFindErrorAsync, ShowDynamicSqlAsync, RefreshPlanIfEdited); SqlProfilerControl (debug-sql) → MainForm.OpenProfilerDebugAsync</w:t>
             </w:r>
           </w:p>
         </w:tc>
@@ -9728,7 +9824,7 @@
                 <w:b w:val="0"/>
                 <w:sz w:val="16"/>
               </w:rPr>
-              <w:t>F10 / Ctrl+F10 / Shift+F5; chạy trong transaction rollback.</w:t>
+              <w:t>F10 / Ctrl+F10 / Shift+F5; chạy trong transaction rollback. Script ALTER/CREATE PROC + GO + đoạn gọi thử: StepParamsForm.InitialValues điền tham số từ câu exec sau GO (thay biến @0… bằng giá trị select/set), SqlStepPlanner.TailPrelude chạy phần chuẩn bị (bảng tạm #…) ở dòng 1, đoạn sau GO không chạy từng bước. ⤴ Back (Ctrl+Shift+F10) + To cursor lùi; 🔍 Tìm lỗi (Alt+F10) chia đôi điểm dừng; bước lỗi tô đỏ đoạn (_lastOkLine, dòng]; vạch lề = dòng dừng được; sửa code giữa chừng → dựng lại plan từ đầu (giữ tham số). 🧩 SQL động (Alt+Shift+F10): DynamicSqlInspector lấy biến chuỗi trông như SQL ở bảng Variables, thay r00$%Partition / %[ ]%, xuống dòng theo từ khoá, SET PARSEONLY, đánh dấu dòng lỗi + gợi ý chuỗi nuốt code → tab mới (OpenObjectInNewTabRequested). Profiler 🐞 Debug store: định nghĩa store (giữ CREATE) + GO + TextData → OpenDebugTargetAsync(compose).</w:t>
             </w:r>
           </w:p>
         </w:tc>
@@ -9748,7 +9844,7 @@
                 <w:b/>
                 <w:sz w:val="16"/>
               </w:rPr>
-              <w:t>Gợi ý code SQL</w:t>
+              <w:t>Hỏi Fast — chat tra kiến thức Fast (không AI)</w:t>
             </w:r>
           </w:p>
         </w:tc>
@@ -9766,7 +9862,7 @@
                 <w:b w:val="0"/>
                 <w:sz w:val="16"/>
               </w:rPr>
-              <w:t>Services/SqlHintCatalog.cs, SqlHintService.cs, SqlHintPopular.cs, SqlFieldTransform.cs, SqlHintEngine.cs; Web/Shell/sqlhints.js, sqlhints-help.html; Controls/SqlHintsHelpControl.cs; App: Controls/NativeSqlHints.cs + HintPopup.cs + SnippetSession.cs</w:t>
+              <w:t>Services/FastAskService.cs (hiểu câu hỏi bằng từ khoá không dấu, luồng hỏi lại báo cáo / danh mục, thẻ trả lời); Controls/FastAskControl.cs; Web/Shell/fastask.html; MainForm.OpenFastAskTab, InsertFromFastAsk (tab SQL dùng gần nhất theo _tabMru), tool fast_ask Ctrl+Shift+M</w:t>
             </w:r>
           </w:p>
         </w:tc>
@@ -9784,7 +9880,7 @@
                 <w:b w:val="0"/>
                 <w:sz w:val="16"/>
               </w:rPr>
-              <w:t>Provider Monaco, hook onDidType; dữ liệu procedure/function/options lấy từ DB đang chọn. Xem memory bcode-sql-hints-gotchas, bcode-sql-typing-perf (provider tên bảng chạy mỗi phím trên ~15k bảng → phải cache/giới hạn). Chế độ App: SqlHintEngine chạy NGUYÊN Web/Shell/sqlhints.js bằng Jint (JS thuần .NET, không WebView2; vỏ "Monaco" giả gom provider; 1 engine dùng chung, nạp lười ~90 ms) trả HintItem (Start/End = khoảng thay thế), chữ ký tham số, cảnh báo biến chưa khai — sửa sqlhints.js / SqlHintCatalog là cả 2 chế độ cùng đổi; HintPopup = khung gợi ý nổi KHÔNG nhận focus (ô loại S/ƒ/P/▫ + chi tiết + xem trước); SnippetSession = chèn snippet kiểu Monaco vào Scintilla (${1:mặc định}, ${1|a,b|}, $0; Tab/Shift+Tab qua ô, ô cùng số chép theo).</w:t>
+              <w:t>Nguồn: SqlHintCatalog (snippet rsrepq/rspivot/tblcat/dynf/total…, Idioms, GroupNotes), ma trận ghost text (Find call/func/filter/decl), database đang kết nối chỉ đọc (sys.tables, sys.objects, sys.sql_modules — SearchModulesAsync, PartitionTablesAsync đếm xxx$%Partition), TableDataService.GetColumnDescriptionsAsync (cấu trúc + JOIN theo khoá), FieldDictionaryService (header.xml), luật danh mục (nút mở QuickList StartRules), Topics = quy ước Fast. Báo cáo: chọn nhiều bảng phân kỳ (khối SET @q … Partition$Execute lặp cho từng bảng, cột = giao các bảng); Save as (SaveAsFlowAsync: OBJECT_DEFINITION chỉ đọc, đổi tên ở dòng CREATE/ALTER, nút Save as… trên thẻ store); rsrepq/rspivot + tham số lọc (kiểu theo ma trận decl) + dòng lọc (ma trận filter → FastGhostRules.FilterLine) + cột thật của bảng$000000 (tổng hợp SUM cột số). Trạng thái hội thoại do trang giữ (state). Học dự án (LearnProjectAsync): FastAskKnowledge.Mine (JOIN + ON giải alias, cột #report theo bảng phân kỳ, cột ngày Partition$Execute, tham số rs_) → fastask/projects/*.json, MergeShared → fastask/shared.json; FastGhostMiner.LearnFromModules + MergeShared → ghost/_shared.json. KnowledgeFor tra: lớp sửa của người dùng (✘ + gõ cách đúng, FastAskFeedback Prefer) → ma trận dự án → _shared → ma trận đi kèm. ✔/✘: AskCard.Ref (m|loại|khoá|cách viết, answer|…, store|…), AskReply.Sig; ApplyFeedback bỏ thẻ bị ✘, đưa thẻ ✔ lên đầu, chèn Câu trả lời bạn đã sửa; nút ✔ Đúng / ✘ Chưa đúng nằm ở hàng nút cuối thẻ (.votes). Dừng luồng: IsStop (bỏ qua / thôi / hủy / quit…) hoặc nút ✕ Dừng (state.flow). Đổi tên tab SQL Query sau khi chạy: MainForm.RenameTabByScript (ScriptExecuted, CREATE/ALTER PROC|FUNCTION|VIEW|TRIGGER ngoài comment → schema.tên). Lịch sử phiên: FastAskSessions (fastask/sessions/*.json). Nhúng vào tab SQL Query (ISqlTab.ShowFastAsk / FastAskRequested, MainForm.EmbedFastAsk) khi bật AiEmbedded. Nút thẻ: insert / newtab / copy / open-object (Arg2 app|P) / quicklist. Quy ước có mẫu (TopicCards(t, f)): câu nêu rõ đối tượng → chỉ mẫu có nhiều từ khớp nhất / ít từ thừa nhất (số dư vụ việc → baljob), "cuối kỳ" đổi @DateFrom → @DateTo, BalanceType 1 → 2.</w:t>
             </w:r>
           </w:p>
         </w:tc>
@@ -9804,7 +9900,7 @@
                 <w:b/>
                 <w:sz w:val="16"/>
               </w:rPr>
-              <w:t>Lịch sử SQL / lịch sử sửa object</w:t>
+              <w:t>Ghost text theo cấu trúc Fast (không AI)</w:t>
             </w:r>
           </w:p>
         </w:tc>
@@ -9822,7 +9918,7 @@
                 <w:b w:val="0"/>
                 <w:sz w:val="16"/>
               </w:rPr>
-              <w:t>Controls/QueryHistoryControl.cs; Services/QueryHistoryService.cs, SqlHistoryService.cs, DdlTrackingService.cs; Forms/SqlHistoryForm.cs; Web/Shell/queryhistory.html, sqlhistory.html</w:t>
+              <w:t>Services/FastGhostRules.cs (luật + ma trận KnowledgeBase: Pattern/Option, Find theo routine|ngữ cảnh, Choose, FilterStyle, KnowledgeFor chồng lớp), Services/FastGhostMiner.cs (rút → đo → hiệu chỉnh ngưỡng → tỉa → JSON), Templates/FastGhostKnowledge.json (ma trận đi kèm), UI/FastGhostLearnUi.cs (nút Học từ database này); sqleditor.html (askFastGhost trước copilotProvide, action fast-ghost); NativeSqlControl (_fastGhostTimer, ShowFastGhost); AppSettings.EnableFastGhost</w:t>
             </w:r>
           </w:p>
         </w:tc>
@@ -9840,7 +9936,7 @@
                 <w:b w:val="0"/>
                 <w:sz w:val="16"/>
               </w:rPr>
-              <w:t>Ctrl+Shift+Y. Ghim câu hay dùng; so sánh phiên bản procedure bằng Monaco diff.</w:t>
+              <w:t>Chạy trước AI, chỉ khi con trỏ cuối dòng ngoài chuỗi/comment. Luật cố định: CREATE TABLE zdm…( → cột danh mục chuẩn; tên cột trong CREATE/ALTER ADD/DECLARE → kiểu hay dùng nhất trong DB (LoadColumnTypes); CASE WHEN @Language song ngữ; SET NOCOUNT/ANSI_NULLS; @UnitKey; REPLACE(RTRIM(@x), ; DROP TABLE #t. Ma trận: loại (call/func/filter) × khoá (routine hoặc routine|ngữ cảnh = ký hiệu/từ khoá đứng trước) → vài cách viết + số lần; chỗ trống {lhs}/{if}/{a}; dòng lọc lưu dạng chuẩn rồi đổi theo dòng lọc gần nhất; bỏ cách dùng biến chưa khai báo; độ tin = số lần/(tổng còn lại + đuôi + 1); chưa đủ ngưỡng thì gợi ý phần đầu chung (cắt ở khoảng trắng/dấu phẩy/ngoặc). Ngưỡng từng loại hiệu chỉnh trên nửa store không dùng để rút (mục tiêu 90%). Ma trận đi kèm chỉ giữ routine chuẩn Fast (repo công khai); ma trận học từ DB ghi %AppData%\Bcode\ghost\&lt;dự án&gt;_app|sys.json. DECLARE @x → kiểu (DeclTypeRx, chỉ kiểu SQL thật): biến cùng tên đã khai báo trong file → ma trận Decls (ngưỡng "decl") → không đoán. Gợi ý chung khi luật trên không khớp (Explain → GenericSplit lấy cả phần trước con trỏ lẫn sau dòng đang gõ): SameCandidates/SameFile ("theo chính file": cả phần đã gõ của dòng khớp đoạn token phía trên HOẶC phía dưới, bỏ dấu phẩy đầu dòng; bậc độ dài SameLadder 8/3/1 token, mỗi bậc 1 ngưỡng "same:k"; độ tin theo số token khớp trên dòng) rồi LineStart ("ma trận đầu dòng" Lines: khoá = ≤6 token đầu dòng, alias → {1}..; rút từ cách viết có ở ≥2 store). Ô lọc / routine đã có mà chưa đủ chắc → Declined (không rơi xuống gợi ý chung). Miner: EvaluateAnyLine chấm giữa dòng bất kỳ; same/line hiệu chỉnh 1 lần (line chỉ trên chỗ same không gợi ý). Ma trận đi kèm: ô đầu dòng chỉ giữ cách viết có ở ≥20 store, mọi tên phải có ở ≥3 file mẫu Templates/fileSource (không tính file z…). SuggestLong = chế độ "Gợi ý Fast dài" (DECLARE biến chưa gặp → decl:near = kiểu biến khai báo gần nhất phía trên, chỉ ở chế độ dài; mặc định, AppSettings.FastGhostLong; SuggestByMode: dài = SuggestLong ?? Suggest, ngắn = Suggest ≥90%; không qua ngưỡng: cả dòng theo chính file nếu ≥60% chỗ khớp cùng viết, hoặc phần chung). editor.fastLong (Alt+Shift+\) / Tùy chọn → Gợi ý Fast dài = đổi dài ⇄ ngắn (sqleditor.html gửi fast-ghost-mode → ToggleFastGhostLong, rồi gợi ý lại với cờ long = gọi tay). Tắt/bật: Tùy chọn → Gợi ý theo cấu trúc Fast khi gõ.</w:t>
             </w:r>
           </w:p>
         </w:tc>
@@ -9860,7 +9956,7 @@
                 <w:b/>
                 <w:sz w:val="16"/>
               </w:rPr>
-              <w:t>Table (Ctrl+Shift+T)</w:t>
+              <w:t>Gợi ý code SQL</w:t>
             </w:r>
           </w:p>
         </w:tc>
@@ -9878,7 +9974,7 @@
                 <w:b w:val="0"/>
                 <w:sz w:val="16"/>
               </w:rPr>
-              <w:t>Controls/TableEditControl.cs, NativeTableBar.cs; Services/TableDataService.cs, DataScriptService.cs, TableMenuService.cs; Forms/ListEditorForm.cs, RowDetailForm.cs, GotoColumnForm.cs, PartitionCheckForm.cs, ColumnDesignForm.cs; Web/Shell/tablebar.html, tablestruct.html, partitioncheck.html, listeditor.html, rowdetail.html, columndesign.html; MainForm.WireTableMenu</w:t>
+              <w:t>Services/SqlHintCatalog.cs, SqlHintService.cs, SqlHintPopular.cs, SqlFieldTransform.cs, SqlHintEngine.cs; Web/Shell/sqlhints.js, sqlhints-help.html; Controls/SqlHintsHelpControl.cs; App: Controls/NativeSqlHints.cs + HintPopup.cs + SnippetSession.cs</w:t>
             </w:r>
           </w:p>
         </w:tc>
@@ -9896,7 +9992,119 @@
                 <w:b w:val="0"/>
                 <w:sz w:val="16"/>
               </w:rPr>
-              <w:t>Sửa dữ liệu kiểu Excel; Add New Column / Edit Column = ColumnDesignForm (bảng Name/Type/Length/Not NULL như hộp Design của FCode, App: ColumnDesignPage trong NativePages.Dialogs.cs) → BuildColumnScript (Gen Add / Alter Column); ô Top mặc định 0 = tất cả (Command mới mặc định TOP 500); Add Script = DELETE + INSERT; F1 chi tiết dòng, F3 khai báo nhanh danh sách. Dòng "Menu: Phiếu nhập kho (inctpnd.aspx)" dưới Where/Order (tablebar.html .menu-row / NativeTableBar.SetMenus; ẩn khi không tra được → thanh giữ chiều cao cũ): TableMenuService.FindAsync tra theo gốc tên bảng (bỏ $yyyymm/$000000/$log) — 1) dmct9 (App): c$/m$/d$/i$ → url → menu wcommand có link cùng trang aspx; 2) controller của menu: CommandTableService.ResolveIn (Dir table= + Grid chi tiết; table="&amp;Tag;" tra &lt;!ENTITY&gt; trong file Dir). Cache theo workspace + số menu trên cây, ⟳ Refresh database = Forget. Gõ thì chờ 300 ms, tải xong bảng thì tra ngay. Bấm menu → MenuRevealRequested → hiện cây WCommand + RevealAsync (chỉ chọn node, không mở File Lookup). Menu trùng tên ở nhiều phân hệ → thêm [phân hệ]; tối đa 4 + "+N". Chuột phải ô Table khi là bảng phân kỳ (xxx$yyyymm) → "Check Partitions Struct" (tablebar.html contextmenu → action table-context; App: NativeTableBar.ContextMenuHook bắt WM_CONTEXTMENU; bảng khác giữ menu mặc định) → Forms/PartitionCheckForm + Web/Shell/partitioncheck.html (App: Controls/NativePages.PartitionCheck.cs): TableDataService.CheckPartitionStructureAsync so mọi {prefix}$dddddd với {prefix}$000000 (1 câu INFORMATION_SCHEMA.COLUMNS) — thiếu / thừa cột, khác kiểu hoặc null, khác thứ tự cột; "Tables are same structure" khi giống hết; Copy ra Tab-separated.</w:t>
+              <w:t>Provider Monaco, hook onDidType; dữ liệu procedure/function/options lấy từ DB đang chọn. Xem memory bcode-sql-hints-gotchas, bcode-sql-typing-perf (provider tên bảng chạy mỗi phím trên ~15k bảng → phải cache/giới hạn). Chế độ App: SqlHintEngine chạy NGUYÊN Web/Shell/sqlhints.js bằng Jint (JS thuần .NET, không WebView2; vỏ "Monaco" giả gom provider; 1 engine dùng chung, nạp lười ~90 ms) trả HintItem (Start/End = khoảng thay thế), chữ ký tham số, cảnh báo biến chưa khai — sửa sqlhints.js / SqlHintCatalog là cả 2 chế độ cùng đổi; HintPopup = khung gợi ý nổi KHÔNG nhận focus (ô loại S/ƒ/P/▫ + chi tiết + xem trước); SnippetSession = chèn snippet kiểu Monaco vào Scintilla (${1:mặc định}, ${1|a,b|}, $0; Tab/Shift+Tab qua ô, ô cùng số chép theo).</w:t>
+            </w:r>
+          </w:p>
+        </w:tc>
+      </w:tr>
+      <w:tr>
+        <w:tc>
+          <w:tcPr>
+            <w:tcW w:type="dxa" w:w="2041"/>
+          </w:tcPr>
+          <w:p>
+            <w:pPr>
+              <w:spacing w:after="20"/>
+            </w:pPr>
+            <w:r/>
+            <w:r>
+              <w:rPr>
+                <w:b/>
+                <w:sz w:val="16"/>
+              </w:rPr>
+              <w:t>Lịch sử SQL / lịch sử sửa object</w:t>
+            </w:r>
+          </w:p>
+        </w:tc>
+        <w:tc>
+          <w:tcPr>
+            <w:tcW w:type="dxa" w:w="3969"/>
+          </w:tcPr>
+          <w:p>
+            <w:pPr>
+              <w:spacing w:after="20"/>
+            </w:pPr>
+            <w:r/>
+            <w:r>
+              <w:rPr>
+                <w:b w:val="0"/>
+                <w:sz w:val="16"/>
+              </w:rPr>
+              <w:t>Controls/QueryHistoryControl.cs; Services/QueryHistoryService.cs, SqlHistoryService.cs, DdlTrackingService.cs; Forms/SqlHistoryForm.cs; Web/Shell/queryhistory.html, sqlhistory.html</w:t>
+            </w:r>
+          </w:p>
+        </w:tc>
+        <w:tc>
+          <w:tcPr>
+            <w:tcW w:type="dxa" w:w="3855"/>
+          </w:tcPr>
+          <w:p>
+            <w:pPr>
+              <w:spacing w:after="20"/>
+            </w:pPr>
+            <w:r/>
+            <w:r>
+              <w:rPr>
+                <w:b w:val="0"/>
+                <w:sz w:val="16"/>
+              </w:rPr>
+              <w:t>Ctrl+Shift+Y. Ghim câu hay dùng; so sánh phiên bản procedure bằng Monaco diff.</w:t>
+            </w:r>
+          </w:p>
+        </w:tc>
+      </w:tr>
+      <w:tr>
+        <w:tc>
+          <w:tcPr>
+            <w:tcW w:type="dxa" w:w="2041"/>
+          </w:tcPr>
+          <w:p>
+            <w:pPr>
+              <w:spacing w:after="20"/>
+            </w:pPr>
+            <w:r/>
+            <w:r>
+              <w:rPr>
+                <w:b/>
+                <w:sz w:val="16"/>
+              </w:rPr>
+              <w:t>Table (Ctrl+Shift+T)</w:t>
+            </w:r>
+          </w:p>
+        </w:tc>
+        <w:tc>
+          <w:tcPr>
+            <w:tcW w:type="dxa" w:w="3969"/>
+          </w:tcPr>
+          <w:p>
+            <w:pPr>
+              <w:spacing w:after="20"/>
+            </w:pPr>
+            <w:r/>
+            <w:r>
+              <w:rPr>
+                <w:b w:val="0"/>
+                <w:sz w:val="16"/>
+              </w:rPr>
+              <w:t>Controls/TableEditControl.cs, NativeTableBar.cs; Services/TableDataService.cs, DataScriptService.cs, TableMenuService.cs; Forms/ListEditorForm.cs, RowDetailForm.cs, GotoColumnForm.cs, PartitionCheckForm.cs, ColumnDesignForm.cs; Web/Shell/tablebar.html, tablestruct.html, partitioncheck.html, listeditor.html, rowdetail.html, columndesign.html; MainForm.WireTableMenu</w:t>
+            </w:r>
+          </w:p>
+        </w:tc>
+        <w:tc>
+          <w:tcPr>
+            <w:tcW w:type="dxa" w:w="3855"/>
+          </w:tcPr>
+          <w:p>
+            <w:pPr>
+              <w:spacing w:after="20"/>
+            </w:pPr>
+            <w:r/>
+            <w:r>
+              <w:rPr>
+                <w:b w:val="0"/>
+                <w:sz w:val="16"/>
+              </w:rPr>
+              <w:t>Sửa dữ liệu kiểu Excel; Add New Column / Edit Column = ColumnDesignForm (bảng Name/Type/Length/Not NULL như hộp Design của FCode, App: ColumnDesignPage trong NativePages.Dialogs.cs) → BuildColumnScript (Gen Add / Alter Column); ô Top mặc định 0 = tất cả (Command mới mặc định TOP 500); Add Script = DELETE + INSERT; F1 chi tiết dòng, F3 khai báo nhanh danh sách. Dòng "Menu: Phiếu nhập kho (inctpnd.aspx)" dưới Where/Order (tablebar.html .menu-row / NativeTableBar.SetMenus; ẩn khi không tra được → thanh giữ chiều cao cũ): TableMenuService.FindAsync tra theo gốc tên bảng (bỏ $yyyymm/$000000/$log) — 1) dmct9 (App): c$/m$/d$/i$ → url → menu wcommand có link cùng trang aspx; 2) controller của menu: CommandTableService.ResolveIn (Dir table= + Grid chi tiết; table="&amp;Tag;" tra &lt;!ENTITY&gt; trong file Dir). Cache theo workspace + số menu trên cây, ⟳ Refresh database = Forget. Gõ thì chờ 300 ms, tải xong bảng thì tra ngay. Bấm menu → MenuRevealRequested → hiện cây WCommand + RevealAsync (chỉ chọn node, không mở File Lookup). Menu trùng tên ở nhiều phân hệ → thêm [phân hệ]; tối đa 4 + "+N". Chuột phải ô Table khi là bảng phân kỳ (xxx$yyyymm) → "Check Partitions Struct" (tablebar.html contextmenu → action table-context; App: NativeTableBar.ContextMenuHook bắt WM_CONTEXTMENU; bảng khác giữ menu mặc định) → Forms/PartitionCheckForm + Web/Shell/partitioncheck.html (App: Controls/NativePages.PartitionCheck.cs): TableDataService.CheckPartitionStructureAsync so mọi {prefix}$dddddd với {prefix}$000000 (1 câu INFORMATION_SCHEMA.COLUMNS) — thiếu / thừa cột, khác kiểu hoặc null, khác thứ tự cột; "Tables are same structure" khi giống hết; Copy ra Tab-separated. Add Script khi bảng 0 dòng → StructureAddScriptAsync: cấu trúc bảng (SqlObjectBrowserService.GetTableSchemaScriptAsync, lỗi thì GenStructureTable) bọc DataScriptService.GenerateStructureScript. Add Script (DataScriptService): bảng có identity → #data lấy [id] + 0, nạp vào bảng thật bọc SET IDENTITY_INSERT ON/OFF kèm danh sách cột; bỏ cột computed/rowversion (TableWriteInfo).</w:t>
             </w:r>
           </w:p>
         </w:tc>

</xml_diff>

<commit_message>
bcode| cải tiến hỏi đáp
</commit_message>
<xml_diff>
--- a/Cấu trúc Bcode  BcodeViewer (v3 - Tóm tắt).docx
+++ b/Cấu trúc Bcode  BcodeViewer (v3 - Tóm tắt).docx
@@ -2134,7 +2134,7 @@
           <w:rFonts w:ascii="Consolas" w:hAnsi="Consolas" w:eastAsia="Consolas"/>
           <w:sz w:val="13"/>
         </w:rPr>
-        <w:t>│   ├── FastAskControl.cs  115</w:t>
+        <w:t>│   ├── FastAskControl.cs  121</w:t>
       </w:r>
     </w:p>
     <w:p>
@@ -4918,7 +4918,7 @@
           <w:rFonts w:ascii="Consolas" w:hAnsi="Consolas" w:eastAsia="Consolas"/>
           <w:sz w:val="13"/>
         </w:rPr>
-        <w:t>│   ├── FastAskService.cs  984</w:t>
+        <w:t>│   ├── FastAskService.cs  1189</w:t>
       </w:r>
     </w:p>
     <w:p>
@@ -4954,19 +4954,19 @@
           <w:rFonts w:ascii="Consolas" w:hAnsi="Consolas" w:eastAsia="Consolas"/>
           <w:sz w:val="13"/>
         </w:rPr>
-        <w:t>│   ├── FastGhostMiner.cs  429</w:t>
-      </w:r>
-    </w:p>
-    <w:p>
-      <w:pPr>
-        <w:spacing w:after="0" w:before="0" w:line="240" w:lineRule="auto"/>
-      </w:pPr>
-      <w:r>
-        <w:rPr>
-          <w:rFonts w:ascii="Consolas" w:hAnsi="Consolas" w:eastAsia="Consolas"/>
-          <w:sz w:val="13"/>
-        </w:rPr>
-        <w:t>│   ├── FastGhostRules.cs  838</w:t>
+        <w:t>│   ├── FastGhostMiner.cs  518</w:t>
+      </w:r>
+    </w:p>
+    <w:p>
+      <w:pPr>
+        <w:spacing w:after="0" w:before="0" w:line="240" w:lineRule="auto"/>
+      </w:pPr>
+      <w:r>
+        <w:rPr>
+          <w:rFonts w:ascii="Consolas" w:hAnsi="Consolas" w:eastAsia="Consolas"/>
+          <w:sz w:val="13"/>
+        </w:rPr>
+        <w:t>│   ├── FastGhostRules.cs  1015</w:t>
       </w:r>
     </w:p>
     <w:p>
@@ -6394,7 +6394,7 @@
           <w:rFonts w:ascii="Consolas" w:hAnsi="Consolas" w:eastAsia="Consolas"/>
           <w:sz w:val="13"/>
         </w:rPr>
-        <w:t>│       ├── fastask.html  276</w:t>
+        <w:t>│       ├── fastask.html  301</w:t>
       </w:r>
     </w:p>
     <w:p>
@@ -9880,7 +9880,7 @@
                 <w:b w:val="0"/>
                 <w:sz w:val="16"/>
               </w:rPr>
-              <w:t>Nguồn: SqlHintCatalog (snippet rsrepq/rspivot/tblcat/dynf/total…, Idioms, GroupNotes), ma trận ghost text (Find call/func/filter/decl), database đang kết nối chỉ đọc (sys.tables, sys.objects, sys.sql_modules — SearchModulesAsync, PartitionTablesAsync đếm xxx$%Partition), TableDataService.GetColumnDescriptionsAsync (cấu trúc + JOIN theo khoá), FieldDictionaryService (header.xml), luật danh mục (nút mở QuickList StartRules), Topics = quy ước Fast. Báo cáo: chọn nhiều bảng phân kỳ (khối SET @q … Partition$Execute lặp cho từng bảng, cột = giao các bảng); Save as (SaveAsFlowAsync: OBJECT_DEFINITION chỉ đọc, đổi tên ở dòng CREATE/ALTER, nút Save as… trên thẻ store); rsrepq/rspivot + tham số lọc (kiểu theo ma trận decl) + dòng lọc (ma trận filter → FastGhostRules.FilterLine) + cột thật của bảng$000000 (tổng hợp SUM cột số). Trạng thái hội thoại do trang giữ (state). Học dự án (LearnProjectAsync): FastAskKnowledge.Mine (JOIN + ON giải alias, cột #report theo bảng phân kỳ, cột ngày Partition$Execute, tham số rs_) → fastask/projects/*.json, MergeShared → fastask/shared.json; FastGhostMiner.LearnFromModules + MergeShared → ghost/_shared.json. KnowledgeFor tra: lớp sửa của người dùng (✘ + gõ cách đúng, FastAskFeedback Prefer) → ma trận dự án → _shared → ma trận đi kèm. ✔/✘: AskCard.Ref (m|loại|khoá|cách viết, answer|…, store|…), AskReply.Sig; ApplyFeedback bỏ thẻ bị ✘, đưa thẻ ✔ lên đầu, chèn Câu trả lời bạn đã sửa; nút ✔ Đúng / ✘ Chưa đúng nằm ở hàng nút cuối thẻ (.votes). Dừng luồng: IsStop (bỏ qua / thôi / hủy / quit…) hoặc nút ✕ Dừng (state.flow). Đổi tên tab SQL Query sau khi chạy: MainForm.RenameTabByScript (ScriptExecuted, CREATE/ALTER PROC|FUNCTION|VIEW|TRIGGER ngoài comment → schema.tên). Lịch sử phiên: FastAskSessions (fastask/sessions/*.json). Nhúng vào tab SQL Query (ISqlTab.ShowFastAsk / FastAskRequested, MainForm.EmbedFastAsk) khi bật AiEmbedded. Nút thẻ: insert / newtab / copy / open-object (Arg2 app|P) / quicklist. Quy ước có mẫu (TopicCards(t, f)): câu nêu rõ đối tượng → chỉ mẫu có nhiều từ khớp nhất / ít từ thừa nhất (số dư vụ việc → baljob), "cuối kỳ" đổi @DateFrom → @DateTo, BalanceType 1 → 2.</w:t>
+              <w:t>Nguồn: SqlHintCatalog (snippet rsrepq/rspivot/tblcat/dynf/total…, Idioms, GroupNotes), ma trận ghost text (Find call/func/filter/decl), database đang kết nối chỉ đọc (sys.tables, sys.objects, sys.sql_modules — SearchModulesAsync, PartitionTablesAsync đếm xxx$%Partition), TableDataService.GetColumnDescriptionsAsync (cấu trúc + JOIN theo khoá), FieldDictionaryService (header.xml), luật danh mục (nút mở QuickList StartRules), Topics = quy ước Fast. Báo cáo: chọn nhiều bảng phân kỳ (khối SET @q … Partition$Execute lặp cho từng bảng, cột = giao các bảng); Save as (SaveAsFlowAsync: OBJECT_DEFINITION chỉ đọc, đổi tên ở dòng CREATE/ALTER, nút Save as… trên thẻ store); rsrepq/rspivot + tham số lọc (kiểu theo ma trận decl) + dòng lọc (ma trận filter → FastGhostRules.FilterLine) + cột thật của bảng$000000 (tổng hợp SUM cột số). Trạng thái hội thoại do trang giữ (state). Học dự án (LearnProjectAsync): FastAskKnowledge.Mine (JOIN + ON giải alias, cột #report theo bảng phân kỳ, cột ngày Partition$Execute, tham số rs_) → fastask/projects/*.json, MergeShared → fastask/shared.json; FastGhostMiner.LearnFromModules + MergeShared → ghost/_shared.json. KnowledgeFor tra: lớp sửa của người dùng (✘ + gõ cách đúng, FastAskFeedback Prefer) → ma trận dự án → _shared → ma trận đi kèm. ✔/✘: AskCard.Ref (m|loại|khoá|cách viết, answer|…, store|…), AskReply.Sig; ApplyFeedback bỏ thẻ bị ✘, đưa thẻ ✔ lên đầu, chèn Câu trả lời bạn đã sửa; nút ✔ Đúng / ✘ Chưa đúng nằm ở hàng nút cuối thẻ (.votes). Dừng luồng: IsStop (bỏ qua / thôi / hủy / quit…) hoặc nút ✕ Dừng (state.flow). Đổi tên tab SQL Query sau khi chạy: MainForm.RenameTabByScript (ScriptExecuted, CREATE/ALTER PROC|FUNCTION|VIEW|TRIGGER ngoài comment → schema.tên). Lịch sử phiên: FastAskSessions (fastask/sessions/*.json). Nhúng vào tab SQL Query (ISqlTab.ShowFastAsk / FastAskRequested, MainForm.EmbedFastAsk) khi bật AiEmbedded. Nút thẻ: insert / newtab / copy / open-object (Arg2 app|P) / quicklist; ✎ Sửa → action correct → FastAskService.Correct (✘ + SaveCorrection). Bảng: ResolveTables (tên đúng → tên gốc bảng phân kỳ → tiếng Việt qua lookup header.xml → dm+tên), DescribeTableAsync (MS_Description, dmct.m_phdbf/m_ctdbf, field tra cứu, quy ước tên, store dùng bảng). Danh mục: CatalogFlowAsync + CatalogColumns (cột người dùng nhập; bảng đã có → ALTER TABLE ADD). Save as: RecentReportsAsync (rs_/zrs_ sửa gần đây), gõ 1 phần tên → chọn. Quy ước có mẫu (TopicCards(t, f)): câu nêu rõ đối tượng → chỉ mẫu có nhiều từ khớp nhất / ít từ thừa nhất (số dư vụ việc → baljob), "cuối kỳ" đổi @DateFrom → @DateTo, BalanceType 1 → 2.</w:t>
             </w:r>
           </w:p>
         </w:tc>
@@ -9936,7 +9936,7 @@
                 <w:b w:val="0"/>
                 <w:sz w:val="16"/>
               </w:rPr>
-              <w:t>Chạy trước AI, chỉ khi con trỏ cuối dòng ngoài chuỗi/comment. Luật cố định: CREATE TABLE zdm…( → cột danh mục chuẩn; tên cột trong CREATE/ALTER ADD/DECLARE → kiểu hay dùng nhất trong DB (LoadColumnTypes); CASE WHEN @Language song ngữ; SET NOCOUNT/ANSI_NULLS; @UnitKey; REPLACE(RTRIM(@x), ; DROP TABLE #t. Ma trận: loại (call/func/filter) × khoá (routine hoặc routine|ngữ cảnh = ký hiệu/từ khoá đứng trước) → vài cách viết + số lần; chỗ trống {lhs}/{if}/{a}; dòng lọc lưu dạng chuẩn rồi đổi theo dòng lọc gần nhất; bỏ cách dùng biến chưa khai báo; độ tin = số lần/(tổng còn lại + đuôi + 1); chưa đủ ngưỡng thì gợi ý phần đầu chung (cắt ở khoảng trắng/dấu phẩy/ngoặc). Ngưỡng từng loại hiệu chỉnh trên nửa store không dùng để rút (mục tiêu 90%). Ma trận đi kèm chỉ giữ routine chuẩn Fast (repo công khai); ma trận học từ DB ghi %AppData%\Bcode\ghost\&lt;dự án&gt;_app|sys.json. DECLARE @x → kiểu (DeclTypeRx, chỉ kiểu SQL thật): biến cùng tên đã khai báo trong file → ma trận Decls (ngưỡng "decl") → không đoán. Gợi ý chung khi luật trên không khớp (Explain → GenericSplit lấy cả phần trước con trỏ lẫn sau dòng đang gõ): SameCandidates/SameFile ("theo chính file": cả phần đã gõ của dòng khớp đoạn token phía trên HOẶC phía dưới, bỏ dấu phẩy đầu dòng; bậc độ dài SameLadder 8/3/1 token, mỗi bậc 1 ngưỡng "same:k"; độ tin theo số token khớp trên dòng) rồi LineStart ("ma trận đầu dòng" Lines: khoá = ≤6 token đầu dòng, alias → {1}..; rút từ cách viết có ở ≥2 store). Ô lọc / routine đã có mà chưa đủ chắc → Declined (không rơi xuống gợi ý chung). Miner: EvaluateAnyLine chấm giữa dòng bất kỳ; same/line hiệu chỉnh 1 lần (line chỉ trên chỗ same không gợi ý). Ma trận đi kèm: ô đầu dòng chỉ giữ cách viết có ở ≥20 store, mọi tên phải có ở ≥3 file mẫu Templates/fileSource (không tính file z…). SuggestLong = chế độ "Gợi ý Fast dài" (DECLARE biến chưa gặp → decl:near = kiểu biến khai báo gần nhất phía trên, chỉ ở chế độ dài; mặc định, AppSettings.FastGhostLong; SuggestByMode: dài = SuggestLong ?? Suggest, ngắn = Suggest ≥90%; không qua ngưỡng: cả dòng theo chính file nếu ≥60% chỗ khớp cùng viết, hoặc phần chung). editor.fastLong (Alt+Shift+\) / Tùy chọn → Gợi ý Fast dài = đổi dài ⇄ ngắn (sqleditor.html gửi fast-ghost-mode → ToggleFastGhostLong, rồi gợi ý lại với cờ long = gọi tay). Tắt/bật: Tùy chọn → Gợi ý theo cấu trúc Fast khi gõ.</w:t>
+              <w:t>Chạy trước AI, chỉ khi con trỏ cuối dòng ngoài chuỗi/comment. Luật cố định: CREATE TABLE zdm…( → cột danh mục chuẩn; tên cột trong CREATE/ALTER ADD/DECLARE → kiểu hay dùng nhất trong DB (LoadColumnTypes); CASE WHEN @Language song ngữ; SET NOCOUNT/ANSI_NULLS; @UnitKey; REPLACE(RTRIM(@x), ; DROP TABLE #t. Ma trận: loại (call/func/filter) × khoá (routine hoặc routine|ngữ cảnh = ký hiệu/từ khoá đứng trước) → vài cách viết + số lần; chỗ trống {lhs}/{if}/{a}; dòng lọc lưu dạng chuẩn rồi đổi theo dòng lọc gần nhất; bỏ cách dùng biến chưa khai báo; độ tin = số lần/(tổng còn lại + đuôi + 1); chưa đủ ngưỡng thì gợi ý phần đầu chung (cắt ở khoảng trắng/dấu phẩy/ngoặc). Ngưỡng từng loại hiệu chỉnh trên nửa store không dùng để rút (mục tiêu 90%). Ma trận đi kèm chỉ giữ routine chuẩn Fast (repo công khai); ma trận học từ DB ghi %AppData%\Bcode\ghost\&lt;dự án&gt;_app|sys.json. DECLARE @x → kiểu (DeclTypeRx, chỉ kiểu SQL thật): biến cùng tên đã khai báo trong file → ma trận Decls (ngưỡng "decl") → không đoán. Gợi ý chung khi luật trên không khớp (Explain → GenericSplit lấy cả phần trước con trỏ lẫn sau dòng đang gõ): SameCandidates/SameFile ("theo chính file": cả phần đã gõ của dòng khớp đoạn token phía trên HOẶC phía dưới, bỏ dấu phẩy đầu dòng; bậc độ dài SameLadder 8/3/1 token, mỗi bậc 1 ngưỡng "same:k"; độ tin theo số token khớp trên dòng) rồi LineStart ("ma trận đầu dòng" Lines: khoá = ≤6 token đầu dòng, alias → {1}..; rút từ cách viết có ở ≥2 store). Ô lọc / routine đã có mà chưa đủ chắc → Declined (không rơi xuống gợi ý chung). Miner: EvaluateAnyLine chấm giữa dòng bất kỳ; same/line hiệu chỉnh 1 lần (line chỉ trên chỗ same không gợi ý). Ma trận đi kèm: ô đầu dòng chỉ giữ cách viết có ở ≥20 store, mọi tên phải có ở ≥3 file mẫu Templates/fileSource (không tính file z…). SuggestLong = chế độ "Gợi ý Fast dài" (dòng trống → NextLine: ma trận Nexts khoá = đầu dòng code trên [| đầu dòng trên nữa], ngưỡng "next" (ngắn) / "next:long" (dài, ≥ LongTarget 60%), EvaluateNext đo; IF @x &lt;&gt;  tham số chưa gặp → ComposeCandidates / ComposeOrder = file (dòng lọc gần nhất làm khuôn, đo ~80%; same/role/std đo &lt; 20% nên tắt), EvaluateCompose; DECLARE biến chưa gặp → decl:near = kiểu biến khai báo gần nhất phía trên, chỉ ở chế độ dài; mặc định, AppSettings.FastGhostLong; SuggestByMode: dài = SuggestLong ?? Suggest, ngắn = Suggest ≥90%; không qua ngưỡng: cả dòng theo chính file nếu ≥60% chỗ khớp cùng viết, hoặc phần chung). editor.fastLong (Alt+Shift+\) / Tùy chọn → Gợi ý Fast dài = đổi dài ⇄ ngắn (sqleditor.html gửi fast-ghost-mode → ToggleFastGhostLong, rồi gợi ý lại với cờ long = gọi tay). Tắt/bật: Tùy chọn → Gợi ý theo cấu trúc Fast khi gõ.</w:t>
             </w:r>
           </w:p>
         </w:tc>

</xml_diff>

<commit_message>
bcode| fix ux ui thanh search, bổ sung options search ngay hoặc ấn enter, fix thỉnh thoảng gõ ko được project, fix 1 số máy ko lọc ra được file f, cải tiến thuật toán gợi ý của Bcode
</commit_message>
<xml_diff>
--- a/Cấu trúc Bcode  BcodeViewer (v3 - Tóm tắt).docx
+++ b/Cấu trúc Bcode  BcodeViewer (v3 - Tóm tắt).docx
@@ -2038,7 +2038,7 @@
           <w:rFonts w:ascii="Consolas" w:hAnsi="Consolas" w:eastAsia="Consolas"/>
           <w:sz w:val="13"/>
         </w:rPr>
-        <w:t>│   ├── AdvanceNoteControl.cs  546</w:t>
+        <w:t>│   ├── AdvanceNoteControl.cs  568</w:t>
       </w:r>
     </w:p>
     <w:p>
@@ -2158,7 +2158,7 @@
           <w:rFonts w:ascii="Consolas" w:hAnsi="Consolas" w:eastAsia="Consolas"/>
           <w:sz w:val="13"/>
         </w:rPr>
-        <w:t>│   ├── FileLookupControl.cs  1387</w:t>
+        <w:t>│   ├── FileLookupControl.cs  1412</w:t>
       </w:r>
     </w:p>
     <w:p>
@@ -2230,7 +2230,7 @@
           <w:rFonts w:ascii="Consolas" w:hAnsi="Consolas" w:eastAsia="Consolas"/>
           <w:sz w:val="13"/>
         </w:rPr>
-        <w:t>│   ├── GenUpdatePackageControl.cs  452</w:t>
+        <w:t>│   ├── GenUpdatePackageControl.cs  471</w:t>
       </w:r>
     </w:p>
     <w:p>
@@ -2374,7 +2374,7 @@
           <w:rFonts w:ascii="Consolas" w:hAnsi="Consolas" w:eastAsia="Consolas"/>
           <w:sz w:val="13"/>
         </w:rPr>
-        <w:t>│   ├── NativeAdvanceNoteControl.cs  1128</w:t>
+        <w:t>│   ├── NativeAdvanceNoteControl.cs  1174</w:t>
       </w:r>
     </w:p>
     <w:p>
@@ -2650,7 +2650,7 @@
           <w:rFonts w:ascii="Consolas" w:hAnsi="Consolas" w:eastAsia="Consolas"/>
           <w:sz w:val="13"/>
         </w:rPr>
-        <w:t>│   ├── NativePages.FileLookup.cs  170</w:t>
+        <w:t>│   ├── NativePages.FileLookup.cs  177</w:t>
       </w:r>
     </w:p>
     <w:p>
@@ -2674,7 +2674,7 @@
           <w:rFonts w:ascii="Consolas" w:hAnsi="Consolas" w:eastAsia="Consolas"/>
           <w:sz w:val="13"/>
         </w:rPr>
-        <w:t>│   ├── NativePages.GenUpdate.cs  355</w:t>
+        <w:t>│   ├── NativePages.GenUpdate.cs  385</w:t>
       </w:r>
     </w:p>
     <w:p>
@@ -3262,7 +3262,7 @@
           <w:rFonts w:ascii="Consolas" w:hAnsi="Consolas" w:eastAsia="Consolas"/>
           <w:sz w:val="13"/>
         </w:rPr>
-        <w:t>│   ├── WebBarHost.cs  209</w:t>
+        <w:t>│   ├── WebBarHost.cs  212</w:t>
       </w:r>
     </w:p>
     <w:p>
@@ -3682,7 +3682,7 @@
           <w:rFonts w:ascii="Consolas" w:hAnsi="Consolas" w:eastAsia="Consolas"/>
           <w:sz w:val="13"/>
         </w:rPr>
-        <w:t>│   ├── MainForm.cs  3943</w:t>
+        <w:t>│   ├── MainForm.cs  3945</w:t>
       </w:r>
     </w:p>
     <w:p>
@@ -3778,7 +3778,7 @@
           <w:rFonts w:ascii="Consolas" w:hAnsi="Consolas" w:eastAsia="Consolas"/>
           <w:sz w:val="13"/>
         </w:rPr>
-        <w:t>│   ├── ProjectPickerForm.cs  108</w:t>
+        <w:t>│   ├── ProjectPickerForm.cs  131</w:t>
       </w:r>
     </w:p>
     <w:p>
@@ -4006,7 +4006,7 @@
           <w:rFonts w:ascii="Consolas" w:hAnsi="Consolas" w:eastAsia="Consolas"/>
           <w:sz w:val="13"/>
         </w:rPr>
-        <w:t>│   ├── UiTemplateForm.cs  683</w:t>
+        <w:t>│   ├── UiTemplateForm.cs  718</w:t>
       </w:r>
     </w:p>
     <w:p>
@@ -4102,7 +4102,7 @@
           <w:rFonts w:ascii="Consolas" w:hAnsi="Consolas" w:eastAsia="Consolas"/>
           <w:sz w:val="13"/>
         </w:rPr>
-        <w:t>│   ├── AppSettings.cs  335</w:t>
+        <w:t>│   ├── AppSettings.cs  350</w:t>
       </w:r>
     </w:p>
     <w:p>
@@ -4906,19 +4906,31 @@
           <w:rFonts w:ascii="Consolas" w:hAnsi="Consolas" w:eastAsia="Consolas"/>
           <w:sz w:val="13"/>
         </w:rPr>
-        <w:t>│   ├── FastAskKnowledge.cs  306</w:t>
-      </w:r>
-    </w:p>
-    <w:p>
-      <w:pPr>
-        <w:spacing w:after="0" w:before="0" w:line="240" w:lineRule="auto"/>
-      </w:pPr>
-      <w:r>
-        <w:rPr>
-          <w:rFonts w:ascii="Consolas" w:hAnsi="Consolas" w:eastAsia="Consolas"/>
-          <w:sz w:val="13"/>
-        </w:rPr>
-        <w:t>│   ├── FastAskService.cs  1189</w:t>
+        <w:t>│   ├── FastAskIndex.cs  73</w:t>
+      </w:r>
+    </w:p>
+    <w:p>
+      <w:pPr>
+        <w:spacing w:after="0" w:before="0" w:line="240" w:lineRule="auto"/>
+      </w:pPr>
+      <w:r>
+        <w:rPr>
+          <w:rFonts w:ascii="Consolas" w:hAnsi="Consolas" w:eastAsia="Consolas"/>
+          <w:sz w:val="13"/>
+        </w:rPr>
+        <w:t>│   ├── FastAskKnowledge.cs  417</w:t>
+      </w:r>
+    </w:p>
+    <w:p>
+      <w:pPr>
+        <w:spacing w:after="0" w:before="0" w:line="240" w:lineRule="auto"/>
+      </w:pPr>
+      <w:r>
+        <w:rPr>
+          <w:rFonts w:ascii="Consolas" w:hAnsi="Consolas" w:eastAsia="Consolas"/>
+          <w:sz w:val="13"/>
+        </w:rPr>
+        <w:t>│   ├── FastAskService.cs  1385</w:t>
       </w:r>
     </w:p>
     <w:p>
@@ -4954,19 +4966,31 @@
           <w:rFonts w:ascii="Consolas" w:hAnsi="Consolas" w:eastAsia="Consolas"/>
           <w:sz w:val="13"/>
         </w:rPr>
-        <w:t>│   ├── FastGhostMiner.cs  518</w:t>
-      </w:r>
-    </w:p>
-    <w:p>
-      <w:pPr>
-        <w:spacing w:after="0" w:before="0" w:line="240" w:lineRule="auto"/>
-      </w:pPr>
-      <w:r>
-        <w:rPr>
-          <w:rFonts w:ascii="Consolas" w:hAnsi="Consolas" w:eastAsia="Consolas"/>
-          <w:sz w:val="13"/>
-        </w:rPr>
-        <w:t>│   ├── FastGhostRules.cs  1015</w:t>
+        <w:t>│   ├── FastGhostMiner.cs  583</w:t>
+      </w:r>
+    </w:p>
+    <w:p>
+      <w:pPr>
+        <w:spacing w:after="0" w:before="0" w:line="240" w:lineRule="auto"/>
+      </w:pPr>
+      <w:r>
+        <w:rPr>
+          <w:rFonts w:ascii="Consolas" w:hAnsi="Consolas" w:eastAsia="Consolas"/>
+          <w:sz w:val="13"/>
+        </w:rPr>
+        <w:t>│   ├── FastGhostRules.cs  1050</w:t>
+      </w:r>
+    </w:p>
+    <w:p>
+      <w:pPr>
+        <w:spacing w:after="0" w:before="0" w:line="240" w:lineRule="auto"/>
+      </w:pPr>
+      <w:r>
+        <w:rPr>
+          <w:rFonts w:ascii="Consolas" w:hAnsi="Consolas" w:eastAsia="Consolas"/>
+          <w:sz w:val="13"/>
+        </w:rPr>
+        <w:t>│   ├── FastTokenModel.cs  371</w:t>
       </w:r>
     </w:p>
     <w:p>
@@ -5002,7 +5026,7 @@
           <w:rFonts w:ascii="Consolas" w:hAnsi="Consolas" w:eastAsia="Consolas"/>
           <w:sz w:val="13"/>
         </w:rPr>
-        <w:t>│   ├── FileLookupService.cs  1293</w:t>
+        <w:t>│   ├── FileLookupService.cs  1359</w:t>
       </w:r>
     </w:p>
     <w:p>
@@ -5074,6 +5098,18 @@
           <w:rFonts w:ascii="Consolas" w:hAnsi="Consolas" w:eastAsia="Consolas"/>
           <w:sz w:val="13"/>
         </w:rPr>
+        <w:t>│   ├── GenAllService.Delivery.cs  109</w:t>
+      </w:r>
+    </w:p>
+    <w:p>
+      <w:pPr>
+        <w:spacing w:after="0" w:before="0" w:line="240" w:lineRule="auto"/>
+      </w:pPr>
+      <w:r>
+        <w:rPr>
+          <w:rFonts w:ascii="Consolas" w:hAnsi="Consolas" w:eastAsia="Consolas"/>
+          <w:sz w:val="13"/>
+        </w:rPr>
         <w:t>│   ├── GenAllService.Suggest.cs  241</w:t>
       </w:r>
     </w:p>
@@ -5710,7 +5746,7 @@
           <w:rFonts w:ascii="Consolas" w:hAnsi="Consolas" w:eastAsia="Consolas"/>
           <w:sz w:val="13"/>
         </w:rPr>
-        <w:t>├── Templates/  (3318 file — không liệt kê)</w:t>
+        <w:t>├── Templates/  (3319 file — không liệt kê)</w:t>
       </w:r>
     </w:p>
     <w:p>
@@ -6082,7 +6118,7 @@
           <w:rFonts w:ascii="Consolas" w:hAnsi="Consolas" w:eastAsia="Consolas"/>
           <w:sz w:val="13"/>
         </w:rPr>
-        <w:t>│       ├── advnote.html  780</w:t>
+        <w:t>│       ├── advnote.html  806</w:t>
       </w:r>
     </w:p>
     <w:p>
@@ -6406,7 +6442,7 @@
           <w:rFonts w:ascii="Consolas" w:hAnsi="Consolas" w:eastAsia="Consolas"/>
           <w:sz w:val="13"/>
         </w:rPr>
-        <w:t>│       ├── filelookupbar.html  171</w:t>
+        <w:t>│       ├── filelookupbar.html  195</w:t>
       </w:r>
     </w:p>
     <w:p>
@@ -6502,7 +6538,7 @@
           <w:rFonts w:ascii="Consolas" w:hAnsi="Consolas" w:eastAsia="Consolas"/>
           <w:sz w:val="13"/>
         </w:rPr>
-        <w:t>│       ├── genupdate.html  594</w:t>
+        <w:t>│       ├── genupdate.html  613</w:t>
       </w:r>
     </w:p>
     <w:p>
@@ -6634,7 +6670,7 @@
           <w:rFonts w:ascii="Consolas" w:hAnsi="Consolas" w:eastAsia="Consolas"/>
           <w:sz w:val="13"/>
         </w:rPr>
-        <w:t>│       ├── projects.html  100</w:t>
+        <w:t>│       ├── projects.html  107</w:t>
       </w:r>
     </w:p>
     <w:p>
@@ -6778,7 +6814,7 @@
           <w:rFonts w:ascii="Consolas" w:hAnsi="Consolas" w:eastAsia="Consolas"/>
           <w:sz w:val="13"/>
         </w:rPr>
-        <w:t>│       ├── searchbox.html  161</w:t>
+        <w:t>│       ├── searchbox.html  187</w:t>
       </w:r>
     </w:p>
     <w:p>
@@ -7030,7 +7066,7 @@
           <w:rFonts w:ascii="Consolas" w:hAnsi="Consolas" w:eastAsia="Consolas"/>
           <w:sz w:val="13"/>
         </w:rPr>
-        <w:t>│       ├── uitemplate.html  1099</w:t>
+        <w:t>│       ├── uitemplate.html  1127</w:t>
       </w:r>
     </w:p>
     <w:p>
@@ -8130,7 +8166,7 @@
           <w:rFonts w:ascii="Consolas" w:hAnsi="Consolas" w:eastAsia="Consolas"/>
           <w:sz w:val="13"/>
         </w:rPr>
-        <w:t>├── MainForm.cs  2715</w:t>
+        <w:t>├── MainForm.cs  2717</w:t>
       </w:r>
     </w:p>
     <w:p>
@@ -9880,7 +9916,7 @@
                 <w:b w:val="0"/>
                 <w:sz w:val="16"/>
               </w:rPr>
-              <w:t>Nguồn: SqlHintCatalog (snippet rsrepq/rspivot/tblcat/dynf/total…, Idioms, GroupNotes), ma trận ghost text (Find call/func/filter/decl), database đang kết nối chỉ đọc (sys.tables, sys.objects, sys.sql_modules — SearchModulesAsync, PartitionTablesAsync đếm xxx$%Partition), TableDataService.GetColumnDescriptionsAsync (cấu trúc + JOIN theo khoá), FieldDictionaryService (header.xml), luật danh mục (nút mở QuickList StartRules), Topics = quy ước Fast. Báo cáo: chọn nhiều bảng phân kỳ (khối SET @q … Partition$Execute lặp cho từng bảng, cột = giao các bảng); Save as (SaveAsFlowAsync: OBJECT_DEFINITION chỉ đọc, đổi tên ở dòng CREATE/ALTER, nút Save as… trên thẻ store); rsrepq/rspivot + tham số lọc (kiểu theo ma trận decl) + dòng lọc (ma trận filter → FastGhostRules.FilterLine) + cột thật của bảng$000000 (tổng hợp SUM cột số). Trạng thái hội thoại do trang giữ (state). Học dự án (LearnProjectAsync): FastAskKnowledge.Mine (JOIN + ON giải alias, cột #report theo bảng phân kỳ, cột ngày Partition$Execute, tham số rs_) → fastask/projects/*.json, MergeShared → fastask/shared.json; FastGhostMiner.LearnFromModules + MergeShared → ghost/_shared.json. KnowledgeFor tra: lớp sửa của người dùng (✘ + gõ cách đúng, FastAskFeedback Prefer) → ma trận dự án → _shared → ma trận đi kèm. ✔/✘: AskCard.Ref (m|loại|khoá|cách viết, answer|…, store|…), AskReply.Sig; ApplyFeedback bỏ thẻ bị ✘, đưa thẻ ✔ lên đầu, chèn Câu trả lời bạn đã sửa; nút ✔ Đúng / ✘ Chưa đúng nằm ở hàng nút cuối thẻ (.votes). Dừng luồng: IsStop (bỏ qua / thôi / hủy / quit…) hoặc nút ✕ Dừng (state.flow). Đổi tên tab SQL Query sau khi chạy: MainForm.RenameTabByScript (ScriptExecuted, CREATE/ALTER PROC|FUNCTION|VIEW|TRIGGER ngoài comment → schema.tên). Lịch sử phiên: FastAskSessions (fastask/sessions/*.json). Nhúng vào tab SQL Query (ISqlTab.ShowFastAsk / FastAskRequested, MainForm.EmbedFastAsk) khi bật AiEmbedded. Nút thẻ: insert / newtab / copy / open-object (Arg2 app|P) / quicklist; ✎ Sửa → action correct → FastAskService.Correct (✘ + SaveCorrection). Bảng: ResolveTables (tên đúng → tên gốc bảng phân kỳ → tiếng Việt qua lookup header.xml → dm+tên), DescribeTableAsync (MS_Description, dmct.m_phdbf/m_ctdbf, field tra cứu, quy ước tên, store dùng bảng). Danh mục: CatalogFlowAsync + CatalogColumns (cột người dùng nhập; bảng đã có → ALTER TABLE ADD). Save as: RecentReportsAsync (rs_/zrs_ sửa gần đây), gõ 1 phần tên → chọn. Quy ước có mẫu (TopicCards(t, f)): câu nêu rõ đối tượng → chỉ mẫu có nhiều từ khớp nhất / ít từ thừa nhất (số dư vụ việc → baljob), "cuối kỳ" đổi @DateFrom → @DateTo, BalanceType 1 → 2.</w:t>
+              <w:t>Nguồn: SqlHintCatalog (snippet rsrepq/rspivot/tblcat/dynf/total…, Idioms, GroupNotes), ma trận ghost text (Find call/func/filter/decl), database đang kết nối chỉ đọc (sys.tables, sys.objects, sys.sql_modules — SearchModulesAsync, PartitionTablesAsync đếm xxx$%Partition), TableDataService.GetColumnDescriptionsAsync (cấu trúc + JOIN theo khoá), FieldDictionaryService (header.xml), luật danh mục (nút mở QuickList StartRules), Topics = quy ước Fast. Báo cáo: chọn nhiều bảng phân kỳ (khối SET @q … Partition$Execute lặp cho từng bảng, cột = giao các bảng); Save as (SaveAsFlowAsync: OBJECT_DEFINITION chỉ đọc, đổi tên ở dòng CREATE/ALTER, nút Save as… trên thẻ store); rsrepq/rspivot + tham số lọc (kiểu theo ma trận decl) + dòng lọc (ma trận filter → FastGhostRules.FilterLine) + cột thật của bảng$000000 (tổng hợp SUM cột số). Trạng thái hội thoại do trang giữ (state). Học dự án (LearnProjectAsync): FastAskKnowledge.Mine (JOIN + ON giải alias, cột #report theo bảng phân kỳ, cột ngày Partition$Execute, tham số rs_) → fastask/projects/*.json, MergeShared → fastask/shared.json; FastGhostMiner.LearnFromModules + MergeShared → ghost/_shared.json. KnowledgeFor tra: lớp sửa của người dùng (✘ + gõ cách đúng, FastAskFeedback Prefer) → ma trận dự án → _shared → ma trận đi kèm. ✔/✘: AskCard.Ref (m|loại|khoá|cách viết, answer|…, store|…), AskReply.Sig; ApplyFeedback bỏ thẻ bị ✘, đưa thẻ ✔ lên đầu, chèn Câu trả lời bạn đã sửa; nút ✔ Đúng / ✘ Chưa đúng nằm ở hàng nút cuối thẻ (.votes). Dừng luồng: IsStop (bỏ qua / thôi / hủy / quit…) hoặc nút ✕ Dừng (state.flow). Đổi tên tab SQL Query sau khi chạy: MainForm.RenameTabByScript (ScriptExecuted, CREATE/ALTER PROC|FUNCTION|VIEW|TRIGGER ngoài comment → schema.tên). Lịch sử phiên: FastAskSessions (fastask/sessions/*.json). Nhúng vào tab SQL Query (ISqlTab.ShowFastAsk / FastAskRequested, MainForm.EmbedFastAsk) khi bật AiEmbedded. Tìm chung: Services/FastAskIndex.cs (BM25, từ khoá không dấu + tách chữ hoa + cặp 2 từ; tài liệu report = store rs_&lt;controller&gt; mang tiêu đề menu Sys wcommand, menu, store, snippet, topic, table (tiêu đề field tra cứu + dmct), field), FastAskService.IndexAsync / IndexCard / SearchAllAsync / FieldReplyAsync / SimilarReportsAsync; chỉ câu có động từ tạo mới vào luồng tạo báo cáo / danh mục / store; DistillAsync = thẻ tóm tắt store; TableUsersAsync = store dùng bảng; bộ câu hỏi chuẩn ASK_GOLD (113 câu) đo top-1 24,8% → 85,8%. Nút thẻ: insert / newtab / copy / open-object (Arg2 app|P) / quicklist; ✎ Sửa → action correct → FastAskService.Correct (✘ + SaveCorrection). Bảng: ResolveTables (tên đúng → tên gốc bảng phân kỳ → tiếng Việt qua lookup header.xml → dm+tên), DescribeTableAsync (MS_Description, dmct.m_phdbf/m_ctdbf, field tra cứu, quy ước tên, store dùng bảng). Danh mục: CatalogFlowAsync + CatalogColumns (cột người dùng nhập; bảng đã có → ALTER TABLE ADD). Save as: RecentReportsAsync (rs_/zrs_ sửa gần đây), gõ 1 phần tên → chọn. Quy ước có mẫu (TopicCards(t, f)): câu nêu rõ đối tượng → chỉ mẫu có nhiều từ khớp nhất / ít từ thừa nhất (số dư vụ việc → baljob), "cuối kỳ" đổi @DateFrom → @DateTo, BalanceType 1 → 2.</w:t>
             </w:r>
           </w:p>
         </w:tc>
@@ -9936,7 +9972,7 @@
                 <w:b w:val="0"/>
                 <w:sz w:val="16"/>
               </w:rPr>
-              <w:t>Chạy trước AI, chỉ khi con trỏ cuối dòng ngoài chuỗi/comment. Luật cố định: CREATE TABLE zdm…( → cột danh mục chuẩn; tên cột trong CREATE/ALTER ADD/DECLARE → kiểu hay dùng nhất trong DB (LoadColumnTypes); CASE WHEN @Language song ngữ; SET NOCOUNT/ANSI_NULLS; @UnitKey; REPLACE(RTRIM(@x), ; DROP TABLE #t. Ma trận: loại (call/func/filter) × khoá (routine hoặc routine|ngữ cảnh = ký hiệu/từ khoá đứng trước) → vài cách viết + số lần; chỗ trống {lhs}/{if}/{a}; dòng lọc lưu dạng chuẩn rồi đổi theo dòng lọc gần nhất; bỏ cách dùng biến chưa khai báo; độ tin = số lần/(tổng còn lại + đuôi + 1); chưa đủ ngưỡng thì gợi ý phần đầu chung (cắt ở khoảng trắng/dấu phẩy/ngoặc). Ngưỡng từng loại hiệu chỉnh trên nửa store không dùng để rút (mục tiêu 90%). Ma trận đi kèm chỉ giữ routine chuẩn Fast (repo công khai); ma trận học từ DB ghi %AppData%\Bcode\ghost\&lt;dự án&gt;_app|sys.json. DECLARE @x → kiểu (DeclTypeRx, chỉ kiểu SQL thật): biến cùng tên đã khai báo trong file → ma trận Decls (ngưỡng "decl") → không đoán. Gợi ý chung khi luật trên không khớp (Explain → GenericSplit lấy cả phần trước con trỏ lẫn sau dòng đang gõ): SameCandidates/SameFile ("theo chính file": cả phần đã gõ của dòng khớp đoạn token phía trên HOẶC phía dưới, bỏ dấu phẩy đầu dòng; bậc độ dài SameLadder 8/3/1 token, mỗi bậc 1 ngưỡng "same:k"; độ tin theo số token khớp trên dòng) rồi LineStart ("ma trận đầu dòng" Lines: khoá = ≤6 token đầu dòng, alias → {1}..; rút từ cách viết có ở ≥2 store). Ô lọc / routine đã có mà chưa đủ chắc → Declined (không rơi xuống gợi ý chung). Miner: EvaluateAnyLine chấm giữa dòng bất kỳ; same/line hiệu chỉnh 1 lần (line chỉ trên chỗ same không gợi ý). Ma trận đi kèm: ô đầu dòng chỉ giữ cách viết có ở ≥20 store, mọi tên phải có ở ≥3 file mẫu Templates/fileSource (không tính file z…). SuggestLong = chế độ "Gợi ý Fast dài" (dòng trống → NextLine: ma trận Nexts khoá = đầu dòng code trên [| đầu dòng trên nữa], ngưỡng "next" (ngắn) / "next:long" (dài, ≥ LongTarget 60%), EvaluateNext đo; IF @x &lt;&gt;  tham số chưa gặp → ComposeCandidates / ComposeOrder = file (dòng lọc gần nhất làm khuôn, đo ~80%; same/role/std đo &lt; 20% nên tắt), EvaluateCompose; DECLARE biến chưa gặp → decl:near = kiểu biến khai báo gần nhất phía trên, chỉ ở chế độ dài; mặc định, AppSettings.FastGhostLong; SuggestByMode: dài = SuggestLong ?? Suggest, ngắn = Suggest ≥90%; không qua ngưỡng: cả dòng theo chính file nếu ≥60% chỗ khớp cùng viết, hoặc phần chung). editor.fastLong (Alt+Shift+\) / Tùy chọn → Gợi ý Fast dài = đổi dài ⇄ ngắn (sqleditor.html gửi fast-ghost-mode → ToggleFastGhostLong, rồi gợi ý lại với cờ long = gọi tay). Tắt/bật: Tùy chọn → Gợi ý theo cấu trúc Fast khi gõ.</w:t>
+              <w:t>Chạy trước AI, chỉ khi con trỏ cuối dòng ngoài chuỗi/comment. Luật cố định: CREATE TABLE zdm…( → cột danh mục chuẩn; tên cột trong CREATE/ALTER ADD/DECLARE → kiểu hay dùng nhất trong DB (LoadColumnTypes); CASE WHEN @Language song ngữ; SET NOCOUNT/ANSI_NULLS; @UnitKey; REPLACE(RTRIM(@x), ; DROP TABLE #t. Ma trận: loại (call/func/filter) × khoá (routine hoặc routine|ngữ cảnh = ký hiệu/từ khoá đứng trước) → vài cách viết + số lần; chỗ trống {lhs}/{if}/{a}; dòng lọc lưu dạng chuẩn rồi đổi theo dòng lọc gần nhất; bỏ cách dùng biến chưa khai báo; độ tin = số lần/(tổng còn lại + đuôi + 1); chưa đủ ngưỡng thì gợi ý phần đầu chung (cắt ở khoảng trắng/dấu phẩy/ngoặc). Ngưỡng từng loại hiệu chỉnh trên nửa store không dùng để rút (mục tiêu 90%). Ma trận đi kèm chỉ giữ routine chuẩn Fast (repo công khai); ma trận học từ DB ghi %AppData%\Bcode\ghost\&lt;dự án&gt;_app|sys.json. DECLARE @x → kiểu (DeclTypeRx, chỉ kiểu SQL thật): biến cùng tên đã khai báo trong file → ma trận Decls (ngưỡng "decl") → không đoán. Gợi ý chung khi luật trên không khớp (Explain → GenericSplit lấy cả phần trước con trỏ lẫn sau dòng đang gõ): SameCandidates/SameFile ("theo chính file": cả phần đã gõ của dòng khớp đoạn token phía trên HOẶC phía dưới, bỏ dấu phẩy đầu dòng; bậc độ dài SameLadder 8/3/1 token, mỗi bậc 1 ngưỡng "same:k"; độ tin theo số token khớp trên dòng) rồi LineStart ("ma trận đầu dòng" Lines: khoá = ≤6 token đầu dòng, alias → {1}..; rút từ cách viết có ở ≥2 store). Ô lọc / routine đã có mà chưa đủ chắc → Declined (không rơi xuống gợi ý chung). Miner: EvaluateAnyLine chấm giữa dòng bất kỳ; same/line hiệu chỉnh 1 lần (line chỉ trên chỗ same không gợi ý). Ma trận đi kèm: ô đầu dòng chỉ giữ cách viết có ở ≥20 store, mọi tên phải có ở ≥3 file mẫu Templates/fileSource (không tính file z…). SuggestLong = chế độ "Gợi ý Fast dài" (ma trận token = Services/FastTokenModel.cs TokenModel: Lex chuẩn hoá token (chữ thường, chuỗi dài → 1 token chung, xuống dòng ⏎), Train đếm n-gram ngữ cảnh 1–4 token (băm 64 bit), P nội suy absolute discounting D=0.75, LocalOf = n-gram của file đang sửa trộn λ = n/(n+β), β=8 (G3, UseLocal; LocalOff tắt riêng luồng học), Decode greedy kéo dài tới ⏎ / độ chắc dồn &lt; ngưỡng, bỏ biến chưa khai báo; ghi riêng &lt;tên&gt;.json.tok gọn (Filter ≥3), Merge cho _shared; EvaluateTok/CalibrateTok ngưỡng "tok" (ngắn, 0.80) / "tok:long" (0.30); Explain gộp same/line/tok lấy gợi ý dài nhất qua ngưỡng; KnowledgePaths (FastAskKnowledge.cs) = thư mục kiến thức dùng chung AppSettings.KnowledgeDir, Template → Đường dẫn (UiTemplateForm paths-set knowledge), WriteAtomic, feedback đọc lại + gộp khi ghi, sessions luôn ở máy; dòng trống → NextLine: ma trận Nexts khoá = đầu dòng code trên [| đầu dòng trên nữa], ngưỡng "next" (ngắn) / "next:long" (dài, ≥ LongTarget 60%), EvaluateNext đo; IF @x &lt;&gt;  tham số chưa gặp → ComposeCandidates / ComposeOrder = file (dòng lọc gần nhất làm khuôn, đo ~80%; same/role/std đo &lt; 20% nên tắt), EvaluateCompose; DECLARE biến chưa gặp → decl:near = kiểu biến khai báo gần nhất phía trên, chỉ ở chế độ dài; mặc định, AppSettings.FastGhostLong; SuggestByMode: dài = SuggestLong ?? Suggest, ngắn = Suggest ≥90%; không qua ngưỡng: cả dòng theo chính file nếu ≥60% chỗ khớp cùng viết, hoặc phần chung). editor.fastLong (Alt+Shift+\) / Tùy chọn → Gợi ý Fast dài = đổi dài ⇄ ngắn (sqleditor.html gửi fast-ghost-mode → ToggleFastGhostLong, rồi gợi ý lại với cờ long = gọi tay). Tắt/bật: Tùy chọn → Gợi ý theo cấu trúc Fast khi gõ.</w:t>
             </w:r>
           </w:p>
         </w:tc>
@@ -10699,7 +10735,7 @@
                 <w:b w:val="0"/>
                 <w:sz w:val="16"/>
               </w:rPr>
-              <w:t>Cây file theo menu (dò như FCode — đối chiếu menu SVTran của VPMILK: include đọc như trình đọc XML qua DtdIncludeResolver — chỉ entity được gọi %X;/&amp;X;, mọi đuôi file, bỏ khối &lt;![%X;[ IGNORE; controller="&amp;X;..." và showForm(]]&gt;&amp;X;&lt;![CDATA[...) trong chính file thì thay entity; thư mục Lookup = controller đuôi "Lookup" / @$relType = "Lookup" (ExtractLookupControllerNames, cache "lkp"); thư mục Report: form in khai controller="X" mang tên controller của menu → Report\X (GLTran → GLTranReport; ExtractReportFormControllers, cache "rptctl" — controller="SVTran" trong AITran.xml thì không lấy), include SYSTEM nằm trong thư mục Report và mang tên controller (Report\Include\GLTranReportBI.xml, GLTranReportSql.txt; BaseCurrency/Separate dùng chung thì không), reportFile ghép entity ("GLTranReport_01&amp;Conditional.GLTranReport.ApprovedBy;" → GLTranReport_01 + GLTranReport_01_a); bảng sysrelative của DB Sys KHÔNG phải nguồn FCode dùng; đổi luật dò thì tăng FileParseCache.SchemaVersion), cache theo dự án (%AppData%\Bcode\FileLookupCache), tô đỏ entity thiếu, tìm nội dung, Edit in BcodeViewer (Process.Start). Ô Search (lọc tên, debounce 200 ms, Enter = lọc ngay; App: FileLookupBarPage): gõ chữ = tìm cả thư mục Path, đang ở cây menu thì nhớ _menuBeforeSearch → xoá trắng quay lại cây menu đó; gõ đúng tên trang .aspx (arcthd1.aspx) = TryShowMenuForPage → MainForm.MenuForLookupPage (menu lá cây WCommand có Link trỏ trang đó, ưu tiên có sysid) → ShowForMenuItem y như bấm menu, thanh trạng thái ghi tên menu; không có menu thì lọc tên như cũ. Cấp source nhanh (FileLookupControl.QuickGrant.cs): chọn file .f Dir/Grid/Filter → dòng 2 thanh xem trước (filelookuppreview.html window.setSource; App: FileLookupPreviewBarPage) hiện phiên bản + thư mục kho (SourceGrantService.ResolveNearestLower: phiên bản dự án, không có thì phiên bản thấp hơn gần nhất cùng 3 chữ đầu; DetectVersion: nhiều phiên bản cùng số thì ưu tiên cùng 3 chữ đầu rồi 2 chữ đầu — FBISP24 → FBOR2SP24, không lấy TT24 của kho FAP), bấm nhãn = SourceViewForm, nút Cấp source = hỏi xác nhận rồi CopyRows; danh sách phiên bản cache 5 phút. Search Box (tìm nội dung) theo luật ở Template → tab "Tìm file" (uitemplate.html #tabSearch ↔ UiTemplateForm search-get/set/default ↔ AppSettings.Search*; FileLookupService.SetSearchRules / SearchRuleSet): File Type *.* chỉ quét "Đuôi file được tìm" (SearchIncludeExtensions, mặc định .xml .f .txt .js .sql .ent .xsd .css .config .json .html; trống = mọi đuôi), trừ "Đuôi luôn bỏ qua" và "nhị phân"; gõ rõ đuôi (*.cs) thì không xét danh sách; thư mục quét trong Controllers, bỏ .f đã biên dịch ở Dir/Filter/Grid, bỏ file &gt; N MB. Đổi tên file (FileLookupControl.Rename.cs): F2 (phím fileLookup.rename, phạm vi Tree) / chuột phải Rename... = sửa nhãn tại chỗ (LabelEdit chỉ bật lúc đổi tên, BeforeLabelEdit chặn node khác; ô sửa mất focus ngay lúc vừa mở — khung xem trước đang nạp — thì mở lại 1 lần) → File.Move; không gõ đuôi = giữ đuôi, đổi đuôi hỏi Yes/No/Cancel, trùng tên / ký tự sai mở lại ô sửa, file khoá báo rõ; cặp cùng tên khác đuôi cùng thư mục hỏi (mặc định Không). FileLookupService.NotifyFileRenamed sửa chỉ mục file trong bộ nhớ + bản lưu file-index (thay bản FileIndex mới, không sửa list tại chỗ), FileParseCache.ForgetFile bỏ mục dính tên cũ (cả trên đĩa ở lần ghi kế), rồi event FileRenamed → mọi tab File Lookup sửa node + khung xem trước (không dựng lại cây). Sau đó tra nền chỗ còn nhắc tên cũ bằng SourceIndexService.FindLinesAsync (dòng include / controller= / SYSTEM / showForm...) — chỉ báo.</w:t>
+              <w:t>Cây file theo menu (dò như FCode — đối chiếu menu SVTran của VPMILK: include đọc như trình đọc XML qua DtdIncludeResolver — chỉ entity được gọi %X;/&amp;X;, mọi đuôi file, bỏ khối &lt;![%X;[ IGNORE; controller="&amp;X;..." và showForm(]]&gt;&amp;X;&lt;![CDATA[...) trong chính file thì thay entity; thư mục Lookup = controller đuôi "Lookup" / @$relType = "Lookup" (ExtractLookupControllerNames, cache "lkp"); thư mục Report: form in khai controller="X" mang tên controller của menu → Report\X (GLTran → GLTranReport; ExtractReportFormControllers, cache "rptctl" — controller="SVTran" trong AITran.xml thì không lấy), include SYSTEM nằm trong thư mục Report và mang tên controller (Report\Include\GLTranReportBI.xml, GLTranReportSql.txt; BaseCurrency/Separate dùng chung thì không), reportFile ghép entity ("GLTranReport_01&amp;Conditional.GLTranReport.ApprovedBy;" → GLTranReport_01 + GLTranReport_01_a); bảng sysrelative của DB Sys KHÔNG phải nguồn FCode dùng; đổi luật dò thì tăng FileParseCache.SchemaVersion), danh sách file lấy từ chỉ mục quét sẵn (bộ nhớ ≤ 2 phút / bản lưu %AppData%\Bcode\file-index) nên file tạo SAU lần quét (biên dịch Filter\X.xml → X.f bằng FCode / BcodeViewer) trước đây không hiện tới khi F5 — FindUnindexedSiblings dò thẳng ổ đĩa file cùng tên X.* trong thư mục đang có file của menu (tên thuộc sysIds / Lookup; lấy từ danh sách TRƯỚC khi lọc đuôi nên Gen Update / Only Show .f vẫn ra X.f), bỏ qua thư mục có giờ sửa y như lúc quét (FileIndex.DirTimes, ScanDirectory ghi; bản lưu trên đĩa không có → luôn dò), cache theo dự án (%AppData%\Bcode\FileLookupCache), tô đỏ entity thiếu, tìm nội dung, Edit in BcodeViewer (Process.Start). Ô Search (lọc tên, debounce 200 ms, Enter = lọc ngay; App: FileLookupBarPage; Template → Tìm file → "Ấn Enter mới tìm" = AppSettings.FileLookupSearchOnEnter: gõ không tìm, chỉ Enter — FileLookupService.SetSearchOnEnter/SearchModeChanged → FileLookupControl.PushSearchMode → window.setSearchOnEnter của thanh, tab đang mở đổi ngay): gõ chữ = tìm cả thư mục Path, đang ở cây menu thì nhớ _menuBeforeSearch → xoá trắng quay lại cây menu đó; gõ đúng tên trang .aspx (arcthd1.aspx) = TryShowMenuForPage → MainForm.MenuForLookupPage (menu lá cây WCommand có Link trỏ trang đó, ưu tiên có sysid) → ShowForMenuItem y như bấm menu, thanh trạng thái ghi tên menu; không có menu thì lọc tên như cũ. Cấp source nhanh (FileLookupControl.QuickGrant.cs): chọn file .f Dir/Grid/Filter → dòng 2 thanh xem trước (filelookuppreview.html window.setSource; App: FileLookupPreviewBarPage) hiện phiên bản + thư mục kho (SourceGrantService.ResolveNearestLower: phiên bản dự án, không có thì phiên bản thấp hơn gần nhất cùng 3 chữ đầu; DetectVersion: nhiều phiên bản cùng số thì ưu tiên cùng 3 chữ đầu rồi 2 chữ đầu — FBISP24 → FBOR2SP24, không lấy TT24 của kho FAP), bấm nhãn = SourceViewForm, nút Cấp source = hỏi xác nhận rồi CopyRows; danh sách phiên bản cache 5 phút. Search Box (tìm nội dung) theo luật ở Template → tab "Tìm file" (uitemplate.html #tabSearch ↔ UiTemplateForm search-get/set/default ↔ AppSettings.Search*; FileLookupService.SetSearchRules / SearchRuleSet): File Type *.* chỉ quét "Đuôi file được tìm" (SearchIncludeExtensions, mặc định .xml .f .txt .js .sql .ent .xsd .css .config .json .html; trống = mọi đuôi), trừ "Đuôi luôn bỏ qua" và "nhị phân"; gõ rõ đuôi (*.cs) thì không xét danh sách; thư mục quét trong Controllers, bỏ .f đã biên dịch ở Dir/Filter/Grid, bỏ file &gt; N MB (luật này chỉ cho Search Box, không đụng cây menu). filelookupbar.html / searchbox.html báo chiều cao nội dung (__height, px thiết bị gồm DPI + UiScale) → FileLookupControl.FitBarHeight đặt chiều cao thanh — trước đây cố định 150 / 158 px nên cột cây hẹp hoặc tỉ lệ giao diện &gt; 100% làm khung Search Box bị cây file che. Đổi tên file (FileLookupControl.Rename.cs): F2 (phím fileLookup.rename, phạm vi Tree) / chuột phải Rename... = sửa nhãn tại chỗ (LabelEdit chỉ bật lúc đổi tên, BeforeLabelEdit chặn node khác; ô sửa mất focus ngay lúc vừa mở — khung xem trước đang nạp — thì mở lại 1 lần) → File.Move; không gõ đuôi = giữ đuôi, đổi đuôi hỏi Yes/No/Cancel, trùng tên / ký tự sai mở lại ô sửa, file khoá báo rõ; cặp cùng tên khác đuôi cùng thư mục hỏi (mặc định Không). FileLookupService.NotifyFileRenamed sửa chỉ mục file trong bộ nhớ + bản lưu file-index (thay bản FileIndex mới, không sửa list tại chỗ), FileParseCache.ForgetFile bỏ mục dính tên cũ (cả trên đĩa ở lần ghi kế), rồi event FileRenamed → mọi tab File Lookup sửa node + khung xem trước (không dựng lại cây). Sau đó tra nền chỗ còn nhắc tên cũ bằng SourceIndexService.FindLinesAsync (dòng include / controller= / SYSTEM / showForm...) — chỉ báo.</w:t>
             </w:r>
           </w:p>
         </w:tc>
@@ -10867,7 +10903,7 @@
                 <w:b w:val="0"/>
                 <w:sz w:val="16"/>
               </w:rPr>
-              <w:t>Ctrl+Shift+G. Cấu trúc gói Script\app\APP_Script.sql | Script\sys\SYS_Script.sql + Web\... dùng chung với Advance Note (lúc tạo gói gọi GenAllService.CombineScripts + CreatePackage như Note (New)).Script procedure/function/view/trigger trong gói (Gen nhanh Store, Note (New)/Gen All) = SqlObjectBrowserService.GetDeployScriptAsync: IF EXISTS (sysobjects, xType, IsEncrypted = 0) DROP ... GO + CREATE gốc; table không bao giờ DROP; object mã hoá chỉ ra dòng nhắc.</w:t>
+              <w:t>Ctrl+Shift+G. Cấu trúc gói Script\app\APP_Script.sql | Script\sys\SYS_Script.sql + Web\... dùng chung với Advance Note (lúc tạo gói gọi GenAllService.CombineScripts + CreatePackage như Note (New)).Script procedure/function/view/trigger trong gói (Gen nhanh Store, Note (New)/Gen All) = SqlObjectBrowserService.GetDeployScriptAsync: IF EXISTS (sysobjects, xType, IsEncrypted = 0) DROP ... GO + CREATE gốc; table không bao giờ DROP; object mã hoá chỉ ra dòng nhắc. Tuỳ chọn gói (cả Note (New) Web/App và BcodeNote): Nén .zip / Gen vào đường dẫn mạng = GenAllService.DeliverPackageAsync (Services/GenAllService.Delivery.cs) chạy SAU CreatePackage — zip = &lt;Folder Name&gt;.zip cạnh thư mục gói; mạng = chép vào AppSettings.PackageNetworkRoot (mặc định \\172.168.5.14\Send\)\&lt;MachineName&gt;\ (tạo nếu chưa có; có zip thì chép .zip, không thì cả thư mục); thử thư mục mạng tối đa 15 s; lỗi chỉ ghi vào Errors (trang hiện đỏ), gói ở Save At Path giữ nguyên. Trang gửi zip/net/netRoot kèm create/generate và action pkgOpts khi đổi → GenAllService.SavePackageOptions (AppSettings.Update; PackageZip / PackageToNetwork / PackageNetworkRoot).</w:t>
             </w:r>
           </w:p>
         </w:tc>

</xml_diff>

<commit_message>
bcode| fix ko gen zip ở customer update mà chỉ gen khi tick đường dẫn
</commit_message>
<xml_diff>
--- a/Cấu trúc Bcode  BcodeViewer (v3 - Tóm tắt).docx
+++ b/Cấu trúc Bcode  BcodeViewer (v3 - Tóm tắt).docx
@@ -2038,7 +2038,7 @@
           <w:rFonts w:ascii="Consolas" w:hAnsi="Consolas" w:eastAsia="Consolas"/>
           <w:sz w:val="13"/>
         </w:rPr>
-        <w:t>│   ├── AdvanceNoteControl.cs  568</w:t>
+        <w:t>│   ├── AdvanceNoteControl.cs  567</w:t>
       </w:r>
     </w:p>
     <w:p>
@@ -2230,7 +2230,7 @@
           <w:rFonts w:ascii="Consolas" w:hAnsi="Consolas" w:eastAsia="Consolas"/>
           <w:sz w:val="13"/>
         </w:rPr>
-        <w:t>│   ├── GenUpdatePackageControl.cs  471</w:t>
+        <w:t>│   ├── GenUpdatePackageControl.cs  470</w:t>
       </w:r>
     </w:p>
     <w:p>
@@ -2374,7 +2374,7 @@
           <w:rFonts w:ascii="Consolas" w:hAnsi="Consolas" w:eastAsia="Consolas"/>
           <w:sz w:val="13"/>
         </w:rPr>
-        <w:t>│   ├── NativeAdvanceNoteControl.cs  1174</w:t>
+        <w:t>│   ├── NativeAdvanceNoteControl.cs  1172</w:t>
       </w:r>
     </w:p>
     <w:p>
@@ -4102,7 +4102,7 @@
           <w:rFonts w:ascii="Consolas" w:hAnsi="Consolas" w:eastAsia="Consolas"/>
           <w:sz w:val="13"/>
         </w:rPr>
-        <w:t>│   ├── AppSettings.cs  350</w:t>
+        <w:t>│   ├── AppSettings.cs  351</w:t>
       </w:r>
     </w:p>
     <w:p>
@@ -5098,7 +5098,7 @@
           <w:rFonts w:ascii="Consolas" w:hAnsi="Consolas" w:eastAsia="Consolas"/>
           <w:sz w:val="13"/>
         </w:rPr>
-        <w:t>│   ├── GenAllService.Delivery.cs  109</w:t>
+        <w:t>│   ├── GenAllService.Delivery.cs  99</w:t>
       </w:r>
     </w:p>
     <w:p>
@@ -6118,7 +6118,7 @@
           <w:rFonts w:ascii="Consolas" w:hAnsi="Consolas" w:eastAsia="Consolas"/>
           <w:sz w:val="13"/>
         </w:rPr>
-        <w:t>│       ├── advnote.html  806</w:t>
+        <w:t>│       ├── advnote.html  805</w:t>
       </w:r>
     </w:p>
     <w:p>
@@ -6538,7 +6538,7 @@
           <w:rFonts w:ascii="Consolas" w:hAnsi="Consolas" w:eastAsia="Consolas"/>
           <w:sz w:val="13"/>
         </w:rPr>
-        <w:t>│       ├── genupdate.html  613</w:t>
+        <w:t>│       ├── genupdate.html  612</w:t>
       </w:r>
     </w:p>
     <w:p>
@@ -10903,7 +10903,7 @@
                 <w:b w:val="0"/>
                 <w:sz w:val="16"/>
               </w:rPr>
-              <w:t>Ctrl+Shift+G. Cấu trúc gói Script\app\APP_Script.sql | Script\sys\SYS_Script.sql + Web\... dùng chung với Advance Note (lúc tạo gói gọi GenAllService.CombineScripts + CreatePackage như Note (New)).Script procedure/function/view/trigger trong gói (Gen nhanh Store, Note (New)/Gen All) = SqlObjectBrowserService.GetDeployScriptAsync: IF EXISTS (sysobjects, xType, IsEncrypted = 0) DROP ... GO + CREATE gốc; table không bao giờ DROP; object mã hoá chỉ ra dòng nhắc. Tuỳ chọn gói (cả Note (New) Web/App và BcodeNote): Nén .zip / Gen vào đường dẫn mạng = GenAllService.DeliverPackageAsync (Services/GenAllService.Delivery.cs) chạy SAU CreatePackage — zip = &lt;Folder Name&gt;.zip cạnh thư mục gói; mạng = chép vào AppSettings.PackageNetworkRoot (mặc định \\172.168.5.14\Send\)\&lt;MachineName&gt;\ (tạo nếu chưa có; có zip thì chép .zip, không thì cả thư mục); thử thư mục mạng tối đa 15 s; lỗi chỉ ghi vào Errors (trang hiện đỏ), gói ở Save At Path giữ nguyên. Trang gửi zip/net/netRoot kèm create/generate và action pkgOpts khi đổi → GenAllService.SavePackageOptions (AppSettings.Update; PackageZip / PackageToNetwork / PackageNetworkRoot).</w:t>
+              <w:t>Ctrl+Shift+G. Cấu trúc gói Script\app\APP_Script.sql | Script\sys\SYS_Script.sql + Web\... dùng chung với Advance Note (lúc tạo gói gọi GenAllService.CombineScripts + CreatePackage như Note (New)).Script procedure/function/view/trigger trong gói (Gen nhanh Store, Note (New)/Gen All) = SqlObjectBrowserService.GetDeployScriptAsync: IF EXISTS (sysobjects, xType, IsEncrypted = 0) DROP ... GO + CREATE gốc; table không bao giờ DROP; object mã hoá chỉ ra dòng nhắc. Tuỳ chọn gói (cả Note (New) Web/App và BcodeNote): Gen vào đường dẫn mạng (+ Nén .zip, chỉ áp cho bản trên mạng) = GenAllService.DeliverPackageAsync (Services/GenAllService.Delivery.cs) chạy SAU CreatePackage — chép vào AppSettings.PackageNetworkRoot (mặc định \\172.168.5.14\Send\)\&lt;MachineName&gt;\ (tạo nếu chưa có); tick zip thì nén ở %TEMP%\Bcode\PackageZip rồi chỉ chép &lt;Folder Name&gt;.zip lên mạng (xoá file tạm), không thì chép cả thư mục; Save At Path luôn chỉ có thư mục gói; thử thư mục mạng tối đa 15 s; lỗi chỉ ghi vào Errors (trang hiện đỏ), gói ở Save At Path giữ nguyên. Trang gửi zip/net/netRoot kèm create/generate và action pkgOpts khi đổi → GenAllService.SavePackageOptions (AppSettings.Update; PackageZip / PackageToNetwork / PackageNetworkRoot).</w:t>
             </w:r>
           </w:p>
         </w:tc>

</xml_diff>

<commit_message>
bcode| bỏ tab command, bổ sung ctrl + shift + c copy column name 1 hay nhiều đều được ở table, result tab, bổ sung lọc tên column thì gán like hoặc = theo kiểu dữ liệu, cải tiến hỏi đáp
</commit_message>
<xml_diff>
--- a/Cấu trúc Bcode  BcodeViewer (v3 - Tóm tắt).docx
+++ b/Cấu trúc Bcode  BcodeViewer (v3 - Tóm tắt).docx
@@ -102,7 +102,7 @@
         <w:rPr>
           <w:sz w:val="20"/>
         </w:rPr>
-        <w:t>Bcode.App (Bcode.exe) — bộ công cụ quản trị/triển khai ERP, bản dựng lại của FCode: SQL Query/Table/Command, WCommand, File Lookup, Gen Update, Advance Note, API LT3, tạo báo cáo, check LCTT/CĐKT, biên bản Word... Gần như mọi màn hình là một trang HTML trong WebView2 (Web/Shell/*.html), C# chỉ giữ dữ liệu và nghiệp vụ. Có 2 chế độ giao diện chọn lúc mở (--web / --native): Web (WebView2) và App (WinForms tự vẽ — NativePage / NK.* / Native*Control thay trang HTML, cùng giao thức action nên nghiệp vụ dùng chung).</w:t>
+        <w:t>Bcode.App (Bcode.exe) — bộ công cụ quản trị/triển khai ERP, bản dựng lại của FCode: SQL Query/Table, WCommand, File Lookup, Gen Update, Advance Note, API LT3, tạo báo cáo, check LCTT/CĐKT, biên bản Word... Gần như mọi màn hình là một trang HTML trong WebView2 (Web/Shell/*.html), C# chỉ giữ dữ liệu và nghiệp vụ. Có 2 chế độ giao diện chọn lúc mở (--web / --native): Web (WebView2) và App (WinForms tự vẽ — NativePage / NK.* / Native*Control thay trang HTML, cùng giao thức action nên nghiệp vụ dùng chung).</w:t>
       </w:r>
     </w:p>
     <w:p>
@@ -2134,7 +2134,7 @@
           <w:rFonts w:ascii="Consolas" w:hAnsi="Consolas" w:eastAsia="Consolas"/>
           <w:sz w:val="13"/>
         </w:rPr>
-        <w:t>│   ├── FastAskControl.cs  121</w:t>
+        <w:t>│   ├── FastAskControl.cs  133</w:t>
       </w:r>
     </w:p>
     <w:p>
@@ -2362,7 +2362,7 @@
           <w:rFonts w:ascii="Consolas" w:hAnsi="Consolas" w:eastAsia="Consolas"/>
           <w:sz w:val="13"/>
         </w:rPr>
-        <w:t>│   ├── MultiResultView.cs  210</w:t>
+        <w:t>│   ├── MultiResultView.cs  211</w:t>
       </w:r>
     </w:p>
     <w:p>
@@ -2902,7 +2902,7 @@
           <w:rFonts w:ascii="Consolas" w:hAnsi="Consolas" w:eastAsia="Consolas"/>
           <w:sz w:val="13"/>
         </w:rPr>
-        <w:t>│   ├── NativeTableBar.cs  231</w:t>
+        <w:t>│   ├── NativeTableBar.cs  288</w:t>
       </w:r>
     </w:p>
     <w:p>
@@ -2998,7 +2998,7 @@
           <w:rFonts w:ascii="Consolas" w:hAnsi="Consolas" w:eastAsia="Consolas"/>
           <w:sz w:val="13"/>
         </w:rPr>
-        <w:t>│   ├── ResultGridMenu.cs  602</w:t>
+        <w:t>│   ├── ResultGridMenu.cs  615</w:t>
       </w:r>
     </w:p>
     <w:p>
@@ -3202,7 +3202,7 @@
           <w:rFonts w:ascii="Consolas" w:hAnsi="Consolas" w:eastAsia="Consolas"/>
           <w:sz w:val="13"/>
         </w:rPr>
-        <w:t>│   ├── TableEditControl.cs  2120</w:t>
+        <w:t>│   ├── TableEditControl.cs  2133</w:t>
       </w:r>
     </w:p>
     <w:p>
@@ -3598,7 +3598,7 @@
           <w:rFonts w:ascii="Consolas" w:hAnsi="Consolas" w:eastAsia="Consolas"/>
           <w:sz w:val="13"/>
         </w:rPr>
-        <w:t>│   ├── GotoColumnForm.cs  84</w:t>
+        <w:t>│   ├── GotoColumnForm.cs  86</w:t>
       </w:r>
     </w:p>
     <w:p>
@@ -3682,7 +3682,7 @@
           <w:rFonts w:ascii="Consolas" w:hAnsi="Consolas" w:eastAsia="Consolas"/>
           <w:sz w:val="13"/>
         </w:rPr>
-        <w:t>│   ├── MainForm.cs  3945</w:t>
+        <w:t>│   ├── MainForm.cs  3937</w:t>
       </w:r>
     </w:p>
     <w:p>
@@ -4930,7 +4930,7 @@
           <w:rFonts w:ascii="Consolas" w:hAnsi="Consolas" w:eastAsia="Consolas"/>
           <w:sz w:val="13"/>
         </w:rPr>
-        <w:t>│   ├── FastAskService.cs  1385</w:t>
+        <w:t>│   ├── FastAskService.cs  1455</w:t>
       </w:r>
     </w:p>
     <w:p>
@@ -5950,7 +5950,7 @@
           <w:rFonts w:ascii="Consolas" w:hAnsi="Consolas" w:eastAsia="Consolas"/>
           <w:sz w:val="13"/>
         </w:rPr>
-        <w:t>│   ├── ShortcutRegistry.cs  343</w:t>
+        <w:t>│   ├── ShortcutRegistry.cs  345</w:t>
       </w:r>
     </w:p>
     <w:p>
@@ -6742,7 +6742,7 @@
           <w:rFonts w:ascii="Consolas" w:hAnsi="Consolas" w:eastAsia="Consolas"/>
           <w:sz w:val="13"/>
         </w:rPr>
-        <w:t>│       ├── resultview.html  621</w:t>
+        <w:t>│       ├── resultview.html  635</w:t>
       </w:r>
     </w:p>
     <w:p>
@@ -7006,7 +7006,7 @@
           <w:rFonts w:ascii="Consolas" w:hAnsi="Consolas" w:eastAsia="Consolas"/>
           <w:sz w:val="13"/>
         </w:rPr>
-        <w:t>│       ├── tablebar.html  283</w:t>
+        <w:t>│       ├── tablebar.html  326</w:t>
       </w:r>
     </w:p>
     <w:p>
@@ -9916,7 +9916,7 @@
                 <w:b w:val="0"/>
                 <w:sz w:val="16"/>
               </w:rPr>
-              <w:t>Nguồn: SqlHintCatalog (snippet rsrepq/rspivot/tblcat/dynf/total…, Idioms, GroupNotes), ma trận ghost text (Find call/func/filter/decl), database đang kết nối chỉ đọc (sys.tables, sys.objects, sys.sql_modules — SearchModulesAsync, PartitionTablesAsync đếm xxx$%Partition), TableDataService.GetColumnDescriptionsAsync (cấu trúc + JOIN theo khoá), FieldDictionaryService (header.xml), luật danh mục (nút mở QuickList StartRules), Topics = quy ước Fast. Báo cáo: chọn nhiều bảng phân kỳ (khối SET @q … Partition$Execute lặp cho từng bảng, cột = giao các bảng); Save as (SaveAsFlowAsync: OBJECT_DEFINITION chỉ đọc, đổi tên ở dòng CREATE/ALTER, nút Save as… trên thẻ store); rsrepq/rspivot + tham số lọc (kiểu theo ma trận decl) + dòng lọc (ma trận filter → FastGhostRules.FilterLine) + cột thật của bảng$000000 (tổng hợp SUM cột số). Trạng thái hội thoại do trang giữ (state). Học dự án (LearnProjectAsync): FastAskKnowledge.Mine (JOIN + ON giải alias, cột #report theo bảng phân kỳ, cột ngày Partition$Execute, tham số rs_) → fastask/projects/*.json, MergeShared → fastask/shared.json; FastGhostMiner.LearnFromModules + MergeShared → ghost/_shared.json. KnowledgeFor tra: lớp sửa của người dùng (✘ + gõ cách đúng, FastAskFeedback Prefer) → ma trận dự án → _shared → ma trận đi kèm. ✔/✘: AskCard.Ref (m|loại|khoá|cách viết, answer|…, store|…), AskReply.Sig; ApplyFeedback bỏ thẻ bị ✘, đưa thẻ ✔ lên đầu, chèn Câu trả lời bạn đã sửa; nút ✔ Đúng / ✘ Chưa đúng nằm ở hàng nút cuối thẻ (.votes). Dừng luồng: IsStop (bỏ qua / thôi / hủy / quit…) hoặc nút ✕ Dừng (state.flow). Đổi tên tab SQL Query sau khi chạy: MainForm.RenameTabByScript (ScriptExecuted, CREATE/ALTER PROC|FUNCTION|VIEW|TRIGGER ngoài comment → schema.tên). Lịch sử phiên: FastAskSessions (fastask/sessions/*.json). Nhúng vào tab SQL Query (ISqlTab.ShowFastAsk / FastAskRequested, MainForm.EmbedFastAsk) khi bật AiEmbedded. Tìm chung: Services/FastAskIndex.cs (BM25, từ khoá không dấu + tách chữ hoa + cặp 2 từ; tài liệu report = store rs_&lt;controller&gt; mang tiêu đề menu Sys wcommand, menu, store, snippet, topic, table (tiêu đề field tra cứu + dmct), field), FastAskService.IndexAsync / IndexCard / SearchAllAsync / FieldReplyAsync / SimilarReportsAsync; chỉ câu có động từ tạo mới vào luồng tạo báo cáo / danh mục / store; DistillAsync = thẻ tóm tắt store; TableUsersAsync = store dùng bảng; bộ câu hỏi chuẩn ASK_GOLD (113 câu) đo top-1 24,8% → 85,8%. Nút thẻ: insert / newtab / copy / open-object (Arg2 app|P) / quicklist; ✎ Sửa → action correct → FastAskService.Correct (✘ + SaveCorrection). Bảng: ResolveTables (tên đúng → tên gốc bảng phân kỳ → tiếng Việt qua lookup header.xml → dm+tên), DescribeTableAsync (MS_Description, dmct.m_phdbf/m_ctdbf, field tra cứu, quy ước tên, store dùng bảng). Danh mục: CatalogFlowAsync + CatalogColumns (cột người dùng nhập; bảng đã có → ALTER TABLE ADD). Save as: RecentReportsAsync (rs_/zrs_ sửa gần đây), gõ 1 phần tên → chọn. Quy ước có mẫu (TopicCards(t, f)): câu nêu rõ đối tượng → chỉ mẫu có nhiều từ khớp nhất / ít từ thừa nhất (số dư vụ việc → baljob), "cuối kỳ" đổi @DateFrom → @DateTo, BalanceType 1 → 2.</w:t>
+              <w:t>Nguồn: SqlHintCatalog (snippet rsrepq/rspivot/tblcat/dynf/total…, Idioms, GroupNotes), ma trận ghost text (Find call/func/filter/decl), database đang kết nối chỉ đọc (sys.tables, sys.objects, sys.sql_modules — SearchModulesAsync, PartitionTablesAsync đếm xxx$%Partition), TableDataService.GetColumnDescriptionsAsync (cấu trúc + JOIN theo khoá), FieldDictionaryService (header.xml), luật danh mục (nút mở QuickList StartRules), Topics = quy ước Fast. Báo cáo: chọn nhiều bảng phân kỳ (khối SET @q … Partition$Execute lặp cho từng bảng, cột = giao các bảng); Save as (SaveAsFlowAsync: OBJECT_DEFINITION chỉ đọc, đổi tên ở dòng CREATE/ALTER, nút Save as… trên thẻ store); rsrepq/rspivot + tham số lọc (kiểu theo ma trận decl) + dòng lọc (ma trận filter → FastGhostRules.FilterLine) + cột thật của bảng$000000 (tổng hợp SUM cột số). Trạng thái hội thoại do trang giữ (state). Học dự án (LearnProjectAsync): FastAskKnowledge.Mine (JOIN + ON giải alias, cột #report theo bảng phân kỳ, cột ngày Partition$Execute, tham số rs_) → fastask/projects/*.json, MergeShared → fastask/shared.json; FastGhostMiner.LearnFromModules + MergeShared → ghost/_shared.json. KnowledgeFor tra: lớp sửa của người dùng (✘ + gõ cách đúng, FastAskFeedback Prefer) → ma trận dự án → _shared → ma trận đi kèm. ✔/✘: AskCard.Ref (m|loại|khoá|cách viết, answer|…, store|…), AskReply.Sig; ApplyFeedback bỏ thẻ bị ✘, đưa thẻ ✔ lên đầu, chèn Câu trả lời bạn đã sửa; nút ✔ Đúng / ✘ Chưa đúng nằm ở hàng nút cuối thẻ (.votes). Dừng luồng: IsStop (bỏ qua / thôi / hủy / quit…) hoặc nút ✕ Dừng (state.flow). Đổi tên tab SQL Query sau khi chạy: MainForm.RenameTabByScript (ScriptExecuted, CREATE/ALTER PROC|FUNCTION|VIEW|TRIGGER ngoài comment → schema.tên). Lịch sử phiên: FastAskSessions (fastask/sessions/*.json). Nhúng vào tab SQL Query (ISqlTab.ShowFastAsk / FastAskRequested, MainForm.EmbedFastAsk) khi bật AiEmbedded. Tìm chung: Services/FastAskIndex.cs (BM25, từ khoá không dấu + tách chữ hoa + cặp 2 từ; tài liệu report = store rs_&lt;controller&gt; mang tiêu đề menu Sys wcommand, menu, store, snippet, topic, table (tiêu đề field tra cứu + dmct), field), FastAskService.IndexAsync / IndexCard / SearchAllAsync / FieldReplyAsync / SimilarReportsAsync; chỉ câu có động từ tạo mới vào luồng tạo báo cáo / danh mục / store; DistillAsync = thẻ tóm tắt store; StatsAsync / StatKinds = câu đếm / liệt kê / thông tin dự án (wcommand, dmct, sys.objects, userinfo, header.xml, workspaces); FastAskControl.ToPage chờ WebBarHost.WaitReadyAsync trước khi trả lời (trước đây câu "hello" lúc mở tab trả lời trước khi trang báo nạp xong → Call bị bỏ, treo "Đang tra…"); TableUsersAsync = store dùng bảng; bộ câu hỏi chuẩn ASK_GOLD (113 câu) đo top-1 24,8% → 85,8%. Nút thẻ: insert / newtab / copy / open-object (Arg2 app|P) / quicklist; ✎ Sửa → action correct → FastAskService.Correct (✘ + SaveCorrection). Bảng: ResolveTables (tên đúng → tên gốc bảng phân kỳ → tiếng Việt qua lookup header.xml → dm+tên), DescribeTableAsync (MS_Description, dmct.m_phdbf/m_ctdbf, field tra cứu, quy ước tên, store dùng bảng). Danh mục: CatalogFlowAsync + CatalogColumns (cột người dùng nhập; bảng đã có → ALTER TABLE ADD). Save as: RecentReportsAsync (rs_/zrs_ sửa gần đây), gõ 1 phần tên → chọn. Quy ước có mẫu (TopicCards(t, f)): câu nêu rõ đối tượng → chỉ mẫu có nhiều từ khớp nhất / ít từ thừa nhất (số dư vụ việc → baljob), "cuối kỳ" đổi @DateFrom → @DateTo, BalanceType 1 → 2.</w:t>
             </w:r>
           </w:p>
         </w:tc>
@@ -10140,7 +10140,7 @@
                 <w:b w:val="0"/>
                 <w:sz w:val="16"/>
               </w:rPr>
-              <w:t>Sửa dữ liệu kiểu Excel; Add New Column / Edit Column = ColumnDesignForm (bảng Name/Type/Length/Not NULL như hộp Design của FCode, App: ColumnDesignPage trong NativePages.Dialogs.cs) → BuildColumnScript (Gen Add / Alter Column); ô Top mặc định 0 = tất cả (Command mới mặc định TOP 500); Add Script = DELETE + INSERT; F1 chi tiết dòng, F3 khai báo nhanh danh sách. Dòng "Menu: Phiếu nhập kho (inctpnd.aspx)" dưới Where/Order (tablebar.html .menu-row / NativeTableBar.SetMenus; ẩn khi không tra được → thanh giữ chiều cao cũ): TableMenuService.FindAsync tra theo gốc tên bảng (bỏ $yyyymm/$000000/$log) — 1) dmct9 (App): c$/m$/d$/i$ → url → menu wcommand có link cùng trang aspx; 2) controller của menu: CommandTableService.ResolveIn (Dir table= + Grid chi tiết; table="&amp;Tag;" tra &lt;!ENTITY&gt; trong file Dir). Cache theo workspace + số menu trên cây, ⟳ Refresh database = Forget. Gõ thì chờ 300 ms, tải xong bảng thì tra ngay. Bấm menu → MenuRevealRequested → hiện cây WCommand + RevealAsync (chỉ chọn node, không mở File Lookup). Menu trùng tên ở nhiều phân hệ → thêm [phân hệ]; tối đa 4 + "+N". Chuột phải ô Table khi là bảng phân kỳ (xxx$yyyymm) → "Check Partitions Struct" (tablebar.html contextmenu → action table-context; App: NativeTableBar.ContextMenuHook bắt WM_CONTEXTMENU; bảng khác giữ menu mặc định) → Forms/PartitionCheckForm + Web/Shell/partitioncheck.html (App: Controls/NativePages.PartitionCheck.cs): TableDataService.CheckPartitionStructureAsync so mọi {prefix}$dddddd với {prefix}$000000 (1 câu INFORMATION_SCHEMA.COLUMNS) — thiếu / thừa cột, khác kiểu hoặc null, khác thứ tự cột; "Tables are same structure" khi giống hết; Copy ra Tab-separated. Add Script khi bảng 0 dòng → StructureAddScriptAsync: cấu trúc bảng (SqlObjectBrowserService.GetTableSchemaScriptAsync, lỗi thì GenStructureTable) bọc DataScriptService.GenerateStructureScript. Add Script (DataScriptService): bảng có identity → #data lấy [id] + 0, nạp vào bảng thật bọc SET IDENTITY_INSERT ON/OFF kèm danh sách cột; bỏ cột computed/rowversion (TableWriteInfo).</w:t>
+              <w:t>Sửa dữ liệu kiểu Excel; Add New Column / Edit Column = ColumnDesignForm (bảng Name/Type/Length/Not NULL như hộp Design của FCode, App: ColumnDesignPage trong NativePages.Dialogs.cs) → BuildColumnScript (Gen Add / Alter Column); ô Top mặc định 0 = tất cả; Enter như FCode: ô Table → nạp bảng / chọn gợi ý rồi focus ô Where; ô Where gõ tên cột + Enter → chèn mẫu theo kiểu cột (TableEditControl.PushStructure đẩy tên+kiểu xuống thanh: window.setColTypes / NativeTableBar.SetColumnTypes; tablebar.html whereSnippet = NativeTableBar.WhereSnippet): char/varchar/text → like '%|%', nchar/nvarchar/ntext → like N'%|%', số → " = |", ngày/uniqueidentifier → = '|'; không phải tên cột (hoặc đang trong chuỗi / vế giá trị) → Enter = Load; chọn cột trong gợi ý bằng Enter / bấm chuột (vd gõ "ghi" → ghi_chu) → BarInsertColumn + BarWhereEnter chèn luôn mẫu như FCode (Tab gửi col-key "tab", chỉ điền tên). Ctrl+G Goto Column (ResultGridMenu → GotoColumnForm currentColumn; resultview.html gotoColumn) điền sẵn tên cột đang đứng, bôi đen; Ctrl+Shift+C (table.copyColumnName, TryRunGridShortcut → ResultGridMenu.CopySelectedColumnNames) = copy tên cột ô đang chọn (nhiều cột "a, b"); Add Script = DELETE + INSERT; F1 chi tiết dòng, F3 khai báo nhanh danh sách. Dòng "Menu: Phiếu nhập kho (inctpnd.aspx)" dưới Where/Order (tablebar.html .menu-row / NativeTableBar.SetMenus; ẩn khi không tra được → thanh giữ chiều cao cũ): TableMenuService.FindAsync tra theo gốc tên bảng (bỏ $yyyymm/$000000/$log) — 1) dmct9 (App): c$/m$/d$/i$ → url → menu wcommand có link cùng trang aspx; 2) controller của menu: CommandTableService.ResolveIn (Dir table= + Grid chi tiết; table="&amp;Tag;" tra &lt;!ENTITY&gt; trong file Dir). Cache theo workspace + số menu trên cây, ⟳ Refresh database = Forget. Gõ thì chờ 300 ms, tải xong bảng thì tra ngay. Bấm menu → MenuRevealRequested → hiện cây WCommand + RevealAsync (chỉ chọn node, không mở File Lookup). Menu trùng tên ở nhiều phân hệ → thêm [phân hệ]; tối đa 4 + "+N". Chuột phải ô Table khi là bảng phân kỳ (xxx$yyyymm) → "Check Partitions Struct" (tablebar.html contextmenu → action table-context; App: NativeTableBar.ContextMenuHook bắt WM_CONTEXTMENU; bảng khác giữ menu mặc định) → Forms/PartitionCheckForm + Web/Shell/partitioncheck.html (App: Controls/NativePages.PartitionCheck.cs): TableDataService.CheckPartitionStructureAsync so mọi {prefix}$dddddd với {prefix}$000000 (1 câu INFORMATION_SCHEMA.COLUMNS) — thiếu / thừa cột, khác kiểu hoặc null, khác thứ tự cột; "Tables are same structure" khi giống hết; Copy ra Tab-separated. Add Script khi bảng 0 dòng → StructureAddScriptAsync: cấu trúc bảng (SqlObjectBrowserService.GetTableSchemaScriptAsync, lỗi thì GenStructureTable) bọc DataScriptService.GenerateStructureScript. Add Script (DataScriptService): bảng có identity → #data lấy [id] + 0, nạp vào bảng thật bọc SET IDENTITY_INSERT ON/OFF kèm danh sách cột; bỏ cột computed/rowversion (TableWriteInfo).</w:t>
             </w:r>
           </w:p>
         </w:tc>
@@ -10160,7 +10160,7 @@
                 <w:b/>
                 <w:sz w:val="16"/>
               </w:rPr>
-              <w:t>Command / Lookup</w:t>
+              <w:t>Lookup (tab Command đã bỏ)</w:t>
             </w:r>
           </w:p>
         </w:tc>
@@ -10196,7 +10196,7 @@
                 <w:b w:val="0"/>
                 <w:sz w:val="16"/>
               </w:rPr>
-              <w:t>Command tự chèn TOP 500, tự UNION bảng kỳ $000000, khung Fields bên trái. Lookup tìm "chữ có trong procedure" (như Search Text của FCode) qua SqlDefinitionIndex: giữ định nghĩa sys.sql_modules trong RAM + bản gz %AppData%\Bcode\sql-definitions theo (server, database), mỗi lần tìm chỉ hỏi danh sách object + modify_date rồi nạp lại phần đổi.</w:t>
+              <w:t>Tab Command ĐÃ BỎ cách mở (gỡ khỏi _toolSpecs của MainForm — không còn nút / phím tool:command / Ctrl+Shift+C; Ctrl+Shift+C giờ là copy tên cột ở lưới Table / Result); SqlQueryControl, NativeCommandPanel.cs, commandquery.html còn trong code nhưng không chỗ nào dùng. Lookup tìm "chữ có trong procedure" (như Search Text của FCode) qua SqlDefinitionIndex: giữ định nghĩa sys.sql_modules trong RAM + bản gz %AppData%\Bcode\sql-definitions theo (server, database), mỗi lần tìm chỉ hỏi danh sách object + modify_date rồi nạp lại phần đổi.</w:t>
             </w:r>
           </w:p>
         </w:tc>
@@ -10252,7 +10252,7 @@
                 <w:b w:val="0"/>
                 <w:sz w:val="16"/>
               </w:rPr>
-              <w:t>Ctrl+Shift+U = Gen Update (Result). Save as CSV / Excel (.xlsx) ở menu tab Result SQL Query (Controls/ResultExport.cs + Services/ResultExportService.cs; Web: resultview.html post save {table, format, rows} → MultiResultView ghi từ DataTable gốc; App: ResultGridMenu.EnableSave chỉ bật ở NativeResultPane): toàn bộ dòng hoặc dòng đã chọn, chạy nền, ghi file tạm rồi đổi tên; XLSX ghi SAX bằng DocumentFormat.OpenXml (có sẵn qua ClosedXML) — chuỗi = inlineStr giữ số 0 đầu, ngày = số + định dạng dd/mm/yyyy; CSV UTF-8 BOM. Thanh trạng thái báo tiến độ + link Mở file / Mở thư mục (ResultExport.Notice → MainForm.PushStatus(text, file); statusbar.html setStatus(text, links) / NativeStatusBar.SetStatus). Phím result.quickExcel Ctrl+E = xuất nhanh (ResultExport.SaveAsync quick: không SaveFileDialog, ghi %TEMP%\Bcode\Export — dọn file &gt; 7 ngày — rồi mở bằng Excel; Web post save {quick:true}); result.saveXlsx, result.saveCsv trống.</w:t>
+              <w:t>Ctrl+Shift+U = Gen Update (Result). Save as CSV / Excel (.xlsx) ở menu tab Result SQL Query (Controls/ResultExport.cs + Services/ResultExportService.cs; Web: resultview.html post save {table, format, rows} → MultiResultView ghi từ DataTable gốc; App: ResultGridMenu.EnableSave chỉ bật ở NativeResultPane): toàn bộ dòng hoặc dòng đã chọn, chạy nền, ghi file tạm rồi đổi tên; XLSX ghi SAX bằng DocumentFormat.OpenXml (có sẵn qua ClosedXML) — chuỗi = inlineStr giữ số 0 đầu, ngày = số + định dạng dd/mm/yyyy; CSV UTF-8 BOM. Thanh trạng thái báo tiến độ + link Mở file / Mở thư mục (ResultExport.Notice → MainForm.PushStatus(text, file); statusbar.html setStatus(text, links) / NativeStatusBar.SetStatus). Phím result.quickExcel Ctrl+E = xuất nhanh (ResultExport.SaveAsync quick: không SaveFileDialog, ghi %TEMP%\Bcode\Export — dọn file &gt; 7 ngày — rồi mở bằng Excel; Web post save {quick:true}); result.saveXlsx, result.saveCsv trống. Phím result.copyColumnName Ctrl+Shift+C = copy tên cột ô đang chọn (Web: resultview.html copyColNames, bắt ở window pha capture + MultiResultView ClaimKeys tổ hợp đang gán; App: MainForm.ProcessCmdKey → ResultGridMenu.HandleCopyKey); "Copy kèm tên cột" chỉ còn ở menu.</w:t>
             </w:r>
           </w:p>
         </w:tc>
@@ -15602,7 +15602,7 @@
                 <w:b/>
                 <w:sz w:val="17"/>
               </w:rPr>
-              <w:t>Ctrl+Shift+Q L T C W F G R O U E 4 Y J</w:t>
+              <w:t>Ctrl+Shift+Q L T W F G R O U E 4 Y J</w:t>
             </w:r>
           </w:p>
         </w:tc>
@@ -15620,7 +15620,7 @@
                 <w:b w:val="0"/>
                 <w:sz w:val="17"/>
               </w:rPr>
-              <w:t>Tool: SQL Query, Lookup, Table, Command, WCommand, File Lookup, Gen Update, File Reference, Change Owner, Gen Update (Result), Note, Note (New), Lịch sử SQL, So sánh object</w:t>
+              <w:t>Tool: SQL Query, Lookup, Table, WCommand, File Lookup, Gen Update, File Reference, Change Owner, Gen Update (Result), Note, Note (New), Lịch sử SQL, So sánh object</w:t>
             </w:r>
           </w:p>
         </w:tc>

</xml_diff>

<commit_message>
bcodeviewr| bổ sung gợi ý, hỏi đáp
</commit_message>
<xml_diff>
--- a/Cấu trúc Bcode  BcodeViewer (v3 - Tóm tắt).docx
+++ b/Cấu trúc Bcode  BcodeViewer (v3 - Tóm tắt).docx
@@ -829,7 +829,7 @@
                 <w:b w:val="0"/>
                 <w:sz w:val="17"/>
               </w:rPr>
-              <w:t>32 .cs + 32 file Web (Monaco bundle ở Web/vs — vendor, bỏ qua)</w:t>
+              <w:t>41 .cs + 33 file Web (Monaco bundle ở Web/vs — vendor, bỏ qua); Host/FastSource = gợi ý Fast + Hỏi Fast</w:t>
             </w:r>
           </w:p>
         </w:tc>
@@ -2746,7 +2746,7 @@
           <w:rFonts w:ascii="Consolas" w:hAnsi="Consolas" w:eastAsia="Consolas"/>
           <w:sz w:val="13"/>
         </w:rPr>
-        <w:t>│   ├── NativePages.Profiler.cs  80</w:t>
+        <w:t>│   ├── NativePages.Profiler.cs  108</w:t>
       </w:r>
     </w:p>
     <w:p>
@@ -3106,7 +3106,7 @@
           <w:rFonts w:ascii="Consolas" w:hAnsi="Consolas" w:eastAsia="Consolas"/>
           <w:sz w:val="13"/>
         </w:rPr>
-        <w:t>│   ├── SqlProfilerControl.cs  1861</w:t>
+        <w:t>│   ├── SqlProfilerControl.cs  1903</w:t>
       </w:r>
     </w:p>
     <w:p>
@@ -4234,7 +4234,7 @@
           <w:rFonts w:ascii="Consolas" w:hAnsi="Consolas" w:eastAsia="Consolas"/>
           <w:sz w:val="13"/>
         </w:rPr>
-        <w:t>│   └── Workspace.cs  122</w:t>
+        <w:t>│   └── Workspace.cs  124</w:t>
       </w:r>
     </w:p>
     <w:p>
@@ -4930,7 +4930,7 @@
           <w:rFonts w:ascii="Consolas" w:hAnsi="Consolas" w:eastAsia="Consolas"/>
           <w:sz w:val="13"/>
         </w:rPr>
-        <w:t>│   ├── FastAskService.cs  1455</w:t>
+        <w:t>│   ├── FastAskService.cs  1547</w:t>
       </w:r>
     </w:p>
     <w:p>
@@ -4978,7 +4978,19 @@
           <w:rFonts w:ascii="Consolas" w:hAnsi="Consolas" w:eastAsia="Consolas"/>
           <w:sz w:val="13"/>
         </w:rPr>
-        <w:t>│   ├── FastGhostRules.cs  1050</w:t>
+        <w:t>│   ├── FastGhostRules.cs  1057</w:t>
+      </w:r>
+    </w:p>
+    <w:p>
+      <w:pPr>
+        <w:spacing w:after="0" w:before="0" w:line="240" w:lineRule="auto"/>
+      </w:pPr>
+      <w:r>
+        <w:rPr>
+          <w:rFonts w:ascii="Consolas" w:hAnsi="Consolas" w:eastAsia="Consolas"/>
+          <w:sz w:val="13"/>
+        </w:rPr>
+        <w:t>│   ├── FastSourceKnowledge.cs  129</w:t>
       </w:r>
     </w:p>
     <w:p>
@@ -6430,7 +6442,7 @@
           <w:rFonts w:ascii="Consolas" w:hAnsi="Consolas" w:eastAsia="Consolas"/>
           <w:sz w:val="13"/>
         </w:rPr>
-        <w:t>│       ├── fastask.html  301</w:t>
+        <w:t>│       ├── fastask.html  369</w:t>
       </w:r>
     </w:p>
     <w:p>
@@ -6934,7 +6946,7 @@
           <w:rFonts w:ascii="Consolas" w:hAnsi="Consolas" w:eastAsia="Consolas"/>
           <w:sz w:val="13"/>
         </w:rPr>
-        <w:t>│       ├── sqlprofilerbar.html  151</w:t>
+        <w:t>│       ├── sqlprofilerbar.html  170</w:t>
       </w:r>
     </w:p>
     <w:p>
@@ -7206,6 +7218,42 @@
           <w:rFonts w:ascii="Consolas" w:hAnsi="Consolas" w:eastAsia="Consolas"/>
           <w:sz w:val="13"/>
         </w:rPr>
+        <w:t>│   ├── fastsource/</w:t>
+      </w:r>
+    </w:p>
+    <w:p>
+      <w:pPr>
+        <w:spacing w:after="0" w:before="0" w:line="240" w:lineRule="auto"/>
+      </w:pPr>
+      <w:r>
+        <w:rPr>
+          <w:rFonts w:ascii="Consolas" w:hAnsi="Consolas" w:eastAsia="Consolas"/>
+          <w:sz w:val="13"/>
+        </w:rPr>
+        <w:t>│   │   ├── ask.json  1</w:t>
+      </w:r>
+    </w:p>
+    <w:p>
+      <w:pPr>
+        <w:spacing w:after="0" w:before="0" w:line="240" w:lineRule="auto"/>
+      </w:pPr>
+      <w:r>
+        <w:rPr>
+          <w:rFonts w:ascii="Consolas" w:hAnsi="Consolas" w:eastAsia="Consolas"/>
+          <w:sz w:val="13"/>
+        </w:rPr>
+        <w:t>│   │   └── ghost.json  1</w:t>
+      </w:r>
+    </w:p>
+    <w:p>
+      <w:pPr>
+        <w:spacing w:after="0" w:before="0" w:line="240" w:lineRule="auto"/>
+      </w:pPr>
+      <w:r>
+        <w:rPr>
+          <w:rFonts w:ascii="Consolas" w:hAnsi="Consolas" w:eastAsia="Consolas"/>
+          <w:sz w:val="13"/>
+        </w:rPr>
         <w:t>│   ├── snippets/</w:t>
       </w:r>
     </w:p>
@@ -7302,6 +7350,114 @@
           <w:rFonts w:ascii="Consolas" w:hAnsi="Consolas" w:eastAsia="Consolas"/>
           <w:sz w:val="13"/>
         </w:rPr>
+        <w:t>│   ├── FastSource/</w:t>
+      </w:r>
+    </w:p>
+    <w:p>
+      <w:pPr>
+        <w:spacing w:after="0" w:before="0" w:line="240" w:lineRule="auto"/>
+      </w:pPr>
+      <w:r>
+        <w:rPr>
+          <w:rFonts w:ascii="Consolas" w:hAnsi="Consolas" w:eastAsia="Consolas"/>
+          <w:sz w:val="13"/>
+        </w:rPr>
+        <w:t>│   │   ├── FastSourceService.Ask.cs  200</w:t>
+      </w:r>
+    </w:p>
+    <w:p>
+      <w:pPr>
+        <w:spacing w:after="0" w:before="0" w:line="240" w:lineRule="auto"/>
+      </w:pPr>
+      <w:r>
+        <w:rPr>
+          <w:rFonts w:ascii="Consolas" w:hAnsi="Consolas" w:eastAsia="Consolas"/>
+          <w:sz w:val="13"/>
+        </w:rPr>
+        <w:t>│   │   ├── FastSourceService.cs  240</w:t>
+      </w:r>
+    </w:p>
+    <w:p>
+      <w:pPr>
+        <w:spacing w:after="0" w:before="0" w:line="240" w:lineRule="auto"/>
+      </w:pPr>
+      <w:r>
+        <w:rPr>
+          <w:rFonts w:ascii="Consolas" w:hAnsi="Consolas" w:eastAsia="Consolas"/>
+          <w:sz w:val="13"/>
+        </w:rPr>
+        <w:t>│   │   ├── SourceAsk.cs  568</w:t>
+      </w:r>
+    </w:p>
+    <w:p>
+      <w:pPr>
+        <w:spacing w:after="0" w:before="0" w:line="240" w:lineRule="auto"/>
+      </w:pPr>
+      <w:r>
+        <w:rPr>
+          <w:rFonts w:ascii="Consolas" w:hAnsi="Consolas" w:eastAsia="Consolas"/>
+          <w:sz w:val="13"/>
+        </w:rPr>
+        <w:t>│   │   ├── SourceGhost.cs  480</w:t>
+      </w:r>
+    </w:p>
+    <w:p>
+      <w:pPr>
+        <w:spacing w:after="0" w:before="0" w:line="240" w:lineRule="auto"/>
+      </w:pPr>
+      <w:r>
+        <w:rPr>
+          <w:rFonts w:ascii="Consolas" w:hAnsi="Consolas" w:eastAsia="Consolas"/>
+          <w:sz w:val="13"/>
+        </w:rPr>
+        <w:t>│   │   ├── SourceGhostMiner.cs  173</w:t>
+      </w:r>
+    </w:p>
+    <w:p>
+      <w:pPr>
+        <w:spacing w:after="0" w:before="0" w:line="240" w:lineRule="auto"/>
+      </w:pPr>
+      <w:r>
+        <w:rPr>
+          <w:rFonts w:ascii="Consolas" w:hAnsi="Consolas" w:eastAsia="Consolas"/>
+          <w:sz w:val="13"/>
+        </w:rPr>
+        <w:t>│   │   ├── SourceTokenModel.cs  389</w:t>
+      </w:r>
+    </w:p>
+    <w:p>
+      <w:pPr>
+        <w:spacing w:after="0" w:before="0" w:line="240" w:lineRule="auto"/>
+      </w:pPr>
+      <w:r>
+        <w:rPr>
+          <w:rFonts w:ascii="Consolas" w:hAnsi="Consolas" w:eastAsia="Consolas"/>
+          <w:sz w:val="13"/>
+        </w:rPr>
+        <w:t>│   │   ├── SourceVersions.cs  244</w:t>
+      </w:r>
+    </w:p>
+    <w:p>
+      <w:pPr>
+        <w:spacing w:after="0" w:before="0" w:line="240" w:lineRule="auto"/>
+      </w:pPr>
+      <w:r>
+        <w:rPr>
+          <w:rFonts w:ascii="Consolas" w:hAnsi="Consolas" w:eastAsia="Consolas"/>
+          <w:sz w:val="13"/>
+        </w:rPr>
+        <w:t>│   │   └── ViewerKnowledge.cs  72</w:t>
+      </w:r>
+    </w:p>
+    <w:p>
+      <w:pPr>
+        <w:spacing w:after="0" w:before="0" w:line="240" w:lineRule="auto"/>
+      </w:pPr>
+      <w:r>
+        <w:rPr>
+          <w:rFonts w:ascii="Consolas" w:hAnsi="Consolas" w:eastAsia="Consolas"/>
+          <w:sz w:val="13"/>
+        </w:rPr>
         <w:t>│   ├── AsyncHostCall.cs  155</w:t>
       </w:r>
     </w:p>
@@ -7338,7 +7494,7 @@
           <w:rFonts w:ascii="Consolas" w:hAnsi="Consolas" w:eastAsia="Consolas"/>
           <w:sz w:val="13"/>
         </w:rPr>
-        <w:t>│   ├── EditorBridge.cs  1436</w:t>
+        <w:t>│   ├── EditorBridge.cs  1511</w:t>
       </w:r>
     </w:p>
     <w:p>
@@ -7578,7 +7734,7 @@
           <w:rFonts w:ascii="Consolas" w:hAnsi="Consolas" w:eastAsia="Consolas"/>
           <w:sz w:val="13"/>
         </w:rPr>
-        <w:t>│   └── ViewerSettings.cs  203</w:t>
+        <w:t>│   └── ViewerSettings.cs  213</w:t>
       </w:r>
     </w:p>
     <w:p>
@@ -7746,7 +7902,7 @@
           <w:rFonts w:ascii="Consolas" w:hAnsi="Consolas" w:eastAsia="Consolas"/>
           <w:sz w:val="13"/>
         </w:rPr>
-        <w:t>│   ├── completion.js  2372</w:t>
+        <w:t>│   ├── completion.js  2540</w:t>
       </w:r>
     </w:p>
     <w:p>
@@ -7830,6 +7986,18 @@
           <w:rFonts w:ascii="Consolas" w:hAnsi="Consolas" w:eastAsia="Consolas"/>
           <w:sz w:val="13"/>
         </w:rPr>
+        <w:t>│   ├── fastask.js  356</w:t>
+      </w:r>
+    </w:p>
+    <w:p>
+      <w:pPr>
+        <w:spacing w:after="0" w:before="0" w:line="240" w:lineRule="auto"/>
+      </w:pPr>
+      <w:r>
+        <w:rPr>
+          <w:rFonts w:ascii="Consolas" w:hAnsi="Consolas" w:eastAsia="Consolas"/>
+          <w:sz w:val="13"/>
+        </w:rPr>
         <w:t>│   ├── fcode-language.js  451</w:t>
       </w:r>
     </w:p>
@@ -7890,19 +8058,19 @@
           <w:rFonts w:ascii="Consolas" w:hAnsi="Consolas" w:eastAsia="Consolas"/>
           <w:sz w:val="13"/>
         </w:rPr>
-        <w:t>│   ├── index.html  233</w:t>
-      </w:r>
-    </w:p>
-    <w:p>
-      <w:pPr>
-        <w:spacing w:after="0" w:before="0" w:line="240" w:lineRule="auto"/>
-      </w:pPr>
-      <w:r>
-        <w:rPr>
-          <w:rFonts w:ascii="Consolas" w:hAnsi="Consolas" w:eastAsia="Consolas"/>
-          <w:sz w:val="13"/>
-        </w:rPr>
-        <w:t>│   ├── keys.js  210</w:t>
+        <w:t>│   ├── index.html  236</w:t>
+      </w:r>
+    </w:p>
+    <w:p>
+      <w:pPr>
+        <w:spacing w:after="0" w:before="0" w:line="240" w:lineRule="auto"/>
+      </w:pPr>
+      <w:r>
+        <w:rPr>
+          <w:rFonts w:ascii="Consolas" w:hAnsi="Consolas" w:eastAsia="Consolas"/>
+          <w:sz w:val="13"/>
+        </w:rPr>
+        <w:t>│   ├── keys.js  212</w:t>
       </w:r>
     </w:p>
     <w:p>
@@ -7998,19 +8166,19 @@
           <w:rFonts w:ascii="Consolas" w:hAnsi="Consolas" w:eastAsia="Consolas"/>
           <w:sz w:val="13"/>
         </w:rPr>
-        <w:t>│   ├── settings.js  696</w:t>
-      </w:r>
-    </w:p>
-    <w:p>
-      <w:pPr>
-        <w:spacing w:after="0" w:before="0" w:line="240" w:lineRule="auto"/>
-      </w:pPr>
-      <w:r>
-        <w:rPr>
-          <w:rFonts w:ascii="Consolas" w:hAnsi="Consolas" w:eastAsia="Consolas"/>
-          <w:sz w:val="13"/>
-        </w:rPr>
-        <w:t>│   ├── shell.js  815</w:t>
+        <w:t>│   ├── settings.js  720</w:t>
+      </w:r>
+    </w:p>
+    <w:p>
+      <w:pPr>
+        <w:spacing w:after="0" w:before="0" w:line="240" w:lineRule="auto"/>
+      </w:pPr>
+      <w:r>
+        <w:rPr>
+          <w:rFonts w:ascii="Consolas" w:hAnsi="Consolas" w:eastAsia="Consolas"/>
+          <w:sz w:val="13"/>
+        </w:rPr>
+        <w:t>│   ├── shell.js  818</w:t>
       </w:r>
     </w:p>
     <w:p>
@@ -8034,7 +8202,7 @@
           <w:rFonts w:ascii="Consolas" w:hAnsi="Consolas" w:eastAsia="Consolas"/>
           <w:sz w:val="13"/>
         </w:rPr>
-        <w:t>│   ├── style.css  997</w:t>
+        <w:t>│   ├── style.css  1054</w:t>
       </w:r>
     </w:p>
     <w:p>
@@ -8142,7 +8310,7 @@
           <w:rFonts w:ascii="Consolas" w:hAnsi="Consolas" w:eastAsia="Consolas"/>
           <w:sz w:val="13"/>
         </w:rPr>
-        <w:t>├── BcodeViewer.App.csproj  52</w:t>
+        <w:t>├── BcodeViewer.App.csproj  54</w:t>
       </w:r>
     </w:p>
     <w:p>
@@ -9916,7 +10084,7 @@
                 <w:b w:val="0"/>
                 <w:sz w:val="16"/>
               </w:rPr>
-              <w:t>Nguồn: SqlHintCatalog (snippet rsrepq/rspivot/tblcat/dynf/total…, Idioms, GroupNotes), ma trận ghost text (Find call/func/filter/decl), database đang kết nối chỉ đọc (sys.tables, sys.objects, sys.sql_modules — SearchModulesAsync, PartitionTablesAsync đếm xxx$%Partition), TableDataService.GetColumnDescriptionsAsync (cấu trúc + JOIN theo khoá), FieldDictionaryService (header.xml), luật danh mục (nút mở QuickList StartRules), Topics = quy ước Fast. Báo cáo: chọn nhiều bảng phân kỳ (khối SET @q … Partition$Execute lặp cho từng bảng, cột = giao các bảng); Save as (SaveAsFlowAsync: OBJECT_DEFINITION chỉ đọc, đổi tên ở dòng CREATE/ALTER, nút Save as… trên thẻ store); rsrepq/rspivot + tham số lọc (kiểu theo ma trận decl) + dòng lọc (ma trận filter → FastGhostRules.FilterLine) + cột thật của bảng$000000 (tổng hợp SUM cột số). Trạng thái hội thoại do trang giữ (state). Học dự án (LearnProjectAsync): FastAskKnowledge.Mine (JOIN + ON giải alias, cột #report theo bảng phân kỳ, cột ngày Partition$Execute, tham số rs_) → fastask/projects/*.json, MergeShared → fastask/shared.json; FastGhostMiner.LearnFromModules + MergeShared → ghost/_shared.json. KnowledgeFor tra: lớp sửa của người dùng (✘ + gõ cách đúng, FastAskFeedback Prefer) → ma trận dự án → _shared → ma trận đi kèm. ✔/✘: AskCard.Ref (m|loại|khoá|cách viết, answer|…, store|…), AskReply.Sig; ApplyFeedback bỏ thẻ bị ✘, đưa thẻ ✔ lên đầu, chèn Câu trả lời bạn đã sửa; nút ✔ Đúng / ✘ Chưa đúng nằm ở hàng nút cuối thẻ (.votes). Dừng luồng: IsStop (bỏ qua / thôi / hủy / quit…) hoặc nút ✕ Dừng (state.flow). Đổi tên tab SQL Query sau khi chạy: MainForm.RenameTabByScript (ScriptExecuted, CREATE/ALTER PROC|FUNCTION|VIEW|TRIGGER ngoài comment → schema.tên). Lịch sử phiên: FastAskSessions (fastask/sessions/*.json). Nhúng vào tab SQL Query (ISqlTab.ShowFastAsk / FastAskRequested, MainForm.EmbedFastAsk) khi bật AiEmbedded. Tìm chung: Services/FastAskIndex.cs (BM25, từ khoá không dấu + tách chữ hoa + cặp 2 từ; tài liệu report = store rs_&lt;controller&gt; mang tiêu đề menu Sys wcommand, menu, store, snippet, topic, table (tiêu đề field tra cứu + dmct), field), FastAskService.IndexAsync / IndexCard / SearchAllAsync / FieldReplyAsync / SimilarReportsAsync; chỉ câu có động từ tạo mới vào luồng tạo báo cáo / danh mục / store; DistillAsync = thẻ tóm tắt store; StatsAsync / StatKinds = câu đếm / liệt kê / thông tin dự án (wcommand, dmct, sys.objects, userinfo, header.xml, workspaces); FastAskControl.ToPage chờ WebBarHost.WaitReadyAsync trước khi trả lời (trước đây câu "hello" lúc mở tab trả lời trước khi trang báo nạp xong → Call bị bỏ, treo "Đang tra…"); TableUsersAsync = store dùng bảng; bộ câu hỏi chuẩn ASK_GOLD (113 câu) đo top-1 24,8% → 85,8%. Nút thẻ: insert / newtab / copy / open-object (Arg2 app|P) / quicklist; ✎ Sửa → action correct → FastAskService.Correct (✘ + SaveCorrection). Bảng: ResolveTables (tên đúng → tên gốc bảng phân kỳ → tiếng Việt qua lookup header.xml → dm+tên), DescribeTableAsync (MS_Description, dmct.m_phdbf/m_ctdbf, field tra cứu, quy ước tên, store dùng bảng). Danh mục: CatalogFlowAsync + CatalogColumns (cột người dùng nhập; bảng đã có → ALTER TABLE ADD). Save as: RecentReportsAsync (rs_/zrs_ sửa gần đây), gõ 1 phần tên → chọn. Quy ước có mẫu (TopicCards(t, f)): câu nêu rõ đối tượng → chỉ mẫu có nhiều từ khớp nhất / ít từ thừa nhất (số dư vụ việc → baljob), "cuối kỳ" đổi @DateFrom → @DateTo, BalanceType 1 → 2.</w:t>
+              <w:t>Nguồn: SqlHintCatalog (snippet rsrepq/rspivot/tblcat/dynf/total…, Idioms, GroupNotes), ma trận ghost text (Find call/func/filter/decl), database đang kết nối chỉ đọc (sys.tables, sys.objects, sys.sql_modules — SearchModulesAsync, PartitionTablesAsync đếm xxx$%Partition), TableDataService.GetColumnDescriptionsAsync (cấu trúc + JOIN theo khoá), FieldDictionaryService (header.xml), luật danh mục (nút mở QuickList StartRules), Topics = quy ước Fast. Báo cáo: chọn nhiều bảng phân kỳ (khối SET @q … Partition$Execute lặp cho từng bảng, cột = giao các bảng); Save as (SaveAsFlowAsync: OBJECT_DEFINITION chỉ đọc, đổi tên ở dòng CREATE/ALTER, nút Save as… trên thẻ store); rsrepq/rspivot + tham số lọc (kiểu theo ma trận decl) + dòng lọc (ma trận filter → FastGhostRules.FilterLine) + cột thật của bảng$000000 (tổng hợp SUM cột số). Trạng thái hội thoại do trang giữ (state). Học dự án (LearnProjectAsync): FastAskKnowledge.Mine (JOIN + ON giải alias, cột #report theo bảng phân kỳ, cột ngày Partition$Execute, tham số rs_) → fastask/projects/*.json, MergeShared → fastask/shared.json; FastGhostMiner.LearnFromModules + MergeShared → ghost/_shared.json. KnowledgeFor tra: lớp sửa của người dùng (✘ + gõ cách đúng, FastAskFeedback Prefer) → ma trận dự án → _shared → ma trận đi kèm. ✔/✘: AskCard.Ref (m|loại|khoá|cách viết, answer|…, store|…), AskReply.Sig; ApplyFeedback bỏ thẻ bị ✘, đưa thẻ ✔ lên đầu, chèn Câu trả lời bạn đã sửa; nút ✔ Đúng / ✘ Chưa đúng nằm ở hàng nút cuối thẻ (.votes). Dừng luồng: IsStop (bỏ qua / thôi / hủy / quit…) hoặc nút ✕ Dừng (state.flow). Đổi tên tab SQL Query sau khi chạy: MainForm.RenameTabByScript (ScriptExecuted, CREATE/ALTER PROC|FUNCTION|VIEW|TRIGGER ngoài comment → schema.tên). Lịch sử phiên: FastAskSessions (fastask/sessions/*.json). Nhúng vào tab SQL Query (ISqlTab.ShowFastAsk / FastAskRequested, MainForm.EmbedFastAsk) khi bật AiEmbedded. Tìm chung: Services/FastAskIndex.cs (BM25, từ khoá không dấu + tách chữ hoa + cặp 2 từ; tài liệu report = store rs_&lt;controller&gt; mang tiêu đề menu Sys wcommand, menu, store, snippet, topic, table (tiêu đề field tra cứu + dmct), field), FastAskService.IndexAsync / IndexCard / SearchAllAsync / FieldReplyAsync / SimilarReportsAsync; chỉ câu có động từ tạo mới vào luồng tạo báo cáo / danh mục / store; DistillAsync = thẻ tóm tắt store; fastask.html Ctrl+F = thanh tìm (#findBar: bỏ dấu từng ký tự, mark.fh, Enter / Shift+Enter, Esc); FastSourceKnowledge.cs = đọc controller XML Filter / Grid / Report (regex; source dự án đọc ở nền, chưa xong thì mẫu đi kèm), ParamMap tham số → cột từ tiêu đề Anh / aliasName của ô lọc (FastGhostRules.ColumnFor, UseFastFilters), ControllerCard (bảng, mã chứng từ, trường, điều kiện lọc, mẫu in, cột mẫu in), DistillAsync thêm điều kiện lọc suy từ tham số, câu hỏi chi tiết (detail) bỏ cụm hỏi rồi tìm báo cáo / màn hình, mã chứng từ → màn hình; StatsAsync / StatKinds = câu đếm / liệt kê / thông tin dự án (wcommand, dmct, sys.objects, userinfo, header.xml, workspaces); FastAskControl.ToPage chờ WebBarHost.WaitReadyAsync trước khi trả lời (trước đây câu "hello" lúc mở tab trả lời trước khi trang báo nạp xong → Call bị bỏ, treo "Đang tra…"); TableUsersAsync = store dùng bảng; bộ câu hỏi chuẩn ASK_GOLD (113 câu) đo top-1 24,8% → 85,8%. Nút thẻ: insert / newtab / copy / open-object (Arg2 app|P) / quicklist; ✎ Sửa → action correct → FastAskService.Correct (✘ + SaveCorrection). Bảng: ResolveTables (tên đúng → tên gốc bảng phân kỳ → tiếng Việt qua lookup header.xml → dm+tên), DescribeTableAsync (MS_Description, dmct.m_phdbf/m_ctdbf, field tra cứu, quy ước tên, store dùng bảng). Danh mục: CatalogFlowAsync + CatalogColumns (cột người dùng nhập; bảng đã có → ALTER TABLE ADD). Save as: RecentReportsAsync (rs_/zrs_ sửa gần đây), gõ 1 phần tên → chọn. Quy ước có mẫu (TopicCards(t, f)): câu nêu rõ đối tượng → chỉ mẫu có nhiều từ khớp nhất / ít từ thừa nhất (số dư vụ việc → baljob), "cuối kỳ" đổi @DateFrom → @DateTo, BalanceType 1 → 2.</w:t>
             </w:r>
           </w:p>
         </w:tc>
@@ -10476,7 +10644,7 @@
                 <w:b w:val="0"/>
                 <w:sz w:val="16"/>
               </w:rPr>
-              <w:t>Nhúng cửa sổ Profiler.exe thật bằng SetParent; Ctrl+3. Ô u_id sửa/xoá được (uidManual): trống = không lọc ApplicationName, gỡ cả filter ID trong .tdf đã có (TryUpdateFilters: "" = bỏ filter).</w:t>
+              <w:t>Nhúng cửa sổ Profiler.exe thật bằng SetParent; Ctrl+3. Ô u_id sửa/xoá được (uidManual): trống = không lọc ApplicationName, gỡ cả filter ID trong .tdf đã có (TryUpdateFilters: "" = bỏ filter). Ô Lọc DatabaseName sửa được: nhớ theo workspace (Workspace.ProfilerDatabaseLike, "" = gợi ý %ProjectId%), action set-db-filter; EffectiveDbLike dùng cho Copy + filter template khi bung; ⟳ = về gợi ý.</w:t>
             </w:r>
           </w:p>
         </w:tc>
@@ -13730,7 +13898,7 @@
         <w:pStyle w:val="Heading2"/>
       </w:pPr>
       <w:r>
-        <w:t>2. IntelliSense (4 lớp) — Web/completion.js</w:t>
+        <w:t>2. IntelliSense (5 lớp) — Web/completion.js</w:t>
       </w:r>
     </w:p>
     <w:tbl>
@@ -13937,7 +14105,7 @@
                 <w:b/>
                 <w:sz w:val="16"/>
               </w:rPr>
-              <w:t>Lớp 3: SQL schema</w:t>
+              <w:t>Lớp 3: Gợi ý theo cấu trúc Fast + Hỏi Fast (không AI)</w:t>
             </w:r>
           </w:p>
         </w:tc>
@@ -13955,7 +14123,7 @@
                 <w:b w:val="0"/>
                 <w:sz w:val="16"/>
               </w:rPr>
-              <w:t>Host/SqlSchemaService.cs, WorkspaceConnection.cs; EditorBridge.BeginGetSqlTables/Columns</w:t>
+              <w:t>Host/FastSource/SourceGhost.cs, SourceTokenModel.cs, SourceGhostMiner.cs, SourceAsk.cs, SourceVersions.cs, FastSourceService.cs (+ .Ask.cs), ViewerKnowledge.cs; Assets/fastsource/ghost.json, ask.json; completion.js (fastGhost, scheduleFastFetch, toggleFastLong); Web/fastask.js; EditorBridge.BeginFastGhost/BeginToggleFastGhostLong/BeginFastAsk*/BeginRelearnFastSource; ViewerSettings.EnableFastGhost/FastGhostLong/FastSourceVersionsPath</w:t>
             </w:r>
           </w:p>
         </w:tc>
@@ -13973,7 +14141,7 @@
                 <w:b w:val="0"/>
                 <w:sz w:val="16"/>
               </w:rPr>
-              <w:t>Chỉ chạy khi con trỏ ở vùng SQL; đọc chung workspace của Bcode.</w:t>
+              <w:t>Cùng cách với phía SQL của Bcode nhưng cho XML controller / JS / ASPX; bản riêng của Viewer (2 project không tham chiếu nhau). Ghost: sau Hint Code + field thiếu trong views, trước structuralGhost + AI; trang chỉ đọc bộ nhớ (fastCache), hỏi host BeginFastGhost sau 40 ms rồi trigger lại; chỉ ở cuối dòng hoặc trước dấu đóng tự chèn. Gộp 3 nguồn lấy gợi ý dài nhất qua ngưỡng — field (ma trận F:&lt;field&gt;|&lt;đầu dòng ≤6 token&gt; hoặc ^&lt;đầu dòng trên&gt; → phần còn lại của dòng, trong khối &lt;field name&gt;; dòng &lt;field name="X" … → ma trận N:&lt;loại file&gt;:&lt;mục&gt;|X và N:&lt;loại file&gt;:&lt;mục&gt;|* — loại file theo đường dẫn: import (Templates/Upload) / clipboard / dir / grid…, mục = views / fields (SectionAt; người dùng báo trong &lt;views&gt; của Grid lại gợi ý thuộc tính khai báo của &lt;fields&gt;)), same (dòng giống trong chính file — dòng &lt;field name="X" chỉ so với dòng cùng mục; dòng &lt;field name="X" … → phần sau tên của 30 dòng &lt;field&gt; gần nhất trong CÙNG khối &lt;fields&gt; / &lt;views&gt; = khai báo đặc thù của file), tok (n-gram 1–4 token; SourceLexer: chuỗi ≤40 ký tự = 1 token, &amp;X;/%X; = 1 token, giữ hoa thường; mô hình xml / aspx / js (đoạn &lt;script&gt;); trộn n-gram của file đang sửa β=8). Ngưỡng theo loại × vùng (SourceGhost.AreaFor: xml / js / sql / aspx, file import "import", dòng trống /next, dòng vừa gõ tên field /fl; vùng chưa hiệu chỉnh lùi về vùng gần nhất; vùng import hiệu chỉnh trên source Fast — chỉ là con số) hiệu chỉnh trên nửa file mẫu không dùng để học: ngắn ≥ 90%, dài ≥ 60% (Alt+Shift+\ = edit.fastLong). Đo 45.923 chỗ trên Templates/fileSource: trước (structuralGhost viết tay) 0,2% chỗ có gợi ý, 0/69 đúng; ngắn 69,9% chỗ đúng 91,7%; dài 87,5% chỗ đúng 65,2% (ma trận đi kèm 4,0 MB, có ngưỡng vùng import). Đo trên nửa source Fast mới nhất không dùng để học (78.127 chỗ): chỉ mẫu đi kèm ngắn 48,2% / 91,6%, dài 74,0% / 65,5%; + học Fast mới nhất (lọc ngữ cảnh ≥6, ô field ≥3 — như khi chạy) ngắn 58,8% / 91,5%, dài 79,6% / 66,5%; vùng import (Upload) ngắn: giữa dòng 9,8% → 52,7% chỗ (đúng 91,8%), sau &lt;field name="X"&gt; 22,1% → 63,8% (92,1%), dòng trống 40,8% → 94,4% (92,6%); dài đều ≥ 61,8%. RAM khi nạp đủ kiến thức Fast ~240 MB managed (chỉ giữ 1 bản gộp mẫu + Fast). Kiến thức: đi kèm (chỉ học Templates/fileSource — repo công khai) + source dự án (WorkspaceConnection.ResolveSourceRoot; App_Data/Controllers + Main; nhớ 7 ngày) + source Fast các phiên bản (SourceVersions: thư mục FBOR1…FBOR2SP24.x, mỗi thư mục 1 gói vá; quét theo thứ tự bản, file trùng kích thước + giờ sửa với lần trước thì bỏ, đọc song song 8; tóm tắt file = root / field / entity / func / command / action / query / button / setting / var (cả Templates/Upload = import danh mục, chứng từ từ Excel và Templates/Clipboard; bỏ mẫu Excel / Rpt), so với lần xuất hiện trước → Change +/-/~ kèm thuộc tính đổi; 60 bản, 9.476 file, 83.993 thay đổi; thử trong Viewer: học xong 66 s) → &lt;Thư mục kiến thức&gt;\viewer\ (ghost, ask, versions). Hỏi Fast: khung phải (Ctrl+Shift+J = panel.fastAsk) — BM25 (AskIndex: không dấu, tách chữ hoa, cặp 2 từ) trên tài liệu controller / field / lookup (chỉ AutoComplete) / entity / include / button / func / import (Upload / Clipboard: loại, startRow, baseTable, listTable, field + check + errorCode, thông báo lỗi) / importfield / version (gộp theo tên controller, gồm cả Upload) / release / topic (cả quy ước import); ×1.6 đúng loại câu hỏi (×2.5 câu hỏi lịch sử), ×3 khoá trùng tên riêng trong câu; tài liệu import ×0.6 khi câu không nói tới import / upload / nhập Excel; câu có ý import / lịch sử thì bỏ gợi ý loại "field", câu lịch sử thì bỏ ý import; controller của dự án thắng, tài liệu gộp lấy từ nguồn lớn trước (thử trong Viewer: dự án 1 file từng che kiến thức mẫu); câu nêu bản (SP22.5) thì thẻ lịch sử chỉ giữ dòng của bản đó; ✔ / ✘ / ✎ Sửa → viewer\ask\feedback.json; lịch sử phiên ở %AppData%\Bcode\viewer-fastask. Bộ câu hỏi chuẩn 167 câu (sinh từ dữ liệu thật + viết tay, gồm 37 câu lịch sử phiên bản): top-1 67,1% → 96,4%, top-3 80,8% → 98,2%; 197 câu khi đã học source Fast các phiên bản (gồm 30 câu import): 54,8% → 90,9%, 69,0% → 95,9% (riêng import 63,3% → 93,3%, 76,7% → 96,7%). Ghost trong trang: Monaco chỉ vẽ chữ mờ khi dropdown gợi ý đóng hoặc khớp mục đang chọn → dropdown tên thuộc tính tự bật nhường cho gợi ý Fast đã có (fastGhostReadyAt, như với AI), kết quả Fast về ở ranh giới thuộc tính thì đóng dropdown (Ctrl+Space vẫn mở); thuộc tính của file import / clipboard theo SEED_ATTRIBUTES_BY_ROOT, xếp theo số lần dùng trong file; crossSectionGhost (field chưa có trong view) chỉ ở Grid / Lookup và chỉ lấy tên khai trong &lt;fields&gt; (bỏ CDATA) — người dùng báo gợi ý &lt;field name&gt; giữa các dòng &lt;item value&gt; của Dir và tên lạ từ đoạn JS ở Grid; kết quả Fast về sau mẫu structuralGhost thì inlineSuggest.hide rồi trigger lại (thử trong Viewer: 16/16 chỗ hiện đúng).</w:t>
             </w:r>
           </w:p>
         </w:tc>
@@ -13993,7 +14161,63 @@
                 <w:b/>
                 <w:sz w:val="16"/>
               </w:rPr>
-              <w:t>Lớp 4: AI ghost text</w:t>
+              <w:t>Lớp 4: SQL schema</w:t>
+            </w:r>
+          </w:p>
+        </w:tc>
+        <w:tc>
+          <w:tcPr>
+            <w:tcW w:type="dxa" w:w="3969"/>
+          </w:tcPr>
+          <w:p>
+            <w:pPr>
+              <w:spacing w:after="20"/>
+            </w:pPr>
+            <w:r/>
+            <w:r>
+              <w:rPr>
+                <w:b w:val="0"/>
+                <w:sz w:val="16"/>
+              </w:rPr>
+              <w:t>Host/SqlSchemaService.cs, WorkspaceConnection.cs; EditorBridge.BeginGetSqlTables/Columns</w:t>
+            </w:r>
+          </w:p>
+        </w:tc>
+        <w:tc>
+          <w:tcPr>
+            <w:tcW w:type="dxa" w:w="3855"/>
+          </w:tcPr>
+          <w:p>
+            <w:pPr>
+              <w:spacing w:after="20"/>
+            </w:pPr>
+            <w:r/>
+            <w:r>
+              <w:rPr>
+                <w:b w:val="0"/>
+                <w:sz w:val="16"/>
+              </w:rPr>
+              <w:t>Chỉ chạy khi con trỏ ở vùng SQL; đọc chung workspace của Bcode.</w:t>
+            </w:r>
+          </w:p>
+        </w:tc>
+      </w:tr>
+      <w:tr>
+        <w:tc>
+          <w:tcPr>
+            <w:tcW w:type="dxa" w:w="2041"/>
+          </w:tcPr>
+          <w:p>
+            <w:pPr>
+              <w:spacing w:after="20"/>
+            </w:pPr>
+            <w:r/>
+            <w:r>
+              <w:rPr>
+                <w:b/>
+                <w:sz w:val="16"/>
+              </w:rPr>
+              <w:t>Lớp 5: AI ghost text</w:t>
             </w:r>
           </w:p>
         </w:tc>
@@ -16584,6 +16808,82 @@
                 <w:b/>
                 <w:sz w:val="17"/>
               </w:rPr>
+              <w:t>Ctrl+Shift+J</w:t>
+            </w:r>
+          </w:p>
+        </w:tc>
+        <w:tc>
+          <w:tcPr>
+            <w:tcW w:type="dxa" w:w="6236"/>
+          </w:tcPr>
+          <w:p>
+            <w:pPr>
+              <w:spacing w:after="20"/>
+            </w:pPr>
+            <w:r/>
+            <w:r>
+              <w:rPr>
+                <w:b w:val="0"/>
+                <w:sz w:val="17"/>
+              </w:rPr>
+              <w:t>Hỏi Fast (không AI)</w:t>
+            </w:r>
+          </w:p>
+        </w:tc>
+      </w:tr>
+      <w:tr>
+        <w:tc>
+          <w:tcPr>
+            <w:tcW w:type="dxa" w:w="3628"/>
+          </w:tcPr>
+          <w:p>
+            <w:pPr>
+              <w:spacing w:after="20"/>
+            </w:pPr>
+            <w:r/>
+            <w:r>
+              <w:rPr>
+                <w:b/>
+                <w:sz w:val="17"/>
+              </w:rPr>
+              <w:t>Alt+Shift+\</w:t>
+            </w:r>
+          </w:p>
+        </w:tc>
+        <w:tc>
+          <w:tcPr>
+            <w:tcW w:type="dxa" w:w="6236"/>
+          </w:tcPr>
+          <w:p>
+            <w:pPr>
+              <w:spacing w:after="20"/>
+            </w:pPr>
+            <w:r/>
+            <w:r>
+              <w:rPr>
+                <w:b w:val="0"/>
+                <w:sz w:val="17"/>
+              </w:rPr>
+              <w:t>Gợi ý Fast dài ⇄ ngắn</w:t>
+            </w:r>
+          </w:p>
+        </w:tc>
+      </w:tr>
+      <w:tr>
+        <w:tc>
+          <w:tcPr>
+            <w:tcW w:type="dxa" w:w="3628"/>
+          </w:tcPr>
+          <w:p>
+            <w:pPr>
+              <w:spacing w:after="20"/>
+            </w:pPr>
+            <w:r/>
+            <w:r>
+              <w:rPr>
+                <w:b/>
+                <w:sz w:val="17"/>
+              </w:rPr>
               <w:t>Giữ Ctrl rồi Tab</w:t>
             </w:r>
           </w:p>
@@ -17292,6 +17592,62 @@
                 <w:sz w:val="16"/>
               </w:rPr>
               <w:t>Log chẩn đoán.</w:t>
+            </w:r>
+          </w:p>
+        </w:tc>
+      </w:tr>
+      <w:tr>
+        <w:tc>
+          <w:tcPr>
+            <w:tcW w:type="dxa" w:w="3685"/>
+          </w:tcPr>
+          <w:p>
+            <w:pPr>
+              <w:spacing w:after="20"/>
+            </w:pPr>
+            <w:r/>
+            <w:r>
+              <w:rPr>
+                <w:b/>
+                <w:sz w:val="16"/>
+              </w:rPr>
+              <w:t>&lt;Thư mục kiến thức&gt;\viewer\ (ghost, ask, versions, ask\feedback.json); …\viewer-fastask\</w:t>
+            </w:r>
+          </w:p>
+        </w:tc>
+        <w:tc>
+          <w:tcPr>
+            <w:tcW w:type="dxa" w:w="964"/>
+          </w:tcPr>
+          <w:p>
+            <w:pPr>
+              <w:spacing w:after="20"/>
+            </w:pPr>
+            <w:r/>
+            <w:r>
+              <w:rPr>
+                <w:b w:val="0"/>
+                <w:sz w:val="16"/>
+              </w:rPr>
+              <w:t>Viewer</w:t>
+            </w:r>
+          </w:p>
+        </w:tc>
+        <w:tc>
+          <w:tcPr>
+            <w:tcW w:type="dxa" w:w="5216"/>
+          </w:tcPr>
+          <w:p>
+            <w:pPr>
+              <w:spacing w:after="20"/>
+            </w:pPr>
+            <w:r/>
+            <w:r>
+              <w:rPr>
+                <w:b w:val="0"/>
+                <w:sz w:val="16"/>
+              </w:rPr>
+              <w:t>Gợi ý Fast + Hỏi Fast học từ source dự án / source Fast các phiên bản, xác nhận ✔ ✘ ✎ (thư mục kiến thức dùng chung với Bcode — KnowledgeDir trong settings.json; xoá được, tự học lại); lịch sử phiên Hỏi Fast luôn ở máy này.</w:t>
             </w:r>
           </w:p>
         </w:tc>

</xml_diff>

<commit_message>
bcode| fix chưa lọc được menu mẹ mà ko có menu con
</commit_message>
<xml_diff>
--- a/Cấu trúc Bcode  BcodeViewer (v3 - Tóm tắt).docx
+++ b/Cấu trúc Bcode  BcodeViewer (v3 - Tóm tắt).docx
@@ -5710,7 +5710,7 @@
           <w:rFonts w:ascii="Consolas" w:hAnsi="Consolas" w:eastAsia="Consolas"/>
           <w:sz w:val="13"/>
         </w:rPr>
-        <w:t>│   ├── WCommandService.cs  812</w:t>
+        <w:t>│   ├── WCommandService.cs  846</w:t>
       </w:r>
     </w:p>
     <w:p>
@@ -7398,7 +7398,7 @@
           <w:rFonts w:ascii="Consolas" w:hAnsi="Consolas" w:eastAsia="Consolas"/>
           <w:sz w:val="13"/>
         </w:rPr>
-        <w:t>│   │   ├── SourceGhost.cs  480</w:t>
+        <w:t>│   │   ├── SourceGhost.cs  498</w:t>
       </w:r>
     </w:p>
     <w:p>
@@ -10791,7 +10791,7 @@
                 <w:b w:val="0"/>
                 <w:sz w:val="16"/>
               </w:rPr>
-              <w:t>New (Insert/F4), Edit F3, Delete F8, Gen Script Menu F12, Check WCommand, Refresh F5; Design = mở ScreenDesigner; Ctrl+F5 chạy menu. Ô (C) trên thanh lọc (cả cây Mobile) = chỉ hiện menu customize (tên có (C) / (*)) kèm menu cha — WCommandService.FilterCustom, lọc trên bản sao. Chuột phải "Menu Name: Bar2 / Bar" (phím wcommand.menuName) = đổi tên hiển thị tiếng Việt ↔ tiếng Anh cho cả cây WCommand và Mobile, nhớ ở %AppData%\Bcode\menu_name_bar2.txt. Chuột phải "Yêu cầu liên quan (QLYC)…" (phím wcommand.requirements, mặc định trống; không có ở cây Mobile) → RequirementsRequested(MenuQuery: wmenu_id, Bar/Bar2, id menu con + menu cha) → MainForm.OpenFsgRequirementReportTab(menu) → tab Yêu cầu FSG lọc theo menu.</w:t>
+              <w:t>New (Insert/F4), Edit F3, Delete F8, Gen Script Menu F12, Check WCommand, Refresh F5; Design = mở ScreenDesigner; Ctrl+F5 chạy menu. Nguồn cây (WCommandService.LoadTreeAsync): wcommand; rỗng/không có → command (APP, FBFF); APP kèm vài menu web (command có menu_id0 + bar, nhiều ≥ 4 lần wcommand — CommandMenuCountAsync, vd BMT FF31 1028 vs 13) → cả hai, BuildHierarchy dựng riêng từng loại (mã 2 bảng trùng nhau), command trước; chữ ký nhẹ menu-cache có tiền tố "2:" để bản lưu cũ tải lại 1 lần. Ô (C) trên thanh lọc (cả cây Mobile) = chỉ hiện menu customize (tên có (C) / (*)) kèm menu cha — WCommandService.FilterCustom, lọc trên bản sao. Chuột phải "Menu Name: Bar2 / Bar" (phím wcommand.menuName) = đổi tên hiển thị tiếng Việt ↔ tiếng Anh cho cả cây WCommand và Mobile, nhớ ở %AppData%\Bcode\menu_name_bar2.txt. Chuột phải "Yêu cầu liên quan (QLYC)…" (phím wcommand.requirements, mặc định trống; không có ở cây Mobile) → RequirementsRequested(MenuQuery: wmenu_id, Bar/Bar2, id menu con + menu cha) → MainForm.OpenFsgRequirementReportTab(menu) → tab Yêu cầu FSG lọc theo menu.</w:t>
             </w:r>
           </w:p>
         </w:tc>
@@ -14141,7 +14141,7 @@
                 <w:b w:val="0"/>
                 <w:sz w:val="16"/>
               </w:rPr>
-              <w:t>Cùng cách với phía SQL của Bcode nhưng cho XML controller / JS / ASPX; bản riêng của Viewer (2 project không tham chiếu nhau). Ghost: sau Hint Code + field thiếu trong views, trước structuralGhost + AI; trang chỉ đọc bộ nhớ (fastCache), hỏi host BeginFastGhost sau 40 ms rồi trigger lại; chỉ ở cuối dòng hoặc trước dấu đóng tự chèn. Gộp 3 nguồn lấy gợi ý dài nhất qua ngưỡng — field (ma trận F:&lt;field&gt;|&lt;đầu dòng ≤6 token&gt; hoặc ^&lt;đầu dòng trên&gt; → phần còn lại của dòng, trong khối &lt;field name&gt;; dòng &lt;field name="X" … → ma trận N:&lt;loại file&gt;:&lt;mục&gt;|X và N:&lt;loại file&gt;:&lt;mục&gt;|* — loại file theo đường dẫn: import (Templates/Upload) / clipboard / dir / grid…, mục = views / fields (SectionAt; người dùng báo trong &lt;views&gt; của Grid lại gợi ý thuộc tính khai báo của &lt;fields&gt;)), same (dòng giống trong chính file — dòng &lt;field name="X" chỉ so với dòng cùng mục; dòng &lt;field name="X" … → phần sau tên của 30 dòng &lt;field&gt; gần nhất trong CÙNG khối &lt;fields&gt; / &lt;views&gt; = khai báo đặc thù của file), tok (n-gram 1–4 token; SourceLexer: chuỗi ≤40 ký tự = 1 token, &amp;X;/%X; = 1 token, giữ hoa thường; mô hình xml / aspx / js (đoạn &lt;script&gt;); trộn n-gram của file đang sửa β=8). Ngưỡng theo loại × vùng (SourceGhost.AreaFor: xml / js / sql / aspx, file import "import", dòng trống /next, dòng vừa gõ tên field /fl; vùng chưa hiệu chỉnh lùi về vùng gần nhất; vùng import hiệu chỉnh trên source Fast — chỉ là con số) hiệu chỉnh trên nửa file mẫu không dùng để học: ngắn ≥ 90%, dài ≥ 60% (Alt+Shift+\ = edit.fastLong). Đo 45.923 chỗ trên Templates/fileSource: trước (structuralGhost viết tay) 0,2% chỗ có gợi ý, 0/69 đúng; ngắn 69,9% chỗ đúng 91,7%; dài 87,5% chỗ đúng 65,2% (ma trận đi kèm 4,0 MB, có ngưỡng vùng import). Đo trên nửa source Fast mới nhất không dùng để học (78.127 chỗ): chỉ mẫu đi kèm ngắn 48,2% / 91,6%, dài 74,0% / 65,5%; + học Fast mới nhất (lọc ngữ cảnh ≥6, ô field ≥3 — như khi chạy) ngắn 58,8% / 91,5%, dài 79,6% / 66,5%; vùng import (Upload) ngắn: giữa dòng 9,8% → 52,7% chỗ (đúng 91,8%), sau &lt;field name="X"&gt; 22,1% → 63,8% (92,1%), dòng trống 40,8% → 94,4% (92,6%); dài đều ≥ 61,8%. RAM khi nạp đủ kiến thức Fast ~240 MB managed (chỉ giữ 1 bản gộp mẫu + Fast). Kiến thức: đi kèm (chỉ học Templates/fileSource — repo công khai) + source dự án (WorkspaceConnection.ResolveSourceRoot; App_Data/Controllers + Main; nhớ 7 ngày) + source Fast các phiên bản (SourceVersions: thư mục FBOR1…FBOR2SP24.x, mỗi thư mục 1 gói vá; quét theo thứ tự bản, file trùng kích thước + giờ sửa với lần trước thì bỏ, đọc song song 8; tóm tắt file = root / field / entity / func / command / action / query / button / setting / var (cả Templates/Upload = import danh mục, chứng từ từ Excel và Templates/Clipboard; bỏ mẫu Excel / Rpt), so với lần xuất hiện trước → Change +/-/~ kèm thuộc tính đổi; 60 bản, 9.476 file, 83.993 thay đổi; thử trong Viewer: học xong 66 s) → &lt;Thư mục kiến thức&gt;\viewer\ (ghost, ask, versions). Hỏi Fast: khung phải (Ctrl+Shift+J = panel.fastAsk) — BM25 (AskIndex: không dấu, tách chữ hoa, cặp 2 từ) trên tài liệu controller / field / lookup (chỉ AutoComplete) / entity / include / button / func / import (Upload / Clipboard: loại, startRow, baseTable, listTable, field + check + errorCode, thông báo lỗi) / importfield / version (gộp theo tên controller, gồm cả Upload) / release / topic (cả quy ước import); ×1.6 đúng loại câu hỏi (×2.5 câu hỏi lịch sử), ×3 khoá trùng tên riêng trong câu; tài liệu import ×0.6 khi câu không nói tới import / upload / nhập Excel; câu có ý import / lịch sử thì bỏ gợi ý loại "field", câu lịch sử thì bỏ ý import; controller của dự án thắng, tài liệu gộp lấy từ nguồn lớn trước (thử trong Viewer: dự án 1 file từng che kiến thức mẫu); câu nêu bản (SP22.5) thì thẻ lịch sử chỉ giữ dòng của bản đó; ✔ / ✘ / ✎ Sửa → viewer\ask\feedback.json; lịch sử phiên ở %AppData%\Bcode\viewer-fastask. Bộ câu hỏi chuẩn 167 câu (sinh từ dữ liệu thật + viết tay, gồm 37 câu lịch sử phiên bản): top-1 67,1% → 96,4%, top-3 80,8% → 98,2%; 197 câu khi đã học source Fast các phiên bản (gồm 30 câu import): 54,8% → 90,9%, 69,0% → 95,9% (riêng import 63,3% → 93,3%, 76,7% → 96,7%). Ghost trong trang: Monaco chỉ vẽ chữ mờ khi dropdown gợi ý đóng hoặc khớp mục đang chọn → dropdown tên thuộc tính tự bật nhường cho gợi ý Fast đã có (fastGhostReadyAt, như với AI), kết quả Fast về ở ranh giới thuộc tính thì đóng dropdown (Ctrl+Space vẫn mở); thuộc tính của file import / clipboard theo SEED_ATTRIBUTES_BY_ROOT, xếp theo số lần dùng trong file; crossSectionGhost (field chưa có trong view) chỉ ở Grid / Lookup và chỉ lấy tên khai trong &lt;fields&gt; (bỏ CDATA) — người dùng báo gợi ý &lt;field name&gt; giữa các dòng &lt;item value&gt; của Dir và tên lạ từ đoạn JS ở Grid; kết quả Fast về sau mẫu structuralGhost thì inlineSuggest.hide rồi trigger lại (thử trong Viewer: 16/16 chỗ hiện đúng).</w:t>
+              <w:t>Cùng cách với phía SQL của Bcode nhưng cho XML controller / JS / ASPX; bản riêng của Viewer (2 project không tham chiếu nhau). Ghost: sau Hint Code + field thiếu trong views, trước structuralGhost + AI; trang chỉ đọc bộ nhớ (fastCache), hỏi host BeginFastGhost sau 40 ms rồi trigger lại; chỉ ở cuối dòng hoặc trước dấu đóng tự chèn. Gộp 3 nguồn lấy gợi ý dài nhất qua ngưỡng — field (ma trận F:&lt;field&gt;|&lt;đầu dòng ≤6 token&gt; hoặc ^&lt;đầu dòng trên&gt; → phần còn lại của dòng, trong khối &lt;field name&gt;; dòng &lt;field name="X" … → ma trận N:&lt;loại file&gt;:&lt;mục&gt;|X và N:&lt;loại file&gt;:&lt;mục&gt;|* — loại file theo đường dẫn: import (Templates/Upload) / clipboard / dir / grid…, mục = template / views / fields (SectionAt — &lt;template&gt; = khối cột Excel của file import; người dùng báo trong &lt;views&gt; của Grid lại gợi ý thuộc tính khai báo của &lt;fields&gt;)), same (dòng giống trong chính file — dòng &lt;field name="X" chỉ so với dòng cùng mục, so khớp bỏ khoảng trắng quanh "=" của thuộc tính (name ="x"); field đã khai trong chính file thì độ tin n/(n+0.25) — 1 lần gặp đã đủ; dòng &lt;field name="X" … → phần sau tên của 30 dòng &lt;field&gt; gần nhất trong CÙNG khối &lt;fields&gt; / &lt;views&gt; = khai báo đặc thù của file), tok (n-gram 1–4 token; SourceLexer: chuỗi ≤40 ký tự = 1 token, &amp;X;/%X; = 1 token, giữ hoa thường; mô hình xml / aspx / js (đoạn &lt;script&gt;); trộn n-gram của file đang sửa β=8). Ngưỡng theo loại × vùng (SourceGhost.AreaFor: xml / js / sql / aspx, file import "import", dòng trống /next, dòng vừa gõ tên field /fl; vùng chưa hiệu chỉnh lùi về vùng gần nhất; vùng import hiệu chỉnh trên source Fast — chỉ là con số) hiệu chỉnh trên nửa file mẫu không dùng để học: ngắn ≥ 90%, dài ≥ 60% (Alt+Shift+\ = edit.fastLong). Đo 45.923 chỗ trên Templates/fileSource: trước (structuralGhost viết tay) 0,2% chỗ có gợi ý, 0/69 đúng; ngắn 69,9% chỗ đúng 91,7%; dài 87,5% chỗ đúng 65,2% (ma trận đi kèm 4,0 MB, có ngưỡng vùng import). Đo trên nửa source Fast mới nhất không dùng để học (78.127 chỗ): chỉ mẫu đi kèm ngắn 48,2% / 91,6%, dài 74,0% / 65,5%; + học Fast mới nhất (lọc ngữ cảnh ≥6, ô field ≥3 — như khi chạy) ngắn 58,8% / 91,5%, dài 79,6% / 66,5%; vùng import (Upload) ngắn: giữa dòng 9,8% → 52,7% chỗ (đúng 91,8%), sau &lt;field name="X"&gt; 22,1% → 63,8% (92,1%), dòng trống 40,8% → 94,4% (92,6%); dài đều ≥ 61,8%. RAM khi nạp đủ kiến thức Fast ~240 MB managed (chỉ giữ 1 bản gộp mẫu + Fast). Kiến thức: đi kèm (chỉ học Templates/fileSource — repo công khai) + source dự án (WorkspaceConnection.ResolveSourceRoot; App_Data/Controllers + Main; nhớ 7 ngày) + source Fast các phiên bản (SourceVersions: thư mục FBOR1…FBOR2SP24.x, mỗi thư mục 1 gói vá; quét theo thứ tự bản, file trùng kích thước + giờ sửa với lần trước thì bỏ, đọc song song 8; tóm tắt file = root / field / entity / func / command / action / query / button / setting / var (cả Templates/Upload = import danh mục, chứng từ từ Excel và Templates/Clipboard; bỏ mẫu Excel / Rpt), so với lần xuất hiện trước → Change +/-/~ kèm thuộc tính đổi; 60 bản, 9.476 file, 83.993 thay đổi; thử trong Viewer: học xong 66 s) → &lt;Thư mục kiến thức&gt;\viewer\ (ghost, ask, versions). Hỏi Fast: khung phải (Ctrl+Shift+J = panel.fastAsk) — BM25 (AskIndex: không dấu, tách chữ hoa, cặp 2 từ) trên tài liệu controller / field / lookup (chỉ AutoComplete) / entity / include / button / func / import (Upload / Clipboard: loại, startRow, baseTable, listTable, field + check + errorCode, thông báo lỗi) / importfield / version (gộp theo tên controller, gồm cả Upload) / release / topic (cả quy ước import); ×1.6 đúng loại câu hỏi (×2.5 câu hỏi lịch sử), ×3 khoá trùng tên riêng trong câu; tài liệu import ×0.6 khi câu không nói tới import / upload / nhập Excel; câu có ý import / lịch sử thì bỏ gợi ý loại "field", câu lịch sử thì bỏ ý import; controller của dự án thắng, tài liệu gộp lấy từ nguồn lớn trước (thử trong Viewer: dự án 1 file từng che kiến thức mẫu); câu nêu bản (SP22.5) thì thẻ lịch sử chỉ giữ dòng của bản đó; ✔ / ✘ / ✎ Sửa → viewer\ask\feedback.json; lịch sử phiên ở %AppData%\Bcode\viewer-fastask. Bộ câu hỏi chuẩn 167 câu (sinh từ dữ liệu thật + viết tay, gồm 37 câu lịch sử phiên bản): top-1 67,1% → 96,4%, top-3 80,8% → 98,2%; 197 câu khi đã học source Fast các phiên bản (gồm 30 câu import): 54,8% → 90,9%, 69,0% → 95,9% (riêng import 63,3% → 93,3%, 76,7% → 96,7%). Ghost trong trang: Monaco chỉ vẽ chữ mờ khi dropdown gợi ý đóng hoặc khớp mục đang chọn → dropdown tên thuộc tính tự bật nhường cho gợi ý Fast đã có (fastGhostReadyAt, như với AI), kết quả Fast về ở ranh giới thuộc tính thì đóng dropdown (Ctrl+Space vẫn mở); thuộc tính của file import / clipboard theo SEED_ATTRIBUTES_BY_ROOT, xếp theo số lần dùng trong file; crossSectionGhost (field chưa có trong view) chỉ ở Grid / Lookup và chỉ lấy tên khai trong &lt;fields&gt; (bỏ CDATA) — người dùng báo gợi ý &lt;field name&gt; giữa các dòng &lt;item value&gt; của Dir và tên lạ từ đoạn JS ở Grid; kết quả Fast về sau mẫu structuralGhost thì inlineSuggest.hide rồi trigger lại (thử trong Viewer: 16/16 chỗ hiện đúng).</w:t>
             </w:r>
           </w:p>
         </w:tc>

</xml_diff>

<commit_message>
bcodeviewer| file Upload: dòng trống trong <template><fields row> gợi ý khai nhanh cột Excel cho field nhập còn thiếu (Tab là xong)
- importTemplateGhost (completion.js, gọi từ crossSectionGhost khi gốc file là <import>): field nhập có column khác rỗng mà chưa có cột trong <template> → gợi ý <field name width><text v e/></field>, chọn field kế tiếp theo thứ tự khai sau cột đứng trên con trỏ.
- width hay dùng nhất của khối, starColor như các cột bắt buộc khi allowNulls="false", tiêu đề v/e từ header.xml, thụt lề theo khối; gõ dở "<fie" vẫn gợi ý.
- Hướng dẫn + bảng tính năng + tài liệu cấu trúc cập nhật.

Co-Authored-By: Claude Opus 5.5 <noreply@anthropic.com>
</commit_message>
<xml_diff>
--- a/Cấu trúc Bcode  BcodeViewer (v3 - Tóm tắt).docx
+++ b/Cấu trúc Bcode  BcodeViewer (v3 - Tóm tắt).docx
@@ -5710,7 +5710,7 @@
           <w:rFonts w:ascii="Consolas" w:hAnsi="Consolas" w:eastAsia="Consolas"/>
           <w:sz w:val="13"/>
         </w:rPr>
-        <w:t>│   ├── WCommandService.cs  846</w:t>
+        <w:t>│   ├── WCommandService.cs  856</w:t>
       </w:r>
     </w:p>
     <w:p>
@@ -7902,7 +7902,7 @@
           <w:rFonts w:ascii="Consolas" w:hAnsi="Consolas" w:eastAsia="Consolas"/>
           <w:sz w:val="13"/>
         </w:rPr>
-        <w:t>│   ├── completion.js  2540</w:t>
+        <w:t>│   ├── completion.js  2612</w:t>
       </w:r>
     </w:p>
     <w:p>
@@ -14141,7 +14141,7 @@
                 <w:b w:val="0"/>
                 <w:sz w:val="16"/>
               </w:rPr>
-              <w:t>Cùng cách với phía SQL của Bcode nhưng cho XML controller / JS / ASPX; bản riêng của Viewer (2 project không tham chiếu nhau). Ghost: sau Hint Code + field thiếu trong views, trước structuralGhost + AI; trang chỉ đọc bộ nhớ (fastCache), hỏi host BeginFastGhost sau 40 ms rồi trigger lại; chỉ ở cuối dòng hoặc trước dấu đóng tự chèn. Gộp 3 nguồn lấy gợi ý dài nhất qua ngưỡng — field (ma trận F:&lt;field&gt;|&lt;đầu dòng ≤6 token&gt; hoặc ^&lt;đầu dòng trên&gt; → phần còn lại của dòng, trong khối &lt;field name&gt;; dòng &lt;field name="X" … → ma trận N:&lt;loại file&gt;:&lt;mục&gt;|X và N:&lt;loại file&gt;:&lt;mục&gt;|* — loại file theo đường dẫn: import (Templates/Upload) / clipboard / dir / grid…, mục = template / views / fields (SectionAt — &lt;template&gt; = khối cột Excel của file import; người dùng báo trong &lt;views&gt; của Grid lại gợi ý thuộc tính khai báo của &lt;fields&gt;)), same (dòng giống trong chính file — dòng &lt;field name="X" chỉ so với dòng cùng mục, so khớp bỏ khoảng trắng quanh "=" của thuộc tính (name ="x"); field đã khai trong chính file thì độ tin n/(n+0.25) — 1 lần gặp đã đủ; dòng &lt;field name="X" … → phần sau tên của 30 dòng &lt;field&gt; gần nhất trong CÙNG khối &lt;fields&gt; / &lt;views&gt; = khai báo đặc thù của file), tok (n-gram 1–4 token; SourceLexer: chuỗi ≤40 ký tự = 1 token, &amp;X;/%X; = 1 token, giữ hoa thường; mô hình xml / aspx / js (đoạn &lt;script&gt;); trộn n-gram của file đang sửa β=8). Ngưỡng theo loại × vùng (SourceGhost.AreaFor: xml / js / sql / aspx, file import "import", dòng trống /next, dòng vừa gõ tên field /fl; vùng chưa hiệu chỉnh lùi về vùng gần nhất; vùng import hiệu chỉnh trên source Fast — chỉ là con số) hiệu chỉnh trên nửa file mẫu không dùng để học: ngắn ≥ 90%, dài ≥ 60% (Alt+Shift+\ = edit.fastLong). Đo 45.923 chỗ trên Templates/fileSource: trước (structuralGhost viết tay) 0,2% chỗ có gợi ý, 0/69 đúng; ngắn 69,9% chỗ đúng 91,7%; dài 87,5% chỗ đúng 65,2% (ma trận đi kèm 4,0 MB, có ngưỡng vùng import). Đo trên nửa source Fast mới nhất không dùng để học (78.127 chỗ): chỉ mẫu đi kèm ngắn 48,2% / 91,6%, dài 74,0% / 65,5%; + học Fast mới nhất (lọc ngữ cảnh ≥6, ô field ≥3 — như khi chạy) ngắn 58,8% / 91,5%, dài 79,6% / 66,5%; vùng import (Upload) ngắn: giữa dòng 9,8% → 52,7% chỗ (đúng 91,8%), sau &lt;field name="X"&gt; 22,1% → 63,8% (92,1%), dòng trống 40,8% → 94,4% (92,6%); dài đều ≥ 61,8%. RAM khi nạp đủ kiến thức Fast ~240 MB managed (chỉ giữ 1 bản gộp mẫu + Fast). Kiến thức: đi kèm (chỉ học Templates/fileSource — repo công khai) + source dự án (WorkspaceConnection.ResolveSourceRoot; App_Data/Controllers + Main; nhớ 7 ngày) + source Fast các phiên bản (SourceVersions: thư mục FBOR1…FBOR2SP24.x, mỗi thư mục 1 gói vá; quét theo thứ tự bản, file trùng kích thước + giờ sửa với lần trước thì bỏ, đọc song song 8; tóm tắt file = root / field / entity / func / command / action / query / button / setting / var (cả Templates/Upload = import danh mục, chứng từ từ Excel và Templates/Clipboard; bỏ mẫu Excel / Rpt), so với lần xuất hiện trước → Change +/-/~ kèm thuộc tính đổi; 60 bản, 9.476 file, 83.993 thay đổi; thử trong Viewer: học xong 66 s) → &lt;Thư mục kiến thức&gt;\viewer\ (ghost, ask, versions). Hỏi Fast: khung phải (Ctrl+Shift+J = panel.fastAsk) — BM25 (AskIndex: không dấu, tách chữ hoa, cặp 2 từ) trên tài liệu controller / field / lookup (chỉ AutoComplete) / entity / include / button / func / import (Upload / Clipboard: loại, startRow, baseTable, listTable, field + check + errorCode, thông báo lỗi) / importfield / version (gộp theo tên controller, gồm cả Upload) / release / topic (cả quy ước import); ×1.6 đúng loại câu hỏi (×2.5 câu hỏi lịch sử), ×3 khoá trùng tên riêng trong câu; tài liệu import ×0.6 khi câu không nói tới import / upload / nhập Excel; câu có ý import / lịch sử thì bỏ gợi ý loại "field", câu lịch sử thì bỏ ý import; controller của dự án thắng, tài liệu gộp lấy từ nguồn lớn trước (thử trong Viewer: dự án 1 file từng che kiến thức mẫu); câu nêu bản (SP22.5) thì thẻ lịch sử chỉ giữ dòng của bản đó; ✔ / ✘ / ✎ Sửa → viewer\ask\feedback.json; lịch sử phiên ở %AppData%\Bcode\viewer-fastask. Bộ câu hỏi chuẩn 167 câu (sinh từ dữ liệu thật + viết tay, gồm 37 câu lịch sử phiên bản): top-1 67,1% → 96,4%, top-3 80,8% → 98,2%; 197 câu khi đã học source Fast các phiên bản (gồm 30 câu import): 54,8% → 90,9%, 69,0% → 95,9% (riêng import 63,3% → 93,3%, 76,7% → 96,7%). Ghost trong trang: Monaco chỉ vẽ chữ mờ khi dropdown gợi ý đóng hoặc khớp mục đang chọn → dropdown tên thuộc tính tự bật nhường cho gợi ý Fast đã có (fastGhostReadyAt, như với AI), kết quả Fast về ở ranh giới thuộc tính thì đóng dropdown (Ctrl+Space vẫn mở); thuộc tính của file import / clipboard theo SEED_ATTRIBUTES_BY_ROOT, xếp theo số lần dùng trong file; crossSectionGhost (field chưa có trong view) chỉ ở Grid / Lookup và chỉ lấy tên khai trong &lt;fields&gt; (bỏ CDATA) — người dùng báo gợi ý &lt;field name&gt; giữa các dòng &lt;item value&gt; của Dir và tên lạ từ đoạn JS ở Grid; kết quả Fast về sau mẫu structuralGhost thì inlineSuggest.hide rồi trigger lại (thử trong Viewer: 16/16 chỗ hiện đúng).</w:t>
+              <w:t>Cùng cách với phía SQL của Bcode nhưng cho XML controller / JS / ASPX; bản riêng của Viewer (2 project không tham chiếu nhau). Ghost: sau Hint Code + field thiếu trong views, trước structuralGhost + AI; trang chỉ đọc bộ nhớ (fastCache), hỏi host BeginFastGhost sau 40 ms rồi trigger lại; chỉ ở cuối dòng hoặc trước dấu đóng tự chèn. Gộp 3 nguồn lấy gợi ý dài nhất qua ngưỡng — field (ma trận F:&lt;field&gt;|&lt;đầu dòng ≤6 token&gt; hoặc ^&lt;đầu dòng trên&gt; → phần còn lại của dòng, trong khối &lt;field name&gt;; dòng &lt;field name="X" … → ma trận N:&lt;loại file&gt;:&lt;mục&gt;|X và N:&lt;loại file&gt;:&lt;mục&gt;|* — loại file theo đường dẫn: import (Templates/Upload) / clipboard / dir / grid…, mục = template / views / fields (SectionAt — &lt;template&gt; = khối cột Excel của file import; người dùng báo trong &lt;views&gt; của Grid lại gợi ý thuộc tính khai báo của &lt;fields&gt;)), same (dòng giống trong chính file — dòng &lt;field name="X" chỉ so với dòng cùng mục, so khớp bỏ khoảng trắng quanh "=" của thuộc tính (name ="x"); field đã khai trong chính file thì độ tin n/(n+0.25) — 1 lần gặp đã đủ; dòng &lt;field name="X" … → phần sau tên của 30 dòng &lt;field&gt; gần nhất trong CÙNG khối &lt;fields&gt; / &lt;views&gt; = khai báo đặc thù của file), tok (n-gram 1–4 token; SourceLexer: chuỗi ≤40 ký tự = 1 token, &amp;X;/%X; = 1 token, giữ hoa thường; mô hình xml / aspx / js (đoạn &lt;script&gt;); trộn n-gram của file đang sửa β=8). Ngưỡng theo loại × vùng (SourceGhost.AreaFor: xml / js / sql / aspx, file import "import", dòng trống /next, dòng vừa gõ tên field /fl; vùng chưa hiệu chỉnh lùi về vùng gần nhất; vùng import hiệu chỉnh trên source Fast — chỉ là con số) hiệu chỉnh trên nửa file mẫu không dùng để học: ngắn ≥ 90%, dài ≥ 60% (Alt+Shift+\ = edit.fastLong). Đo 45.923 chỗ trên Templates/fileSource: trước (structuralGhost viết tay) 0,2% chỗ có gợi ý, 0/69 đúng; ngắn 69,9% chỗ đúng 91,7%; dài 87,5% chỗ đúng 65,2% (ma trận đi kèm 4,0 MB, có ngưỡng vùng import). Đo trên nửa source Fast mới nhất không dùng để học (78.127 chỗ): chỉ mẫu đi kèm ngắn 48,2% / 91,6%, dài 74,0% / 65,5%; + học Fast mới nhất (lọc ngữ cảnh ≥6, ô field ≥3 — như khi chạy) ngắn 58,8% / 91,5%, dài 79,6% / 66,5%; vùng import (Upload) ngắn: giữa dòng 9,8% → 52,7% chỗ (đúng 91,8%), sau &lt;field name="X"&gt; 22,1% → 63,8% (92,1%), dòng trống 40,8% → 94,4% (92,6%); dài đều ≥ 61,8%. RAM khi nạp đủ kiến thức Fast ~240 MB managed (chỉ giữ 1 bản gộp mẫu + Fast). Kiến thức: đi kèm (chỉ học Templates/fileSource — repo công khai) + source dự án (WorkspaceConnection.ResolveSourceRoot; App_Data/Controllers + Main; nhớ 7 ngày) + source Fast các phiên bản (SourceVersions: thư mục FBOR1…FBOR2SP24.x, mỗi thư mục 1 gói vá; quét theo thứ tự bản, file trùng kích thước + giờ sửa với lần trước thì bỏ, đọc song song 8; tóm tắt file = root / field / entity / func / command / action / query / button / setting / var (cả Templates/Upload = import danh mục, chứng từ từ Excel và Templates/Clipboard; bỏ mẫu Excel / Rpt), so với lần xuất hiện trước → Change +/-/~ kèm thuộc tính đổi; 60 bản, 9.476 file, 83.993 thay đổi; thử trong Viewer: học xong 66 s) → &lt;Thư mục kiến thức&gt;\viewer\ (ghost, ask, versions). Hỏi Fast: khung phải (Ctrl+Shift+J = panel.fastAsk) — BM25 (AskIndex: không dấu, tách chữ hoa, cặp 2 từ) trên tài liệu controller / field / lookup (chỉ AutoComplete) / entity / include / button / func / import (Upload / Clipboard: loại, startRow, baseTable, listTable, field + check + errorCode, thông báo lỗi) / importfield / version (gộp theo tên controller, gồm cả Upload) / release / topic (cả quy ước import); ×1.6 đúng loại câu hỏi (×2.5 câu hỏi lịch sử), ×3 khoá trùng tên riêng trong câu; tài liệu import ×0.6 khi câu không nói tới import / upload / nhập Excel; câu có ý import / lịch sử thì bỏ gợi ý loại "field", câu lịch sử thì bỏ ý import; controller của dự án thắng, tài liệu gộp lấy từ nguồn lớn trước (thử trong Viewer: dự án 1 file từng che kiến thức mẫu); câu nêu bản (SP22.5) thì thẻ lịch sử chỉ giữ dòng của bản đó; ✔ / ✘ / ✎ Sửa → viewer\ask\feedback.json; lịch sử phiên ở %AppData%\Bcode\viewer-fastask. Bộ câu hỏi chuẩn 167 câu (sinh từ dữ liệu thật + viết tay, gồm 37 câu lịch sử phiên bản): top-1 67,1% → 96,4%, top-3 80,8% → 98,2%; 197 câu khi đã học source Fast các phiên bản (gồm 30 câu import): 54,8% → 90,9%, 69,0% → 95,9% (riêng import 63,3% → 93,3%, 76,7% → 96,7%). Ghost trong trang: Monaco chỉ vẽ chữ mờ khi dropdown gợi ý đóng hoặc khớp mục đang chọn → dropdown tên thuộc tính tự bật nhường cho gợi ý Fast đã có (fastGhostReadyAt, như với AI), kết quả Fast về ở ranh giới thuộc tính thì đóng dropdown (Ctrl+Space vẫn mở); thuộc tính của file import / clipboard theo SEED_ATTRIBUTES_BY_ROOT, xếp theo số lần dùng trong file; crossSectionGhost (field chưa có trong view) chỉ ở Grid / Lookup và chỉ lấy tên khai trong &lt;fields&gt; (bỏ CDATA); file import → importTemplateGhost: dòng trống trong &lt;template&gt;&lt;fields row&gt; gợi ý cả khối &lt;field name width (+ starColor nếu allowNulls="false")&gt;&lt;text v e/&gt;&lt;/field&gt; cho field nhập kế tiếp (column khác rỗng) chưa có cột Excel, tiêu đề từ header.xml — người dùng báo gợi ý &lt;field name&gt; giữa các dòng &lt;item value&gt; của Dir và tên lạ từ đoạn JS ở Grid; kết quả Fast về sau mẫu structuralGhost thì inlineSuggest.hide rồi trigger lại (thử trong Viewer: 16/16 chỗ hiện đúng).</w:t>
             </w:r>
           </w:p>
         </w:tc>

</xml_diff>

<commit_message>
bcode| fix không sửa giá trị được khi tab, bcodeviewr| fix dư dấu > ở cuối
</commit_message>
<xml_diff>
--- a/Cấu trúc Bcode  BcodeViewer (v3 - Tóm tắt).docx
+++ b/Cấu trúc Bcode  BcodeViewer (v3 - Tóm tắt).docx
@@ -3202,7 +3202,7 @@
           <w:rFonts w:ascii="Consolas" w:hAnsi="Consolas" w:eastAsia="Consolas"/>
           <w:sz w:val="13"/>
         </w:rPr>
-        <w:t>│   ├── TableEditControl.cs  2133</w:t>
+        <w:t>│   ├── TableEditControl.cs  2146</w:t>
       </w:r>
     </w:p>
     <w:p>
@@ -7902,7 +7902,7 @@
           <w:rFonts w:ascii="Consolas" w:hAnsi="Consolas" w:eastAsia="Consolas"/>
           <w:sz w:val="13"/>
         </w:rPr>
-        <w:t>│   ├── completion.js  2612</w:t>
+        <w:t>│   ├── completion.js  2615</w:t>
       </w:r>
     </w:p>
     <w:p>
@@ -10308,7 +10308,7 @@
                 <w:b w:val="0"/>
                 <w:sz w:val="16"/>
               </w:rPr>
-              <w:t>Sửa dữ liệu kiểu Excel; Add New Column / Edit Column = ColumnDesignForm (bảng Name/Type/Length/Not NULL như hộp Design của FCode, App: ColumnDesignPage trong NativePages.Dialogs.cs) → BuildColumnScript (Gen Add / Alter Column); ô Top mặc định 0 = tất cả; Enter như FCode: ô Table → nạp bảng / chọn gợi ý rồi focus ô Where; ô Where gõ tên cột + Enter → chèn mẫu theo kiểu cột (TableEditControl.PushStructure đẩy tên+kiểu xuống thanh: window.setColTypes / NativeTableBar.SetColumnTypes; tablebar.html whereSnippet = NativeTableBar.WhereSnippet): char/varchar/text → like '%|%', nchar/nvarchar/ntext → like N'%|%', số → " = |", ngày/uniqueidentifier → = '|'; không phải tên cột (hoặc đang trong chuỗi / vế giá trị) → Enter = Load; chọn cột trong gợi ý bằng Enter / bấm chuột (vd gõ "ghi" → ghi_chu) → BarInsertColumn + BarWhereEnter chèn luôn mẫu như FCode (Tab gửi col-key "tab", chỉ điền tên). Ctrl+G Goto Column (ResultGridMenu → GotoColumnForm currentColumn; resultview.html gotoColumn) điền sẵn tên cột đang đứng, bôi đen; Ctrl+Shift+C (table.copyColumnName, TryRunGridShortcut → ResultGridMenu.CopySelectedColumnNames) = copy tên cột ô đang chọn (nhiều cột "a, b"); Add Script = DELETE + INSERT; F1 chi tiết dòng, F3 khai báo nhanh danh sách. Dòng "Menu: Phiếu nhập kho (inctpnd.aspx)" dưới Where/Order (tablebar.html .menu-row / NativeTableBar.SetMenus; ẩn khi không tra được → thanh giữ chiều cao cũ): TableMenuService.FindAsync tra theo gốc tên bảng (bỏ $yyyymm/$000000/$log) — 1) dmct9 (App): c$/m$/d$/i$ → url → menu wcommand có link cùng trang aspx; 2) controller của menu: CommandTableService.ResolveIn (Dir table= + Grid chi tiết; table="&amp;Tag;" tra &lt;!ENTITY&gt; trong file Dir). Cache theo workspace + số menu trên cây, ⟳ Refresh database = Forget. Gõ thì chờ 300 ms, tải xong bảng thì tra ngay. Bấm menu → MenuRevealRequested → hiện cây WCommand + RevealAsync (chỉ chọn node, không mở File Lookup). Menu trùng tên ở nhiều phân hệ → thêm [phân hệ]; tối đa 4 + "+N". Chuột phải ô Table khi là bảng phân kỳ (xxx$yyyymm) → "Check Partitions Struct" (tablebar.html contextmenu → action table-context; App: NativeTableBar.ContextMenuHook bắt WM_CONTEXTMENU; bảng khác giữ menu mặc định) → Forms/PartitionCheckForm + Web/Shell/partitioncheck.html (App: Controls/NativePages.PartitionCheck.cs): TableDataService.CheckPartitionStructureAsync so mọi {prefix}$dddddd với {prefix}$000000 (1 câu INFORMATION_SCHEMA.COLUMNS) — thiếu / thừa cột, khác kiểu hoặc null, khác thứ tự cột; "Tables are same structure" khi giống hết; Copy ra Tab-separated. Add Script khi bảng 0 dòng → StructureAddScriptAsync: cấu trúc bảng (SqlObjectBrowserService.GetTableSchemaScriptAsync, lỗi thì GenStructureTable) bọc DataScriptService.GenerateStructureScript. Add Script (DataScriptService): bảng có identity → #data lấy [id] + 0, nạp vào bảng thật bọc SET IDENTITY_INSERT ON/OFF kèm danh sách cột; bỏ cột computed/rowversion (TableWriteInfo).</w:t>
+              <w:t>Sửa dữ liệu kiểu Excel; tự lưu khi rời dòng (RowValidated → AutoSaveRowAsync) và khi rời ô đã sửa của dòng đã có (CellEndEdit → DataRowView.EndEdit + AutoSaveRowAsync: Tab / Shift+Tab / bấm ô khác cùng dòng; dòng mới vẫn chờ rời dòng); Add New Column / Edit Column = ColumnDesignForm (bảng Name/Type/Length/Not NULL như hộp Design của FCode, App: ColumnDesignPage trong NativePages.Dialogs.cs) → BuildColumnScript (Gen Add / Alter Column); ô Top mặc định 0 = tất cả; Enter như FCode: ô Table → nạp bảng / chọn gợi ý rồi focus ô Where; ô Where gõ tên cột + Enter → chèn mẫu theo kiểu cột (TableEditControl.PushStructure đẩy tên+kiểu xuống thanh: window.setColTypes / NativeTableBar.SetColumnTypes; tablebar.html whereSnippet = NativeTableBar.WhereSnippet): char/varchar/text → like '%|%', nchar/nvarchar/ntext → like N'%|%', số → " = |", ngày/uniqueidentifier → = '|'; không phải tên cột (hoặc đang trong chuỗi / vế giá trị) → Enter = Load; chọn cột trong gợi ý bằng Enter / bấm chuột (vd gõ "ghi" → ghi_chu) → BarInsertColumn + BarWhereEnter chèn luôn mẫu như FCode (Tab gửi col-key "tab", chỉ điền tên). Ctrl+G Goto Column (ResultGridMenu → GotoColumnForm currentColumn; resultview.html gotoColumn) điền sẵn tên cột đang đứng, bôi đen; Ctrl+Shift+C (table.copyColumnName, TryRunGridShortcut → ResultGridMenu.CopySelectedColumnNames) = copy tên cột ô đang chọn (nhiều cột "a, b"); Add Script = DELETE + INSERT; F1 chi tiết dòng, F3 khai báo nhanh danh sách. Dòng "Menu: Phiếu nhập kho (inctpnd.aspx)" dưới Where/Order (tablebar.html .menu-row / NativeTableBar.SetMenus; ẩn khi không tra được → thanh giữ chiều cao cũ): TableMenuService.FindAsync tra theo gốc tên bảng (bỏ $yyyymm/$000000/$log) — 1) dmct9 (App): c$/m$/d$/i$ → url → menu wcommand có link cùng trang aspx; 2) controller của menu: CommandTableService.ResolveIn (Dir table= + Grid chi tiết; table="&amp;Tag;" tra &lt;!ENTITY&gt; trong file Dir). Cache theo workspace + số menu trên cây, ⟳ Refresh database = Forget. Gõ thì chờ 300 ms, tải xong bảng thì tra ngay. Bấm menu → MenuRevealRequested → hiện cây WCommand + RevealAsync (chỉ chọn node, không mở File Lookup). Menu trùng tên ở nhiều phân hệ → thêm [phân hệ]; tối đa 4 + "+N". Chuột phải ô Table khi là bảng phân kỳ (xxx$yyyymm) → "Check Partitions Struct" (tablebar.html contextmenu → action table-context; App: NativeTableBar.ContextMenuHook bắt WM_CONTEXTMENU; bảng khác giữ menu mặc định) → Forms/PartitionCheckForm + Web/Shell/partitioncheck.html (App: Controls/NativePages.PartitionCheck.cs): TableDataService.CheckPartitionStructureAsync so mọi {prefix}$dddddd với {prefix}$000000 (1 câu INFORMATION_SCHEMA.COLUMNS) — thiếu / thừa cột, khác kiểu hoặc null, khác thứ tự cột; "Tables are same structure" khi giống hết; Copy ra Tab-separated. Add Script khi bảng 0 dòng → StructureAddScriptAsync: cấu trúc bảng (SqlObjectBrowserService.GetTableSchemaScriptAsync, lỗi thì GenStructureTable) bọc DataScriptService.GenerateStructureScript. Add Script (DataScriptService): bảng có identity → #data lấy [id] + 0, nạp vào bảng thật bọc SET IDENTITY_INSERT ON/OFF kèm danh sách cột; bỏ cột computed/rowversion (TableWriteInfo).</w:t>
             </w:r>
           </w:p>
         </w:tc>

</xml_diff>

<commit_message>
bcodeviewr| cải thiện gợi ý
</commit_message>
<xml_diff>
--- a/Cấu trúc Bcode  BcodeViewer (v3 - Tóm tắt).docx
+++ b/Cấu trúc Bcode  BcodeViewer (v3 - Tóm tắt).docx
@@ -2374,7 +2374,7 @@
           <w:rFonts w:ascii="Consolas" w:hAnsi="Consolas" w:eastAsia="Consolas"/>
           <w:sz w:val="13"/>
         </w:rPr>
-        <w:t>│   ├── NativeAdvanceNoteControl.cs  1172</w:t>
+        <w:t>│   ├── NativeAdvanceNoteControl.cs  1178</w:t>
       </w:r>
     </w:p>
     <w:p>
@@ -2674,7 +2674,7 @@
           <w:rFonts w:ascii="Consolas" w:hAnsi="Consolas" w:eastAsia="Consolas"/>
           <w:sz w:val="13"/>
         </w:rPr>
-        <w:t>│   ├── NativePages.GenUpdate.cs  385</w:t>
+        <w:t>│   ├── NativePages.GenUpdate.cs  386</w:t>
       </w:r>
     </w:p>
     <w:p>
@@ -4258,18 +4258,6 @@
           <w:rFonts w:ascii="Consolas" w:hAnsi="Consolas" w:eastAsia="Consolas"/>
           <w:sz w:val="13"/>
         </w:rPr>
-        <w:t>│   ├── LocalSecrets.cs  30</w:t>
-      </w:r>
-    </w:p>
-    <w:p>
-      <w:pPr>
-        <w:spacing w:after="0" w:before="0" w:line="240" w:lineRule="auto"/>
-      </w:pPr>
-      <w:r>
-        <w:rPr>
-          <w:rFonts w:ascii="Consolas" w:hAnsi="Consolas" w:eastAsia="Consolas"/>
-          <w:sz w:val="13"/>
-        </w:rPr>
         <w:t>│   ├── LocalSecrets.Empty.cs  38</w:t>
       </w:r>
     </w:p>
@@ -5110,7 +5098,7 @@
           <w:rFonts w:ascii="Consolas" w:hAnsi="Consolas" w:eastAsia="Consolas"/>
           <w:sz w:val="13"/>
         </w:rPr>
-        <w:t>│   ├── GenAllService.Delivery.cs  99</w:t>
+        <w:t>│   ├── GenAllService.Delivery.cs  117</w:t>
       </w:r>
     </w:p>
     <w:p>
@@ -6130,7 +6118,7 @@
           <w:rFonts w:ascii="Consolas" w:hAnsi="Consolas" w:eastAsia="Consolas"/>
           <w:sz w:val="13"/>
         </w:rPr>
-        <w:t>│       ├── advnote.html  805</w:t>
+        <w:t>│       ├── advnote.html  806</w:t>
       </w:r>
     </w:p>
     <w:p>
@@ -6550,7 +6538,7 @@
           <w:rFonts w:ascii="Consolas" w:hAnsi="Consolas" w:eastAsia="Consolas"/>
           <w:sz w:val="13"/>
         </w:rPr>
-        <w:t>│       ├── genupdate.html  612</w:t>
+        <w:t>│       ├── genupdate.html  616</w:t>
       </w:r>
     </w:p>
     <w:p>
@@ -7374,7 +7362,31 @@
           <w:rFonts w:ascii="Consolas" w:hAnsi="Consolas" w:eastAsia="Consolas"/>
           <w:sz w:val="13"/>
         </w:rPr>
-        <w:t>│   │   ├── FastSourceService.cs  240</w:t>
+        <w:t>│   │   ├── FastSourceService.cs  261</w:t>
+      </w:r>
+    </w:p>
+    <w:p>
+      <w:pPr>
+        <w:spacing w:after="0" w:before="0" w:line="240" w:lineRule="auto"/>
+      </w:pPr>
+      <w:r>
+        <w:rPr>
+          <w:rFonts w:ascii="Consolas" w:hAnsi="Consolas" w:eastAsia="Consolas"/>
+          <w:sz w:val="13"/>
+        </w:rPr>
+        <w:t>│   │   ├── FastSourceService.Shared.cs  226</w:t>
+      </w:r>
+    </w:p>
+    <w:p>
+      <w:pPr>
+        <w:spacing w:after="0" w:before="0" w:line="240" w:lineRule="auto"/>
+      </w:pPr>
+      <w:r>
+        <w:rPr>
+          <w:rFonts w:ascii="Consolas" w:hAnsi="Consolas" w:eastAsia="Consolas"/>
+          <w:sz w:val="13"/>
+        </w:rPr>
+        <w:t>│   │   ├── FastSourceService.Siblings.cs  96</w:t>
       </w:r>
     </w:p>
     <w:p>
@@ -7398,19 +7410,19 @@
           <w:rFonts w:ascii="Consolas" w:hAnsi="Consolas" w:eastAsia="Consolas"/>
           <w:sz w:val="13"/>
         </w:rPr>
-        <w:t>│   │   ├── SourceGhost.cs  498</w:t>
-      </w:r>
-    </w:p>
-    <w:p>
-      <w:pPr>
-        <w:spacing w:after="0" w:before="0" w:line="240" w:lineRule="auto"/>
-      </w:pPr>
-      <w:r>
-        <w:rPr>
-          <w:rFonts w:ascii="Consolas" w:hAnsi="Consolas" w:eastAsia="Consolas"/>
-          <w:sz w:val="13"/>
-        </w:rPr>
-        <w:t>│   │   ├── SourceGhostMiner.cs  173</w:t>
+        <w:t>│   │   ├── SourceGhost.cs  843</w:t>
+      </w:r>
+    </w:p>
+    <w:p>
+      <w:pPr>
+        <w:spacing w:after="0" w:before="0" w:line="240" w:lineRule="auto"/>
+      </w:pPr>
+      <w:r>
+        <w:rPr>
+          <w:rFonts w:ascii="Consolas" w:hAnsi="Consolas" w:eastAsia="Consolas"/>
+          <w:sz w:val="13"/>
+        </w:rPr>
+        <w:t>│   │   ├── SourceGhostMiner.cs  164</w:t>
       </w:r>
     </w:p>
     <w:p>
@@ -7446,7 +7458,7 @@
           <w:rFonts w:ascii="Consolas" w:hAnsi="Consolas" w:eastAsia="Consolas"/>
           <w:sz w:val="13"/>
         </w:rPr>
-        <w:t>│   │   └── ViewerKnowledge.cs  72</w:t>
+        <w:t>│   │   └── ViewerKnowledge.cs  86</w:t>
       </w:r>
     </w:p>
     <w:p>
@@ -7494,7 +7506,7 @@
           <w:rFonts w:ascii="Consolas" w:hAnsi="Consolas" w:eastAsia="Consolas"/>
           <w:sz w:val="13"/>
         </w:rPr>
-        <w:t>│   ├── EditorBridge.cs  1511</w:t>
+        <w:t>│   ├── EditorBridge.cs  1523</w:t>
       </w:r>
     </w:p>
     <w:p>
@@ -7734,7 +7746,7 @@
           <w:rFonts w:ascii="Consolas" w:hAnsi="Consolas" w:eastAsia="Consolas"/>
           <w:sz w:val="13"/>
         </w:rPr>
-        <w:t>│   └── ViewerSettings.cs  213</w:t>
+        <w:t>│   └── ViewerSettings.cs  217</w:t>
       </w:r>
     </w:p>
     <w:p>
@@ -7902,7 +7914,7 @@
           <w:rFonts w:ascii="Consolas" w:hAnsi="Consolas" w:eastAsia="Consolas"/>
           <w:sz w:val="13"/>
         </w:rPr>
-        <w:t>│   ├── completion.js  2615</w:t>
+        <w:t>│   ├── completion.js  2647</w:t>
       </w:r>
     </w:p>
     <w:p>
@@ -8166,7 +8178,7 @@
           <w:rFonts w:ascii="Consolas" w:hAnsi="Consolas" w:eastAsia="Consolas"/>
           <w:sz w:val="13"/>
         </w:rPr>
-        <w:t>│   ├── settings.js  720</w:t>
+        <w:t>│   ├── settings.js  733</w:t>
       </w:r>
     </w:p>
     <w:p>
@@ -8898,7 +8910,7 @@
           <w:rFonts w:ascii="Consolas" w:hAnsi="Consolas" w:eastAsia="Consolas"/>
           <w:sz w:val="13"/>
         </w:rPr>
-        <w:t>└── Program.cs  94</w:t>
+        <w:t>└── Program.cs  90</w:t>
       </w:r>
     </w:p>
     <w:p>
@@ -14141,7 +14153,7 @@
                 <w:b w:val="0"/>
                 <w:sz w:val="16"/>
               </w:rPr>
-              <w:t>Cùng cách với phía SQL của Bcode nhưng cho XML controller / JS / ASPX; bản riêng của Viewer (2 project không tham chiếu nhau). Ghost: sau Hint Code + field thiếu trong views, trước structuralGhost + AI; trang chỉ đọc bộ nhớ (fastCache), hỏi host BeginFastGhost sau 40 ms rồi trigger lại; chỉ ở cuối dòng hoặc trước dấu đóng tự chèn. Gộp 3 nguồn lấy gợi ý dài nhất qua ngưỡng — field (ma trận F:&lt;field&gt;|&lt;đầu dòng ≤6 token&gt; hoặc ^&lt;đầu dòng trên&gt; → phần còn lại của dòng, trong khối &lt;field name&gt;; dòng &lt;field name="X" … → ma trận N:&lt;loại file&gt;:&lt;mục&gt;|X và N:&lt;loại file&gt;:&lt;mục&gt;|* — loại file theo đường dẫn: import (Templates/Upload) / clipboard / dir / grid…, mục = template / views / fields (SectionAt — &lt;template&gt; = khối cột Excel của file import; người dùng báo trong &lt;views&gt; của Grid lại gợi ý thuộc tính khai báo của &lt;fields&gt;)), same (dòng giống trong chính file — dòng &lt;field name="X" chỉ so với dòng cùng mục, so khớp bỏ khoảng trắng quanh "=" của thuộc tính (name ="x"); field đã khai trong chính file thì độ tin n/(n+0.25) — 1 lần gặp đã đủ; dòng &lt;field name="X" … → phần sau tên của 30 dòng &lt;field&gt; gần nhất trong CÙNG khối &lt;fields&gt; / &lt;views&gt; = khai báo đặc thù của file), tok (n-gram 1–4 token; SourceLexer: chuỗi ≤40 ký tự = 1 token, &amp;X;/%X; = 1 token, giữ hoa thường; mô hình xml / aspx / js (đoạn &lt;script&gt;); trộn n-gram của file đang sửa β=8). Ngưỡng theo loại × vùng (SourceGhost.AreaFor: xml / js / sql / aspx, file import "import", dòng trống /next, dòng vừa gõ tên field /fl; vùng chưa hiệu chỉnh lùi về vùng gần nhất; vùng import hiệu chỉnh trên source Fast — chỉ là con số) hiệu chỉnh trên nửa file mẫu không dùng để học: ngắn ≥ 90%, dài ≥ 60% (Alt+Shift+\ = edit.fastLong). Đo 45.923 chỗ trên Templates/fileSource: trước (structuralGhost viết tay) 0,2% chỗ có gợi ý, 0/69 đúng; ngắn 69,9% chỗ đúng 91,7%; dài 87,5% chỗ đúng 65,2% (ma trận đi kèm 4,0 MB, có ngưỡng vùng import). Đo trên nửa source Fast mới nhất không dùng để học (78.127 chỗ): chỉ mẫu đi kèm ngắn 48,2% / 91,6%, dài 74,0% / 65,5%; + học Fast mới nhất (lọc ngữ cảnh ≥6, ô field ≥3 — như khi chạy) ngắn 58,8% / 91,5%, dài 79,6% / 66,5%; vùng import (Upload) ngắn: giữa dòng 9,8% → 52,7% chỗ (đúng 91,8%), sau &lt;field name="X"&gt; 22,1% → 63,8% (92,1%), dòng trống 40,8% → 94,4% (92,6%); dài đều ≥ 61,8%. RAM khi nạp đủ kiến thức Fast ~240 MB managed (chỉ giữ 1 bản gộp mẫu + Fast). Kiến thức: đi kèm (chỉ học Templates/fileSource — repo công khai) + source dự án (WorkspaceConnection.ResolveSourceRoot; App_Data/Controllers + Main; nhớ 7 ngày) + source Fast các phiên bản (SourceVersions: thư mục FBOR1…FBOR2SP24.x, mỗi thư mục 1 gói vá; quét theo thứ tự bản, file trùng kích thước + giờ sửa với lần trước thì bỏ, đọc song song 8; tóm tắt file = root / field / entity / func / command / action / query / button / setting / var (cả Templates/Upload = import danh mục, chứng từ từ Excel và Templates/Clipboard; bỏ mẫu Excel / Rpt), so với lần xuất hiện trước → Change +/-/~ kèm thuộc tính đổi; 60 bản, 9.476 file, 83.993 thay đổi; thử trong Viewer: học xong 66 s) → &lt;Thư mục kiến thức&gt;\viewer\ (ghost, ask, versions). Hỏi Fast: khung phải (Ctrl+Shift+J = panel.fastAsk) — BM25 (AskIndex: không dấu, tách chữ hoa, cặp 2 từ) trên tài liệu controller / field / lookup (chỉ AutoComplete) / entity / include / button / func / import (Upload / Clipboard: loại, startRow, baseTable, listTable, field + check + errorCode, thông báo lỗi) / importfield / version (gộp theo tên controller, gồm cả Upload) / release / topic (cả quy ước import); ×1.6 đúng loại câu hỏi (×2.5 câu hỏi lịch sử), ×3 khoá trùng tên riêng trong câu; tài liệu import ×0.6 khi câu không nói tới import / upload / nhập Excel; câu có ý import / lịch sử thì bỏ gợi ý loại "field", câu lịch sử thì bỏ ý import; controller của dự án thắng, tài liệu gộp lấy từ nguồn lớn trước (thử trong Viewer: dự án 1 file từng che kiến thức mẫu); câu nêu bản (SP22.5) thì thẻ lịch sử chỉ giữ dòng của bản đó; ✔ / ✘ / ✎ Sửa → viewer\ask\feedback.json; lịch sử phiên ở %AppData%\Bcode\viewer-fastask. Bộ câu hỏi chuẩn 167 câu (sinh từ dữ liệu thật + viết tay, gồm 37 câu lịch sử phiên bản): top-1 67,1% → 96,4%, top-3 80,8% → 98,2%; 197 câu khi đã học source Fast các phiên bản (gồm 30 câu import): 54,8% → 90,9%, 69,0% → 95,9% (riêng import 63,3% → 93,3%, 76,7% → 96,7%). Ghost trong trang: Monaco chỉ vẽ chữ mờ khi dropdown gợi ý đóng hoặc khớp mục đang chọn → dropdown tên thuộc tính tự bật nhường cho gợi ý Fast đã có (fastGhostReadyAt, như với AI), kết quả Fast về ở ranh giới thuộc tính thì đóng dropdown (Ctrl+Space vẫn mở); thuộc tính của file import / clipboard theo SEED_ATTRIBUTES_BY_ROOT, xếp theo số lần dùng trong file; crossSectionGhost (field chưa có trong view) chỉ ở Grid / Lookup và chỉ lấy tên khai trong &lt;fields&gt; (bỏ CDATA); file import → importTemplateGhost: dòng trống trong &lt;template&gt;&lt;fields row&gt; gợi ý cả khối &lt;field name width (+ starColor nếu allowNulls="false")&gt;&lt;text v e/&gt;&lt;/field&gt; cho field nhập kế tiếp (column khác rỗng) chưa có cột Excel, tiêu đề từ header.xml — người dùng báo gợi ý &lt;field name&gt; giữa các dòng &lt;item value&gt; của Dir và tên lạ từ đoạn JS ở Grid; kết quả Fast về sau mẫu structuralGhost thì inlineSuggest.hide rồi trigger lại (thử trong Viewer: 16/16 chỗ hiện đúng).</w:t>
+              <w:t>Cùng cách với phía SQL của Bcode nhưng cho XML controller / JS / ASPX; bản riêng của Viewer (2 project không tham chiếu nhau). Ghost: sau Hint Code + field thiếu trong views, trước structuralGhost + AI; trang chỉ đọc bộ nhớ (fastCache), hỏi host BeginFastGhost sau 40 ms rồi trigger lại; chỉ ở cuối dòng hoặc trước dấu đóng tự chèn. Thêm: XML / ASPX cũng có line / next, khoá thêm 2 thẻ cha (SourceGhost.FeedTags / PathKey, XmlPathKeys; event của command); nguồn "sib" = file anh em (FastSourceService.Siblings.cs: chỉ mục &lt;dự án&gt;.v5.sib.json = đường dẫn + loại + tên field, 3 file cùng loại Jaccard ≥ 0,2, đọc file khi cần); nguồn "agree" (2 nguồn khác loại cùng phần đầu, tin = 1−(1−a)(1−b)); kiến thức chung + phản hồi người dùng (FastSourceService.Shared.cs: viewer\ghost\_shared.v5.json gộp mọi dự án, feedback\&lt;máy-người&gt;.json, SourceGhost.Cell / Adjust, trang completion.js checkFastFeedback → BeginFastFeedback; Settings "Thư mục kiến thức chung" = ViewerSettings.KnowledgeDir → ViewerKnowledge.Configure). Thử bỏ: tiêu đề field từ header.xml (đúng 20%). Tổng (30.628 chỗ): ngắn 76,2% / 91,2% → 89,2% / 92,1% (21.274 → 25.174 gợi ý đúng), dài 90,6% / 65,8% → 97,1% / 85,7% (18.260 → 25.472); ghost.json 10,4 MB, RAM +45 MB. Vùng js / sql thêm 2 nguồn "line" / "next" (SourceGhost.Lines / Nexts, TrainLines: đầu dòng ≤6 token → phần còn lại; ^đầu dòng trên ≤4 token [| dòng trên nữa] → dòng kế; đếm số file, giữ ≥2 file; ghost.json +2 MB, +16 MB RAM) — cách của FastGhostRules.LineStart / NextLine nhưng học từ JS / SQL của source Fast (ma trận SQL của Bcode đo chỉ đúng 33% ở CDATA); ngắn JS+SQL 980 → 1.736 gợi ý đúng. Tổng (30.628 chỗ): ngắn 76,2% / 91,2% → 83,1% / 93,1%, dài 90,6% / 65,8% → 93,7% / 73,9%. Gõ &lt;/ → close (SourceGhost.CloseTag: thẻ mở gần nhất chưa đóng theo TagRx, bỏ comment/CDATA/tự đóng/thẻ void ASPX; đo 99,9%), trả sớm. Gộp 3 nguồn bằng SourceGhost.Choose (dùng chung với SourceGhostMiner): close thắng, rồi nguồn qua ngưỡng có độ tin cao nhất, cùng độ tin thì dài hơn — thay cho "dài nhất thắng" (đo: ngắn 76,2% / 91,2% → 80,5% / 93,1%, dài 90,6% / 65,8% → 91,0% / 74,3%; ngưỡng ghost.json đo lại theo cách chọn mới, vùng import giữ ngưỡng cũ) — các nguồn — field (ma trận F:&lt;field&gt;|&lt;đầu dòng ≤6 token&gt; hoặc ^&lt;đầu dòng trên&gt; → phần còn lại của dòng, trong khối &lt;field name&gt;; dòng &lt;field name="X" … → ma trận N:&lt;loại file&gt;:&lt;mục&gt;|X và N:&lt;loại file&gt;:&lt;mục&gt;|* — loại file theo đường dẫn: import (Templates/Upload) / clipboard / dir / grid…, mục = template / views / fields (SectionAt — &lt;template&gt; = khối cột Excel của file import; người dùng báo trong &lt;views&gt; của Grid lại gợi ý thuộc tính khai báo của &lt;fields&gt;)), same (dòng giống trong chính file — dòng &lt;field name="X" chỉ so với dòng cùng mục, so khớp bỏ khoảng trắng quanh "=" của thuộc tính (name ="x"); field đã khai trong chính file thì độ tin n/(n+0.25) — 1 lần gặp đã đủ; dòng &lt;field name="X" … → phần sau tên của 30 dòng &lt;field&gt; gần nhất trong CÙNG khối &lt;fields&gt; / &lt;views&gt; = khai báo đặc thù của file), tok (n-gram 1–4 token; SourceLexer: chuỗi ≤40 ký tự = 1 token, &amp;X;/%X; = 1 token, giữ hoa thường; mô hình xml / aspx / js (đoạn &lt;script&gt;); trộn n-gram của file đang sửa β=8). Ngưỡng theo loại × vùng (SourceGhost.AreaFor: xml / js / sql / aspx, file import "import", dòng trống /next, dòng vừa gõ tên field /fl; vùng chưa hiệu chỉnh lùi về vùng gần nhất; vùng import hiệu chỉnh trên source Fast — chỉ là con số) hiệu chỉnh trên nửa file mẫu không dùng để học: ngắn ≥ 90%, dài ≥ 60% (Alt+Shift+\ = edit.fastLong). Đo 45.923 chỗ trên Templates/fileSource: trước (structuralGhost viết tay) 0,2% chỗ có gợi ý, 0/69 đúng; ngắn 69,9% chỗ đúng 91,7%; dài 87,5% chỗ đúng 65,2% (ma trận đi kèm 4,0 MB, có ngưỡng vùng import). Đo trên nửa source Fast mới nhất không dùng để học (78.127 chỗ): chỉ mẫu đi kèm ngắn 48,2% / 91,6%, dài 74,0% / 65,5%; + học Fast mới nhất (lọc ngữ cảnh ≥6, ô field ≥3 — như khi chạy) ngắn 58,8% / 91,5%, dài 79,6% / 66,5%; vùng import (Upload) ngắn: giữa dòng 9,8% → 52,7% chỗ (đúng 91,8%), sau &lt;field name="X"&gt; 22,1% → 63,8% (92,1%), dòng trống 40,8% → 94,4% (92,6%); dài đều ≥ 61,8%. RAM khi nạp đủ kiến thức Fast ~240 MB managed (chỉ giữ 1 bản gộp mẫu + Fast). Kiến thức: đi kèm (chỉ học Templates/fileSource — repo công khai) + source dự án (WorkspaceConnection.ResolveSourceRoot; App_Data/Controllers + Main; nhớ 7 ngày) + source Fast các phiên bản (SourceVersions: thư mục FBOR1…FBOR2SP24.x, mỗi thư mục 1 gói vá; quét theo thứ tự bản, file trùng kích thước + giờ sửa với lần trước thì bỏ, đọc song song 8; tóm tắt file = root / field / entity / func / command / action / query / button / setting / var (cả Templates/Upload = import danh mục, chứng từ từ Excel và Templates/Clipboard; bỏ mẫu Excel / Rpt), so với lần xuất hiện trước → Change +/-/~ kèm thuộc tính đổi; 60 bản, 9.476 file, 83.993 thay đổi; thử trong Viewer: học xong 66 s) → &lt;Thư mục kiến thức&gt;\viewer\ (ghost, ask, versions). Hỏi Fast: khung phải (Ctrl+Shift+J = panel.fastAsk) — BM25 (AskIndex: không dấu, tách chữ hoa, cặp 2 từ) trên tài liệu controller / field / lookup (chỉ AutoComplete) / entity / include / button / func / import (Upload / Clipboard: loại, startRow, baseTable, listTable, field + check + errorCode, thông báo lỗi) / importfield / version (gộp theo tên controller, gồm cả Upload) / release / topic (cả quy ước import); ×1.6 đúng loại câu hỏi (×2.5 câu hỏi lịch sử), ×3 khoá trùng tên riêng trong câu; tài liệu import ×0.6 khi câu không nói tới import / upload / nhập Excel; câu có ý import / lịch sử thì bỏ gợi ý loại "field", câu lịch sử thì bỏ ý import; controller của dự án thắng, tài liệu gộp lấy từ nguồn lớn trước (thử trong Viewer: dự án 1 file từng che kiến thức mẫu); câu nêu bản (SP22.5) thì thẻ lịch sử chỉ giữ dòng của bản đó; ✔ / ✘ / ✎ Sửa → viewer\ask\feedback.json; lịch sử phiên ở %AppData%\Bcode\viewer-fastask. Bộ câu hỏi chuẩn 167 câu (sinh từ dữ liệu thật + viết tay, gồm 37 câu lịch sử phiên bản): top-1 67,1% → 96,4%, top-3 80,8% → 98,2%; 197 câu khi đã học source Fast các phiên bản (gồm 30 câu import): 54,8% → 90,9%, 69,0% → 95,9% (riêng import 63,3% → 93,3%, 76,7% → 96,7%). Ghost trong trang: Monaco chỉ vẽ chữ mờ khi dropdown gợi ý đóng hoặc khớp mục đang chọn → dropdown tên thuộc tính tự bật nhường cho gợi ý Fast đã có (fastGhostReadyAt, như với AI), kết quả Fast về ở ranh giới thuộc tính thì đóng dropdown (Ctrl+Space vẫn mở); thuộc tính của file import / clipboard theo SEED_ATTRIBUTES_BY_ROOT, xếp theo số lần dùng trong file; crossSectionGhost (field chưa có trong view) chỉ ở Grid / Lookup và chỉ lấy tên khai trong &lt;fields&gt; (bỏ CDATA); file import → importTemplateGhost: dòng trống trong &lt;template&gt;&lt;fields row&gt; gợi ý cả khối &lt;field name width (+ starColor nếu allowNulls="false")&gt;&lt;text v e/&gt;&lt;/field&gt; cho field nhập kế tiếp (column khác rỗng) chưa có cột Excel, tiêu đề từ header.xml — người dùng báo gợi ý &lt;field name&gt; giữa các dòng &lt;item value&gt; của Dir và tên lạ từ đoạn JS ở Grid; kết quả Fast về sau mẫu structuralGhost thì inlineSuggest.hide rồi trigger lại (thử trong Viewer: 16/16 chỗ hiện đúng).</w:t>
             </w:r>
           </w:p>
         </w:tc>

</xml_diff>

<commit_message>
bcode| fix thêm options tự động profiler hoặc thủ công, bổ sung edit, new menu thì sẽ tự create menu tại qlyc, bổ sung kiến thức liên quan hóa đơn điện tử,...| bcodeviewer| cải tiến gợi ý
</commit_message>
<xml_diff>
--- a/Cấu trúc Bcode  BcodeViewer (v3 - Tóm tắt).docx
+++ b/Cấu trúc Bcode  BcodeViewer (v3 - Tóm tắt).docx
@@ -2134,7 +2134,7 @@
           <w:rFonts w:ascii="Consolas" w:hAnsi="Consolas" w:eastAsia="Consolas"/>
           <w:sz w:val="13"/>
         </w:rPr>
-        <w:t>│   ├── FastAskControl.cs  133</w:t>
+        <w:t>│   ├── FastAskControl.cs  162</w:t>
       </w:r>
     </w:p>
     <w:p>
@@ -3106,7 +3106,7 @@
           <w:rFonts w:ascii="Consolas" w:hAnsi="Consolas" w:eastAsia="Consolas"/>
           <w:sz w:val="13"/>
         </w:rPr>
-        <w:t>│   ├── SqlProfilerControl.cs  1903</w:t>
+        <w:t>│   ├── SqlProfilerControl.cs  1938</w:t>
       </w:r>
     </w:p>
     <w:p>
@@ -3682,7 +3682,7 @@
           <w:rFonts w:ascii="Consolas" w:hAnsi="Consolas" w:eastAsia="Consolas"/>
           <w:sz w:val="13"/>
         </w:rPr>
-        <w:t>│   ├── MainForm.cs  3937</w:t>
+        <w:t>│   ├── MainForm.cs  3940</w:t>
       </w:r>
     </w:p>
     <w:p>
@@ -4006,7 +4006,7 @@
           <w:rFonts w:ascii="Consolas" w:hAnsi="Consolas" w:eastAsia="Consolas"/>
           <w:sz w:val="13"/>
         </w:rPr>
-        <w:t>│   ├── UiTemplateForm.cs  718</w:t>
+        <w:t>│   ├── UiTemplateForm.cs  723</w:t>
       </w:r>
     </w:p>
     <w:p>
@@ -4030,7 +4030,7 @@
           <w:rFonts w:ascii="Consolas" w:hAnsi="Consolas" w:eastAsia="Consolas"/>
           <w:sz w:val="13"/>
         </w:rPr>
-        <w:t>│   ├── WCommandEditForm.cs  373</w:t>
+        <w:t>│   ├── WCommandEditForm.cs  375</w:t>
       </w:r>
     </w:p>
     <w:p>
@@ -4102,7 +4102,7 @@
           <w:rFonts w:ascii="Consolas" w:hAnsi="Consolas" w:eastAsia="Consolas"/>
           <w:sz w:val="13"/>
         </w:rPr>
-        <w:t>│   ├── AppSettings.cs  351</w:t>
+        <w:t>│   ├── AppSettings.cs  354</w:t>
       </w:r>
     </w:p>
     <w:p>
@@ -4258,6 +4258,18 @@
           <w:rFonts w:ascii="Consolas" w:hAnsi="Consolas" w:eastAsia="Consolas"/>
           <w:sz w:val="13"/>
         </w:rPr>
+        <w:t>│   ├── LocalSecrets.cs  30</w:t>
+      </w:r>
+    </w:p>
+    <w:p>
+      <w:pPr>
+        <w:spacing w:after="0" w:before="0" w:line="240" w:lineRule="auto"/>
+      </w:pPr>
+      <w:r>
+        <w:rPr>
+          <w:rFonts w:ascii="Consolas" w:hAnsi="Consolas" w:eastAsia="Consolas"/>
+          <w:sz w:val="13"/>
+        </w:rPr>
         <w:t>│   ├── LocalSecrets.Empty.cs  38</w:t>
       </w:r>
     </w:p>
@@ -4918,7 +4930,19 @@
           <w:rFonts w:ascii="Consolas" w:hAnsi="Consolas" w:eastAsia="Consolas"/>
           <w:sz w:val="13"/>
         </w:rPr>
-        <w:t>│   ├── FastAskService.cs  1547</w:t>
+        <w:t>│   ├── FastAskNotes.cs  141</w:t>
+      </w:r>
+    </w:p>
+    <w:p>
+      <w:pPr>
+        <w:spacing w:after="0" w:before="0" w:line="240" w:lineRule="auto"/>
+      </w:pPr>
+      <w:r>
+        <w:rPr>
+          <w:rFonts w:ascii="Consolas" w:hAnsi="Consolas" w:eastAsia="Consolas"/>
+          <w:sz w:val="13"/>
+        </w:rPr>
+        <w:t>│   ├── FastAskService.cs  1609</w:t>
       </w:r>
     </w:p>
     <w:p>
@@ -5698,7 +5722,7 @@
           <w:rFonts w:ascii="Consolas" w:hAnsi="Consolas" w:eastAsia="Consolas"/>
           <w:sz w:val="13"/>
         </w:rPr>
-        <w:t>│   ├── WCommandService.cs  856</w:t>
+        <w:t>│   ├── WCommandService.cs  894</w:t>
       </w:r>
     </w:p>
     <w:p>
@@ -6430,7 +6454,7 @@
           <w:rFonts w:ascii="Consolas" w:hAnsi="Consolas" w:eastAsia="Consolas"/>
           <w:sz w:val="13"/>
         </w:rPr>
-        <w:t>│       ├── fastask.html  369</w:t>
+        <w:t>│       ├── fastask.html  371</w:t>
       </w:r>
     </w:p>
     <w:p>
@@ -7066,7 +7090,7 @@
           <w:rFonts w:ascii="Consolas" w:hAnsi="Consolas" w:eastAsia="Consolas"/>
           <w:sz w:val="13"/>
         </w:rPr>
-        <w:t>│       ├── uitemplate.html  1127</w:t>
+        <w:t>│       ├── uitemplate.html  1135</w:t>
       </w:r>
     </w:p>
     <w:p>
@@ -7410,19 +7434,19 @@
           <w:rFonts w:ascii="Consolas" w:hAnsi="Consolas" w:eastAsia="Consolas"/>
           <w:sz w:val="13"/>
         </w:rPr>
-        <w:t>│   │   ├── SourceGhost.cs  843</w:t>
-      </w:r>
-    </w:p>
-    <w:p>
-      <w:pPr>
-        <w:spacing w:after="0" w:before="0" w:line="240" w:lineRule="auto"/>
-      </w:pPr>
-      <w:r>
-        <w:rPr>
-          <w:rFonts w:ascii="Consolas" w:hAnsi="Consolas" w:eastAsia="Consolas"/>
-          <w:sz w:val="13"/>
-        </w:rPr>
-        <w:t>│   │   ├── SourceGhostMiner.cs  164</w:t>
+        <w:t>│   │   ├── SourceGhost.cs  924</w:t>
+      </w:r>
+    </w:p>
+    <w:p>
+      <w:pPr>
+        <w:spacing w:after="0" w:before="0" w:line="240" w:lineRule="auto"/>
+      </w:pPr>
+      <w:r>
+        <w:rPr>
+          <w:rFonts w:ascii="Consolas" w:hAnsi="Consolas" w:eastAsia="Consolas"/>
+          <w:sz w:val="13"/>
+        </w:rPr>
+        <w:t>│   │   ├── SourceGhostMiner.cs  183</w:t>
       </w:r>
     </w:p>
     <w:p>
@@ -7914,7 +7938,7 @@
           <w:rFonts w:ascii="Consolas" w:hAnsi="Consolas" w:eastAsia="Consolas"/>
           <w:sz w:val="13"/>
         </w:rPr>
-        <w:t>│   ├── completion.js  2647</w:t>
+        <w:t>│   ├── completion.js  2693</w:t>
       </w:r>
     </w:p>
     <w:p>
@@ -8910,7 +8934,7 @@
           <w:rFonts w:ascii="Consolas" w:hAnsi="Consolas" w:eastAsia="Consolas"/>
           <w:sz w:val="13"/>
         </w:rPr>
-        <w:t>└── Program.cs  90</w:t>
+        <w:t>└── Program.cs  94</w:t>
       </w:r>
     </w:p>
     <w:p>
@@ -10096,7 +10120,7 @@
                 <w:b w:val="0"/>
                 <w:sz w:val="16"/>
               </w:rPr>
-              <w:t>Nguồn: SqlHintCatalog (snippet rsrepq/rspivot/tblcat/dynf/total…, Idioms, GroupNotes), ma trận ghost text (Find call/func/filter/decl), database đang kết nối chỉ đọc (sys.tables, sys.objects, sys.sql_modules — SearchModulesAsync, PartitionTablesAsync đếm xxx$%Partition), TableDataService.GetColumnDescriptionsAsync (cấu trúc + JOIN theo khoá), FieldDictionaryService (header.xml), luật danh mục (nút mở QuickList StartRules), Topics = quy ước Fast. Báo cáo: chọn nhiều bảng phân kỳ (khối SET @q … Partition$Execute lặp cho từng bảng, cột = giao các bảng); Save as (SaveAsFlowAsync: OBJECT_DEFINITION chỉ đọc, đổi tên ở dòng CREATE/ALTER, nút Save as… trên thẻ store); rsrepq/rspivot + tham số lọc (kiểu theo ma trận decl) + dòng lọc (ma trận filter → FastGhostRules.FilterLine) + cột thật của bảng$000000 (tổng hợp SUM cột số). Trạng thái hội thoại do trang giữ (state). Học dự án (LearnProjectAsync): FastAskKnowledge.Mine (JOIN + ON giải alias, cột #report theo bảng phân kỳ, cột ngày Partition$Execute, tham số rs_) → fastask/projects/*.json, MergeShared → fastask/shared.json; FastGhostMiner.LearnFromModules + MergeShared → ghost/_shared.json. KnowledgeFor tra: lớp sửa của người dùng (✘ + gõ cách đúng, FastAskFeedback Prefer) → ma trận dự án → _shared → ma trận đi kèm. ✔/✘: AskCard.Ref (m|loại|khoá|cách viết, answer|…, store|…), AskReply.Sig; ApplyFeedback bỏ thẻ bị ✘, đưa thẻ ✔ lên đầu, chèn Câu trả lời bạn đã sửa; nút ✔ Đúng / ✘ Chưa đúng nằm ở hàng nút cuối thẻ (.votes). Dừng luồng: IsStop (bỏ qua / thôi / hủy / quit…) hoặc nút ✕ Dừng (state.flow). Đổi tên tab SQL Query sau khi chạy: MainForm.RenameTabByScript (ScriptExecuted, CREATE/ALTER PROC|FUNCTION|VIEW|TRIGGER ngoài comment → schema.tên). Lịch sử phiên: FastAskSessions (fastask/sessions/*.json). Nhúng vào tab SQL Query (ISqlTab.ShowFastAsk / FastAskRequested, MainForm.EmbedFastAsk) khi bật AiEmbedded. Tìm chung: Services/FastAskIndex.cs (BM25, từ khoá không dấu + tách chữ hoa + cặp 2 từ; tài liệu report = store rs_&lt;controller&gt; mang tiêu đề menu Sys wcommand, menu, store, snippet, topic, table (tiêu đề field tra cứu + dmct), field), FastAskService.IndexAsync / IndexCard / SearchAllAsync / FieldReplyAsync / SimilarReportsAsync; chỉ câu có động từ tạo mới vào luồng tạo báo cáo / danh mục / store; DistillAsync = thẻ tóm tắt store; fastask.html Ctrl+F = thanh tìm (#findBar: bỏ dấu từng ký tự, mark.fh, Enter / Shift+Enter, Esc); FastSourceKnowledge.cs = đọc controller XML Filter / Grid / Report (regex; source dự án đọc ở nền, chưa xong thì mẫu đi kèm), ParamMap tham số → cột từ tiêu đề Anh / aliasName của ô lọc (FastGhostRules.ColumnFor, UseFastFilters), ControllerCard (bảng, mã chứng từ, trường, điều kiện lọc, mẫu in, cột mẫu in), DistillAsync thêm điều kiện lọc suy từ tham số, câu hỏi chi tiết (detail) bỏ cụm hỏi rồi tìm báo cáo / màn hình, mã chứng từ → màn hình; StatsAsync / StatKinds = câu đếm / liệt kê / thông tin dự án (wcommand, dmct, sys.objects, userinfo, header.xml, workspaces); FastAskControl.ToPage chờ WebBarHost.WaitReadyAsync trước khi trả lời (trước đây câu "hello" lúc mở tab trả lời trước khi trang báo nạp xong → Call bị bỏ, treo "Đang tra…"); TableUsersAsync = store dùng bảng; bộ câu hỏi chuẩn ASK_GOLD (113 câu) đo top-1 24,8% → 85,8%. Nút thẻ: insert / newtab / copy / open-object (Arg2 app|P) / quicklist; ✎ Sửa → action correct → FastAskService.Correct (✘ + SaveCorrection). Bảng: ResolveTables (tên đúng → tên gốc bảng phân kỳ → tiếng Việt qua lookup header.xml → dm+tên), DescribeTableAsync (MS_Description, dmct.m_phdbf/m_ctdbf, field tra cứu, quy ước tên, store dùng bảng). Danh mục: CatalogFlowAsync + CatalogColumns (cột người dùng nhập; bảng đã có → ALTER TABLE ADD). Save as: RecentReportsAsync (rs_/zrs_ sửa gần đây), gõ 1 phần tên → chọn. Quy ước có mẫu (TopicCards(t, f)): câu nêu rõ đối tượng → chỉ mẫu có nhiều từ khớp nhất / ít từ thừa nhất (số dư vụ việc → baljob), "cuối kỳ" đổi @DateFrom → @DateTo, BalanceType 1 → 2.</w:t>
+              <w:t>Nguồn: SqlHintCatalog (snippet rsrepq/rspivot/tblcat/dynf/total…, Idioms, GroupNotes), ma trận ghost text (Find call/func/filter/decl), database đang kết nối chỉ đọc (sys.tables, sys.objects, sys.sql_modules — SearchModulesAsync, PartitionTablesAsync đếm xxx$%Partition), TableDataService.GetColumnDescriptionsAsync (cấu trúc + JOIN theo khoá), FieldDictionaryService (header.xml), luật danh mục (nút mở QuickList StartRules), Topics = quy ước Fast. Báo cáo: chọn nhiều bảng phân kỳ (khối SET @q … Partition$Execute lặp cho từng bảng, cột = giao các bảng); Save as (SaveAsFlowAsync: OBJECT_DEFINITION chỉ đọc, đổi tên ở dòng CREATE/ALTER, nút Save as… trên thẻ store); rsrepq/rspivot + tham số lọc (kiểu theo ma trận decl) + dòng lọc (ma trận filter → FastGhostRules.FilterLine) + cột thật của bảng$000000 (tổng hợp SUM cột số). Trạng thái hội thoại do trang giữ (state). Học dự án (LearnProjectAsync): FastAskKnowledge.Mine (JOIN + ON giải alias, cột #report theo bảng phân kỳ, cột ngày Partition$Execute, tham số rs_) → fastask/projects/*.json, MergeShared → fastask/shared.json; FastGhostMiner.LearnFromModules + MergeShared → ghost/_shared.json. KnowledgeFor tra: lớp sửa của người dùng (✘ + gõ cách đúng, FastAskFeedback Prefer) → ma trận dự án → _shared → ma trận đi kèm. ✔/✘: AskCard.Ref (m|loại|khoá|cách viết, answer|…, store|…), AskReply.Sig; ApplyFeedback bỏ thẻ bị ✘, đưa thẻ ✔ lên đầu, chèn Câu trả lời bạn đã sửa; nút ✔ Đúng / ✘ Chưa đúng nằm ở hàng nút cuối thẻ (.votes). Dừng luồng: IsStop (bỏ qua / thôi / hủy / quit…) hoặc nút ✕ Dừng (state.flow). Đổi tên tab SQL Query sau khi chạy: MainForm.RenameTabByScript (ScriptExecuted, CREATE/ALTER PROC|FUNCTION|VIEW|TRIGGER ngoài comment → schema.tên). Lịch sử phiên: FastAskSessions (fastask/sessions/*.json). Nhúng vào tab SQL Query (ISqlTab.ShowFastAsk / FastAskRequested, MainForm.EmbedFastAsk) khi bật AiEmbedded. Tìm chung: Services/FastAskIndex.cs (BM25, từ khoá không dấu + tách chữ hoa + cặp 2 từ; tài liệu report = store rs_&lt;controller&gt; mang tiêu đề menu Sys wcommand, menu, store, snippet, topic, table (tiêu đề field tra cứu + dmct), field), FastAskService.IndexAsync / IndexCard / SearchAllAsync / FieldReplyAsync / SimilarReportsAsync; chỉ câu có động từ tạo mới vào luồng tạo báo cáo / danh mục / store; DistillAsync = thẻ tóm tắt store; fastask.html Ctrl+F = thanh tìm (#findBar: bỏ dấu từng ký tự, mark.fh, Enter / Shift+Enter, Esc); FastSourceKnowledge.cs = đọc controller XML Filter / Grid / Report (regex; source dự án đọc ở nền, chưa xong thì mẫu đi kèm), ParamMap tham số → cột từ tiêu đề Anh / aliasName của ô lọc (FastGhostRules.ColumnFor, UseFastFilters), ControllerCard (bảng, mã chứng từ, trường, điều kiện lọc, mẫu in, cột mẫu in), DistillAsync thêm điều kiện lọc suy từ tham số, câu hỏi chi tiết (detail) bỏ cụm hỏi rồi tìm báo cáo / màn hình, mã chứng từ → màn hình; FastAskNotes.cs = bảng tra nạp thêm (ImportExcel bằng ClosedXML: dòng tiêu đề Mã số / Nội dung / Ghi chú / Diễn giải / Nghiệp vụ / Mô hình; notes/*.json ở thư mục kiến thức, Merged gộp mục trùng), NoteAnswerAsync (mã lỗi trùng số trong câu → các mục mã đó; câu về HĐĐT / chứng thư / ký số / cập nhật / forum → tìm theo nội dung, cần khớp ≥ 50% từ và tiêu đề ≥ 30%), kho tìm kiếm riêng NoteIndex (tách khỏi kho chính để bài forum dài không làm lệch IDF; x0,7 khi tìm chung), nút 📥 Nạp kiến thức (FastAskControl.ImportNotes); StatsAsync / StatKinds = câu đếm / liệt kê / thông tin dự án (wcommand, dmct, sys.objects, userinfo, header.xml, workspaces); FastAskControl.ToPage chờ WebBarHost.WaitReadyAsync trước khi trả lời (trước đây câu "hello" lúc mở tab trả lời trước khi trang báo nạp xong → Call bị bỏ, treo "Đang tra…"); TableUsersAsync = store dùng bảng; bộ câu hỏi chuẩn ASK_GOLD (113 câu) đo top-1 24,8% → 85,8%. Nút thẻ: insert / newtab / copy / open-object (Arg2 app|P) / quicklist; ✎ Sửa → action correct → FastAskService.Correct (✘ + SaveCorrection). Bảng: ResolveTables (tên đúng → tên gốc bảng phân kỳ → tiếng Việt qua lookup header.xml → dm+tên), DescribeTableAsync (MS_Description, dmct.m_phdbf/m_ctdbf, field tra cứu, quy ước tên, store dùng bảng). Danh mục: CatalogFlowAsync + CatalogColumns (cột người dùng nhập; bảng đã có → ALTER TABLE ADD). Save as: RecentReportsAsync (rs_/zrs_ sửa gần đây), gõ 1 phần tên → chọn. Quy ước có mẫu (TopicCards(t, f)): câu nêu rõ đối tượng → chỉ mẫu có nhiều từ khớp nhất / ít từ thừa nhất (số dư vụ việc → baljob), "cuối kỳ" đổi @DateFrom → @DateTo, BalanceType 1 → 2.</w:t>
             </w:r>
           </w:p>
         </w:tc>
@@ -10656,7 +10680,7 @@
                 <w:b w:val="0"/>
                 <w:sz w:val="16"/>
               </w:rPr>
-              <w:t>Nhúng cửa sổ Profiler.exe thật bằng SetParent; Ctrl+3. Ô u_id sửa/xoá được (uidManual): trống = không lọc ApplicationName, gỡ cả filter ID trong .tdf đã có (TryUpdateFilters: "" = bỏ filter). Ô Lọc DatabaseName sửa được: nhớ theo workspace (Workspace.ProfilerDatabaseLike, "" = gợi ý %ProjectId%), action set-db-filter; EffectiveDbLike dùng cho Copy + filter template khi bung; ⟳ = về gợi ý.</w:t>
+              <w:t>Nhúng cửa sổ Profiler.exe thật bằng SetParent; Ctrl+3. Ô u_id sửa/xoá được (uidManual): trống = không lọc ApplicationName, gỡ cả filter ID trong .tdf đã có (TryUpdateFilters: "" = bỏ filter). Ô Lọc DatabaseName sửa được: nhớ theo workspace (Workspace.ProfilerDatabaseLike, "" = gợi ý %ProjectId%), action set-db-filter; EffectiveDbLike dùng cho Copy + filter template khi bung; ⟳ = về gợi ý. Chế độ mở (AppSettings.ProfilerAutoStart, Template → Cửa sổ, Forms/UiTemplateForm.cs profiler-mode-*): Tự động = MainForm.OpenSqlProfilerTab gọi AutoStartIfEnabled (bỏ qua khi _sessionRestoring), bung theo cấu hình đã lưu + ẩn thanh tạm (SetBarHidden persist:false).</w:t>
             </w:r>
           </w:p>
         </w:tc>
@@ -10803,7 +10827,7 @@
                 <w:b w:val="0"/>
                 <w:sz w:val="16"/>
               </w:rPr>
-              <w:t>New (Insert/F4), Edit F3, Delete F8, Gen Script Menu F12, Check WCommand, Refresh F5; Design = mở ScreenDesigner; Ctrl+F5 chạy menu. Nguồn cây (WCommandService.LoadTreeAsync): wcommand; rỗng/không có → command (APP, FBFF); APP kèm vài menu web (command có menu_id0 + bar, nhiều ≥ 4 lần wcommand — CommandMenuCountAsync, vd BMT FF31 1028 vs 13) → cả hai, BuildHierarchy dựng riêng từng loại (mã 2 bảng trùng nhau), command trước; chữ ký nhẹ menu-cache có tiền tố "2:" để bản lưu cũ tải lại 1 lần. Ô (C) trên thanh lọc (cả cây Mobile) = chỉ hiện menu customize (tên có (C) / (*)) kèm menu cha — WCommandService.FilterCustom, lọc trên bản sao. Chuột phải "Menu Name: Bar2 / Bar" (phím wcommand.menuName) = đổi tên hiển thị tiếng Việt ↔ tiếng Anh cho cả cây WCommand và Mobile, nhớ ở %AppData%\Bcode\menu_name_bar2.txt. Chuột phải "Yêu cầu liên quan (QLYC)…" (phím wcommand.requirements, mặc định trống; không có ở cây Mobile) → RequirementsRequested(MenuQuery: wmenu_id, Bar/Bar2, id menu con + menu cha) → MainForm.OpenFsgRequirementReportTab(menu) → tab Yêu cầu FSG lọc theo menu.</w:t>
+              <w:t>New (Insert/F4), Edit F3, Delete F8, Gen Script Menu F12, Check WCommand, Refresh F5; Design = mở ScreenDesigner; Ctrl+F5 chạy menu. Form WCOMMAND - New/Edit (cả 2 chế độ giao diện qua WCommandEditForm): Suggest WMenu Id = SuggestNextWMenuIdAsync(cha, seed = id trong ô / menu đang đứng) — seed GG.SS.LL (SS ≠ 00, cùng nhóm với cha) thì giữ GG.SS., lấy 2 ký tự cuối trống đầu tiên theo LeafCodes (01..99, A1..Z1, A2..Z2 … A9..Z9), không thì theo cha như cũ; Save xong gọi WCommandService.SyncQlycInBackground = FsgProjectLookupService.CreateMenuAsync (như Actions &gt; Create Menu) chạy ngầm, lỗi bỏ qua. Nguồn cây (WCommandService.LoadTreeAsync): wcommand; rỗng/không có → command (APP, FBFF); APP kèm vài menu web (command có menu_id0 + bar, nhiều ≥ 4 lần wcommand — CommandMenuCountAsync, vd BMT FF31 1028 vs 13) → cả hai, BuildHierarchy dựng riêng từng loại (mã 2 bảng trùng nhau), command trước; chữ ký nhẹ menu-cache có tiền tố "2:" để bản lưu cũ tải lại 1 lần. Ô (C) trên thanh lọc (cả cây Mobile) = chỉ hiện menu customize (tên có (C) / (*)) kèm menu cha — WCommandService.FilterCustom, lọc trên bản sao. Chuột phải "Menu Name: Bar2 / Bar" (phím wcommand.menuName) = đổi tên hiển thị tiếng Việt ↔ tiếng Anh cho cả cây WCommand và Mobile, nhớ ở %AppData%\Bcode\menu_name_bar2.txt. Chuột phải "Yêu cầu liên quan (QLYC)…" (phím wcommand.requirements, mặc định trống; không có ở cây Mobile) → RequirementsRequested(MenuQuery: wmenu_id, Bar/Bar2, id menu con + menu cha) → MainForm.OpenFsgRequirementReportTab(menu) → tab Yêu cầu FSG lọc theo menu.</w:t>
             </w:r>
           </w:p>
         </w:tc>
@@ -14153,7 +14177,7 @@
                 <w:b w:val="0"/>
                 <w:sz w:val="16"/>
               </w:rPr>
-              <w:t>Cùng cách với phía SQL của Bcode nhưng cho XML controller / JS / ASPX; bản riêng của Viewer (2 project không tham chiếu nhau). Ghost: sau Hint Code + field thiếu trong views, trước structuralGhost + AI; trang chỉ đọc bộ nhớ (fastCache), hỏi host BeginFastGhost sau 40 ms rồi trigger lại; chỉ ở cuối dòng hoặc trước dấu đóng tự chèn. Thêm: XML / ASPX cũng có line / next, khoá thêm 2 thẻ cha (SourceGhost.FeedTags / PathKey, XmlPathKeys; event của command); nguồn "sib" = file anh em (FastSourceService.Siblings.cs: chỉ mục &lt;dự án&gt;.v5.sib.json = đường dẫn + loại + tên field, 3 file cùng loại Jaccard ≥ 0,2, đọc file khi cần); nguồn "agree" (2 nguồn khác loại cùng phần đầu, tin = 1−(1−a)(1−b)); kiến thức chung + phản hồi người dùng (FastSourceService.Shared.cs: viewer\ghost\_shared.v5.json gộp mọi dự án, feedback\&lt;máy-người&gt;.json, SourceGhost.Cell / Adjust, trang completion.js checkFastFeedback → BeginFastFeedback; Settings "Thư mục kiến thức chung" = ViewerSettings.KnowledgeDir → ViewerKnowledge.Configure). Thử bỏ: tiêu đề field từ header.xml (đúng 20%). Tổng (30.628 chỗ): ngắn 76,2% / 91,2% → 89,2% / 92,1% (21.274 → 25.174 gợi ý đúng), dài 90,6% / 65,8% → 97,1% / 85,7% (18.260 → 25.472); ghost.json 10,4 MB, RAM +45 MB. Vùng js / sql thêm 2 nguồn "line" / "next" (SourceGhost.Lines / Nexts, TrainLines: đầu dòng ≤6 token → phần còn lại; ^đầu dòng trên ≤4 token [| dòng trên nữa] → dòng kế; đếm số file, giữ ≥2 file; ghost.json +2 MB, +16 MB RAM) — cách của FastGhostRules.LineStart / NextLine nhưng học từ JS / SQL của source Fast (ma trận SQL của Bcode đo chỉ đúng 33% ở CDATA); ngắn JS+SQL 980 → 1.736 gợi ý đúng. Tổng (30.628 chỗ): ngắn 76,2% / 91,2% → 83,1% / 93,1%, dài 90,6% / 65,8% → 93,7% / 73,9%. Gõ &lt;/ → close (SourceGhost.CloseTag: thẻ mở gần nhất chưa đóng theo TagRx, bỏ comment/CDATA/tự đóng/thẻ void ASPX; đo 99,9%), trả sớm. Gộp 3 nguồn bằng SourceGhost.Choose (dùng chung với SourceGhostMiner): close thắng, rồi nguồn qua ngưỡng có độ tin cao nhất, cùng độ tin thì dài hơn — thay cho "dài nhất thắng" (đo: ngắn 76,2% / 91,2% → 80,5% / 93,1%, dài 90,6% / 65,8% → 91,0% / 74,3%; ngưỡng ghost.json đo lại theo cách chọn mới, vùng import giữ ngưỡng cũ) — các nguồn — field (ma trận F:&lt;field&gt;|&lt;đầu dòng ≤6 token&gt; hoặc ^&lt;đầu dòng trên&gt; → phần còn lại của dòng, trong khối &lt;field name&gt;; dòng &lt;field name="X" … → ma trận N:&lt;loại file&gt;:&lt;mục&gt;|X và N:&lt;loại file&gt;:&lt;mục&gt;|* — loại file theo đường dẫn: import (Templates/Upload) / clipboard / dir / grid…, mục = template / views / fields (SectionAt — &lt;template&gt; = khối cột Excel của file import; người dùng báo trong &lt;views&gt; của Grid lại gợi ý thuộc tính khai báo của &lt;fields&gt;)), same (dòng giống trong chính file — dòng &lt;field name="X" chỉ so với dòng cùng mục, so khớp bỏ khoảng trắng quanh "=" của thuộc tính (name ="x"); field đã khai trong chính file thì độ tin n/(n+0.25) — 1 lần gặp đã đủ; dòng &lt;field name="X" … → phần sau tên của 30 dòng &lt;field&gt; gần nhất trong CÙNG khối &lt;fields&gt; / &lt;views&gt; = khai báo đặc thù của file), tok (n-gram 1–4 token; SourceLexer: chuỗi ≤40 ký tự = 1 token, &amp;X;/%X; = 1 token, giữ hoa thường; mô hình xml / aspx / js (đoạn &lt;script&gt;); trộn n-gram của file đang sửa β=8). Ngưỡng theo loại × vùng (SourceGhost.AreaFor: xml / js / sql / aspx, file import "import", dòng trống /next, dòng vừa gõ tên field /fl; vùng chưa hiệu chỉnh lùi về vùng gần nhất; vùng import hiệu chỉnh trên source Fast — chỉ là con số) hiệu chỉnh trên nửa file mẫu không dùng để học: ngắn ≥ 90%, dài ≥ 60% (Alt+Shift+\ = edit.fastLong). Đo 45.923 chỗ trên Templates/fileSource: trước (structuralGhost viết tay) 0,2% chỗ có gợi ý, 0/69 đúng; ngắn 69,9% chỗ đúng 91,7%; dài 87,5% chỗ đúng 65,2% (ma trận đi kèm 4,0 MB, có ngưỡng vùng import). Đo trên nửa source Fast mới nhất không dùng để học (78.127 chỗ): chỉ mẫu đi kèm ngắn 48,2% / 91,6%, dài 74,0% / 65,5%; + học Fast mới nhất (lọc ngữ cảnh ≥6, ô field ≥3 — như khi chạy) ngắn 58,8% / 91,5%, dài 79,6% / 66,5%; vùng import (Upload) ngắn: giữa dòng 9,8% → 52,7% chỗ (đúng 91,8%), sau &lt;field name="X"&gt; 22,1% → 63,8% (92,1%), dòng trống 40,8% → 94,4% (92,6%); dài đều ≥ 61,8%. RAM khi nạp đủ kiến thức Fast ~240 MB managed (chỉ giữ 1 bản gộp mẫu + Fast). Kiến thức: đi kèm (chỉ học Templates/fileSource — repo công khai) + source dự án (WorkspaceConnection.ResolveSourceRoot; App_Data/Controllers + Main; nhớ 7 ngày) + source Fast các phiên bản (SourceVersions: thư mục FBOR1…FBOR2SP24.x, mỗi thư mục 1 gói vá; quét theo thứ tự bản, file trùng kích thước + giờ sửa với lần trước thì bỏ, đọc song song 8; tóm tắt file = root / field / entity / func / command / action / query / button / setting / var (cả Templates/Upload = import danh mục, chứng từ từ Excel và Templates/Clipboard; bỏ mẫu Excel / Rpt), so với lần xuất hiện trước → Change +/-/~ kèm thuộc tính đổi; 60 bản, 9.476 file, 83.993 thay đổi; thử trong Viewer: học xong 66 s) → &lt;Thư mục kiến thức&gt;\viewer\ (ghost, ask, versions). Hỏi Fast: khung phải (Ctrl+Shift+J = panel.fastAsk) — BM25 (AskIndex: không dấu, tách chữ hoa, cặp 2 từ) trên tài liệu controller / field / lookup (chỉ AutoComplete) / entity / include / button / func / import (Upload / Clipboard: loại, startRow, baseTable, listTable, field + check + errorCode, thông báo lỗi) / importfield / version (gộp theo tên controller, gồm cả Upload) / release / topic (cả quy ước import); ×1.6 đúng loại câu hỏi (×2.5 câu hỏi lịch sử), ×3 khoá trùng tên riêng trong câu; tài liệu import ×0.6 khi câu không nói tới import / upload / nhập Excel; câu có ý import / lịch sử thì bỏ gợi ý loại "field", câu lịch sử thì bỏ ý import; controller của dự án thắng, tài liệu gộp lấy từ nguồn lớn trước (thử trong Viewer: dự án 1 file từng che kiến thức mẫu); câu nêu bản (SP22.5) thì thẻ lịch sử chỉ giữ dòng của bản đó; ✔ / ✘ / ✎ Sửa → viewer\ask\feedback.json; lịch sử phiên ở %AppData%\Bcode\viewer-fastask. Bộ câu hỏi chuẩn 167 câu (sinh từ dữ liệu thật + viết tay, gồm 37 câu lịch sử phiên bản): top-1 67,1% → 96,4%, top-3 80,8% → 98,2%; 197 câu khi đã học source Fast các phiên bản (gồm 30 câu import): 54,8% → 90,9%, 69,0% → 95,9% (riêng import 63,3% → 93,3%, 76,7% → 96,7%). Ghost trong trang: Monaco chỉ vẽ chữ mờ khi dropdown gợi ý đóng hoặc khớp mục đang chọn → dropdown tên thuộc tính tự bật nhường cho gợi ý Fast đã có (fastGhostReadyAt, như với AI), kết quả Fast về ở ranh giới thuộc tính thì đóng dropdown (Ctrl+Space vẫn mở); thuộc tính của file import / clipboard theo SEED_ATTRIBUTES_BY_ROOT, xếp theo số lần dùng trong file; crossSectionGhost (field chưa có trong view) chỉ ở Grid / Lookup và chỉ lấy tên khai trong &lt;fields&gt; (bỏ CDATA); file import → importTemplateGhost: dòng trống trong &lt;template&gt;&lt;fields row&gt; gợi ý cả khối &lt;field name width (+ starColor nếu allowNulls="false")&gt;&lt;text v e/&gt;&lt;/field&gt; cho field nhập kế tiếp (column khác rỗng) chưa có cột Excel, tiêu đề từ header.xml — người dùng báo gợi ý &lt;field name&gt; giữa các dòng &lt;item value&gt; của Dir và tên lạ từ đoạn JS ở Grid; kết quả Fast về sau mẫu structuralGhost thì inlineSuggest.hide rồi trigger lại (thử trong Viewer: 16/16 chỗ hiện đúng).</w:t>
+              <w:t>Cùng cách với phía SQL của Bcode nhưng cho XML controller / JS / ASPX; bản riêng của Viewer (2 project không tham chiếu nhau). Ghost: sau Hint Code + field thiếu trong views, trước structuralGhost + AI; trang chỉ đọc bộ nhớ (fastCache), hỏi host BeginFastGhost sau 40 ms rồi trigger lại; chỉ ở cuối dòng hoặc trước dấu đóng tự chèn. Thêm: XML / ASPX cũng có line / next, khoá thêm 2 thẻ cha (SourceGhost.FeedTags / PathKey, XmlPathKeys; event của command); nguồn "sib" = file anh em (FastSourceService.Siblings.cs: chỉ mục &lt;dự án&gt;.v5.sib.json = đường dẫn + loại + tên field, 3 file cùng loại Jaccard ≥ 0,2, đọc file khi cần); nguồn "agree" (2 nguồn khác loại cùng phần đầu, tin = 1−(1−a)(1−b)); nguồn "word" (SourceGhost.AddWord: gõ dở 1 tên → tên trong chính file cùng tiền tố, nặng theo độ gần + token đứng trước, sau "function" chỉ tên được gọi mà chưa khai hàm; vùng ngưỡng "/mw" = SourceGhost.EndsInName, SourceGhostMiner đo thêm chỗ cắt giữa tên; trang: Monaco giấu chữ mờ khi dropdown mở mà mục đang chọn là snippet có tham số → completion.js yieldSuggestToFast / watchSuggestForFast đóng dropdown khi gợi ý Fast ra đúng tên mục đang chọn, dòng "function X" luôn nhường + fastContext gửi cả file); kiến thức chung + phản hồi người dùng (FastSourceService.Shared.cs: viewer\ghost\_shared.v5.json gộp mọi dự án, feedback\&lt;máy-người&gt;.json, SourceGhost.Cell / Adjust, trang completion.js checkFastFeedback → BeginFastFeedback; Settings "Thư mục kiến thức chung" = ViewerSettings.KnowledgeDir → ViewerKnowledge.Configure). Thử bỏ: tiêu đề field từ header.xml (đúng 20%). Tổng (30.628 chỗ): ngắn 76,2% / 91,2% → 89,2% / 92,1% (21.274 → 25.174 gợi ý đúng), dài 90,6% / 65,8% → 97,1% / 85,7% (18.260 → 25.472); ghost.json 10,4 MB, RAM +45 MB. Vùng js / sql thêm 2 nguồn "line" / "next" (SourceGhost.Lines / Nexts, TrainLines: đầu dòng ≤6 token → phần còn lại; ^đầu dòng trên ≤4 token [| dòng trên nữa] → dòng kế; đếm số file, giữ ≥2 file; ghost.json +2 MB, +16 MB RAM) — cách của FastGhostRules.LineStart / NextLine nhưng học từ JS / SQL của source Fast (ma trận SQL của Bcode đo chỉ đúng 33% ở CDATA); ngắn JS+SQL 980 → 1.736 gợi ý đúng. Tổng (30.628 chỗ): ngắn 76,2% / 91,2% → 83,1% / 93,1%, dài 90,6% / 65,8% → 93,7% / 73,9%. Gõ &lt;/ → close (SourceGhost.CloseTag: thẻ mở gần nhất chưa đóng theo TagRx, bỏ comment/CDATA/tự đóng/thẻ void ASPX; đo 99,9%), trả sớm. Gộp 3 nguồn bằng SourceGhost.Choose (dùng chung với SourceGhostMiner): close thắng, rồi nguồn qua ngưỡng có độ tin cao nhất, cùng độ tin thì dài hơn — thay cho "dài nhất thắng" (đo: ngắn 76,2% / 91,2% → 80,5% / 93,1%, dài 90,6% / 65,8% → 91,0% / 74,3%; ngưỡng ghost.json đo lại theo cách chọn mới, vùng import giữ ngưỡng cũ) — các nguồn — field (ma trận F:&lt;field&gt;|&lt;đầu dòng ≤6 token&gt; hoặc ^&lt;đầu dòng trên&gt; → phần còn lại của dòng, trong khối &lt;field name&gt;; dòng &lt;field name="X" … → ma trận N:&lt;loại file&gt;:&lt;mục&gt;|X và N:&lt;loại file&gt;:&lt;mục&gt;|* — loại file theo đường dẫn: import (Templates/Upload) / clipboard / dir / grid…, mục = template / views / fields (SectionAt — &lt;template&gt; = khối cột Excel của file import; người dùng báo trong &lt;views&gt; của Grid lại gợi ý thuộc tính khai báo của &lt;fields&gt;)), same (dòng giống trong chính file — dòng &lt;field name="X" chỉ so với dòng cùng mục, so khớp bỏ khoảng trắng quanh "=" của thuộc tính (name ="x"); field đã khai trong chính file thì độ tin n/(n+0.25) — 1 lần gặp đã đủ; dòng &lt;field name="X" … → phần sau tên của 30 dòng &lt;field&gt; gần nhất trong CÙNG khối &lt;fields&gt; / &lt;views&gt; = khai báo đặc thù của file), tok (n-gram 1–4 token; SourceLexer: chuỗi ≤40 ký tự = 1 token, &amp;X;/%X; = 1 token, giữ hoa thường; mô hình xml / aspx / js (đoạn &lt;script&gt;); trộn n-gram của file đang sửa β=8). Ngưỡng theo loại × vùng (SourceGhost.AreaFor: xml / js / sql / aspx, file import "import", dòng trống /next, dòng vừa gõ tên field /fl; vùng chưa hiệu chỉnh lùi về vùng gần nhất; vùng import hiệu chỉnh trên source Fast — chỉ là con số) hiệu chỉnh trên nửa file mẫu không dùng để học: ngắn ≥ 90%, dài ≥ 60% (Alt+Shift+\ = edit.fastLong). Đo 45.923 chỗ trên Templates/fileSource: trước (structuralGhost viết tay) 0,2% chỗ có gợi ý, 0/69 đúng; ngắn 69,9% chỗ đúng 91,7%; dài 87,5% chỗ đúng 65,2% (ma trận đi kèm 4,0 MB, có ngưỡng vùng import). Đo trên nửa source Fast mới nhất không dùng để học (78.127 chỗ): chỉ mẫu đi kèm ngắn 48,2% / 91,6%, dài 74,0% / 65,5%; + học Fast mới nhất (lọc ngữ cảnh ≥6, ô field ≥3 — như khi chạy) ngắn 58,8% / 91,5%, dài 79,6% / 66,5%; vùng import (Upload) ngắn: giữa dòng 9,8% → 52,7% chỗ (đúng 91,8%), sau &lt;field name="X"&gt; 22,1% → 63,8% (92,1%), dòng trống 40,8% → 94,4% (92,6%); dài đều ≥ 61,8%. RAM khi nạp đủ kiến thức Fast ~240 MB managed (chỉ giữ 1 bản gộp mẫu + Fast). Kiến thức: đi kèm (chỉ học Templates/fileSource — repo công khai) + source dự án (WorkspaceConnection.ResolveSourceRoot; App_Data/Controllers + Main; nhớ 7 ngày) + source Fast các phiên bản (SourceVersions: thư mục FBOR1…FBOR2SP24.x, mỗi thư mục 1 gói vá; quét theo thứ tự bản, file trùng kích thước + giờ sửa với lần trước thì bỏ, đọc song song 8; tóm tắt file = root / field / entity / func / command / action / query / button / setting / var (cả Templates/Upload = import danh mục, chứng từ từ Excel và Templates/Clipboard; bỏ mẫu Excel / Rpt), so với lần xuất hiện trước → Change +/-/~ kèm thuộc tính đổi; 60 bản, 9.476 file, 83.993 thay đổi; thử trong Viewer: học xong 66 s) → &lt;Thư mục kiến thức&gt;\viewer\ (ghost, ask, versions). Hỏi Fast: khung phải (Ctrl+Shift+J = panel.fastAsk) — BM25 (AskIndex: không dấu, tách chữ hoa, cặp 2 từ) trên tài liệu controller / field / lookup (chỉ AutoComplete) / entity / include / button / func / import (Upload / Clipboard: loại, startRow, baseTable, listTable, field + check + errorCode, thông báo lỗi) / importfield / version (gộp theo tên controller, gồm cả Upload) / release / topic (cả quy ước import); ×1.6 đúng loại câu hỏi (×2.5 câu hỏi lịch sử), ×3 khoá trùng tên riêng trong câu; tài liệu import ×0.6 khi câu không nói tới import / upload / nhập Excel; câu có ý import / lịch sử thì bỏ gợi ý loại "field", câu lịch sử thì bỏ ý import; controller của dự án thắng, tài liệu gộp lấy từ nguồn lớn trước (thử trong Viewer: dự án 1 file từng che kiến thức mẫu); câu nêu bản (SP22.5) thì thẻ lịch sử chỉ giữ dòng của bản đó; ✔ / ✘ / ✎ Sửa → viewer\ask\feedback.json; lịch sử phiên ở %AppData%\Bcode\viewer-fastask. Bộ câu hỏi chuẩn 167 câu (sinh từ dữ liệu thật + viết tay, gồm 37 câu lịch sử phiên bản): top-1 67,1% → 96,4%, top-3 80,8% → 98,2%; 197 câu khi đã học source Fast các phiên bản (gồm 30 câu import): 54,8% → 90,9%, 69,0% → 95,9% (riêng import 63,3% → 93,3%, 76,7% → 96,7%). Ghost trong trang: Monaco chỉ vẽ chữ mờ khi dropdown gợi ý đóng hoặc khớp mục đang chọn → dropdown tên thuộc tính tự bật nhường cho gợi ý Fast đã có (fastGhostReadyAt, như với AI), kết quả Fast về ở ranh giới thuộc tính thì đóng dropdown (Ctrl+Space vẫn mở); thuộc tính của file import / clipboard theo SEED_ATTRIBUTES_BY_ROOT, xếp theo số lần dùng trong file; crossSectionGhost (field chưa có trong view) chỉ ở Grid / Lookup và chỉ lấy tên khai trong &lt;fields&gt; (bỏ CDATA); file import → importTemplateGhost: dòng trống trong &lt;template&gt;&lt;fields row&gt; gợi ý cả khối &lt;field name width (+ starColor nếu allowNulls="false")&gt;&lt;text v e/&gt;&lt;/field&gt; cho field nhập kế tiếp (column khác rỗng) chưa có cột Excel, tiêu đề từ header.xml — người dùng báo gợi ý &lt;field name&gt; giữa các dòng &lt;item value&gt; của Dir và tên lạ từ đoạn JS ở Grid; kết quả Fast về sau mẫu structuralGhost thì inlineSuggest.hide rồi trigger lại (thử trong Viewer: 16/16 chỗ hiện đúng).</w:t>
             </w:r>
           </w:p>
         </w:tc>

</xml_diff>

<commit_message>
cải tiến cache bcode
</commit_message>
<xml_diff>
--- a/Cấu trúc Bcode  BcodeViewer (v3 - Tóm tắt).docx
+++ b/Cấu trúc Bcode  BcodeViewer (v3 - Tóm tắt).docx
@@ -5050,7 +5050,7 @@
           <w:rFonts w:ascii="Consolas" w:hAnsi="Consolas" w:eastAsia="Consolas"/>
           <w:sz w:val="13"/>
         </w:rPr>
-        <w:t>│   ├── FileLookupService.cs  1359</w:t>
+        <w:t>│   ├── FileLookupService.cs  1520</w:t>
       </w:r>
     </w:p>
     <w:p>
@@ -10939,7 +10939,7 @@
                 <w:b w:val="0"/>
                 <w:sz w:val="16"/>
               </w:rPr>
-              <w:t>Cây file theo menu (dò như FCode — đối chiếu menu SVTran của VPMILK: include đọc như trình đọc XML qua DtdIncludeResolver — chỉ entity được gọi %X;/&amp;X;, mọi đuôi file, bỏ khối &lt;![%X;[ IGNORE; controller="&amp;X;..." và showForm(]]&gt;&amp;X;&lt;![CDATA[...) trong chính file thì thay entity; thư mục Lookup = controller đuôi "Lookup" / @$relType = "Lookup" (ExtractLookupControllerNames, cache "lkp"); thư mục Report: form in khai controller="X" mang tên controller của menu → Report\X (GLTran → GLTranReport; ExtractReportFormControllers, cache "rptctl" — controller="SVTran" trong AITran.xml thì không lấy), include SYSTEM nằm trong thư mục Report và mang tên controller (Report\Include\GLTranReportBI.xml, GLTranReportSql.txt; BaseCurrency/Separate dùng chung thì không), reportFile ghép entity ("GLTranReport_01&amp;Conditional.GLTranReport.ApprovedBy;" → GLTranReport_01 + GLTranReport_01_a); bảng sysrelative của DB Sys KHÔNG phải nguồn FCode dùng; đổi luật dò thì tăng FileParseCache.SchemaVersion), danh sách file lấy từ chỉ mục quét sẵn (bộ nhớ ≤ 2 phút / bản lưu %AppData%\Bcode\file-index) nên file tạo SAU lần quét (biên dịch Filter\X.xml → X.f bằng FCode / BcodeViewer) trước đây không hiện tới khi F5 — FindUnindexedSiblings dò thẳng ổ đĩa file cùng tên X.* trong thư mục đang có file của menu (tên thuộc sysIds / Lookup; lấy từ danh sách TRƯỚC khi lọc đuôi nên Gen Update / Only Show .f vẫn ra X.f), bỏ qua thư mục có giờ sửa y như lúc quét (FileIndex.DirTimes, ScanDirectory ghi; bản lưu trên đĩa không có → luôn dò), cache theo dự án (%AppData%\Bcode\FileLookupCache), tô đỏ entity thiếu, tìm nội dung, Edit in BcodeViewer (Process.Start). Ô Search (lọc tên, debounce 200 ms, Enter = lọc ngay; App: FileLookupBarPage; Template → Tìm file → "Ấn Enter mới tìm" = AppSettings.FileLookupSearchOnEnter: gõ không tìm, chỉ Enter — FileLookupService.SetSearchOnEnter/SearchModeChanged → FileLookupControl.PushSearchMode → window.setSearchOnEnter của thanh, tab đang mở đổi ngay): gõ chữ = tìm cả thư mục Path, đang ở cây menu thì nhớ _menuBeforeSearch → xoá trắng quay lại cây menu đó; gõ đúng tên trang .aspx (arcthd1.aspx) = TryShowMenuForPage → MainForm.MenuForLookupPage (menu lá cây WCommand có Link trỏ trang đó, ưu tiên có sysid) → ShowForMenuItem y như bấm menu, thanh trạng thái ghi tên menu; không có menu thì lọc tên như cũ. Cấp source nhanh (FileLookupControl.QuickGrant.cs): chọn file .f Dir/Grid/Filter → dòng 2 thanh xem trước (filelookuppreview.html window.setSource; App: FileLookupPreviewBarPage) hiện phiên bản + thư mục kho (SourceGrantService.ResolveNearestLower: phiên bản dự án, không có thì phiên bản thấp hơn gần nhất cùng 3 chữ đầu; DetectVersion: nhiều phiên bản cùng số thì ưu tiên cùng 3 chữ đầu rồi 2 chữ đầu — FBISP24 → FBOR2SP24, không lấy TT24 của kho FAP), bấm nhãn = SourceViewForm, nút Cấp source = hỏi xác nhận rồi CopyRows; danh sách phiên bản cache 5 phút. Search Box (tìm nội dung) theo luật ở Template → tab "Tìm file" (uitemplate.html #tabSearch ↔ UiTemplateForm search-get/set/default ↔ AppSettings.Search*; FileLookupService.SetSearchRules / SearchRuleSet): File Type *.* chỉ quét "Đuôi file được tìm" (SearchIncludeExtensions, mặc định .xml .f .txt .js .sql .ent .xsd .css .config .json .html; trống = mọi đuôi), trừ "Đuôi luôn bỏ qua" và "nhị phân"; gõ rõ đuôi (*.cs) thì không xét danh sách; thư mục quét trong Controllers, bỏ .f đã biên dịch ở Dir/Filter/Grid, bỏ file &gt; N MB (luật này chỉ cho Search Box, không đụng cây menu). filelookupbar.html / searchbox.html báo chiều cao nội dung (__height, px thiết bị gồm DPI + UiScale) → FileLookupControl.FitBarHeight đặt chiều cao thanh — trước đây cố định 150 / 158 px nên cột cây hẹp hoặc tỉ lệ giao diện &gt; 100% làm khung Search Box bị cây file che. Đổi tên file (FileLookupControl.Rename.cs): F2 (phím fileLookup.rename, phạm vi Tree) / chuột phải Rename... = sửa nhãn tại chỗ (LabelEdit chỉ bật lúc đổi tên, BeforeLabelEdit chặn node khác; ô sửa mất focus ngay lúc vừa mở — khung xem trước đang nạp — thì mở lại 1 lần) → File.Move; không gõ đuôi = giữ đuôi, đổi đuôi hỏi Yes/No/Cancel, trùng tên / ký tự sai mở lại ô sửa, file khoá báo rõ; cặp cùng tên khác đuôi cùng thư mục hỏi (mặc định Không). FileLookupService.NotifyFileRenamed sửa chỉ mục file trong bộ nhớ + bản lưu file-index (thay bản FileIndex mới, không sửa list tại chỗ), FileParseCache.ForgetFile bỏ mục dính tên cũ (cả trên đĩa ở lần ghi kế), rồi event FileRenamed → mọi tab File Lookup sửa node + khung xem trước (không dựng lại cây). Sau đó tra nền chỗ còn nhắc tên cũ bằng SourceIndexService.FindLinesAsync (dòng include / controller= / SYSTEM / showForm...) — chỉ báo.</w:t>
+              <w:t>Cây file theo menu (dò như FCode — đối chiếu menu SVTran của VPMILK: include đọc như trình đọc XML qua DtdIncludeResolver — chỉ entity được gọi %X;/&amp;X;, mọi đuôi file, bỏ khối &lt;![%X;[ IGNORE; controller="&amp;X;..." và showForm(]]&gt;&amp;X;&lt;![CDATA[...) trong chính file thì thay entity; thư mục Lookup = controller đuôi "Lookup" / @$relType = "Lookup" (ExtractLookupControllerNames, cache "lkp"); thư mục Report: form in khai controller="X" mang tên controller của menu → Report\X (GLTran → GLTranReport; ExtractReportFormControllers, cache "rptctl" — controller="SVTran" trong AITran.xml thì không lấy), include SYSTEM nằm trong thư mục Report và mang tên controller (Report\Include\GLTranReportBI.xml, GLTranReportSql.txt; BaseCurrency/Separate dùng chung thì không), reportFile ghép entity ("GLTranReport_01&amp;Conditional.GLTranReport.ApprovedBy;" → GLTranReport_01 + GLTranReport_01_a); bảng sysrelative của DB Sys KHÔNG phải nguồn FCode dùng; đổi luật dò thì tăng FileParseCache.SchemaVersion), danh sách file lấy từ chỉ mục quét sẵn (bộ nhớ / bản lưu %AppData%\Bcode\file-index\&lt;băm&gt;.t.gz kèm giờ sửa từng thư mục; bản &lt;băm&gt;.gz kiểu cũ không có giờ vẫn đọc được) nhưng mỗi lần dùng (GetIndex, tối đa 1 lần / giây / gốc) FileLookupService.Revalidate đối chiếu giờ sửa của mọi thư mục đã biết (FileIndex.DirTimes, kể cả gốc; hỏi song song ~100 thư mục ở Controllers ≈ 1–3 ms ổ D, ≈ 12–17 ms UNC) — thư mục đổi giờ thì liệt kê lại riêng nó, thư mục con mới quét đủ nhánh, thư mục mất bỏ cả nhánh (ApplyDirChanges) → file tạo / copy / xoá / đổi tên ngoài Bcode (Explorer, FCode, git pull, deploy) có ngay ở lần lọc kế, không cần F5; chỉ mục có giờ thư mục không hết hạn 2 phút nữa, quét nền 20 s sau khi nạp bản lưu vẫn giữ làm lưới an toàn; sửa nội dung file không đổi giờ thư mục — phần đó FileParseCache tự kiểm theo kích thước + giờ từng file. Chỉ mục không có giờ (bản lưu cũ, trước lần quét nền) thì như trước: hạn 2 phút + FindUnindexedSiblings dò thẳng ổ đĩa file cùng tên X.* trong thư mục đang có file của menu, cache theo dự án (%AppData%\Bcode\FileLookupCache), tô đỏ entity thiếu, tìm nội dung, Edit in BcodeViewer (Process.Start). Ô Search (lọc tên, debounce 200 ms, Enter = lọc ngay; App: FileLookupBarPage; Template → Tìm file → "Ấn Enter mới tìm" = AppSettings.FileLookupSearchOnEnter: gõ không tìm, chỉ Enter — FileLookupService.SetSearchOnEnter/SearchModeChanged → FileLookupControl.PushSearchMode → window.setSearchOnEnter của thanh, tab đang mở đổi ngay): gõ chữ = tìm cả thư mục Path, đang ở cây menu thì nhớ _menuBeforeSearch → xoá trắng quay lại cây menu đó; gõ đúng tên trang .aspx (arcthd1.aspx) = TryShowMenuForPage → MainForm.MenuForLookupPage (menu lá cây WCommand có Link trỏ trang đó, ưu tiên có sysid) → ShowForMenuItem y như bấm menu, thanh trạng thái ghi tên menu; không có menu thì lọc tên như cũ. Cấp source nhanh (FileLookupControl.QuickGrant.cs): chọn file .f Dir/Grid/Filter → dòng 2 thanh xem trước (filelookuppreview.html window.setSource; App: FileLookupPreviewBarPage) hiện phiên bản + thư mục kho (SourceGrantService.ResolveNearestLower: phiên bản dự án, không có thì phiên bản thấp hơn gần nhất cùng 3 chữ đầu; DetectVersion: nhiều phiên bản cùng số thì ưu tiên cùng 3 chữ đầu rồi 2 chữ đầu — FBISP24 → FBOR2SP24, không lấy TT24 của kho FAP), bấm nhãn = SourceViewForm, nút Cấp source = hỏi xác nhận rồi CopyRows; danh sách phiên bản cache 5 phút. Search Box (tìm nội dung) theo luật ở Template → tab "Tìm file" (uitemplate.html #tabSearch ↔ UiTemplateForm search-get/set/default ↔ AppSettings.Search*; FileLookupService.SetSearchRules / SearchRuleSet): File Type *.* chỉ quét "Đuôi file được tìm" (SearchIncludeExtensions, mặc định .xml .f .txt .js .sql .ent .xsd .css .config .json .html; trống = mọi đuôi), trừ "Đuôi luôn bỏ qua" và "nhị phân"; gõ rõ đuôi (*.cs) thì không xét danh sách; thư mục quét trong Controllers, bỏ .f đã biên dịch ở Dir/Filter/Grid, bỏ file &gt; N MB (luật này chỉ cho Search Box, không đụng cây menu). filelookupbar.html / searchbox.html báo chiều cao nội dung (__height, px thiết bị gồm DPI + UiScale) → FileLookupControl.FitBarHeight đặt chiều cao thanh — trước đây cố định 150 / 158 px nên cột cây hẹp hoặc tỉ lệ giao diện &gt; 100% làm khung Search Box bị cây file che. Đổi tên file (FileLookupControl.Rename.cs): F2 (phím fileLookup.rename, phạm vi Tree) / chuột phải Rename... = sửa nhãn tại chỗ (LabelEdit chỉ bật lúc đổi tên, BeforeLabelEdit chặn node khác; ô sửa mất focus ngay lúc vừa mở — khung xem trước đang nạp — thì mở lại 1 lần) → File.Move; không gõ đuôi = giữ đuôi, đổi đuôi hỏi Yes/No/Cancel, trùng tên / ký tự sai mở lại ô sửa, file khoá báo rõ; cặp cùng tên khác đuôi cùng thư mục hỏi (mặc định Không). FileLookupService.NotifyFileRenamed sửa chỉ mục file trong bộ nhớ + bản lưu file-index (thay bản FileIndex mới, không sửa list tại chỗ), FileParseCache.ForgetFile bỏ mục dính tên cũ (cả trên đĩa ở lần ghi kế), rồi event FileRenamed → mọi tab File Lookup sửa node + khung xem trước (không dựng lại cây). Sau đó tra nền chỗ còn nhắc tên cũ bằng SourceIndexService.FindLinesAsync (dòng include / controller= / SYSTEM / showForm...) — chỉ báo.</w:t>
             </w:r>
           </w:p>
         </w:tc>

</xml_diff>

<commit_message>
bcode| bổ sung note trong genupdate, các file webconfig, masterpage, options, message tự thêm dấu _ ở trước
</commit_message>
<xml_diff>
--- a/Cấu trúc Bcode  BcodeViewer (v3 - Tóm tắt).docx
+++ b/Cấu trúc Bcode  BcodeViewer (v3 - Tóm tắt).docx
@@ -2038,7 +2038,7 @@
           <w:rFonts w:ascii="Consolas" w:hAnsi="Consolas" w:eastAsia="Consolas"/>
           <w:sz w:val="13"/>
         </w:rPr>
-        <w:t>│   ├── AdvanceNoteControl.cs  567</w:t>
+        <w:t>│   ├── AdvanceNoteControl.cs  568</w:t>
       </w:r>
     </w:p>
     <w:p>
@@ -2374,7 +2374,7 @@
           <w:rFonts w:ascii="Consolas" w:hAnsi="Consolas" w:eastAsia="Consolas"/>
           <w:sz w:val="13"/>
         </w:rPr>
-        <w:t>│   ├── NativeAdvanceNoteControl.cs  1178</w:t>
+        <w:t>│   ├── NativeAdvanceNoteControl.cs  1201</w:t>
       </w:r>
     </w:p>
     <w:p>
@@ -4510,19 +4510,19 @@
           <w:rFonts w:ascii="Consolas" w:hAnsi="Consolas" w:eastAsia="Consolas"/>
           <w:sz w:val="13"/>
         </w:rPr>
-        <w:t>│   ├── AdvanceNoteService.cs  166</w:t>
-      </w:r>
-    </w:p>
-    <w:p>
-      <w:pPr>
-        <w:spacing w:after="0" w:before="0" w:line="240" w:lineRule="auto"/>
-      </w:pPr>
-      <w:r>
-        <w:rPr>
-          <w:rFonts w:ascii="Consolas" w:hAnsi="Consolas" w:eastAsia="Consolas"/>
-          <w:sz w:val="13"/>
-        </w:rPr>
-        <w:t>│   ├── AdvancePackageBuilder.cs  170</w:t>
+        <w:t>│   ├── AdvanceNoteService.cs  169</w:t>
+      </w:r>
+    </w:p>
+    <w:p>
+      <w:pPr>
+        <w:spacing w:after="0" w:before="0" w:line="240" w:lineRule="auto"/>
+      </w:pPr>
+      <w:r>
+        <w:rPr>
+          <w:rFonts w:ascii="Consolas" w:hAnsi="Consolas" w:eastAsia="Consolas"/>
+          <w:sz w:val="13"/>
+        </w:rPr>
+        <w:t>│   ├── AdvancePackageBuilder.cs  179</w:t>
       </w:r>
     </w:p>
     <w:p>
@@ -5110,7 +5110,7 @@
           <w:rFonts w:ascii="Consolas" w:hAnsi="Consolas" w:eastAsia="Consolas"/>
           <w:sz w:val="13"/>
         </w:rPr>
-        <w:t>│   ├── GenAllService.cs  789</w:t>
+        <w:t>│   ├── GenAllService.cs  806</w:t>
       </w:r>
     </w:p>
     <w:p>
@@ -6142,7 +6142,7 @@
           <w:rFonts w:ascii="Consolas" w:hAnsi="Consolas" w:eastAsia="Consolas"/>
           <w:sz w:val="13"/>
         </w:rPr>
-        <w:t>│       ├── advnote.html  806</w:t>
+        <w:t>│       ├── advnote.html  818</w:t>
       </w:r>
     </w:p>
     <w:p>
@@ -11107,7 +11107,7 @@
                 <w:b w:val="0"/>
                 <w:sz w:val="16"/>
               </w:rPr>
-              <w:t>Ctrl+Shift+G. Cấu trúc gói Script\app\APP_Script.sql | Script\sys\SYS_Script.sql + Web\... dùng chung với Advance Note (lúc tạo gói gọi GenAllService.CombineScripts + CreatePackage như Note (New)).Script procedure/function/view/trigger trong gói (Gen nhanh Store, Note (New)/Gen All) = SqlObjectBrowserService.GetDeployScriptAsync: IF EXISTS (sysobjects, xType, IsEncrypted = 0) DROP ... GO + CREATE gốc; table không bao giờ DROP; object mã hoá chỉ ra dòng nhắc. Tuỳ chọn gói (cả Note (New) Web/App và BcodeNote): Gen vào đường dẫn mạng (+ Nén .zip, chỉ áp cho bản trên mạng) = GenAllService.DeliverPackageAsync (Services/GenAllService.Delivery.cs) chạy SAU CreatePackage — chép vào AppSettings.PackageNetworkRoot (mặc định \\172.168.5.14\Send\)\&lt;MachineName&gt;\ (tạo nếu chưa có); tick zip thì nén ở %TEMP%\Bcode\PackageZip rồi chỉ chép &lt;Folder Name&gt;.zip lên mạng (xoá file tạm), không thì chép cả thư mục; Save At Path luôn chỉ có thư mục gói; thử thư mục mạng tối đa 15 s; lỗi chỉ ghi vào Errors (trang hiện đỏ), gói ở Save At Path giữ nguyên. Trang gửi zip/net/netRoot kèm create/generate và action pkgOpts khi đổi → GenAllService.SavePackageOptions (AppSettings.Update; PackageZip / PackageToNetwork / PackageNetworkRoot).</w:t>
+              <w:t>Ctrl+Shift+G. GenAllService.CreatePackage đổi tên file thuộc GuardedFileNames (Web.config, MasterPage.master, Options.xml, Message.xml) thành "__" + tên (PackagePath — cũng dùng cho xem trước của Gen Update / Note (New) / App), thêm note.txt khi có Note. Cấu trúc gói Script\app\APP_Script.sql | Script\sys\SYS_Script.sql + Web\... dùng chung với Advance Note (lúc tạo gói gọi GenAllService.CombineScripts + CreatePackage như Note (New)).Script procedure/function/view/trigger trong gói (Gen nhanh Store, Note (New)/Gen All) = SqlObjectBrowserService.GetDeployScriptAsync: IF EXISTS (sysobjects, xType, IsEncrypted = 0) DROP ... GO + CREATE gốc; table không bao giờ DROP; object mã hoá chỉ ra dòng nhắc. Tuỳ chọn gói (cả Note (New) Web/App và BcodeNote): Gen vào đường dẫn mạng (+ Nén .zip, chỉ áp cho bản trên mạng) = GenAllService.DeliverPackageAsync (Services/GenAllService.Delivery.cs) chạy SAU CreatePackage — chép vào AppSettings.PackageNetworkRoot (mặc định \\172.168.5.14\Send\)\&lt;MachineName&gt;\ (tạo nếu chưa có); tick zip thì nén ở %TEMP%\Bcode\PackageZip rồi chỉ chép &lt;Folder Name&gt;.zip lên mạng (xoá file tạm), không thì chép cả thư mục; Save At Path luôn chỉ có thư mục gói; thử thư mục mạng tối đa 15 s; lỗi chỉ ghi vào Errors (trang hiện đỏ), gói ở Save At Path giữ nguyên. Trang gửi zip/net/netRoot kèm create/generate và action pkgOpts khi đổi → GenAllService.SavePackageOptions (AppSettings.Update; PackageZip / PackageToNetwork / PackageNetworkRoot).</w:t>
             </w:r>
           </w:p>
         </w:tc>
@@ -11163,7 +11163,7 @@
                 <w:b w:val="0"/>
                 <w:sz w:val="16"/>
               </w:rPr>
-              <w:t>Ctrl+Shift+E / Ctrl+Shift+4. Request lưu %AppData%\Bcode\AdvanceNotes\&lt;ws&gt;.json; "Sync yêu cầu" từ bảng nvphyc. File dùng chung với BcodeNote.exe: AdvanceNoteControl so dấu file (AdvanceNoteService.Stamp = giờ ghi + kích thước) ở mỗi tin từ trang — tiến trình khác vừa ghi thì nạp lại trước khi lưu; trang focus lại gửi "refresh" để thấy thay đổi bên kia. FlushAsync (advNote.flush → "flushed") ghi phần đang gõ trước khi đổi dự án / đóng; ApplySuggestion → advNote.applySuggest (chỉ THÊM dòng chưa có vào Gen All / File Path / SQL Object App, Sys / Table liên quan; chưa mở y/c thì tạo y/c mới tên theo menu). Bản App (NativeAdvanceNoteControl) chỉ đọc file lúc mở tab. Ô "Lọc mã y/c" trên Request List (advnote.html #listFilter / NativeAdvanceNoteControl._listFilter): chữ thường bỏ dấu, nhiều mã cách dấu cách / phẩy = khớp một trong các mã; Enter mở y/c đầu tiên khớp, Esc xoá; tick-tất-cả ở tiêu đề chỉ áp các dòng đang hiện, y/c đã tick mà bị ẩn vẫn giữ tick.</w:t>
+              <w:t>Ctrl+Shift+E / Ctrl+Shift+4. Request lưu %AppData%\Bcode\AdvanceNotes\&lt;ws&gt;.json; nút 📝 Note (AdvanceRequest.Note, advnote.html btnNote + ô ẩn fNote dùng chung khung cModal — S.cField; App: NativeAdvanceNoteControl.OpenNote + RequestContentDialog plain) → AdvancePackageBuilder.NoteText gộp Note các y/c đã chọn → CreatePackage ghi note.txt (không Note thì không tạo); "Sync yêu cầu" từ bảng nvphyc. File dùng chung với BcodeNote.exe: AdvanceNoteControl so dấu file (AdvanceNoteService.Stamp = giờ ghi + kích thước) ở mỗi tin từ trang — tiến trình khác vừa ghi thì nạp lại trước khi lưu; trang focus lại gửi "refresh" để thấy thay đổi bên kia. FlushAsync (advNote.flush → "flushed") ghi phần đang gõ trước khi đổi dự án / đóng; ApplySuggestion → advNote.applySuggest (chỉ THÊM dòng chưa có vào Gen All / File Path / SQL Object App, Sys / Table liên quan; chưa mở y/c thì tạo y/c mới tên theo menu). Bản App (NativeAdvanceNoteControl) chỉ đọc file lúc mở tab. Ô "Lọc mã y/c" trên Request List (advnote.html #listFilter / NativeAdvanceNoteControl._listFilter): chữ thường bỏ dấu, nhiều mã cách dấu cách / phẩy = khớp một trong các mã; Enter mở y/c đầu tiên khớp, Esc xoá; tick-tất-cả ở tiêu đề chỉ áp các dòng đang hiện, y/c đã tick mà bị ẩn vẫn giữ tick.</w:t>
             </w:r>
           </w:p>
         </w:tc>

</xml_diff>

<commit_message>
bổ sung ctrl + click vào các file sẽ cho tick chọn nhanh, ctrl + C = copy path nhiều đường dẫn file cùng lúc
</commit_message>
<xml_diff>
--- a/Cấu trúc Bcode  BcodeViewer (v3 - Tóm tắt).docx
+++ b/Cấu trúc Bcode  BcodeViewer (v3 - Tóm tắt).docx
@@ -2158,7 +2158,7 @@
           <w:rFonts w:ascii="Consolas" w:hAnsi="Consolas" w:eastAsia="Consolas"/>
           <w:sz w:val="13"/>
         </w:rPr>
-        <w:t>│   ├── FileLookupControl.cs  1412</w:t>
+        <w:t>│   ├── FileLookupControl.cs  1445</w:t>
       </w:r>
     </w:p>
     <w:p>
@@ -5974,7 +5974,7 @@
           <w:rFonts w:ascii="Consolas" w:hAnsi="Consolas" w:eastAsia="Consolas"/>
           <w:sz w:val="13"/>
         </w:rPr>
-        <w:t>│   ├── ShortcutRegistry.cs  345</w:t>
+        <w:t>│   ├── ShortcutRegistry.cs  346</w:t>
       </w:r>
     </w:p>
     <w:p>
@@ -10939,7 +10939,7 @@
                 <w:b w:val="0"/>
                 <w:sz w:val="16"/>
               </w:rPr>
-              <w:t>Cây file theo menu (dò như FCode — đối chiếu menu SVTran của VPMILK: include đọc như trình đọc XML qua DtdIncludeResolver — chỉ entity được gọi %X;/&amp;X;, mọi đuôi file, bỏ khối &lt;![%X;[ IGNORE; controller="&amp;X;..." và showForm(]]&gt;&amp;X;&lt;![CDATA[...) trong chính file thì thay entity; thư mục Lookup = controller đuôi "Lookup" / @$relType = "Lookup" (ExtractLookupControllerNames, cache "lkp"); thư mục Report: form in khai controller="X" mang tên controller của menu → Report\X (GLTran → GLTranReport; ExtractReportFormControllers, cache "rptctl" — controller="SVTran" trong AITran.xml thì không lấy), include SYSTEM nằm trong thư mục Report và mang tên controller (Report\Include\GLTranReportBI.xml, GLTranReportSql.txt; BaseCurrency/Separate dùng chung thì không), reportFile ghép entity ("GLTranReport_01&amp;Conditional.GLTranReport.ApprovedBy;" → GLTranReport_01 + GLTranReport_01_a); bảng sysrelative của DB Sys KHÔNG phải nguồn FCode dùng; đổi luật dò thì tăng FileParseCache.SchemaVersion), danh sách file lấy từ chỉ mục quét sẵn (bộ nhớ / bản lưu %AppData%\Bcode\file-index\&lt;băm&gt;.t.gz kèm giờ sửa từng thư mục; bản &lt;băm&gt;.gz kiểu cũ không có giờ vẫn đọc được) nhưng mỗi lần dùng (GetIndex, tối đa 1 lần / giây / gốc) FileLookupService.Revalidate đối chiếu giờ sửa của mọi thư mục đã biết (FileIndex.DirTimes, kể cả gốc; hỏi song song ~100 thư mục ở Controllers ≈ 1–3 ms ổ D, ≈ 12–17 ms UNC) — thư mục đổi giờ thì liệt kê lại riêng nó, thư mục con mới quét đủ nhánh, thư mục mất bỏ cả nhánh (ApplyDirChanges) → file tạo / copy / xoá / đổi tên ngoài Bcode (Explorer, FCode, git pull, deploy) có ngay ở lần lọc kế, không cần F5; chỉ mục có giờ thư mục không hết hạn 2 phút nữa, quét nền 20 s sau khi nạp bản lưu vẫn giữ làm lưới an toàn; sửa nội dung file không đổi giờ thư mục — phần đó FileParseCache tự kiểm theo kích thước + giờ từng file. Chỉ mục không có giờ (bản lưu cũ, trước lần quét nền) thì như trước: hạn 2 phút + FindUnindexedSiblings dò thẳng ổ đĩa file cùng tên X.* trong thư mục đang có file của menu, cache theo dự án (%AppData%\Bcode\FileLookupCache), tô đỏ entity thiếu, tìm nội dung, Edit in BcodeViewer (Process.Start). Ô Search (lọc tên, debounce 200 ms, Enter = lọc ngay; App: FileLookupBarPage; Template → Tìm file → "Ấn Enter mới tìm" = AppSettings.FileLookupSearchOnEnter: gõ không tìm, chỉ Enter — FileLookupService.SetSearchOnEnter/SearchModeChanged → FileLookupControl.PushSearchMode → window.setSearchOnEnter của thanh, tab đang mở đổi ngay): gõ chữ = tìm cả thư mục Path, đang ở cây menu thì nhớ _menuBeforeSearch → xoá trắng quay lại cây menu đó; gõ đúng tên trang .aspx (arcthd1.aspx) = TryShowMenuForPage → MainForm.MenuForLookupPage (menu lá cây WCommand có Link trỏ trang đó, ưu tiên có sysid) → ShowForMenuItem y như bấm menu, thanh trạng thái ghi tên menu; không có menu thì lọc tên như cũ. Cấp source nhanh (FileLookupControl.QuickGrant.cs): chọn file .f Dir/Grid/Filter → dòng 2 thanh xem trước (filelookuppreview.html window.setSource; App: FileLookupPreviewBarPage) hiện phiên bản + thư mục kho (SourceGrantService.ResolveNearestLower: phiên bản dự án, không có thì phiên bản thấp hơn gần nhất cùng 3 chữ đầu; DetectVersion: nhiều phiên bản cùng số thì ưu tiên cùng 3 chữ đầu rồi 2 chữ đầu — FBISP24 → FBOR2SP24, không lấy TT24 của kho FAP), bấm nhãn = SourceViewForm, nút Cấp source = hỏi xác nhận rồi CopyRows; danh sách phiên bản cache 5 phút. Search Box (tìm nội dung) theo luật ở Template → tab "Tìm file" (uitemplate.html #tabSearch ↔ UiTemplateForm search-get/set/default ↔ AppSettings.Search*; FileLookupService.SetSearchRules / SearchRuleSet): File Type *.* chỉ quét "Đuôi file được tìm" (SearchIncludeExtensions, mặc định .xml .f .txt .js .sql .ent .xsd .css .config .json .html; trống = mọi đuôi), trừ "Đuôi luôn bỏ qua" và "nhị phân"; gõ rõ đuôi (*.cs) thì không xét danh sách; thư mục quét trong Controllers, bỏ .f đã biên dịch ở Dir/Filter/Grid, bỏ file &gt; N MB (luật này chỉ cho Search Box, không đụng cây menu). filelookupbar.html / searchbox.html báo chiều cao nội dung (__height, px thiết bị gồm DPI + UiScale) → FileLookupControl.FitBarHeight đặt chiều cao thanh — trước đây cố định 150 / 158 px nên cột cây hẹp hoặc tỉ lệ giao diện &gt; 100% làm khung Search Box bị cây file che. Đổi tên file (FileLookupControl.Rename.cs): F2 (phím fileLookup.rename, phạm vi Tree) / chuột phải Rename... = sửa nhãn tại chỗ (LabelEdit chỉ bật lúc đổi tên, BeforeLabelEdit chặn node khác; ô sửa mất focus ngay lúc vừa mở — khung xem trước đang nạp — thì mở lại 1 lần) → File.Move; không gõ đuôi = giữ đuôi, đổi đuôi hỏi Yes/No/Cancel, trùng tên / ký tự sai mở lại ô sửa, file khoá báo rõ; cặp cùng tên khác đuôi cùng thư mục hỏi (mặc định Không). FileLookupService.NotifyFileRenamed sửa chỉ mục file trong bộ nhớ + bản lưu file-index (thay bản FileIndex mới, không sửa list tại chỗ), FileParseCache.ForgetFile bỏ mục dính tên cũ (cả trên đĩa ở lần ghi kế), rồi event FileRenamed → mọi tab File Lookup sửa node + khung xem trước (không dựng lại cây). Sau đó tra nền chỗ còn nhắc tên cũ bằng SourceIndexService.FindLinesAsync (dòng include / controller= / SYSTEM / showForm...) — chỉ báo.</w:t>
+              <w:t>Cây file theo menu (dò như FCode — đối chiếu menu SVTran của VPMILK: include đọc như trình đọc XML qua DtdIncludeResolver — chỉ entity được gọi %X;/&amp;X;, mọi đuôi file, bỏ khối &lt;![%X;[ IGNORE; controller="&amp;X;..." và showForm(]]&gt;&amp;X;&lt;![CDATA[...) trong chính file thì thay entity; thư mục Lookup = controller đuôi "Lookup" / @$relType = "Lookup" (ExtractLookupControllerNames, cache "lkp"); thư mục Report: form in khai controller="X" mang tên controller của menu → Report\X (GLTran → GLTranReport; ExtractReportFormControllers, cache "rptctl" — controller="SVTran" trong AITran.xml thì không lấy), include SYSTEM nằm trong thư mục Report và mang tên controller (Report\Include\GLTranReportBI.xml, GLTranReportSql.txt; BaseCurrency/Separate dùng chung thì không), reportFile ghép entity ("GLTranReport_01&amp;Conditional.GLTranReport.ApprovedBy;" → GLTranReport_01 + GLTranReport_01_a); bảng sysrelative của DB Sys KHÔNG phải nguồn FCode dùng; đổi luật dò thì tăng FileParseCache.SchemaVersion), danh sách file lấy từ chỉ mục quét sẵn (bộ nhớ / bản lưu %AppData%\Bcode\file-index\&lt;băm&gt;.t.gz kèm giờ sửa từng thư mục; bản &lt;băm&gt;.gz kiểu cũ không có giờ vẫn đọc được) nhưng mỗi lần dùng (GetIndex, tối đa 1 lần / giây / gốc) FileLookupService.Revalidate đối chiếu giờ sửa của mọi thư mục đã biết (FileIndex.DirTimes, kể cả gốc; hỏi song song ~100 thư mục ở Controllers ≈ 1–3 ms ổ D, ≈ 12–17 ms UNC) — thư mục đổi giờ thì liệt kê lại riêng nó, thư mục con mới quét đủ nhánh, thư mục mất bỏ cả nhánh (ApplyDirChanges) → file tạo / copy / xoá / đổi tên ngoài Bcode (Explorer, FCode, git pull, deploy) có ngay ở lần lọc kế, không cần F5; chỉ mục có giờ thư mục không hết hạn 2 phút nữa, quét nền 20 s sau khi nạp bản lưu vẫn giữ làm lưới an toàn; sửa nội dung file không đổi giờ thư mục — phần đó FileParseCache tự kiểm theo kích thước + giờ từng file. Chỉ mục không có giờ (bản lưu cũ, trước lần quét nền) thì như trước: hạn 2 phút + FindUnindexedSiblings dò thẳng ổ đĩa file cùng tên X.* trong thư mục đang có file của menu, cache theo dự án (%AppData%\Bcode\FileLookupCache), tô đỏ entity thiếu, tìm nội dung, Edit in BcodeViewer (Process.Start). Ô Search (lọc tên, debounce 200 ms, Enter = lọc ngay; App: FileLookupBarPage; Template → Tìm file → "Ấn Enter mới tìm" = AppSettings.FileLookupSearchOnEnter: gõ không tìm, chỉ Enter — FileLookupService.SetSearchOnEnter/SearchModeChanged → FileLookupControl.PushSearchMode → window.setSearchOnEnter của thanh, tab đang mở đổi ngay): gõ chữ = tìm cả thư mục Path, đang ở cây menu thì nhớ _menuBeforeSearch → xoá trắng quay lại cây menu đó; gõ đúng tên trang .aspx (arcthd1.aspx) = TryShowMenuForPage → MainForm.MenuForLookupPage (menu lá cây WCommand có Link trỏ trang đó, ưu tiên có sysid) → ShowForMenuItem y như bấm menu, thanh trạng thái ghi tên menu; không có menu thì lọc tên như cũ. Cấp source nhanh (FileLookupControl.QuickGrant.cs): chọn file .f Dir/Grid/Filter → dòng 2 thanh xem trước (filelookuppreview.html window.setSource; App: FileLookupPreviewBarPage) hiện phiên bản + thư mục kho (SourceGrantService.ResolveNearestLower: phiên bản dự án, không có thì phiên bản thấp hơn gần nhất cùng 3 chữ đầu; DetectVersion: nhiều phiên bản cùng số thì ưu tiên cùng 3 chữ đầu rồi 2 chữ đầu — FBISP24 → FBOR2SP24, không lấy TT24 của kho FAP), bấm nhãn = SourceViewForm, nút Cấp source = hỏi xác nhận rồi CopyRows; danh sách phiên bản cache 5 phút. Search Box (tìm nội dung) theo luật ở Template → tab "Tìm file" (uitemplate.html #tabSearch ↔ UiTemplateForm search-get/set/default ↔ AppSettings.Search*; FileLookupService.SetSearchRules / SearchRuleSet): File Type *.* chỉ quét "Đuôi file được tìm" (SearchIncludeExtensions, mặc định .xml .f .txt .js .sql .ent .xsd .css .config .json .html; trống = mọi đuôi), trừ "Đuôi luôn bỏ qua" và "nhị phân"; gõ rõ đuôi (*.cs) thì không xét danh sách; thư mục quét trong Controllers, bỏ .f đã biên dịch ở Dir/Filter/Grid, bỏ file &gt; N MB (luật này chỉ cho Search Box, không đụng cây menu). filelookupbar.html / searchbox.html báo chiều cao nội dung (__height, px thiết bị gồm DPI + UiScale) → FileLookupControl.FitBarHeight đặt chiều cao thanh — trước đây cố định 150 / 158 px nên cột cây hẹp hoặc tỉ lệ giao diện &gt; 100% làm khung Search Box bị cây file che. Ctrl+C trên cây (phím fileLookup.copyPaths, phạm vi Tree, mặc định Ctrl+C) → CopyCheckedPaths: đường dẫn các file đã tick (CheckedFiles, bỏ trùng, mỗi dòng 1 file), không tick thì CopyPath dòng đang chọn; Ctrl+click vào nhãn / biểu tượng node (NodeMouseClick + HitTest, không tính ô tick) → ToggleChecked đảo tick (thư mục kéo theo cây con). Đổi tên file (FileLookupControl.Rename.cs): F2 (phím fileLookup.rename, phạm vi Tree) / chuột phải Rename... = sửa nhãn tại chỗ (LabelEdit chỉ bật lúc đổi tên, BeforeLabelEdit chặn node khác; ô sửa mất focus ngay lúc vừa mở — khung xem trước đang nạp — thì mở lại 1 lần) → File.Move; không gõ đuôi = giữ đuôi, đổi đuôi hỏi Yes/No/Cancel, trùng tên / ký tự sai mở lại ô sửa, file khoá báo rõ; cặp cùng tên khác đuôi cùng thư mục hỏi (mặc định Không). FileLookupService.NotifyFileRenamed sửa chỉ mục file trong bộ nhớ + bản lưu file-index (thay bản FileIndex mới, không sửa list tại chỗ), FileParseCache.ForgetFile bỏ mục dính tên cũ (cả trên đĩa ở lần ghi kế), rồi event FileRenamed → mọi tab File Lookup sửa node + khung xem trước (không dựng lại cây). Sau đó tra nền chỗ còn nhắc tên cũ bằng SourceIndexService.FindLinesAsync (dòng include / controller= / SYSTEM / showForm...) — chỉ báo.</w:t>
             </w:r>
           </w:p>
         </w:tc>
@@ -16318,7 +16318,7 @@
                 <w:b/>
                 <w:sz w:val="17"/>
               </w:rPr>
-              <w:t>Cây file File Lookup: F2 / F5 / F4</w:t>
+              <w:t>Cây file File Lookup: F2 / F5 / F4 / Ctrl+C</w:t>
             </w:r>
           </w:p>
         </w:tc>
@@ -16336,7 +16336,7 @@
                 <w:b w:val="0"/>
                 <w:sz w:val="17"/>
               </w:rPr>
-              <w:t>Đổi tên file / quét lại / nhân bản tab File Lookup</w:t>
+              <w:t>Đổi tên file / quét lại / nhân bản tab File Lookup / copy đường dẫn các file đã tick (Ctrl+click = tick nhanh)</w:t>
             </w:r>
           </w:p>
         </w:tc>

</xml_diff>

<commit_message>
bcode| fix so sánh ctrl + f5 và webconfig
</commit_message>
<xml_diff>
--- a/Cấu trúc Bcode  BcodeViewer (v3 - Tóm tắt).docx
+++ b/Cấu trúc Bcode  BcodeViewer (v3 - Tóm tắt).docx
@@ -3490,7 +3490,7 @@
           <w:rFonts w:ascii="Consolas" w:hAnsi="Consolas" w:eastAsia="Consolas"/>
           <w:sz w:val="13"/>
         </w:rPr>
-        <w:t>│   ├── ConnectionSettingsForm.cs  328</w:t>
+        <w:t>│   ├── ConnectionSettingsForm.cs  341</w:t>
       </w:r>
     </w:p>
     <w:p>
@@ -5098,7 +5098,7 @@
           <w:rFonts w:ascii="Consolas" w:hAnsi="Consolas" w:eastAsia="Consolas"/>
           <w:sz w:val="13"/>
         </w:rPr>
-        <w:t>│   ├── FsgProjectLookupService.cs  501</w:t>
+        <w:t>│   ├── FsgProjectLookupService.cs  578</w:t>
       </w:r>
     </w:p>
     <w:p>
@@ -5723,6 +5723,18 @@
           <w:sz w:val="13"/>
         </w:rPr>
         <w:t>│   ├── WCommandService.cs  894</w:t>
+      </w:r>
+    </w:p>
+    <w:p>
+      <w:pPr>
+        <w:spacing w:after="0" w:before="0" w:line="240" w:lineRule="auto"/>
+      </w:pPr>
+      <w:r>
+        <w:rPr>
+          <w:rFonts w:ascii="Consolas" w:hAnsi="Consolas" w:eastAsia="Consolas"/>
+          <w:sz w:val="13"/>
+        </w:rPr>
+        <w:t>│   ├── WebConfigConnectionReader.cs  141</w:t>
       </w:r>
     </w:p>
     <w:p>
@@ -9192,7 +9204,7 @@
                 <w:b w:val="0"/>
                 <w:sz w:val="16"/>
               </w:rPr>
-              <w:t>Services/FsgProjectLookupService.cs, FCodeConfigImportService.cs</w:t>
+              <w:t>Services/FsgProjectLookupService.cs, WebConfigConnectionReader.cs, FCodeConfigImportService.cs</w:t>
             </w:r>
           </w:p>
         </w:tc>
@@ -9210,7 +9222,7 @@
                 <w:b w:val="0"/>
                 <w:sz w:val="16"/>
               </w:rPr>
-              <w:t>Ctrl+F5, 3 chế độ (thêm 1 mã / chỉ thêm mới / ghi đè). Đọc DB FSG_A (nbdmda, nbdmserver). Create Menu = exec ns_createCommand.</w:t>
+              <w:t>Ctrl+F5, 3 chế độ (thêm 1 mã / chỉ thêm mới / ghi đè). Đọc DB FSG_A (nbdmda, nbdmserver). Create Menu = exec ns_createCommand. Sau khi lấy từ QLYC: đối chiếu Web.config ở Program Path (Services/WebConfigConnectionReader.cs — sysDatabaseName, sys/appConnectionString qua SqlConnectionStringBuilder; song song 8, chờ 4 s/file, server ".\SQL" → host UNC) → lệch thì lấy theo Web.config (FsgProjectLookupService.OverrideFromWebConfig), SyncResult.WebConfigFixes liệt kê trường đã thay; không đọc được thì giữ QLYC.</w:t>
             </w:r>
           </w:p>
         </w:tc>

</xml_diff>

<commit_message>
bcode| cho phép ctrl + 4 được nhiều tab
</commit_message>
<xml_diff>
--- a/Cấu trúc Bcode  BcodeViewer (v3 - Tóm tắt).docx
+++ b/Cấu trúc Bcode  BcodeViewer (v3 - Tóm tắt).docx
@@ -3682,7 +3682,7 @@
           <w:rFonts w:ascii="Consolas" w:hAnsi="Consolas" w:eastAsia="Consolas"/>
           <w:sz w:val="13"/>
         </w:rPr>
-        <w:t>│   ├── MainForm.cs  3940</w:t>
+        <w:t>│   ├── MainForm.cs  3966</w:t>
       </w:r>
     </w:p>
     <w:p>
@@ -3802,7 +3802,7 @@
           <w:rFonts w:ascii="Consolas" w:hAnsi="Consolas" w:eastAsia="Consolas"/>
           <w:sz w:val="13"/>
         </w:rPr>
-        <w:t>│   ├── QuickLaunchLoginForm.cs  558</w:t>
+        <w:t>│   ├── QuickLaunchLoginForm.cs  621</w:t>
       </w:r>
     </w:p>
     <w:p>
@@ -12029,7 +12029,7 @@
                 <w:b w:val="0"/>
                 <w:sz w:val="16"/>
               </w:rPr>
-              <w:t>Bung web đăng nhập Workspace.LoginWLink, tự điền user/pass bằng JS injection. F12 (phím fbo.devtools) ở tab FSG FBO = DevTools gắn bên phải trang như Chrome (UI/DevToolsDock.cs: OpenDevToolsWindow rồi nhúng cửa sổ DevTools bằng SetParent vào khung Dock=Right + Splitter, lệch cửa sổ để cắt thanh tiêu đề Chromium tự vẽ; bắt phím ở AcceleratorKeyPressed qua WebViewEnvironment.ControllerOf). Khung chi tiết y/c có nút 🤖 AI tạo danh mục (#dtAi, fsgReq.aiCatalog / Ctrl+Alt+I) → FsgRequirementReportControl.AiCatalogRequested → MainForm.OpenQuickListWithAi (như Note (New)). Lọc theo menu (chuột phải cây WCommand → ShowForMenu, chờ _web.IsReady → fsgReq.menuFilter): menuWhy trong fsgreq.html — y/c cùng ma_da (= Project ID) và 1) menu_id = wmenu_id, 2) menu_id của menu con, 3) ten_menu_ngan = Bar/Bar2 (bỏ hoa/dấu/(C)/(*)), 4) nội dung chứa trọn tên menu khi y/c gắn menu chung xx.00.00 / menu cha hoặc trên dòng "Đường dẫn:". Dữ liệu từ fsg-requirements.json; dự án chưa có thì kéo ngầm (keepFilters: không đổi ô lọc đã lưu; 0 y/c → lưu mục rỗng).</w:t>
+              <w:t>Bung web đăng nhập Workspace.LoginWLink, tự điền user/pass bằng JS injection. Nhiều tab FSG FBO / dự án (MainForm._quickLaunchForms): Ctrl+4 ở menu khác khi dự án đã có tab đăng nhập → ShowQuickLaunchTab(reuseSession) mở tab mới đi thẳng tới URL menu, chung phiên nhờ cùng hồ sơ WebView2 fbo_&lt;dự án&gt; (cookie chung); trùng menu (MenuUrl) → chuyển tab + RunMenuAsync nạp lại; bị đẩy về trang đăng nhập trong 8 giây sau khi vào menu → CheckMenuPageAsync tự đăng nhập lại 1 lần. F12 (phím fbo.devtools) ở tab FSG FBO = DevTools gắn bên phải trang như Chrome (UI/DevToolsDock.cs: OpenDevToolsWindow rồi nhúng cửa sổ DevTools bằng SetParent vào khung Dock=Right + Splitter, lệch cửa sổ để cắt thanh tiêu đề Chromium tự vẽ; bắt phím ở AcceleratorKeyPressed qua WebViewEnvironment.ControllerOf). Khung chi tiết y/c có nút 🤖 AI tạo danh mục (#dtAi, fsgReq.aiCatalog / Ctrl+Alt+I) → FsgRequirementReportControl.AiCatalogRequested → MainForm.OpenQuickListWithAi (như Note (New)). Lọc theo menu (chuột phải cây WCommand → ShowForMenu, chờ _web.IsReady → fsgReq.menuFilter): menuWhy trong fsgreq.html — y/c cùng ma_da (= Project ID) và 1) menu_id = wmenu_id, 2) menu_id của menu con, 3) ten_menu_ngan = Bar/Bar2 (bỏ hoa/dấu/(C)/(*)), 4) nội dung chứa trọn tên menu khi y/c gắn menu chung xx.00.00 / menu cha hoặc trên dòng "Đường dẫn:". Dữ liệu từ fsg-requirements.json; dự án chưa có thì kéo ngầm (keepFilters: không đổi ô lọc đã lưu; 0 y/c → lưu mục rỗng).</w:t>
             </w:r>
           </w:p>
         </w:tc>
@@ -15930,7 +15930,7 @@
                 <w:b w:val="0"/>
                 <w:sz w:val="17"/>
               </w:rPr>
-              <w:t>SQL Profiler / FSG FBO (ở cây WCommand: mở FBO, tự đăng nhập rồi vào đúng menu) / mở Program Path</w:t>
+              <w:t>SQL Profiler / FSG FBO (ở cây WCommand: mở FBO, tự đăng nhập rồi vào đúng menu; menu khác cùng dự án = thêm tab chung phiên) / mở Program Path</w:t>
             </w:r>
           </w:p>
         </w:tc>

</xml_diff>